<commit_message>
Add controller and views
</commit_message>
<xml_diff>
--- a/ghi-chu-asp.net.docx
+++ b/ghi-chu-asp.net.docx
@@ -2,8 +2,12 @@
 <file path=word/document.xml><?xml version="1.0" encoding="utf-8"?>
 <w:document xmlns:wpc="http://schemas.microsoft.com/office/word/2010/wordprocessingCanvas" xmlns:cx="http://schemas.microsoft.com/office/drawing/2014/chartex" xmlns:cx1="http://schemas.microsoft.com/office/drawing/2015/9/8/chartex" xmlns:cx2="http://schemas.microsoft.com/office/drawing/2015/10/21/chartex" xmlns:cx3="http://schemas.microsoft.com/office/drawing/2016/5/9/chartex" xmlns:cx4="http://schemas.microsoft.com/office/drawing/2016/5/10/chartex" xmlns:cx5="http://schemas.microsoft.com/office/drawing/2016/5/11/chartex" xmlns:cx6="http://schemas.microsoft.com/office/drawing/2016/5/12/chartex" xmlns:cx7="http://schemas.microsoft.com/office/drawing/2016/5/13/chartex" xmlns:cx8="http://schemas.microsoft.com/office/drawing/2016/5/14/chartex" xmlns:mc="http://schemas.openxmlformats.org/markup-compatibility/2006" xmlns:aink="http://schemas.microsoft.com/office/drawing/2016/ink" xmlns:am3d="http://schemas.microsoft.com/office/drawing/2017/model3d" xmlns:o="urn:schemas-microsoft-com:office:office" xmlns:oel="http://schemas.microsoft.com/office/2019/extlst" xmlns:r="http://schemas.openxmlformats.org/officeDocument/2006/relationships" xmlns:m="http://schemas.openxmlformats.org/officeDocument/2006/math" xmlns:v="urn:schemas-microsoft-com:vml" xmlns:wp14="http://schemas.microsoft.com/office/word/2010/wordprocessingDrawing" xmlns:wp="http://schemas.openxmlformats.org/drawingml/2006/wordprocessingDrawing" xmlns:w10="urn:schemas-microsoft-com:office:word" xmlns:w="http://schemas.openxmlformats.org/wordprocessingml/2006/main" xmlns:w14="http://schemas.microsoft.com/office/word/2010/wordml" xmlns:w15="http://schemas.microsoft.com/office/word/2012/wordml" xmlns:w16cex="http://schemas.microsoft.com/office/word/2018/wordml/cex" xmlns:w16cid="http://schemas.microsoft.com/office/word/2016/wordml/cid" xmlns:w16="http://schemas.microsoft.com/office/word/2018/wordml" xmlns:w16du="http://schemas.microsoft.com/office/word/2023/wordml/word16du" xmlns:w16sdtdh="http://schemas.microsoft.com/office/word/2020/wordml/sdtdatahash" xmlns:w16sdtfl="http://schemas.microsoft.com/office/word/2024/wordml/sdtformatlock" xmlns:w16se="http://schemas.microsoft.com/office/word/2015/wordml/symex" xmlns:wpg="http://schemas.microsoft.com/office/word/2010/wordprocessingGroup" xmlns:wpi="http://schemas.microsoft.com/office/word/2010/wordprocessingInk" xmlns:wne="http://schemas.microsoft.com/office/word/2006/wordml" xmlns:wps="http://schemas.microsoft.com/office/word/2010/wordprocessingShape" mc:Ignorable="w14 w15 w16se w16cid w16 w16cex w16sdtdh w16sdtfl w16du wp14">
   <w:body>
+    <w:p/>
     <w:p>
       <w:r>
+        <w:rPr>
+          <w:noProof/>
+        </w:rPr>
         <w:drawing>
           <wp:inline distT="0" distB="0" distL="0" distR="0" wp14:anchorId="5A1BCED9" wp14:editId="26CBA46C">
             <wp:extent cx="5943600" cy="2489200"/>
@@ -29,6 +33,45 @@
                     <a:xfrm>
                       <a:off x="0" y="0"/>
                       <a:ext cx="5943600" cy="2489200"/>
+                    </a:xfrm>
+                    <a:prstGeom prst="rect">
+                      <a:avLst/>
+                    </a:prstGeom>
+                  </pic:spPr>
+                </pic:pic>
+              </a:graphicData>
+            </a:graphic>
+          </wp:inline>
+        </w:drawing>
+      </w:r>
+    </w:p>
+    <w:p>
+      <w:r>
+        <w:drawing>
+          <wp:inline distT="0" distB="0" distL="0" distR="0" wp14:anchorId="4099BCE4" wp14:editId="2C2D8D6E">
+            <wp:extent cx="5943600" cy="725805"/>
+            <wp:effectExtent l="0" t="0" r="0" b="0"/>
+            <wp:docPr id="2000476992" name="Picture 1"/>
+            <wp:cNvGraphicFramePr>
+              <a:graphicFrameLocks xmlns:a="http://schemas.openxmlformats.org/drawingml/2006/main" noChangeAspect="1"/>
+            </wp:cNvGraphicFramePr>
+            <a:graphic xmlns:a="http://schemas.openxmlformats.org/drawingml/2006/main">
+              <a:graphicData uri="http://schemas.openxmlformats.org/drawingml/2006/picture">
+                <pic:pic xmlns:pic="http://schemas.openxmlformats.org/drawingml/2006/picture">
+                  <pic:nvPicPr>
+                    <pic:cNvPr id="2000476992" name=""/>
+                    <pic:cNvPicPr/>
+                  </pic:nvPicPr>
+                  <pic:blipFill>
+                    <a:blip r:embed="rId6"/>
+                    <a:stretch>
+                      <a:fillRect/>
+                    </a:stretch>
+                  </pic:blipFill>
+                  <pic:spPr>
+                    <a:xfrm>
+                      <a:off x="0" y="0"/>
+                      <a:ext cx="5943600" cy="725805"/>
                     </a:xfrm>
                     <a:prstGeom prst="rect">
                       <a:avLst/>

</xml_diff>

<commit_message>
Connection database and add migration
</commit_message>
<xml_diff>
--- a/ghi-chu-asp.net.docx
+++ b/ghi-chu-asp.net.docx
@@ -47,6 +47,9 @@
     </w:p>
     <w:p>
       <w:r>
+        <w:rPr>
+          <w:noProof/>
+        </w:rPr>
         <w:drawing>
           <wp:inline distT="0" distB="0" distL="0" distR="0" wp14:anchorId="4099BCE4" wp14:editId="2C2D8D6E">
             <wp:extent cx="5943600" cy="725805"/>
@@ -84,6 +87,160 @@
         </w:drawing>
       </w:r>
     </w:p>
+    <w:p/>
+    <w:p>
+      <w:r>
+        <w:t>Add-Migration FirstMigration</w:t>
+      </w:r>
+      <w:r>
+        <w:t xml:space="preserve"> -&gt; </w:t>
+      </w:r>
+      <w:r>
+        <w:t xml:space="preserve">database và bảng có thể </w:t>
+      </w:r>
+      <w:r>
+        <w:rPr>
+          <w:b/>
+          <w:bCs/>
+        </w:rPr>
+        <w:t>được tạo tự động từ code</w:t>
+      </w:r>
+      <w:r>
+        <w:t>.</w:t>
+      </w:r>
+    </w:p>
+    <w:p>
+      <w:r>
+        <w:t xml:space="preserve">Sau đó chạy lệnh: </w:t>
+      </w:r>
+      <w:r>
+        <w:t>Update-Database</w:t>
+      </w:r>
+      <w:r>
+        <w:t xml:space="preserve"> -&gt; </w:t>
+      </w:r>
+      <w:r>
+        <w:rPr>
+          <w:bCs/>
+        </w:rPr>
+        <w:t>tạo hoặc cập nhật database dựa trên Migration</w:t>
+      </w:r>
+    </w:p>
+    <w:p>
+      <w:r>
+        <w:rPr>
+          <w:noProof/>
+        </w:rPr>
+        <w:drawing>
+          <wp:inline distT="0" distB="0" distL="0" distR="0" wp14:anchorId="76CAA966" wp14:editId="6953CA45">
+            <wp:extent cx="5009322" cy="3365237"/>
+            <wp:effectExtent l="0" t="0" r="1270" b="6985"/>
+            <wp:docPr id="1615332411" name="Picture 1"/>
+            <wp:cNvGraphicFramePr>
+              <a:graphicFrameLocks xmlns:a="http://schemas.openxmlformats.org/drawingml/2006/main" noChangeAspect="1"/>
+            </wp:cNvGraphicFramePr>
+            <a:graphic xmlns:a="http://schemas.openxmlformats.org/drawingml/2006/main">
+              <a:graphicData uri="http://schemas.openxmlformats.org/drawingml/2006/picture">
+                <pic:pic xmlns:pic="http://schemas.openxmlformats.org/drawingml/2006/picture">
+                  <pic:nvPicPr>
+                    <pic:cNvPr id="1615332411" name=""/>
+                    <pic:cNvPicPr/>
+                  </pic:nvPicPr>
+                  <pic:blipFill>
+                    <a:blip r:embed="rId7"/>
+                    <a:stretch>
+                      <a:fillRect/>
+                    </a:stretch>
+                  </pic:blipFill>
+                  <pic:spPr>
+                    <a:xfrm>
+                      <a:off x="0" y="0"/>
+                      <a:ext cx="5019149" cy="3371839"/>
+                    </a:xfrm>
+                    <a:prstGeom prst="rect">
+                      <a:avLst/>
+                    </a:prstGeom>
+                  </pic:spPr>
+                </pic:pic>
+              </a:graphicData>
+            </a:graphic>
+          </wp:inline>
+        </w:drawing>
+      </w:r>
+    </w:p>
+    <w:p/>
+    <w:p>
+      <w:r>
+        <w:t>Quy trình chuẩn ASP.NET</w:t>
+      </w:r>
+    </w:p>
+    <w:p>
+      <w:r>
+        <w:t>1️</w:t>
+      </w:r>
+      <w:r>
+        <w:rPr>
+          <w:rFonts w:ascii="Segoe UI Symbol" w:hAnsi="Segoe UI Symbol" w:cs="Segoe UI Symbol"/>
+        </w:rPr>
+        <w:t>⃣</w:t>
+      </w:r>
+      <w:r>
+        <w:t xml:space="preserve"> Tạo Model</w:t>
+      </w:r>
+      <w:r>
+        <w:br/>
+        <w:t>2️</w:t>
+      </w:r>
+      <w:r>
+        <w:rPr>
+          <w:rFonts w:ascii="Segoe UI Symbol" w:hAnsi="Segoe UI Symbol" w:cs="Segoe UI Symbol"/>
+        </w:rPr>
+        <w:t>⃣</w:t>
+      </w:r>
+      <w:r>
+        <w:t xml:space="preserve"> Tạo DataContext</w:t>
+      </w:r>
+      <w:r>
+        <w:br/>
+        <w:t>3️</w:t>
+      </w:r>
+      <w:r>
+        <w:rPr>
+          <w:rFonts w:ascii="Segoe UI Symbol" w:hAnsi="Segoe UI Symbol" w:cs="Segoe UI Symbol"/>
+        </w:rPr>
+        <w:t>⃣</w:t>
+      </w:r>
+      <w:r>
+        <w:t xml:space="preserve"> Cấu hình ConnectionString</w:t>
+      </w:r>
+      <w:r>
+        <w:br/>
+        <w:t>4️</w:t>
+      </w:r>
+      <w:r>
+        <w:rPr>
+          <w:rFonts w:ascii="Segoe UI Symbol" w:hAnsi="Segoe UI Symbol" w:cs="Segoe UI Symbol"/>
+        </w:rPr>
+        <w:t>⃣</w:t>
+      </w:r>
+      <w:r>
+        <w:t xml:space="preserve"> Add-Migration</w:t>
+      </w:r>
+      <w:r>
+        <w:br/>
+        <w:t>5️</w:t>
+      </w:r>
+      <w:r>
+        <w:rPr>
+          <w:rFonts w:ascii="Segoe UI Symbol" w:hAnsi="Segoe UI Symbol" w:cs="Segoe UI Symbol"/>
+        </w:rPr>
+        <w:t>⃣</w:t>
+      </w:r>
+      <w:r>
+        <w:t xml:space="preserve"> Update-Database</w:t>
+      </w:r>
+    </w:p>
+    <w:p/>
     <w:sectPr>
       <w:pgSz w:w="12240" w:h="15840"/>
       <w:pgMar w:top="1440" w:right="1440" w:bottom="1440" w:left="1440" w:header="720" w:footer="720" w:gutter="0"/>
@@ -939,7 +1096,6 @@
   <w:style w:type="character" w:default="1" w:styleId="DefaultParagraphFont">
     <w:name w:val="Default Paragraph Font"/>
     <w:uiPriority w:val="1"/>
-    <w:semiHidden/>
     <w:unhideWhenUsed/>
   </w:style>
   <w:style w:type="table" w:default="1" w:styleId="TableNormal">
@@ -1287,6 +1443,17 @@
       <w:smallCaps/>
       <w:color w:val="2F5496" w:themeColor="accent1" w:themeShade="BF"/>
       <w:spacing w:val="5"/>
+    </w:rPr>
+  </w:style>
+  <w:style w:type="paragraph" w:styleId="NormalWeb">
+    <w:name w:val="Normal (Web)"/>
+    <w:basedOn w:val="Normal"/>
+    <w:uiPriority w:val="99"/>
+    <w:semiHidden/>
+    <w:unhideWhenUsed/>
+    <w:rsid w:val="008E2631"/>
+    <w:rPr>
+      <w:rFonts w:ascii="Times New Roman" w:hAnsi="Times New Roman" w:cs="Times New Roman"/>
     </w:rPr>
   </w:style>
 </w:styles>

</xml_diff>

<commit_message>
Add product details page
</commit_message>
<xml_diff>
--- a/ghi-chu-asp.net.docx
+++ b/ghi-chu-asp.net.docx
@@ -381,6 +381,147 @@
         <w:t>&lt;vc:categories&gt;&lt;/vc:categories&gt;</w:t>
       </w:r>
     </w:p>
+    <w:p>
+      <w:r>
+        <w:br w:type="page"/>
+      </w:r>
+    </w:p>
+    <w:p>
+      <w:r>
+        <w:lastRenderedPageBreak/>
+        <w:t>async Task&lt;IActionResult&gt; nghĩa là: hàm trả về kết quả cho web và chạy bất đồng bộ để không bị chậm</w:t>
+      </w:r>
+    </w:p>
+    <w:p>
+      <w:pPr>
+        <w:rPr>
+          <w:b/>
+          <w:bCs/>
+        </w:rPr>
+      </w:pPr>
+      <w:r>
+        <w:rPr>
+          <w:rFonts w:ascii="Segoe UI Emoji" w:hAnsi="Segoe UI Emoji" w:cs="Segoe UI Emoji"/>
+          <w:b/>
+          <w:bCs/>
+        </w:rPr>
+        <w:t>🔥</w:t>
+      </w:r>
+      <w:r>
+        <w:rPr>
+          <w:b/>
+          <w:bCs/>
+        </w:rPr>
+        <w:t xml:space="preserve"> Ví dụ đời thường</w:t>
+      </w:r>
+    </w:p>
+    <w:p>
+      <w:r>
+        <w:rPr>
+          <w:rFonts w:ascii="Segoe UI Emoji" w:hAnsi="Segoe UI Emoji" w:cs="Segoe UI Emoji"/>
+        </w:rPr>
+        <w:t>👉</w:t>
+      </w:r>
+      <w:r>
+        <w:t xml:space="preserve"> Không async:</w:t>
+      </w:r>
+    </w:p>
+    <w:p>
+      <w:r>
+        <w:t>Gọi đồ ăn → đứng chờ → lấy đồ → đi</w:t>
+      </w:r>
+    </w:p>
+    <w:p>
+      <w:r>
+        <w:rPr>
+          <w:rFonts w:ascii="Segoe UI Emoji" w:hAnsi="Segoe UI Emoji" w:cs="Segoe UI Emoji"/>
+        </w:rPr>
+        <w:t>👉</w:t>
+      </w:r>
+      <w:r>
+        <w:t xml:space="preserve"> Async:</w:t>
+      </w:r>
+    </w:p>
+    <w:p>
+      <w:r>
+        <w:t>Gọi đồ ăn → ngồi chơi → có đồ thì lấy</w:t>
+      </w:r>
+    </w:p>
+    <w:p>
+      <w:r>
+        <w:pict w14:anchorId="226671D9">
+          <v:rect id="_x0000_i1031" style="width:0;height:1.5pt" o:hralign="center" o:hrstd="t" o:hr="t" fillcolor="#a0a0a0" stroked="f"/>
+        </w:pict>
+      </w:r>
+    </w:p>
+    <w:p>
+      <w:pPr>
+        <w:rPr>
+          <w:b/>
+          <w:bCs/>
+        </w:rPr>
+      </w:pPr>
+      <w:r>
+        <w:rPr>
+          <w:rFonts w:ascii="Segoe UI Emoji" w:hAnsi="Segoe UI Emoji" w:cs="Segoe UI Emoji"/>
+          <w:b/>
+          <w:bCs/>
+        </w:rPr>
+        <w:t>🔥</w:t>
+      </w:r>
+      <w:r>
+        <w:rPr>
+          <w:b/>
+          <w:bCs/>
+        </w:rPr>
+        <w:t xml:space="preserve"> Khi nào dùng?</w:t>
+      </w:r>
+    </w:p>
+    <w:p>
+      <w:r>
+        <w:rPr>
+          <w:rFonts w:ascii="Segoe UI Emoji" w:hAnsi="Segoe UI Emoji" w:cs="Segoe UI Emoji"/>
+        </w:rPr>
+        <w:t>👉</w:t>
+      </w:r>
+      <w:r>
+        <w:t xml:space="preserve"> Khi làm việc với:</w:t>
+      </w:r>
+    </w:p>
+    <w:p>
+      <w:pPr>
+        <w:numPr>
+          <w:ilvl w:val="0"/>
+          <w:numId w:val="3"/>
+        </w:numPr>
+      </w:pPr>
+      <w:r>
+        <w:t>Database (ToListAsync, FirstOrDefaultAsync)</w:t>
+      </w:r>
+    </w:p>
+    <w:p>
+      <w:pPr>
+        <w:numPr>
+          <w:ilvl w:val="0"/>
+          <w:numId w:val="3"/>
+        </w:numPr>
+      </w:pPr>
+      <w:r>
+        <w:t>API</w:t>
+      </w:r>
+    </w:p>
+    <w:p>
+      <w:pPr>
+        <w:numPr>
+          <w:ilvl w:val="0"/>
+          <w:numId w:val="3"/>
+        </w:numPr>
+      </w:pPr>
+      <w:r>
+        <w:t>File</w:t>
+      </w:r>
+    </w:p>
+    <w:p/>
     <w:sectPr>
       <w:pgSz w:w="12240" w:h="15840"/>
       <w:pgMar w:top="1440" w:right="1440" w:bottom="1440" w:left="1440" w:header="720" w:footer="720" w:gutter="0"/>
@@ -508,6 +649,155 @@
     </w:lvl>
   </w:abstractNum>
   <w:abstractNum w:abstractNumId="1" w15:restartNumberingAfterBreak="0">
+    <w:nsid w:val="444C63B5"/>
+    <w:multiLevelType w:val="multilevel"/>
+    <w:tmpl w:val="ABA8ED22"/>
+    <w:lvl w:ilvl="0">
+      <w:start w:val="1"/>
+      <w:numFmt w:val="bullet"/>
+      <w:lvlText w:val=""/>
+      <w:lvlJc w:val="left"/>
+      <w:pPr>
+        <w:tabs>
+          <w:tab w:val="num" w:pos="720"/>
+        </w:tabs>
+        <w:ind w:left="720" w:hanging="360"/>
+      </w:pPr>
+      <w:rPr>
+        <w:rFonts w:ascii="Symbol" w:hAnsi="Symbol" w:hint="default"/>
+        <w:sz w:val="20"/>
+      </w:rPr>
+    </w:lvl>
+    <w:lvl w:ilvl="1" w:tentative="1">
+      <w:start w:val="1"/>
+      <w:numFmt w:val="bullet"/>
+      <w:lvlText w:val="o"/>
+      <w:lvlJc w:val="left"/>
+      <w:pPr>
+        <w:tabs>
+          <w:tab w:val="num" w:pos="1440"/>
+        </w:tabs>
+        <w:ind w:left="1440" w:hanging="360"/>
+      </w:pPr>
+      <w:rPr>
+        <w:rFonts w:ascii="Courier New" w:hAnsi="Courier New" w:hint="default"/>
+        <w:sz w:val="20"/>
+      </w:rPr>
+    </w:lvl>
+    <w:lvl w:ilvl="2" w:tentative="1">
+      <w:start w:val="1"/>
+      <w:numFmt w:val="bullet"/>
+      <w:lvlText w:val=""/>
+      <w:lvlJc w:val="left"/>
+      <w:pPr>
+        <w:tabs>
+          <w:tab w:val="num" w:pos="2160"/>
+        </w:tabs>
+        <w:ind w:left="2160" w:hanging="360"/>
+      </w:pPr>
+      <w:rPr>
+        <w:rFonts w:ascii="Wingdings" w:hAnsi="Wingdings" w:hint="default"/>
+        <w:sz w:val="20"/>
+      </w:rPr>
+    </w:lvl>
+    <w:lvl w:ilvl="3" w:tentative="1">
+      <w:start w:val="1"/>
+      <w:numFmt w:val="bullet"/>
+      <w:lvlText w:val=""/>
+      <w:lvlJc w:val="left"/>
+      <w:pPr>
+        <w:tabs>
+          <w:tab w:val="num" w:pos="2880"/>
+        </w:tabs>
+        <w:ind w:left="2880" w:hanging="360"/>
+      </w:pPr>
+      <w:rPr>
+        <w:rFonts w:ascii="Wingdings" w:hAnsi="Wingdings" w:hint="default"/>
+        <w:sz w:val="20"/>
+      </w:rPr>
+    </w:lvl>
+    <w:lvl w:ilvl="4" w:tentative="1">
+      <w:start w:val="1"/>
+      <w:numFmt w:val="bullet"/>
+      <w:lvlText w:val=""/>
+      <w:lvlJc w:val="left"/>
+      <w:pPr>
+        <w:tabs>
+          <w:tab w:val="num" w:pos="3600"/>
+        </w:tabs>
+        <w:ind w:left="3600" w:hanging="360"/>
+      </w:pPr>
+      <w:rPr>
+        <w:rFonts w:ascii="Wingdings" w:hAnsi="Wingdings" w:hint="default"/>
+        <w:sz w:val="20"/>
+      </w:rPr>
+    </w:lvl>
+    <w:lvl w:ilvl="5" w:tentative="1">
+      <w:start w:val="1"/>
+      <w:numFmt w:val="bullet"/>
+      <w:lvlText w:val=""/>
+      <w:lvlJc w:val="left"/>
+      <w:pPr>
+        <w:tabs>
+          <w:tab w:val="num" w:pos="4320"/>
+        </w:tabs>
+        <w:ind w:left="4320" w:hanging="360"/>
+      </w:pPr>
+      <w:rPr>
+        <w:rFonts w:ascii="Wingdings" w:hAnsi="Wingdings" w:hint="default"/>
+        <w:sz w:val="20"/>
+      </w:rPr>
+    </w:lvl>
+    <w:lvl w:ilvl="6" w:tentative="1">
+      <w:start w:val="1"/>
+      <w:numFmt w:val="bullet"/>
+      <w:lvlText w:val=""/>
+      <w:lvlJc w:val="left"/>
+      <w:pPr>
+        <w:tabs>
+          <w:tab w:val="num" w:pos="5040"/>
+        </w:tabs>
+        <w:ind w:left="5040" w:hanging="360"/>
+      </w:pPr>
+      <w:rPr>
+        <w:rFonts w:ascii="Wingdings" w:hAnsi="Wingdings" w:hint="default"/>
+        <w:sz w:val="20"/>
+      </w:rPr>
+    </w:lvl>
+    <w:lvl w:ilvl="7" w:tentative="1">
+      <w:start w:val="1"/>
+      <w:numFmt w:val="bullet"/>
+      <w:lvlText w:val=""/>
+      <w:lvlJc w:val="left"/>
+      <w:pPr>
+        <w:tabs>
+          <w:tab w:val="num" w:pos="5760"/>
+        </w:tabs>
+        <w:ind w:left="5760" w:hanging="360"/>
+      </w:pPr>
+      <w:rPr>
+        <w:rFonts w:ascii="Wingdings" w:hAnsi="Wingdings" w:hint="default"/>
+        <w:sz w:val="20"/>
+      </w:rPr>
+    </w:lvl>
+    <w:lvl w:ilvl="8" w:tentative="1">
+      <w:start w:val="1"/>
+      <w:numFmt w:val="bullet"/>
+      <w:lvlText w:val=""/>
+      <w:lvlJc w:val="left"/>
+      <w:pPr>
+        <w:tabs>
+          <w:tab w:val="num" w:pos="6480"/>
+        </w:tabs>
+        <w:ind w:left="6480" w:hanging="360"/>
+      </w:pPr>
+      <w:rPr>
+        <w:rFonts w:ascii="Wingdings" w:hAnsi="Wingdings" w:hint="default"/>
+        <w:sz w:val="20"/>
+      </w:rPr>
+    </w:lvl>
+  </w:abstractNum>
+  <w:abstractNum w:abstractNumId="2" w15:restartNumberingAfterBreak="0">
     <w:nsid w:val="73B52B43"/>
     <w:multiLevelType w:val="multilevel"/>
     <w:tmpl w:val="59884D7E"/>
@@ -625,10 +915,13 @@
     </w:lvl>
   </w:abstractNum>
   <w:num w:numId="1" w16cid:durableId="430272983">
-    <w:abstractNumId w:val="1"/>
+    <w:abstractNumId w:val="2"/>
   </w:num>
   <w:num w:numId="2" w16cid:durableId="137504538">
     <w:abstractNumId w:val="0"/>
+  </w:num>
+  <w:num w:numId="3" w16cid:durableId="1963071122">
+    <w:abstractNumId w:val="1"/>
   </w:num>
 </w:numbering>
 </file>

</xml_diff>

<commit_message>
Add notification in partial
</commit_message>
<xml_diff>
--- a/ghi-chu-asp.net.docx
+++ b/ghi-chu-asp.net.docx
@@ -2,7 +2,45 @@
 <file path=word/document.xml><?xml version="1.0" encoding="utf-8"?>
 <w:document xmlns:wpc="http://schemas.microsoft.com/office/word/2010/wordprocessingCanvas" xmlns:cx="http://schemas.microsoft.com/office/drawing/2014/chartex" xmlns:cx1="http://schemas.microsoft.com/office/drawing/2015/9/8/chartex" xmlns:cx2="http://schemas.microsoft.com/office/drawing/2015/10/21/chartex" xmlns:cx3="http://schemas.microsoft.com/office/drawing/2016/5/9/chartex" xmlns:cx4="http://schemas.microsoft.com/office/drawing/2016/5/10/chartex" xmlns:cx5="http://schemas.microsoft.com/office/drawing/2016/5/11/chartex" xmlns:cx6="http://schemas.microsoft.com/office/drawing/2016/5/12/chartex" xmlns:cx7="http://schemas.microsoft.com/office/drawing/2016/5/13/chartex" xmlns:cx8="http://schemas.microsoft.com/office/drawing/2016/5/14/chartex" xmlns:mc="http://schemas.openxmlformats.org/markup-compatibility/2006" xmlns:aink="http://schemas.microsoft.com/office/drawing/2016/ink" xmlns:am3d="http://schemas.microsoft.com/office/drawing/2017/model3d" xmlns:o="urn:schemas-microsoft-com:office:office" xmlns:oel="http://schemas.microsoft.com/office/2019/extlst" xmlns:r="http://schemas.openxmlformats.org/officeDocument/2006/relationships" xmlns:m="http://schemas.openxmlformats.org/officeDocument/2006/math" xmlns:v="urn:schemas-microsoft-com:vml" xmlns:wp14="http://schemas.microsoft.com/office/word/2010/wordprocessingDrawing" xmlns:wp="http://schemas.openxmlformats.org/drawingml/2006/wordprocessingDrawing" xmlns:w10="urn:schemas-microsoft-com:office:word" xmlns:w="http://schemas.openxmlformats.org/wordprocessingml/2006/main" xmlns:w14="http://schemas.microsoft.com/office/word/2010/wordml" xmlns:w15="http://schemas.microsoft.com/office/word/2012/wordml" xmlns:w16cex="http://schemas.microsoft.com/office/word/2018/wordml/cex" xmlns:w16cid="http://schemas.microsoft.com/office/word/2016/wordml/cid" xmlns:w16="http://schemas.microsoft.com/office/word/2018/wordml" xmlns:w16du="http://schemas.microsoft.com/office/word/2023/wordml/word16du" xmlns:w16sdtdh="http://schemas.microsoft.com/office/word/2020/wordml/sdtdatahash" xmlns:w16sdtfl="http://schemas.microsoft.com/office/word/2024/wordml/sdtformatlock" xmlns:w16se="http://schemas.microsoft.com/office/word/2015/wordml/symex" xmlns:wpg="http://schemas.microsoft.com/office/word/2010/wordprocessingGroup" xmlns:wpi="http://schemas.microsoft.com/office/word/2010/wordprocessingInk" xmlns:wne="http://schemas.microsoft.com/office/word/2006/wordml" xmlns:wps="http://schemas.microsoft.com/office/word/2010/wordprocessingShape" mc:Ignorable="w14 w15 w16se w16cid w16 w16cex w16sdtdh w16sdtfl w16du wp14">
   <w:body>
-    <w:p/>
+    <w:p>
+      <w:r>
+        <w:drawing>
+          <wp:inline distT="0" distB="0" distL="0" distR="0" wp14:anchorId="4B1A5A7E" wp14:editId="4D0E7EEC">
+            <wp:extent cx="4210638" cy="828791"/>
+            <wp:effectExtent l="0" t="0" r="0" b="9525"/>
+            <wp:docPr id="686073547" name="Picture 1"/>
+            <wp:cNvGraphicFramePr>
+              <a:graphicFrameLocks xmlns:a="http://schemas.openxmlformats.org/drawingml/2006/main" noChangeAspect="1"/>
+            </wp:cNvGraphicFramePr>
+            <a:graphic xmlns:a="http://schemas.openxmlformats.org/drawingml/2006/main">
+              <a:graphicData uri="http://schemas.openxmlformats.org/drawingml/2006/picture">
+                <pic:pic xmlns:pic="http://schemas.openxmlformats.org/drawingml/2006/picture">
+                  <pic:nvPicPr>
+                    <pic:cNvPr id="686073547" name=""/>
+                    <pic:cNvPicPr/>
+                  </pic:nvPicPr>
+                  <pic:blipFill>
+                    <a:blip r:embed="rId5"/>
+                    <a:stretch>
+                      <a:fillRect/>
+                    </a:stretch>
+                  </pic:blipFill>
+                  <pic:spPr>
+                    <a:xfrm>
+                      <a:off x="0" y="0"/>
+                      <a:ext cx="4210638" cy="828791"/>
+                    </a:xfrm>
+                    <a:prstGeom prst="rect">
+                      <a:avLst/>
+                    </a:prstGeom>
+                  </pic:spPr>
+                </pic:pic>
+              </a:graphicData>
+            </a:graphic>
+          </wp:inline>
+        </w:drawing>
+      </w:r>
+    </w:p>
     <w:p>
       <w:r>
         <w:rPr>
@@ -24,7 +62,7 @@
                     <pic:cNvPicPr/>
                   </pic:nvPicPr>
                   <pic:blipFill>
-                    <a:blip r:embed="rId5"/>
+                    <a:blip r:embed="rId6"/>
                     <a:stretch>
                       <a:fillRect/>
                     </a:stretch>
@@ -66,7 +104,7 @@
                     <pic:cNvPicPr/>
                   </pic:nvPicPr>
                   <pic:blipFill>
-                    <a:blip r:embed="rId6"/>
+                    <a:blip r:embed="rId7"/>
                     <a:stretch>
                       <a:fillRect/>
                     </a:stretch>
@@ -131,6 +169,7 @@
         <w:rPr>
           <w:noProof/>
         </w:rPr>
+        <w:lastRenderedPageBreak/>
         <w:drawing>
           <wp:inline distT="0" distB="0" distL="0" distR="0" wp14:anchorId="76CAA966" wp14:editId="6953CA45">
             <wp:extent cx="5009322" cy="3365237"/>
@@ -147,7 +186,7 @@
                     <pic:cNvPicPr/>
                   </pic:nvPicPr>
                   <pic:blipFill>
-                    <a:blip r:embed="rId7"/>
+                    <a:blip r:embed="rId8"/>
                     <a:stretch>
                       <a:fillRect/>
                     </a:stretch>
@@ -568,7 +607,7 @@
                     <pic:cNvPicPr/>
                   </pic:nvPicPr>
                   <pic:blipFill>
-                    <a:blip r:embed="rId8"/>
+                    <a:blip r:embed="rId9"/>
                     <a:stretch>
                       <a:fillRect/>
                     </a:stretch>
@@ -591,6 +630,9 @@
     </w:p>
     <w:p>
       <w:r>
+        <w:rPr>
+          <w:noProof/>
+        </w:rPr>
         <w:drawing>
           <wp:inline distT="0" distB="0" distL="0" distR="0" wp14:anchorId="7458DCF7" wp14:editId="060183E5">
             <wp:extent cx="5943600" cy="2506345"/>
@@ -607,7 +649,7 @@
                     <pic:cNvPicPr/>
                   </pic:nvPicPr>
                   <pic:blipFill>
-                    <a:blip r:embed="rId9"/>
+                    <a:blip r:embed="rId10"/>
                     <a:stretch>
                       <a:fillRect/>
                     </a:stretch>
@@ -630,6 +672,9 @@
     </w:p>
     <w:p>
       <w:r>
+        <w:rPr>
+          <w:noProof/>
+        </w:rPr>
         <w:lastRenderedPageBreak/>
         <w:drawing>
           <wp:inline distT="0" distB="0" distL="0" distR="0" wp14:anchorId="3347EBEC" wp14:editId="24CFD6A1">
@@ -647,7 +692,7 @@
                     <pic:cNvPicPr/>
                   </pic:nvPicPr>
                   <pic:blipFill>
-                    <a:blip r:embed="rId10"/>
+                    <a:blip r:embed="rId11"/>
                     <a:stretch>
                       <a:fillRect/>
                     </a:stretch>

</xml_diff>

<commit_message>
Add: Form add product
</commit_message>
<xml_diff>
--- a/ghi-chu-asp.net.docx
+++ b/ghi-chu-asp.net.docx
@@ -723,6 +723,9 @@
     </w:p>
     <w:p>
       <w:r>
+        <w:rPr>
+          <w:noProof/>
+        </w:rPr>
         <w:lastRenderedPageBreak/>
         <w:drawing>
           <wp:inline distT="0" distB="0" distL="0" distR="0" wp14:anchorId="424B0978" wp14:editId="63DE7423">
@@ -761,6 +764,671 @@
         </w:drawing>
       </w:r>
     </w:p>
+    <w:p>
+      <w:r>
+        <w:br w:type="page"/>
+      </w:r>
+    </w:p>
+    <w:p>
+      <w:r>
+        <w:lastRenderedPageBreak/>
+        <w:t xml:space="preserve">Ok, mình sẽ giải thích lại </w:t>
+      </w:r>
+      <w:r>
+        <w:rPr>
+          <w:b/>
+          <w:bCs/>
+        </w:rPr>
+        <w:t>theo kiểu cực dễ hiểu, từng bước một</w:t>
+      </w:r>
+      <w:r>
+        <w:t xml:space="preserve">, đảm bảo bạn hiểu </w:t>
+      </w:r>
+      <w:r>
+        <w:rPr>
+          <w:rFonts w:ascii="Segoe UI Emoji" w:hAnsi="Segoe UI Emoji" w:cs="Segoe UI Emoji"/>
+        </w:rPr>
+        <w:t>👇</w:t>
+      </w:r>
+    </w:p>
+    <w:p>
+      <w:r>
+        <w:pict w14:anchorId="3BCC4FD2">
+          <v:rect id="_x0000_i1026" style="width:0;height:1.5pt" o:hralign="center" o:hrstd="t" o:hr="t" fillcolor="#a0a0a0" stroked="f"/>
+        </w:pict>
+      </w:r>
+    </w:p>
+    <w:p>
+      <w:pPr>
+        <w:rPr>
+          <w:b/>
+          <w:bCs/>
+        </w:rPr>
+      </w:pPr>
+      <w:r>
+        <w:rPr>
+          <w:rFonts w:ascii="Segoe UI Emoji" w:hAnsi="Segoe UI Emoji" w:cs="Segoe UI Emoji"/>
+          <w:b/>
+          <w:bCs/>
+        </w:rPr>
+        <w:t>🎯</w:t>
+      </w:r>
+      <w:r>
+        <w:rPr>
+          <w:b/>
+          <w:bCs/>
+        </w:rPr>
+        <w:t xml:space="preserve"> Bạn đang có 2 route:</w:t>
+      </w:r>
+    </w:p>
+    <w:p>
+      <w:pPr>
+        <w:rPr>
+          <w:b/>
+          <w:bCs/>
+        </w:rPr>
+      </w:pPr>
+      <w:r>
+        <w:rPr>
+          <w:b/>
+          <w:bCs/>
+        </w:rPr>
+        <w:t>1. Route Areas</w:t>
+      </w:r>
+    </w:p>
+    <w:p>
+      <w:r>
+        <w:t>{area}/{controller}/{action}</w:t>
+      </w:r>
+    </w:p>
+    <w:p>
+      <w:pPr>
+        <w:rPr>
+          <w:b/>
+          <w:bCs/>
+        </w:rPr>
+      </w:pPr>
+      <w:r>
+        <w:rPr>
+          <w:b/>
+          <w:bCs/>
+        </w:rPr>
+        <w:t>2. Route default</w:t>
+      </w:r>
+    </w:p>
+    <w:p>
+      <w:r>
+        <w:t>{controller}/{action}/{id}</w:t>
+      </w:r>
+    </w:p>
+    <w:p>
+      <w:r>
+        <w:pict w14:anchorId="281EF8D7">
+          <v:rect id="_x0000_i1027" style="width:0;height:1.5pt" o:hralign="center" o:hrstd="t" o:hr="t" fillcolor="#a0a0a0" stroked="f"/>
+        </w:pict>
+      </w:r>
+    </w:p>
+    <w:p>
+      <w:pPr>
+        <w:rPr>
+          <w:b/>
+          <w:bCs/>
+        </w:rPr>
+      </w:pPr>
+      <w:r>
+        <w:rPr>
+          <w:rFonts w:ascii="Segoe UI Emoji" w:hAnsi="Segoe UI Emoji" w:cs="Segoe UI Emoji"/>
+          <w:b/>
+          <w:bCs/>
+        </w:rPr>
+        <w:t>🧠</w:t>
+      </w:r>
+      <w:r>
+        <w:rPr>
+          <w:b/>
+          <w:bCs/>
+        </w:rPr>
+        <w:t xml:space="preserve"> Giả sử bạn vào URL này:</w:t>
+      </w:r>
+    </w:p>
+    <w:p>
+      <w:r>
+        <w:t>/Admin/Product/Index</w:t>
+      </w:r>
+    </w:p>
+    <w:p>
+      <w:r>
+        <w:pict w14:anchorId="473D29DF">
+          <v:rect id="_x0000_i1028" style="width:0;height:1.5pt" o:hralign="center" o:hrstd="t" o:hr="t" fillcolor="#a0a0a0" stroked="f"/>
+        </w:pict>
+      </w:r>
+    </w:p>
+    <w:p>
+      <w:pPr>
+        <w:rPr>
+          <w:b/>
+          <w:bCs/>
+        </w:rPr>
+      </w:pPr>
+      <w:r>
+        <w:rPr>
+          <w:rFonts w:ascii="Segoe UI Emoji" w:hAnsi="Segoe UI Emoji" w:cs="Segoe UI Emoji"/>
+          <w:b/>
+          <w:bCs/>
+        </w:rPr>
+        <w:t>🔥</w:t>
+      </w:r>
+      <w:r>
+        <w:rPr>
+          <w:b/>
+          <w:bCs/>
+        </w:rPr>
+        <w:t xml:space="preserve"> TRƯỜNG HỢP 1: Đúng (Areas đặt TRÊN)</w:t>
+      </w:r>
+    </w:p>
+    <w:p>
+      <w:r>
+        <w:t>Areas</w:t>
+      </w:r>
+      <w:r>
+        <w:br/>
+        <w:t>↓</w:t>
+      </w:r>
+      <w:r>
+        <w:br/>
+        <w:t>default</w:t>
+      </w:r>
+    </w:p>
+    <w:p>
+      <w:pPr>
+        <w:rPr>
+          <w:b/>
+          <w:bCs/>
+        </w:rPr>
+      </w:pPr>
+      <w:r>
+        <w:rPr>
+          <w:rFonts w:ascii="Segoe UI Emoji" w:hAnsi="Segoe UI Emoji" w:cs="Segoe UI Emoji"/>
+          <w:b/>
+          <w:bCs/>
+        </w:rPr>
+        <w:t>👉</w:t>
+      </w:r>
+      <w:r>
+        <w:rPr>
+          <w:b/>
+          <w:bCs/>
+        </w:rPr>
+        <w:t xml:space="preserve"> Bước 1: check route Areas</w:t>
+      </w:r>
+    </w:p>
+    <w:p>
+      <w:r>
+        <w:t>{area}/{controller}/{action}</w:t>
+      </w:r>
+    </w:p>
+    <w:p>
+      <w:r>
+        <w:t>So với URL:</w:t>
+      </w:r>
+    </w:p>
+    <w:p>
+      <w:r>
+        <w:t>Admin / Product / Index</w:t>
+      </w:r>
+    </w:p>
+    <w:p>
+      <w:r>
+        <w:rPr>
+          <w:rFonts w:ascii="Segoe UI Emoji" w:hAnsi="Segoe UI Emoji" w:cs="Segoe UI Emoji"/>
+        </w:rPr>
+        <w:t>👉</w:t>
+      </w:r>
+      <w:r>
+        <w:t xml:space="preserve"> Nó hiểu:</w:t>
+      </w:r>
+    </w:p>
+    <w:p>
+      <w:pPr>
+        <w:numPr>
+          <w:ilvl w:val="0"/>
+          <w:numId w:val="4"/>
+        </w:numPr>
+      </w:pPr>
+      <w:r>
+        <w:t xml:space="preserve">area = Admin </w:t>
+      </w:r>
+      <w:r>
+        <w:rPr>
+          <w:rFonts w:ascii="Segoe UI Emoji" w:hAnsi="Segoe UI Emoji" w:cs="Segoe UI Emoji"/>
+        </w:rPr>
+        <w:t>✅</w:t>
+      </w:r>
+      <w:r>
+        <w:t xml:space="preserve"> </w:t>
+      </w:r>
+    </w:p>
+    <w:p>
+      <w:pPr>
+        <w:numPr>
+          <w:ilvl w:val="0"/>
+          <w:numId w:val="4"/>
+        </w:numPr>
+      </w:pPr>
+      <w:r>
+        <w:t xml:space="preserve">controller = Product </w:t>
+      </w:r>
+      <w:r>
+        <w:rPr>
+          <w:rFonts w:ascii="Segoe UI Emoji" w:hAnsi="Segoe UI Emoji" w:cs="Segoe UI Emoji"/>
+        </w:rPr>
+        <w:t>✅</w:t>
+      </w:r>
+      <w:r>
+        <w:t xml:space="preserve"> </w:t>
+      </w:r>
+    </w:p>
+    <w:p>
+      <w:pPr>
+        <w:numPr>
+          <w:ilvl w:val="0"/>
+          <w:numId w:val="4"/>
+        </w:numPr>
+      </w:pPr>
+      <w:r>
+        <w:t xml:space="preserve">action = Index </w:t>
+      </w:r>
+      <w:r>
+        <w:rPr>
+          <w:rFonts w:ascii="Segoe UI Emoji" w:hAnsi="Segoe UI Emoji" w:cs="Segoe UI Emoji"/>
+        </w:rPr>
+        <w:t>✅</w:t>
+      </w:r>
+      <w:r>
+        <w:t xml:space="preserve"> </w:t>
+      </w:r>
+    </w:p>
+    <w:p>
+      <w:r>
+        <w:rPr>
+          <w:rFonts w:ascii="Segoe UI Emoji" w:hAnsi="Segoe UI Emoji" w:cs="Segoe UI Emoji"/>
+        </w:rPr>
+        <w:t>➡️</w:t>
+      </w:r>
+      <w:r>
+        <w:t xml:space="preserve"> </w:t>
+      </w:r>
+      <w:r>
+        <w:rPr>
+          <w:b/>
+          <w:bCs/>
+        </w:rPr>
+        <w:t>KHỚP → chạy luôn (đúng)</w:t>
+      </w:r>
+    </w:p>
+    <w:p>
+      <w:r>
+        <w:pict w14:anchorId="107C1AB8">
+          <v:rect id="_x0000_i1029" style="width:0;height:1.5pt" o:hralign="center" o:hrstd="t" o:hr="t" fillcolor="#a0a0a0" stroked="f"/>
+        </w:pict>
+      </w:r>
+    </w:p>
+    <w:p>
+      <w:pPr>
+        <w:rPr>
+          <w:b/>
+          <w:bCs/>
+        </w:rPr>
+      </w:pPr>
+      <w:r>
+        <w:rPr>
+          <w:rFonts w:ascii="Segoe UI Emoji" w:hAnsi="Segoe UI Emoji" w:cs="Segoe UI Emoji"/>
+          <w:b/>
+          <w:bCs/>
+        </w:rPr>
+        <w:t>❌</w:t>
+      </w:r>
+      <w:r>
+        <w:rPr>
+          <w:b/>
+          <w:bCs/>
+        </w:rPr>
+        <w:t xml:space="preserve"> TRƯỜNG HỢP 2: Sai (default đặt TRÊN)</w:t>
+      </w:r>
+    </w:p>
+    <w:p>
+      <w:r>
+        <w:lastRenderedPageBreak/>
+        <w:t>default</w:t>
+      </w:r>
+      <w:r>
+        <w:br/>
+        <w:t>↓</w:t>
+      </w:r>
+      <w:r>
+        <w:br/>
+        <w:t>Areas</w:t>
+      </w:r>
+    </w:p>
+    <w:p>
+      <w:r>
+        <w:pict w14:anchorId="0419BBFF">
+          <v:rect id="_x0000_i1030" style="width:0;height:1.5pt" o:hralign="center" o:hrstd="t" o:hr="t" fillcolor="#a0a0a0" stroked="f"/>
+        </w:pict>
+      </w:r>
+    </w:p>
+    <w:p>
+      <w:pPr>
+        <w:rPr>
+          <w:b/>
+          <w:bCs/>
+        </w:rPr>
+      </w:pPr>
+      <w:r>
+        <w:rPr>
+          <w:rFonts w:ascii="Segoe UI Emoji" w:hAnsi="Segoe UI Emoji" w:cs="Segoe UI Emoji"/>
+          <w:b/>
+          <w:bCs/>
+        </w:rPr>
+        <w:t>👉</w:t>
+      </w:r>
+      <w:r>
+        <w:rPr>
+          <w:b/>
+          <w:bCs/>
+        </w:rPr>
+        <w:t xml:space="preserve"> Bước 1: check route default trước</w:t>
+      </w:r>
+    </w:p>
+    <w:p>
+      <w:r>
+        <w:t>{controller}/{action}/{id}</w:t>
+      </w:r>
+    </w:p>
+    <w:p>
+      <w:r>
+        <w:t>So với URL:</w:t>
+      </w:r>
+    </w:p>
+    <w:p>
+      <w:r>
+        <w:t>Admin / Product / Index</w:t>
+      </w:r>
+    </w:p>
+    <w:p>
+      <w:r>
+        <w:rPr>
+          <w:rFonts w:ascii="Segoe UI Emoji" w:hAnsi="Segoe UI Emoji" w:cs="Segoe UI Emoji"/>
+        </w:rPr>
+        <w:t>👉</w:t>
+      </w:r>
+      <w:r>
+        <w:t xml:space="preserve"> Nó hiểu:</w:t>
+      </w:r>
+    </w:p>
+    <w:p>
+      <w:pPr>
+        <w:numPr>
+          <w:ilvl w:val="0"/>
+          <w:numId w:val="5"/>
+        </w:numPr>
+      </w:pPr>
+      <w:r>
+        <w:t xml:space="preserve">controller = Admin </w:t>
+      </w:r>
+      <w:r>
+        <w:rPr>
+          <w:rFonts w:ascii="Segoe UI Emoji" w:hAnsi="Segoe UI Emoji" w:cs="Segoe UI Emoji"/>
+        </w:rPr>
+        <w:t>⚠️</w:t>
+      </w:r>
+      <w:r>
+        <w:t xml:space="preserve"> </w:t>
+      </w:r>
+    </w:p>
+    <w:p>
+      <w:pPr>
+        <w:numPr>
+          <w:ilvl w:val="0"/>
+          <w:numId w:val="5"/>
+        </w:numPr>
+      </w:pPr>
+      <w:r>
+        <w:t xml:space="preserve">action = Product </w:t>
+      </w:r>
+      <w:r>
+        <w:rPr>
+          <w:rFonts w:ascii="Segoe UI Emoji" w:hAnsi="Segoe UI Emoji" w:cs="Segoe UI Emoji"/>
+        </w:rPr>
+        <w:t>⚠️</w:t>
+      </w:r>
+      <w:r>
+        <w:t xml:space="preserve"> </w:t>
+      </w:r>
+    </w:p>
+    <w:p>
+      <w:pPr>
+        <w:numPr>
+          <w:ilvl w:val="0"/>
+          <w:numId w:val="5"/>
+        </w:numPr>
+      </w:pPr>
+      <w:r>
+        <w:t xml:space="preserve">id = Index </w:t>
+      </w:r>
+      <w:r>
+        <w:rPr>
+          <w:rFonts w:ascii="Segoe UI Emoji" w:hAnsi="Segoe UI Emoji" w:cs="Segoe UI Emoji"/>
+        </w:rPr>
+        <w:t>⚠️</w:t>
+      </w:r>
+      <w:r>
+        <w:t xml:space="preserve"> </w:t>
+      </w:r>
+    </w:p>
+    <w:p>
+      <w:r>
+        <w:rPr>
+          <w:rFonts w:ascii="Segoe UI Emoji" w:hAnsi="Segoe UI Emoji" w:cs="Segoe UI Emoji"/>
+        </w:rPr>
+        <w:t>👉</w:t>
+      </w:r>
+      <w:r>
+        <w:t xml:space="preserve"> </w:t>
+      </w:r>
+      <w:r>
+        <w:rPr>
+          <w:rFonts w:ascii="Segoe UI Emoji" w:hAnsi="Segoe UI Emoji" w:cs="Segoe UI Emoji"/>
+        </w:rPr>
+        <w:t>❗</w:t>
+      </w:r>
+      <w:r>
+        <w:t xml:space="preserve"> Bạn thấy không:</w:t>
+      </w:r>
+    </w:p>
+    <w:p>
+      <w:pPr>
+        <w:numPr>
+          <w:ilvl w:val="0"/>
+          <w:numId w:val="6"/>
+        </w:numPr>
+      </w:pPr>
+      <w:r>
+        <w:t xml:space="preserve">Nó </w:t>
+      </w:r>
+      <w:r>
+        <w:rPr>
+          <w:b/>
+          <w:bCs/>
+        </w:rPr>
+        <w:t>vẫn khớp format</w:t>
+      </w:r>
+      <w:r>
+        <w:t xml:space="preserve"> (3 phần) </w:t>
+      </w:r>
+    </w:p>
+    <w:p>
+      <w:pPr>
+        <w:numPr>
+          <w:ilvl w:val="0"/>
+          <w:numId w:val="6"/>
+        </w:numPr>
+      </w:pPr>
+      <w:r>
+        <w:t xml:space="preserve">Nên nó nghĩ: "OK hợp lệ rồi" </w:t>
+      </w:r>
+    </w:p>
+    <w:p>
+      <w:r>
+        <w:rPr>
+          <w:rFonts w:ascii="Segoe UI Emoji" w:hAnsi="Segoe UI Emoji" w:cs="Segoe UI Emoji"/>
+        </w:rPr>
+        <w:t>➡️</w:t>
+      </w:r>
+      <w:r>
+        <w:t xml:space="preserve"> </w:t>
+      </w:r>
+      <w:r>
+        <w:rPr>
+          <w:b/>
+          <w:bCs/>
+        </w:rPr>
+        <w:t>DÙNG LUÔN</w:t>
+      </w:r>
+      <w:r>
+        <w:br/>
+      </w:r>
+      <w:r>
+        <w:rPr>
+          <w:rFonts w:ascii="Segoe UI Emoji" w:hAnsi="Segoe UI Emoji" w:cs="Segoe UI Emoji"/>
+        </w:rPr>
+        <w:t>➡️</w:t>
+      </w:r>
+      <w:r>
+        <w:t xml:space="preserve"> KHÔNG xuống route Areas nữa</w:t>
+      </w:r>
+    </w:p>
+    <w:p>
+      <w:r>
+        <w:pict w14:anchorId="6A4DCD1F">
+          <v:rect id="_x0000_i1031" style="width:0;height:1.5pt" o:hralign="center" o:hrstd="t" o:hr="t" fillcolor="#a0a0a0" stroked="f"/>
+        </w:pict>
+      </w:r>
+    </w:p>
+    <w:p>
+      <w:pPr>
+        <w:rPr>
+          <w:b/>
+          <w:bCs/>
+        </w:rPr>
+      </w:pPr>
+      <w:r>
+        <w:rPr>
+          <w:rFonts w:ascii="Segoe UI Emoji" w:hAnsi="Segoe UI Emoji" w:cs="Segoe UI Emoji"/>
+          <w:b/>
+          <w:bCs/>
+        </w:rPr>
+        <w:t>❗</w:t>
+      </w:r>
+      <w:r>
+        <w:rPr>
+          <w:b/>
+          <w:bCs/>
+        </w:rPr>
+        <w:t xml:space="preserve"> Vấn đề ở đây</w:t>
+      </w:r>
+    </w:p>
+    <w:p>
+      <w:r>
+        <w:rPr>
+          <w:rFonts w:ascii="Segoe UI Emoji" w:hAnsi="Segoe UI Emoji" w:cs="Segoe UI Emoji"/>
+        </w:rPr>
+        <w:t>👉</w:t>
+      </w:r>
+      <w:r>
+        <w:t xml:space="preserve"> Default route </w:t>
+      </w:r>
+      <w:r>
+        <w:rPr>
+          <w:b/>
+          <w:bCs/>
+        </w:rPr>
+        <w:t>quá dễ tính</w:t>
+      </w:r>
+    </w:p>
+    <w:p>
+      <w:pPr>
+        <w:numPr>
+          <w:ilvl w:val="0"/>
+          <w:numId w:val="7"/>
+        </w:numPr>
+      </w:pPr>
+      <w:r>
+        <w:t>Thấy 3 phần là nhận đại:</w:t>
+      </w:r>
+    </w:p>
+    <w:p>
+      <w:r>
+        <w:t>gì / gì / gì cũng được</w:t>
+      </w:r>
+    </w:p>
+    <w:p>
+      <w:r>
+        <w:rPr>
+          <w:rFonts w:ascii="Segoe UI Emoji" w:hAnsi="Segoe UI Emoji" w:cs="Segoe UI Emoji"/>
+        </w:rPr>
+        <w:t>👉</w:t>
+      </w:r>
+      <w:r>
+        <w:t xml:space="preserve"> Nên nó “cướp” luôn URL của Areas</w:t>
+      </w:r>
+    </w:p>
+    <w:p>
+      <w:r>
+        <w:br w:type="page"/>
+      </w:r>
+    </w:p>
+    <w:p>
+      <w:r>
+        <w:lastRenderedPageBreak/>
+        <w:drawing>
+          <wp:inline distT="0" distB="0" distL="0" distR="0" wp14:anchorId="044DA109" wp14:editId="533CACD5">
+            <wp:extent cx="5943600" cy="3249930"/>
+            <wp:effectExtent l="0" t="0" r="0" b="7620"/>
+            <wp:docPr id="463413374" name="Picture 1"/>
+            <wp:cNvGraphicFramePr>
+              <a:graphicFrameLocks xmlns:a="http://schemas.openxmlformats.org/drawingml/2006/main" noChangeAspect="1"/>
+            </wp:cNvGraphicFramePr>
+            <a:graphic xmlns:a="http://schemas.openxmlformats.org/drawingml/2006/main">
+              <a:graphicData uri="http://schemas.openxmlformats.org/drawingml/2006/picture">
+                <pic:pic xmlns:pic="http://schemas.openxmlformats.org/drawingml/2006/picture">
+                  <pic:nvPicPr>
+                    <pic:cNvPr id="463413374" name=""/>
+                    <pic:cNvPicPr/>
+                  </pic:nvPicPr>
+                  <pic:blipFill>
+                    <a:blip r:embed="rId13"/>
+                    <a:stretch>
+                      <a:fillRect/>
+                    </a:stretch>
+                  </pic:blipFill>
+                  <pic:spPr>
+                    <a:xfrm>
+                      <a:off x="0" y="0"/>
+                      <a:ext cx="5943600" cy="3249930"/>
+                    </a:xfrm>
+                    <a:prstGeom prst="rect">
+                      <a:avLst/>
+                    </a:prstGeom>
+                  </pic:spPr>
+                </pic:pic>
+              </a:graphicData>
+            </a:graphic>
+          </wp:inline>
+        </w:drawing>
+      </w:r>
+    </w:p>
+    <w:p/>
     <w:sectPr>
       <w:pgSz w:w="12240" w:h="15840"/>
       <w:pgMar w:top="1440" w:right="1440" w:bottom="1440" w:left="1440" w:header="720" w:footer="720" w:gutter="0"/>
@@ -1037,6 +1705,453 @@
     </w:lvl>
   </w:abstractNum>
   <w:abstractNum w:abstractNumId="2" w15:restartNumberingAfterBreak="0">
+    <w:nsid w:val="4CD438BD"/>
+    <w:multiLevelType w:val="multilevel"/>
+    <w:tmpl w:val="DC3C93C8"/>
+    <w:lvl w:ilvl="0">
+      <w:start w:val="1"/>
+      <w:numFmt w:val="bullet"/>
+      <w:lvlText w:val=""/>
+      <w:lvlJc w:val="left"/>
+      <w:pPr>
+        <w:tabs>
+          <w:tab w:val="num" w:pos="720"/>
+        </w:tabs>
+        <w:ind w:left="720" w:hanging="360"/>
+      </w:pPr>
+      <w:rPr>
+        <w:rFonts w:ascii="Symbol" w:hAnsi="Symbol" w:hint="default"/>
+        <w:sz w:val="20"/>
+      </w:rPr>
+    </w:lvl>
+    <w:lvl w:ilvl="1" w:tentative="1">
+      <w:start w:val="1"/>
+      <w:numFmt w:val="bullet"/>
+      <w:lvlText w:val="o"/>
+      <w:lvlJc w:val="left"/>
+      <w:pPr>
+        <w:tabs>
+          <w:tab w:val="num" w:pos="1440"/>
+        </w:tabs>
+        <w:ind w:left="1440" w:hanging="360"/>
+      </w:pPr>
+      <w:rPr>
+        <w:rFonts w:ascii="Courier New" w:hAnsi="Courier New" w:hint="default"/>
+        <w:sz w:val="20"/>
+      </w:rPr>
+    </w:lvl>
+    <w:lvl w:ilvl="2" w:tentative="1">
+      <w:start w:val="1"/>
+      <w:numFmt w:val="bullet"/>
+      <w:lvlText w:val=""/>
+      <w:lvlJc w:val="left"/>
+      <w:pPr>
+        <w:tabs>
+          <w:tab w:val="num" w:pos="2160"/>
+        </w:tabs>
+        <w:ind w:left="2160" w:hanging="360"/>
+      </w:pPr>
+      <w:rPr>
+        <w:rFonts w:ascii="Wingdings" w:hAnsi="Wingdings" w:hint="default"/>
+        <w:sz w:val="20"/>
+      </w:rPr>
+    </w:lvl>
+    <w:lvl w:ilvl="3" w:tentative="1">
+      <w:start w:val="1"/>
+      <w:numFmt w:val="bullet"/>
+      <w:lvlText w:val=""/>
+      <w:lvlJc w:val="left"/>
+      <w:pPr>
+        <w:tabs>
+          <w:tab w:val="num" w:pos="2880"/>
+        </w:tabs>
+        <w:ind w:left="2880" w:hanging="360"/>
+      </w:pPr>
+      <w:rPr>
+        <w:rFonts w:ascii="Wingdings" w:hAnsi="Wingdings" w:hint="default"/>
+        <w:sz w:val="20"/>
+      </w:rPr>
+    </w:lvl>
+    <w:lvl w:ilvl="4" w:tentative="1">
+      <w:start w:val="1"/>
+      <w:numFmt w:val="bullet"/>
+      <w:lvlText w:val=""/>
+      <w:lvlJc w:val="left"/>
+      <w:pPr>
+        <w:tabs>
+          <w:tab w:val="num" w:pos="3600"/>
+        </w:tabs>
+        <w:ind w:left="3600" w:hanging="360"/>
+      </w:pPr>
+      <w:rPr>
+        <w:rFonts w:ascii="Wingdings" w:hAnsi="Wingdings" w:hint="default"/>
+        <w:sz w:val="20"/>
+      </w:rPr>
+    </w:lvl>
+    <w:lvl w:ilvl="5" w:tentative="1">
+      <w:start w:val="1"/>
+      <w:numFmt w:val="bullet"/>
+      <w:lvlText w:val=""/>
+      <w:lvlJc w:val="left"/>
+      <w:pPr>
+        <w:tabs>
+          <w:tab w:val="num" w:pos="4320"/>
+        </w:tabs>
+        <w:ind w:left="4320" w:hanging="360"/>
+      </w:pPr>
+      <w:rPr>
+        <w:rFonts w:ascii="Wingdings" w:hAnsi="Wingdings" w:hint="default"/>
+        <w:sz w:val="20"/>
+      </w:rPr>
+    </w:lvl>
+    <w:lvl w:ilvl="6" w:tentative="1">
+      <w:start w:val="1"/>
+      <w:numFmt w:val="bullet"/>
+      <w:lvlText w:val=""/>
+      <w:lvlJc w:val="left"/>
+      <w:pPr>
+        <w:tabs>
+          <w:tab w:val="num" w:pos="5040"/>
+        </w:tabs>
+        <w:ind w:left="5040" w:hanging="360"/>
+      </w:pPr>
+      <w:rPr>
+        <w:rFonts w:ascii="Wingdings" w:hAnsi="Wingdings" w:hint="default"/>
+        <w:sz w:val="20"/>
+      </w:rPr>
+    </w:lvl>
+    <w:lvl w:ilvl="7" w:tentative="1">
+      <w:start w:val="1"/>
+      <w:numFmt w:val="bullet"/>
+      <w:lvlText w:val=""/>
+      <w:lvlJc w:val="left"/>
+      <w:pPr>
+        <w:tabs>
+          <w:tab w:val="num" w:pos="5760"/>
+        </w:tabs>
+        <w:ind w:left="5760" w:hanging="360"/>
+      </w:pPr>
+      <w:rPr>
+        <w:rFonts w:ascii="Wingdings" w:hAnsi="Wingdings" w:hint="default"/>
+        <w:sz w:val="20"/>
+      </w:rPr>
+    </w:lvl>
+    <w:lvl w:ilvl="8" w:tentative="1">
+      <w:start w:val="1"/>
+      <w:numFmt w:val="bullet"/>
+      <w:lvlText w:val=""/>
+      <w:lvlJc w:val="left"/>
+      <w:pPr>
+        <w:tabs>
+          <w:tab w:val="num" w:pos="6480"/>
+        </w:tabs>
+        <w:ind w:left="6480" w:hanging="360"/>
+      </w:pPr>
+      <w:rPr>
+        <w:rFonts w:ascii="Wingdings" w:hAnsi="Wingdings" w:hint="default"/>
+        <w:sz w:val="20"/>
+      </w:rPr>
+    </w:lvl>
+  </w:abstractNum>
+  <w:abstractNum w:abstractNumId="3" w15:restartNumberingAfterBreak="0">
+    <w:nsid w:val="5EBC1FBA"/>
+    <w:multiLevelType w:val="multilevel"/>
+    <w:tmpl w:val="D8C46B14"/>
+    <w:lvl w:ilvl="0">
+      <w:start w:val="1"/>
+      <w:numFmt w:val="bullet"/>
+      <w:lvlText w:val=""/>
+      <w:lvlJc w:val="left"/>
+      <w:pPr>
+        <w:tabs>
+          <w:tab w:val="num" w:pos="720"/>
+        </w:tabs>
+        <w:ind w:left="720" w:hanging="360"/>
+      </w:pPr>
+      <w:rPr>
+        <w:rFonts w:ascii="Symbol" w:hAnsi="Symbol" w:hint="default"/>
+        <w:sz w:val="20"/>
+      </w:rPr>
+    </w:lvl>
+    <w:lvl w:ilvl="1" w:tentative="1">
+      <w:start w:val="1"/>
+      <w:numFmt w:val="bullet"/>
+      <w:lvlText w:val="o"/>
+      <w:lvlJc w:val="left"/>
+      <w:pPr>
+        <w:tabs>
+          <w:tab w:val="num" w:pos="1440"/>
+        </w:tabs>
+        <w:ind w:left="1440" w:hanging="360"/>
+      </w:pPr>
+      <w:rPr>
+        <w:rFonts w:ascii="Courier New" w:hAnsi="Courier New" w:hint="default"/>
+        <w:sz w:val="20"/>
+      </w:rPr>
+    </w:lvl>
+    <w:lvl w:ilvl="2" w:tentative="1">
+      <w:start w:val="1"/>
+      <w:numFmt w:val="bullet"/>
+      <w:lvlText w:val=""/>
+      <w:lvlJc w:val="left"/>
+      <w:pPr>
+        <w:tabs>
+          <w:tab w:val="num" w:pos="2160"/>
+        </w:tabs>
+        <w:ind w:left="2160" w:hanging="360"/>
+      </w:pPr>
+      <w:rPr>
+        <w:rFonts w:ascii="Wingdings" w:hAnsi="Wingdings" w:hint="default"/>
+        <w:sz w:val="20"/>
+      </w:rPr>
+    </w:lvl>
+    <w:lvl w:ilvl="3" w:tentative="1">
+      <w:start w:val="1"/>
+      <w:numFmt w:val="bullet"/>
+      <w:lvlText w:val=""/>
+      <w:lvlJc w:val="left"/>
+      <w:pPr>
+        <w:tabs>
+          <w:tab w:val="num" w:pos="2880"/>
+        </w:tabs>
+        <w:ind w:left="2880" w:hanging="360"/>
+      </w:pPr>
+      <w:rPr>
+        <w:rFonts w:ascii="Wingdings" w:hAnsi="Wingdings" w:hint="default"/>
+        <w:sz w:val="20"/>
+      </w:rPr>
+    </w:lvl>
+    <w:lvl w:ilvl="4" w:tentative="1">
+      <w:start w:val="1"/>
+      <w:numFmt w:val="bullet"/>
+      <w:lvlText w:val=""/>
+      <w:lvlJc w:val="left"/>
+      <w:pPr>
+        <w:tabs>
+          <w:tab w:val="num" w:pos="3600"/>
+        </w:tabs>
+        <w:ind w:left="3600" w:hanging="360"/>
+      </w:pPr>
+      <w:rPr>
+        <w:rFonts w:ascii="Wingdings" w:hAnsi="Wingdings" w:hint="default"/>
+        <w:sz w:val="20"/>
+      </w:rPr>
+    </w:lvl>
+    <w:lvl w:ilvl="5" w:tentative="1">
+      <w:start w:val="1"/>
+      <w:numFmt w:val="bullet"/>
+      <w:lvlText w:val=""/>
+      <w:lvlJc w:val="left"/>
+      <w:pPr>
+        <w:tabs>
+          <w:tab w:val="num" w:pos="4320"/>
+        </w:tabs>
+        <w:ind w:left="4320" w:hanging="360"/>
+      </w:pPr>
+      <w:rPr>
+        <w:rFonts w:ascii="Wingdings" w:hAnsi="Wingdings" w:hint="default"/>
+        <w:sz w:val="20"/>
+      </w:rPr>
+    </w:lvl>
+    <w:lvl w:ilvl="6" w:tentative="1">
+      <w:start w:val="1"/>
+      <w:numFmt w:val="bullet"/>
+      <w:lvlText w:val=""/>
+      <w:lvlJc w:val="left"/>
+      <w:pPr>
+        <w:tabs>
+          <w:tab w:val="num" w:pos="5040"/>
+        </w:tabs>
+        <w:ind w:left="5040" w:hanging="360"/>
+      </w:pPr>
+      <w:rPr>
+        <w:rFonts w:ascii="Wingdings" w:hAnsi="Wingdings" w:hint="default"/>
+        <w:sz w:val="20"/>
+      </w:rPr>
+    </w:lvl>
+    <w:lvl w:ilvl="7" w:tentative="1">
+      <w:start w:val="1"/>
+      <w:numFmt w:val="bullet"/>
+      <w:lvlText w:val=""/>
+      <w:lvlJc w:val="left"/>
+      <w:pPr>
+        <w:tabs>
+          <w:tab w:val="num" w:pos="5760"/>
+        </w:tabs>
+        <w:ind w:left="5760" w:hanging="360"/>
+      </w:pPr>
+      <w:rPr>
+        <w:rFonts w:ascii="Wingdings" w:hAnsi="Wingdings" w:hint="default"/>
+        <w:sz w:val="20"/>
+      </w:rPr>
+    </w:lvl>
+    <w:lvl w:ilvl="8" w:tentative="1">
+      <w:start w:val="1"/>
+      <w:numFmt w:val="bullet"/>
+      <w:lvlText w:val=""/>
+      <w:lvlJc w:val="left"/>
+      <w:pPr>
+        <w:tabs>
+          <w:tab w:val="num" w:pos="6480"/>
+        </w:tabs>
+        <w:ind w:left="6480" w:hanging="360"/>
+      </w:pPr>
+      <w:rPr>
+        <w:rFonts w:ascii="Wingdings" w:hAnsi="Wingdings" w:hint="default"/>
+        <w:sz w:val="20"/>
+      </w:rPr>
+    </w:lvl>
+  </w:abstractNum>
+  <w:abstractNum w:abstractNumId="4" w15:restartNumberingAfterBreak="0">
+    <w:nsid w:val="68194282"/>
+    <w:multiLevelType w:val="multilevel"/>
+    <w:tmpl w:val="8042E988"/>
+    <w:lvl w:ilvl="0">
+      <w:start w:val="1"/>
+      <w:numFmt w:val="bullet"/>
+      <w:lvlText w:val=""/>
+      <w:lvlJc w:val="left"/>
+      <w:pPr>
+        <w:tabs>
+          <w:tab w:val="num" w:pos="720"/>
+        </w:tabs>
+        <w:ind w:left="720" w:hanging="360"/>
+      </w:pPr>
+      <w:rPr>
+        <w:rFonts w:ascii="Symbol" w:hAnsi="Symbol" w:hint="default"/>
+        <w:sz w:val="20"/>
+      </w:rPr>
+    </w:lvl>
+    <w:lvl w:ilvl="1" w:tentative="1">
+      <w:start w:val="1"/>
+      <w:numFmt w:val="bullet"/>
+      <w:lvlText w:val="o"/>
+      <w:lvlJc w:val="left"/>
+      <w:pPr>
+        <w:tabs>
+          <w:tab w:val="num" w:pos="1440"/>
+        </w:tabs>
+        <w:ind w:left="1440" w:hanging="360"/>
+      </w:pPr>
+      <w:rPr>
+        <w:rFonts w:ascii="Courier New" w:hAnsi="Courier New" w:hint="default"/>
+        <w:sz w:val="20"/>
+      </w:rPr>
+    </w:lvl>
+    <w:lvl w:ilvl="2" w:tentative="1">
+      <w:start w:val="1"/>
+      <w:numFmt w:val="bullet"/>
+      <w:lvlText w:val=""/>
+      <w:lvlJc w:val="left"/>
+      <w:pPr>
+        <w:tabs>
+          <w:tab w:val="num" w:pos="2160"/>
+        </w:tabs>
+        <w:ind w:left="2160" w:hanging="360"/>
+      </w:pPr>
+      <w:rPr>
+        <w:rFonts w:ascii="Wingdings" w:hAnsi="Wingdings" w:hint="default"/>
+        <w:sz w:val="20"/>
+      </w:rPr>
+    </w:lvl>
+    <w:lvl w:ilvl="3" w:tentative="1">
+      <w:start w:val="1"/>
+      <w:numFmt w:val="bullet"/>
+      <w:lvlText w:val=""/>
+      <w:lvlJc w:val="left"/>
+      <w:pPr>
+        <w:tabs>
+          <w:tab w:val="num" w:pos="2880"/>
+        </w:tabs>
+        <w:ind w:left="2880" w:hanging="360"/>
+      </w:pPr>
+      <w:rPr>
+        <w:rFonts w:ascii="Wingdings" w:hAnsi="Wingdings" w:hint="default"/>
+        <w:sz w:val="20"/>
+      </w:rPr>
+    </w:lvl>
+    <w:lvl w:ilvl="4" w:tentative="1">
+      <w:start w:val="1"/>
+      <w:numFmt w:val="bullet"/>
+      <w:lvlText w:val=""/>
+      <w:lvlJc w:val="left"/>
+      <w:pPr>
+        <w:tabs>
+          <w:tab w:val="num" w:pos="3600"/>
+        </w:tabs>
+        <w:ind w:left="3600" w:hanging="360"/>
+      </w:pPr>
+      <w:rPr>
+        <w:rFonts w:ascii="Wingdings" w:hAnsi="Wingdings" w:hint="default"/>
+        <w:sz w:val="20"/>
+      </w:rPr>
+    </w:lvl>
+    <w:lvl w:ilvl="5" w:tentative="1">
+      <w:start w:val="1"/>
+      <w:numFmt w:val="bullet"/>
+      <w:lvlText w:val=""/>
+      <w:lvlJc w:val="left"/>
+      <w:pPr>
+        <w:tabs>
+          <w:tab w:val="num" w:pos="4320"/>
+        </w:tabs>
+        <w:ind w:left="4320" w:hanging="360"/>
+      </w:pPr>
+      <w:rPr>
+        <w:rFonts w:ascii="Wingdings" w:hAnsi="Wingdings" w:hint="default"/>
+        <w:sz w:val="20"/>
+      </w:rPr>
+    </w:lvl>
+    <w:lvl w:ilvl="6" w:tentative="1">
+      <w:start w:val="1"/>
+      <w:numFmt w:val="bullet"/>
+      <w:lvlText w:val=""/>
+      <w:lvlJc w:val="left"/>
+      <w:pPr>
+        <w:tabs>
+          <w:tab w:val="num" w:pos="5040"/>
+        </w:tabs>
+        <w:ind w:left="5040" w:hanging="360"/>
+      </w:pPr>
+      <w:rPr>
+        <w:rFonts w:ascii="Wingdings" w:hAnsi="Wingdings" w:hint="default"/>
+        <w:sz w:val="20"/>
+      </w:rPr>
+    </w:lvl>
+    <w:lvl w:ilvl="7" w:tentative="1">
+      <w:start w:val="1"/>
+      <w:numFmt w:val="bullet"/>
+      <w:lvlText w:val=""/>
+      <w:lvlJc w:val="left"/>
+      <w:pPr>
+        <w:tabs>
+          <w:tab w:val="num" w:pos="5760"/>
+        </w:tabs>
+        <w:ind w:left="5760" w:hanging="360"/>
+      </w:pPr>
+      <w:rPr>
+        <w:rFonts w:ascii="Wingdings" w:hAnsi="Wingdings" w:hint="default"/>
+        <w:sz w:val="20"/>
+      </w:rPr>
+    </w:lvl>
+    <w:lvl w:ilvl="8" w:tentative="1">
+      <w:start w:val="1"/>
+      <w:numFmt w:val="bullet"/>
+      <w:lvlText w:val=""/>
+      <w:lvlJc w:val="left"/>
+      <w:pPr>
+        <w:tabs>
+          <w:tab w:val="num" w:pos="6480"/>
+        </w:tabs>
+        <w:ind w:left="6480" w:hanging="360"/>
+      </w:pPr>
+      <w:rPr>
+        <w:rFonts w:ascii="Wingdings" w:hAnsi="Wingdings" w:hint="default"/>
+        <w:sz w:val="20"/>
+      </w:rPr>
+    </w:lvl>
+  </w:abstractNum>
+  <w:abstractNum w:abstractNumId="5" w15:restartNumberingAfterBreak="0">
     <w:nsid w:val="73B52B43"/>
     <w:multiLevelType w:val="multilevel"/>
     <w:tmpl w:val="59884D7E"/>
@@ -1153,14 +2268,175 @@
       </w:rPr>
     </w:lvl>
   </w:abstractNum>
+  <w:abstractNum w:abstractNumId="6" w15:restartNumberingAfterBreak="0">
+    <w:nsid w:val="763E0766"/>
+    <w:multiLevelType w:val="multilevel"/>
+    <w:tmpl w:val="2BD6197E"/>
+    <w:lvl w:ilvl="0">
+      <w:start w:val="1"/>
+      <w:numFmt w:val="bullet"/>
+      <w:lvlText w:val=""/>
+      <w:lvlJc w:val="left"/>
+      <w:pPr>
+        <w:tabs>
+          <w:tab w:val="num" w:pos="720"/>
+        </w:tabs>
+        <w:ind w:left="720" w:hanging="360"/>
+      </w:pPr>
+      <w:rPr>
+        <w:rFonts w:ascii="Symbol" w:hAnsi="Symbol" w:hint="default"/>
+        <w:sz w:val="20"/>
+      </w:rPr>
+    </w:lvl>
+    <w:lvl w:ilvl="1" w:tentative="1">
+      <w:start w:val="1"/>
+      <w:numFmt w:val="bullet"/>
+      <w:lvlText w:val="o"/>
+      <w:lvlJc w:val="left"/>
+      <w:pPr>
+        <w:tabs>
+          <w:tab w:val="num" w:pos="1440"/>
+        </w:tabs>
+        <w:ind w:left="1440" w:hanging="360"/>
+      </w:pPr>
+      <w:rPr>
+        <w:rFonts w:ascii="Courier New" w:hAnsi="Courier New" w:hint="default"/>
+        <w:sz w:val="20"/>
+      </w:rPr>
+    </w:lvl>
+    <w:lvl w:ilvl="2" w:tentative="1">
+      <w:start w:val="1"/>
+      <w:numFmt w:val="bullet"/>
+      <w:lvlText w:val=""/>
+      <w:lvlJc w:val="left"/>
+      <w:pPr>
+        <w:tabs>
+          <w:tab w:val="num" w:pos="2160"/>
+        </w:tabs>
+        <w:ind w:left="2160" w:hanging="360"/>
+      </w:pPr>
+      <w:rPr>
+        <w:rFonts w:ascii="Wingdings" w:hAnsi="Wingdings" w:hint="default"/>
+        <w:sz w:val="20"/>
+      </w:rPr>
+    </w:lvl>
+    <w:lvl w:ilvl="3" w:tentative="1">
+      <w:start w:val="1"/>
+      <w:numFmt w:val="bullet"/>
+      <w:lvlText w:val=""/>
+      <w:lvlJc w:val="left"/>
+      <w:pPr>
+        <w:tabs>
+          <w:tab w:val="num" w:pos="2880"/>
+        </w:tabs>
+        <w:ind w:left="2880" w:hanging="360"/>
+      </w:pPr>
+      <w:rPr>
+        <w:rFonts w:ascii="Wingdings" w:hAnsi="Wingdings" w:hint="default"/>
+        <w:sz w:val="20"/>
+      </w:rPr>
+    </w:lvl>
+    <w:lvl w:ilvl="4" w:tentative="1">
+      <w:start w:val="1"/>
+      <w:numFmt w:val="bullet"/>
+      <w:lvlText w:val=""/>
+      <w:lvlJc w:val="left"/>
+      <w:pPr>
+        <w:tabs>
+          <w:tab w:val="num" w:pos="3600"/>
+        </w:tabs>
+        <w:ind w:left="3600" w:hanging="360"/>
+      </w:pPr>
+      <w:rPr>
+        <w:rFonts w:ascii="Wingdings" w:hAnsi="Wingdings" w:hint="default"/>
+        <w:sz w:val="20"/>
+      </w:rPr>
+    </w:lvl>
+    <w:lvl w:ilvl="5" w:tentative="1">
+      <w:start w:val="1"/>
+      <w:numFmt w:val="bullet"/>
+      <w:lvlText w:val=""/>
+      <w:lvlJc w:val="left"/>
+      <w:pPr>
+        <w:tabs>
+          <w:tab w:val="num" w:pos="4320"/>
+        </w:tabs>
+        <w:ind w:left="4320" w:hanging="360"/>
+      </w:pPr>
+      <w:rPr>
+        <w:rFonts w:ascii="Wingdings" w:hAnsi="Wingdings" w:hint="default"/>
+        <w:sz w:val="20"/>
+      </w:rPr>
+    </w:lvl>
+    <w:lvl w:ilvl="6" w:tentative="1">
+      <w:start w:val="1"/>
+      <w:numFmt w:val="bullet"/>
+      <w:lvlText w:val=""/>
+      <w:lvlJc w:val="left"/>
+      <w:pPr>
+        <w:tabs>
+          <w:tab w:val="num" w:pos="5040"/>
+        </w:tabs>
+        <w:ind w:left="5040" w:hanging="360"/>
+      </w:pPr>
+      <w:rPr>
+        <w:rFonts w:ascii="Wingdings" w:hAnsi="Wingdings" w:hint="default"/>
+        <w:sz w:val="20"/>
+      </w:rPr>
+    </w:lvl>
+    <w:lvl w:ilvl="7" w:tentative="1">
+      <w:start w:val="1"/>
+      <w:numFmt w:val="bullet"/>
+      <w:lvlText w:val=""/>
+      <w:lvlJc w:val="left"/>
+      <w:pPr>
+        <w:tabs>
+          <w:tab w:val="num" w:pos="5760"/>
+        </w:tabs>
+        <w:ind w:left="5760" w:hanging="360"/>
+      </w:pPr>
+      <w:rPr>
+        <w:rFonts w:ascii="Wingdings" w:hAnsi="Wingdings" w:hint="default"/>
+        <w:sz w:val="20"/>
+      </w:rPr>
+    </w:lvl>
+    <w:lvl w:ilvl="8" w:tentative="1">
+      <w:start w:val="1"/>
+      <w:numFmt w:val="bullet"/>
+      <w:lvlText w:val=""/>
+      <w:lvlJc w:val="left"/>
+      <w:pPr>
+        <w:tabs>
+          <w:tab w:val="num" w:pos="6480"/>
+        </w:tabs>
+        <w:ind w:left="6480" w:hanging="360"/>
+      </w:pPr>
+      <w:rPr>
+        <w:rFonts w:ascii="Wingdings" w:hAnsi="Wingdings" w:hint="default"/>
+        <w:sz w:val="20"/>
+      </w:rPr>
+    </w:lvl>
+  </w:abstractNum>
   <w:num w:numId="1" w16cid:durableId="430272983">
-    <w:abstractNumId w:val="2"/>
+    <w:abstractNumId w:val="5"/>
   </w:num>
   <w:num w:numId="2" w16cid:durableId="137504538">
     <w:abstractNumId w:val="0"/>
   </w:num>
   <w:num w:numId="3" w16cid:durableId="1963071122">
     <w:abstractNumId w:val="1"/>
+  </w:num>
+  <w:num w:numId="4" w16cid:durableId="848760794">
+    <w:abstractNumId w:val="6"/>
+  </w:num>
+  <w:num w:numId="5" w16cid:durableId="565577409">
+    <w:abstractNumId w:val="3"/>
+  </w:num>
+  <w:num w:numId="6" w16cid:durableId="2099518094">
+    <w:abstractNumId w:val="2"/>
+  </w:num>
+  <w:num w:numId="7" w16cid:durableId="1236621603">
+    <w:abstractNumId w:val="4"/>
   </w:num>
 </w:numbering>
 </file>

</xml_diff>

<commit_message>
Fix: create product page
</commit_message>
<xml_diff>
--- a/ghi-chu-asp.net.docx
+++ b/ghi-chu-asp.net.docx
@@ -1510,6 +1510,9 @@
     </w:p>
     <w:p>
       <w:r>
+        <w:rPr>
+          <w:noProof/>
+        </w:rPr>
         <w:drawing>
           <wp:inline distT="0" distB="0" distL="0" distR="0" wp14:anchorId="1610BFF7" wp14:editId="7EEE38CE">
             <wp:extent cx="5943600" cy="2112010"/>
@@ -1547,6 +1550,168 @@
         </w:drawing>
       </w:r>
     </w:p>
+    <w:p>
+      <w:r>
+        <w:br w:type="page"/>
+      </w:r>
+    </w:p>
+    <w:p>
+      <w:r>
+        <w:rPr>
+          <w:noProof/>
+        </w:rPr>
+        <w:lastRenderedPageBreak/>
+        <w:drawing>
+          <wp:inline distT="0" distB="0" distL="0" distR="0" wp14:anchorId="3F36B53E" wp14:editId="519C916D">
+            <wp:extent cx="5943600" cy="1790065"/>
+            <wp:effectExtent l="0" t="0" r="0" b="635"/>
+            <wp:docPr id="843989874" name="Picture 1"/>
+            <wp:cNvGraphicFramePr>
+              <a:graphicFrameLocks xmlns:a="http://schemas.openxmlformats.org/drawingml/2006/main" noChangeAspect="1"/>
+            </wp:cNvGraphicFramePr>
+            <a:graphic xmlns:a="http://schemas.openxmlformats.org/drawingml/2006/main">
+              <a:graphicData uri="http://schemas.openxmlformats.org/drawingml/2006/picture">
+                <pic:pic xmlns:pic="http://schemas.openxmlformats.org/drawingml/2006/picture">
+                  <pic:nvPicPr>
+                    <pic:cNvPr id="843989874" name=""/>
+                    <pic:cNvPicPr/>
+                  </pic:nvPicPr>
+                  <pic:blipFill>
+                    <a:blip r:embed="rId16"/>
+                    <a:stretch>
+                      <a:fillRect/>
+                    </a:stretch>
+                  </pic:blipFill>
+                  <pic:spPr>
+                    <a:xfrm>
+                      <a:off x="0" y="0"/>
+                      <a:ext cx="5943600" cy="1790065"/>
+                    </a:xfrm>
+                    <a:prstGeom prst="rect">
+                      <a:avLst/>
+                    </a:prstGeom>
+                  </pic:spPr>
+                </pic:pic>
+              </a:graphicData>
+            </a:graphic>
+          </wp:inline>
+        </w:drawing>
+      </w:r>
+    </w:p>
+    <w:p/>
+    <w:p>
+      <w:r>
+        <w:rPr>
+          <w:noProof/>
+        </w:rPr>
+        <w:drawing>
+          <wp:inline distT="0" distB="0" distL="0" distR="0" wp14:anchorId="1E67E3C2" wp14:editId="60B84B98">
+            <wp:extent cx="5943600" cy="1861185"/>
+            <wp:effectExtent l="0" t="0" r="0" b="5715"/>
+            <wp:docPr id="1569641333" name="Picture 1"/>
+            <wp:cNvGraphicFramePr>
+              <a:graphicFrameLocks xmlns:a="http://schemas.openxmlformats.org/drawingml/2006/main" noChangeAspect="1"/>
+            </wp:cNvGraphicFramePr>
+            <a:graphic xmlns:a="http://schemas.openxmlformats.org/drawingml/2006/main">
+              <a:graphicData uri="http://schemas.openxmlformats.org/drawingml/2006/picture">
+                <pic:pic xmlns:pic="http://schemas.openxmlformats.org/drawingml/2006/picture">
+                  <pic:nvPicPr>
+                    <pic:cNvPr id="1569641333" name=""/>
+                    <pic:cNvPicPr/>
+                  </pic:nvPicPr>
+                  <pic:blipFill>
+                    <a:blip r:embed="rId17"/>
+                    <a:stretch>
+                      <a:fillRect/>
+                    </a:stretch>
+                  </pic:blipFill>
+                  <pic:spPr>
+                    <a:xfrm>
+                      <a:off x="0" y="0"/>
+                      <a:ext cx="5943600" cy="1861185"/>
+                    </a:xfrm>
+                    <a:prstGeom prst="rect">
+                      <a:avLst/>
+                    </a:prstGeom>
+                  </pic:spPr>
+                </pic:pic>
+              </a:graphicData>
+            </a:graphic>
+          </wp:inline>
+        </w:drawing>
+      </w:r>
+    </w:p>
+    <w:p>
+      <w:r>
+        <w:br w:type="page"/>
+      </w:r>
+    </w:p>
+    <w:p>
+      <w:pPr>
+        <w:jc w:val="center"/>
+        <w:rPr>
+          <w:b/>
+          <w:bCs/>
+          <w:sz w:val="32"/>
+          <w:szCs w:val="32"/>
+        </w:rPr>
+      </w:pPr>
+      <w:r>
+        <w:rPr>
+          <w:b/>
+          <w:bCs/>
+          <w:sz w:val="32"/>
+          <w:szCs w:val="32"/>
+        </w:rPr>
+        <w:lastRenderedPageBreak/>
+        <w:t>Tạo đường dẫn hình ảnh để lưu vào server</w:t>
+      </w:r>
+    </w:p>
+    <w:p>
+      <w:r>
+        <w:t>FileStream fs = new FileStream(filePath, FileMode.Create);</w:t>
+      </w:r>
+    </w:p>
+    <w:p>
+      <w:r>
+        <w:drawing>
+          <wp:inline distT="0" distB="0" distL="0" distR="0" wp14:anchorId="3B330491" wp14:editId="2F4309DD">
+            <wp:extent cx="3077004" cy="1428949"/>
+            <wp:effectExtent l="0" t="0" r="9525" b="0"/>
+            <wp:docPr id="1410376400" name="Picture 1"/>
+            <wp:cNvGraphicFramePr>
+              <a:graphicFrameLocks xmlns:a="http://schemas.openxmlformats.org/drawingml/2006/main" noChangeAspect="1"/>
+            </wp:cNvGraphicFramePr>
+            <a:graphic xmlns:a="http://schemas.openxmlformats.org/drawingml/2006/main">
+              <a:graphicData uri="http://schemas.openxmlformats.org/drawingml/2006/picture">
+                <pic:pic xmlns:pic="http://schemas.openxmlformats.org/drawingml/2006/picture">
+                  <pic:nvPicPr>
+                    <pic:cNvPr id="1410376400" name=""/>
+                    <pic:cNvPicPr/>
+                  </pic:nvPicPr>
+                  <pic:blipFill>
+                    <a:blip r:embed="rId18"/>
+                    <a:stretch>
+                      <a:fillRect/>
+                    </a:stretch>
+                  </pic:blipFill>
+                  <pic:spPr>
+                    <a:xfrm>
+                      <a:off x="0" y="0"/>
+                      <a:ext cx="3077004" cy="1428949"/>
+                    </a:xfrm>
+                    <a:prstGeom prst="rect">
+                      <a:avLst/>
+                    </a:prstGeom>
+                  </pic:spPr>
+                </pic:pic>
+              </a:graphicData>
+            </a:graphic>
+          </wp:inline>
+        </w:drawing>
+      </w:r>
+    </w:p>
+    <w:p/>
     <w:sectPr>
       <w:pgSz w:w="12240" w:h="15840"/>
       <w:pgMar w:top="1440" w:right="1440" w:bottom="1440" w:left="1440" w:header="720" w:footer="720" w:gutter="0"/>
@@ -3162,7 +3327,6 @@
   <w:style w:type="character" w:default="1" w:styleId="DefaultParagraphFont">
     <w:name w:val="Default Paragraph Font"/>
     <w:uiPriority w:val="1"/>
-    <w:semiHidden/>
     <w:unhideWhenUsed/>
   </w:style>
   <w:style w:type="table" w:default="1" w:styleId="TableNormal">

</xml_diff>

<commit_message>
feat: add identity and migration
</commit_message>
<xml_diff>
--- a/ghi-chu-asp.net.docx
+++ b/ghi-chu-asp.net.docx
@@ -1459,6 +1459,9 @@
     </w:p>
     <w:p>
       <w:r>
+        <w:rPr>
+          <w:noProof/>
+        </w:rPr>
         <w:drawing>
           <wp:inline distT="0" distB="0" distL="0" distR="0" wp14:anchorId="19A895EC" wp14:editId="7C8D152A">
             <wp:extent cx="4198737" cy="2870034"/>
@@ -1508,14 +1511,7 @@
           <w:b/>
           <w:bCs/>
         </w:rPr>
-        <w:t>tại sao phải xóa file ảnh rồi mới xóa sản phẩm</w:t>
-      </w:r>
-      <w:r>
-        <w:rPr>
-          <w:b/>
-          <w:bCs/>
-        </w:rPr>
-        <w:t>?</w:t>
+        <w:t>tại sao phải xóa file ảnh rồi mới xóa sản phẩm?</w:t>
       </w:r>
     </w:p>
     <w:p>
@@ -1547,6 +1543,9 @@
     </w:p>
     <w:p>
       <w:r>
+        <w:rPr>
+          <w:noProof/>
+        </w:rPr>
         <w:drawing>
           <wp:inline distT="0" distB="0" distL="0" distR="0" wp14:anchorId="1397710A" wp14:editId="0FE1E3B2">
             <wp:extent cx="4405023" cy="3428953"/>
@@ -1868,7 +1867,489 @@
         </w:drawing>
       </w:r>
     </w:p>
+    <w:p>
+      <w:r>
+        <w:br w:type="page"/>
+      </w:r>
+    </w:p>
+    <w:p>
+      <w:pPr>
+        <w:jc w:val="center"/>
+        <w:rPr>
+          <w:b/>
+          <w:bCs/>
+          <w:sz w:val="32"/>
+          <w:szCs w:val="32"/>
+        </w:rPr>
+      </w:pPr>
+      <w:r>
+        <w:rPr>
+          <w:b/>
+          <w:bCs/>
+          <w:sz w:val="32"/>
+          <w:szCs w:val="32"/>
+        </w:rPr>
+        <w:lastRenderedPageBreak/>
+        <w:t xml:space="preserve">ĐĂNG NHẬP, ĐĂNG KÝ, XÁC THỰC, </w:t>
+      </w:r>
+      <w:r>
+        <w:rPr>
+          <w:b/>
+          <w:bCs/>
+          <w:sz w:val="32"/>
+          <w:szCs w:val="32"/>
+        </w:rPr>
+        <w:t>PHÂN</w:t>
+      </w:r>
+      <w:r>
+        <w:rPr>
+          <w:b/>
+          <w:bCs/>
+          <w:sz w:val="32"/>
+          <w:szCs w:val="32"/>
+        </w:rPr>
+        <w:t xml:space="preserve"> QUYỀN</w:t>
+      </w:r>
+    </w:p>
+    <w:p>
+      <w:r>
+        <w:t xml:space="preserve">Dùng </w:t>
+      </w:r>
+      <w:r>
+        <w:rPr>
+          <w:b/>
+          <w:bCs/>
+          <w:i/>
+          <w:iCs/>
+        </w:rPr>
+        <w:t>IdentityDbContext</w:t>
+      </w:r>
+      <w:r>
+        <w:rPr>
+          <w:b/>
+          <w:bCs/>
+          <w:i/>
+          <w:iCs/>
+        </w:rPr>
+        <w:t xml:space="preserve"> </w:t>
+      </w:r>
+      <w:r>
+        <w:t>để làm</w:t>
+      </w:r>
+    </w:p>
+    <w:p>
+      <w:r>
+        <w:t>IdentityDbContext là một lớp có sẵn trong ASP.NET Core Identity, được dùng để quản lý dữ liệu xác thực và phân quyền người dùng trong cơ sở dữ liệu.</w:t>
+      </w:r>
+    </w:p>
+    <w:p>
+      <w:r>
+        <w:drawing>
+          <wp:inline distT="0" distB="0" distL="0" distR="0" wp14:anchorId="1F0B4F8A" wp14:editId="3E7EEE29">
+            <wp:extent cx="5367130" cy="3194474"/>
+            <wp:effectExtent l="0" t="0" r="5080" b="6350"/>
+            <wp:docPr id="1622048518" name="Picture 1"/>
+            <wp:cNvGraphicFramePr>
+              <a:graphicFrameLocks xmlns:a="http://schemas.openxmlformats.org/drawingml/2006/main" noChangeAspect="1"/>
+            </wp:cNvGraphicFramePr>
+            <a:graphic xmlns:a="http://schemas.openxmlformats.org/drawingml/2006/main">
+              <a:graphicData uri="http://schemas.openxmlformats.org/drawingml/2006/picture">
+                <pic:pic xmlns:pic="http://schemas.openxmlformats.org/drawingml/2006/picture">
+                  <pic:nvPicPr>
+                    <pic:cNvPr id="1622048518" name=""/>
+                    <pic:cNvPicPr/>
+                  </pic:nvPicPr>
+                  <pic:blipFill>
+                    <a:blip r:embed="rId21"/>
+                    <a:stretch>
+                      <a:fillRect/>
+                    </a:stretch>
+                  </pic:blipFill>
+                  <pic:spPr>
+                    <a:xfrm>
+                      <a:off x="0" y="0"/>
+                      <a:ext cx="5369997" cy="3196180"/>
+                    </a:xfrm>
+                    <a:prstGeom prst="rect">
+                      <a:avLst/>
+                    </a:prstGeom>
+                  </pic:spPr>
+                </pic:pic>
+              </a:graphicData>
+            </a:graphic>
+          </wp:inline>
+        </w:drawing>
+      </w:r>
+    </w:p>
+    <w:p>
+      <w:r>
+        <w:t>Nó sẽ tự động tạo các bảng như:</w:t>
+      </w:r>
+    </w:p>
+    <w:tbl>
+      <w:tblPr>
+        <w:tblStyle w:val="TableGrid"/>
+        <w:tblW w:w="0" w:type="auto"/>
+        <w:tblLook w:val="04A0" w:firstRow="1" w:lastRow="0" w:firstColumn="1" w:lastColumn="0" w:noHBand="0" w:noVBand="1"/>
+      </w:tblPr>
+      <w:tblGrid>
+        <w:gridCol w:w="2043"/>
+        <w:gridCol w:w="3362"/>
+      </w:tblGrid>
+      <w:tr>
+        <w:tc>
+          <w:tcPr>
+            <w:tcW w:w="0" w:type="auto"/>
+            <w:hideMark/>
+          </w:tcPr>
+          <w:p>
+            <w:pPr>
+              <w:spacing w:after="160" w:line="278" w:lineRule="auto"/>
+              <w:rPr>
+                <w:b/>
+                <w:bCs/>
+              </w:rPr>
+            </w:pPr>
+            <w:r>
+              <w:rPr>
+                <w:b/>
+                <w:bCs/>
+              </w:rPr>
+              <w:t>Bảng</w:t>
+            </w:r>
+          </w:p>
+        </w:tc>
+        <w:tc>
+          <w:tcPr>
+            <w:tcW w:w="0" w:type="auto"/>
+            <w:hideMark/>
+          </w:tcPr>
+          <w:p>
+            <w:pPr>
+              <w:spacing w:after="160" w:line="278" w:lineRule="auto"/>
+              <w:rPr>
+                <w:b/>
+                <w:bCs/>
+              </w:rPr>
+            </w:pPr>
+            <w:r>
+              <w:rPr>
+                <w:b/>
+                <w:bCs/>
+              </w:rPr>
+              <w:t>Chức năng</w:t>
+            </w:r>
+          </w:p>
+        </w:tc>
+      </w:tr>
+      <w:tr>
+        <w:tc>
+          <w:tcPr>
+            <w:tcW w:w="0" w:type="auto"/>
+            <w:hideMark/>
+          </w:tcPr>
+          <w:p>
+            <w:pPr>
+              <w:spacing w:after="160" w:line="278" w:lineRule="auto"/>
+            </w:pPr>
+            <w:r>
+              <w:t>AspNetUsers</w:t>
+            </w:r>
+          </w:p>
+        </w:tc>
+        <w:tc>
+          <w:tcPr>
+            <w:tcW w:w="0" w:type="auto"/>
+            <w:hideMark/>
+          </w:tcPr>
+          <w:p>
+            <w:pPr>
+              <w:spacing w:after="160" w:line="278" w:lineRule="auto"/>
+            </w:pPr>
+            <w:r>
+              <w:t>Lưu thông tin người dùng</w:t>
+            </w:r>
+          </w:p>
+        </w:tc>
+      </w:tr>
+      <w:tr>
+        <w:tc>
+          <w:tcPr>
+            <w:tcW w:w="0" w:type="auto"/>
+            <w:hideMark/>
+          </w:tcPr>
+          <w:p>
+            <w:pPr>
+              <w:spacing w:after="160" w:line="278" w:lineRule="auto"/>
+            </w:pPr>
+            <w:r>
+              <w:t>AspNetRoles</w:t>
+            </w:r>
+          </w:p>
+        </w:tc>
+        <w:tc>
+          <w:tcPr>
+            <w:tcW w:w="0" w:type="auto"/>
+            <w:hideMark/>
+          </w:tcPr>
+          <w:p>
+            <w:pPr>
+              <w:spacing w:after="160" w:line="278" w:lineRule="auto"/>
+            </w:pPr>
+            <w:r>
+              <w:t>Lưu vai trò (Admin, User, Staff...)</w:t>
+            </w:r>
+          </w:p>
+        </w:tc>
+      </w:tr>
+      <w:tr>
+        <w:tc>
+          <w:tcPr>
+            <w:tcW w:w="0" w:type="auto"/>
+            <w:hideMark/>
+          </w:tcPr>
+          <w:p>
+            <w:pPr>
+              <w:spacing w:after="160" w:line="278" w:lineRule="auto"/>
+            </w:pPr>
+            <w:r>
+              <w:t>AspNetUserRoles</w:t>
+            </w:r>
+          </w:p>
+        </w:tc>
+        <w:tc>
+          <w:tcPr>
+            <w:tcW w:w="0" w:type="auto"/>
+            <w:hideMark/>
+          </w:tcPr>
+          <w:p>
+            <w:pPr>
+              <w:spacing w:after="160" w:line="278" w:lineRule="auto"/>
+            </w:pPr>
+            <w:r>
+              <w:t>Liên kết User và Role</w:t>
+            </w:r>
+          </w:p>
+        </w:tc>
+      </w:tr>
+      <w:tr>
+        <w:tc>
+          <w:tcPr>
+            <w:tcW w:w="0" w:type="auto"/>
+            <w:hideMark/>
+          </w:tcPr>
+          <w:p>
+            <w:pPr>
+              <w:spacing w:after="160" w:line="278" w:lineRule="auto"/>
+            </w:pPr>
+            <w:r>
+              <w:t>AspNetUserClaims</w:t>
+            </w:r>
+          </w:p>
+        </w:tc>
+        <w:tc>
+          <w:tcPr>
+            <w:tcW w:w="0" w:type="auto"/>
+            <w:hideMark/>
+          </w:tcPr>
+          <w:p>
+            <w:pPr>
+              <w:spacing w:after="160" w:line="278" w:lineRule="auto"/>
+            </w:pPr>
+            <w:r>
+              <w:t>Claim của User</w:t>
+            </w:r>
+          </w:p>
+        </w:tc>
+      </w:tr>
+      <w:tr>
+        <w:tc>
+          <w:tcPr>
+            <w:tcW w:w="0" w:type="auto"/>
+            <w:hideMark/>
+          </w:tcPr>
+          <w:p>
+            <w:pPr>
+              <w:spacing w:after="160" w:line="278" w:lineRule="auto"/>
+            </w:pPr>
+            <w:r>
+              <w:t>AspNetRoleClaims</w:t>
+            </w:r>
+          </w:p>
+        </w:tc>
+        <w:tc>
+          <w:tcPr>
+            <w:tcW w:w="0" w:type="auto"/>
+            <w:hideMark/>
+          </w:tcPr>
+          <w:p>
+            <w:pPr>
+              <w:spacing w:after="160" w:line="278" w:lineRule="auto"/>
+            </w:pPr>
+            <w:r>
+              <w:t>Claim của Role</w:t>
+            </w:r>
+          </w:p>
+        </w:tc>
+      </w:tr>
+      <w:tr>
+        <w:tc>
+          <w:tcPr>
+            <w:tcW w:w="0" w:type="auto"/>
+            <w:hideMark/>
+          </w:tcPr>
+          <w:p>
+            <w:pPr>
+              <w:spacing w:after="160" w:line="278" w:lineRule="auto"/>
+            </w:pPr>
+            <w:r>
+              <w:t>AspNetUserLogins</w:t>
+            </w:r>
+          </w:p>
+        </w:tc>
+        <w:tc>
+          <w:tcPr>
+            <w:tcW w:w="0" w:type="auto"/>
+            <w:hideMark/>
+          </w:tcPr>
+          <w:p>
+            <w:pPr>
+              <w:spacing w:after="160" w:line="278" w:lineRule="auto"/>
+            </w:pPr>
+            <w:r>
+              <w:t>Đăng nhập Google, Facebook...</w:t>
+            </w:r>
+          </w:p>
+        </w:tc>
+      </w:tr>
+      <w:tr>
+        <w:tc>
+          <w:tcPr>
+            <w:tcW w:w="0" w:type="auto"/>
+            <w:hideMark/>
+          </w:tcPr>
+          <w:p>
+            <w:pPr>
+              <w:spacing w:after="160" w:line="278" w:lineRule="auto"/>
+            </w:pPr>
+            <w:r>
+              <w:t>AspNetUserTokens</w:t>
+            </w:r>
+          </w:p>
+        </w:tc>
+        <w:tc>
+          <w:tcPr>
+            <w:tcW w:w="0" w:type="auto"/>
+            <w:hideMark/>
+          </w:tcPr>
+          <w:p>
+            <w:pPr>
+              <w:spacing w:after="160" w:line="278" w:lineRule="auto"/>
+            </w:pPr>
+            <w:r>
+              <w:t>Token xác thực</w:t>
+            </w:r>
+          </w:p>
+        </w:tc>
+      </w:tr>
+      <w:tr>
+        <w:tc>
+          <w:tcPr>
+            <w:tcW w:w="0" w:type="auto"/>
+            <w:hideMark/>
+          </w:tcPr>
+          <w:p>
+            <w:pPr>
+              <w:spacing w:after="160" w:line="278" w:lineRule="auto"/>
+            </w:pPr>
+            <w:r>
+              <w:t>AspNetUserClaims</w:t>
+            </w:r>
+          </w:p>
+        </w:tc>
+        <w:tc>
+          <w:tcPr>
+            <w:tcW w:w="0" w:type="auto"/>
+            <w:hideMark/>
+          </w:tcPr>
+          <w:p>
+            <w:pPr>
+              <w:spacing w:after="160" w:line="278" w:lineRule="auto"/>
+            </w:pPr>
+            <w:r>
+              <w:t>Quyền bổ sung của User</w:t>
+            </w:r>
+          </w:p>
+        </w:tc>
+      </w:tr>
+    </w:tbl>
     <w:p/>
+    <w:p>
+      <w:r>
+        <w:lastRenderedPageBreak/>
+        <w:br w:type="page"/>
+      </w:r>
+    </w:p>
+    <w:p>
+      <w:pPr>
+        <w:jc w:val="center"/>
+        <w:rPr>
+          <w:b/>
+          <w:bCs/>
+          <w:sz w:val="32"/>
+          <w:szCs w:val="32"/>
+        </w:rPr>
+      </w:pPr>
+      <w:r>
+        <w:rPr>
+          <w:b/>
+          <w:bCs/>
+          <w:sz w:val="32"/>
+          <w:szCs w:val="32"/>
+        </w:rPr>
+        <w:lastRenderedPageBreak/>
+        <w:t>COMMIT GITHUB</w:t>
+      </w:r>
+    </w:p>
+    <w:p>
+      <w:r>
+        <w:drawing>
+          <wp:inline distT="0" distB="0" distL="0" distR="0" wp14:anchorId="62E0FFAF" wp14:editId="5C9691DB">
+            <wp:extent cx="5943600" cy="4777105"/>
+            <wp:effectExtent l="0" t="0" r="0" b="4445"/>
+            <wp:docPr id="87002936" name="Picture 1"/>
+            <wp:cNvGraphicFramePr>
+              <a:graphicFrameLocks xmlns:a="http://schemas.openxmlformats.org/drawingml/2006/main" noChangeAspect="1"/>
+            </wp:cNvGraphicFramePr>
+            <a:graphic xmlns:a="http://schemas.openxmlformats.org/drawingml/2006/main">
+              <a:graphicData uri="http://schemas.openxmlformats.org/drawingml/2006/picture">
+                <pic:pic xmlns:pic="http://schemas.openxmlformats.org/drawingml/2006/picture">
+                  <pic:nvPicPr>
+                    <pic:cNvPr id="87002936" name=""/>
+                    <pic:cNvPicPr/>
+                  </pic:nvPicPr>
+                  <pic:blipFill>
+                    <a:blip r:embed="rId22"/>
+                    <a:stretch>
+                      <a:fillRect/>
+                    </a:stretch>
+                  </pic:blipFill>
+                  <pic:spPr>
+                    <a:xfrm>
+                      <a:off x="0" y="0"/>
+                      <a:ext cx="5943600" cy="4777105"/>
+                    </a:xfrm>
+                    <a:prstGeom prst="rect">
+                      <a:avLst/>
+                    </a:prstGeom>
+                  </pic:spPr>
+                </pic:pic>
+              </a:graphicData>
+            </a:graphic>
+          </wp:inline>
+        </w:drawing>
+      </w:r>
+    </w:p>
     <w:sectPr>
       <w:pgSz w:w="12240" w:h="15840"/>
       <w:pgMar w:top="1440" w:right="1440" w:bottom="1440" w:left="1440" w:header="720" w:footer="720" w:gutter="0"/>
@@ -4000,6 +4481,25 @@
       <w:rFonts w:ascii="Times New Roman" w:hAnsi="Times New Roman" w:cs="Times New Roman"/>
     </w:rPr>
   </w:style>
+  <w:style w:type="table" w:styleId="TableGrid">
+    <w:name w:val="Table Grid"/>
+    <w:basedOn w:val="TableNormal"/>
+    <w:uiPriority w:val="39"/>
+    <w:rsid w:val="006665F7"/>
+    <w:pPr>
+      <w:spacing w:after="0" w:line="240" w:lineRule="auto"/>
+    </w:pPr>
+    <w:tblPr>
+      <w:tblBorders>
+        <w:top w:val="single" w:sz="4" w:space="0" w:color="auto"/>
+        <w:left w:val="single" w:sz="4" w:space="0" w:color="auto"/>
+        <w:bottom w:val="single" w:sz="4" w:space="0" w:color="auto"/>
+        <w:right w:val="single" w:sz="4" w:space="0" w:color="auto"/>
+        <w:insideH w:val="single" w:sz="4" w:space="0" w:color="auto"/>
+        <w:insideV w:val="single" w:sz="4" w:space="0" w:color="auto"/>
+      </w:tblBorders>
+    </w:tblPr>
+  </w:style>
 </w:styles>
 </file>
 

</xml_diff>

<commit_message>
Add ASP.NET Core Identity configuration
</commit_message>
<xml_diff>
--- a/ghi-chu-asp.net.docx
+++ b/ghi-chu-asp.net.docx
@@ -2338,6 +2338,71 @@
                     <a:xfrm>
                       <a:off x="0" y="0"/>
                       <a:ext cx="5943600" cy="4777105"/>
+                    </a:xfrm>
+                    <a:prstGeom prst="rect">
+                      <a:avLst/>
+                    </a:prstGeom>
+                  </pic:spPr>
+                </pic:pic>
+              </a:graphicData>
+            </a:graphic>
+          </wp:inline>
+        </w:drawing>
+      </w:r>
+    </w:p>
+    <w:p>
+      <w:r>
+        <w:br w:type="page"/>
+      </w:r>
+    </w:p>
+    <w:p>
+      <w:pPr>
+        <w:jc w:val="center"/>
+        <w:rPr>
+          <w:b/>
+          <w:bCs/>
+          <w:sz w:val="32"/>
+          <w:szCs w:val="32"/>
+        </w:rPr>
+      </w:pPr>
+      <w:r>
+        <w:rPr>
+          <w:b/>
+          <w:bCs/>
+          <w:sz w:val="32"/>
+          <w:szCs w:val="32"/>
+        </w:rPr>
+        <w:lastRenderedPageBreak/>
+        <w:t>LUỒNG HOẠT ĐỘNG</w:t>
+      </w:r>
+    </w:p>
+    <w:p>
+      <w:r>
+        <w:drawing>
+          <wp:inline distT="0" distB="0" distL="0" distR="0" wp14:anchorId="78304E2D" wp14:editId="7738FC92">
+            <wp:extent cx="5943600" cy="3621405"/>
+            <wp:effectExtent l="0" t="0" r="0" b="0"/>
+            <wp:docPr id="920034727" name="Picture 1"/>
+            <wp:cNvGraphicFramePr>
+              <a:graphicFrameLocks xmlns:a="http://schemas.openxmlformats.org/drawingml/2006/main" noChangeAspect="1"/>
+            </wp:cNvGraphicFramePr>
+            <a:graphic xmlns:a="http://schemas.openxmlformats.org/drawingml/2006/main">
+              <a:graphicData uri="http://schemas.openxmlformats.org/drawingml/2006/picture">
+                <pic:pic xmlns:pic="http://schemas.openxmlformats.org/drawingml/2006/picture">
+                  <pic:nvPicPr>
+                    <pic:cNvPr id="920034727" name=""/>
+                    <pic:cNvPicPr/>
+                  </pic:nvPicPr>
+                  <pic:blipFill>
+                    <a:blip r:embed="rId23"/>
+                    <a:stretch>
+                      <a:fillRect/>
+                    </a:stretch>
+                  </pic:blipFill>
+                  <pic:spPr>
+                    <a:xfrm>
+                      <a:off x="0" y="0"/>
+                      <a:ext cx="5943600" cy="3621405"/>
                     </a:xfrm>
                     <a:prstGeom prst="rect">
                       <a:avLst/>

</xml_diff>

<commit_message>
feat: create an account
</commit_message>
<xml_diff>
--- a/ghi-chu-asp.net.docx
+++ b/ghi-chu-asp.net.docx
@@ -1944,6 +1944,9 @@
     </w:p>
     <w:p>
       <w:r>
+        <w:rPr>
+          <w:noProof/>
+        </w:rPr>
         <w:drawing>
           <wp:inline distT="0" distB="0" distL="0" distR="0" wp14:anchorId="1F0B4F8A" wp14:editId="3E7EEE29">
             <wp:extent cx="5367130" cy="3194474"/>
@@ -2313,6 +2316,9 @@
     </w:p>
     <w:p>
       <w:r>
+        <w:rPr>
+          <w:noProof/>
+        </w:rPr>
         <w:drawing>
           <wp:inline distT="0" distB="0" distL="0" distR="0" wp14:anchorId="62E0FFAF" wp14:editId="5C9691DB">
             <wp:extent cx="5943600" cy="4777105"/>
@@ -2378,6 +2384,9 @@
     </w:p>
     <w:p>
       <w:r>
+        <w:rPr>
+          <w:noProof/>
+        </w:rPr>
         <w:drawing>
           <wp:inline distT="0" distB="0" distL="0" distR="0" wp14:anchorId="78304E2D" wp14:editId="7738FC92">
             <wp:extent cx="5943600" cy="3621405"/>
@@ -2415,6 +2424,1991 @@
         </w:drawing>
       </w:r>
     </w:p>
+    <w:p>
+      <w:r>
+        <w:br w:type="page"/>
+      </w:r>
+    </w:p>
+    <w:p>
+      <w:pPr>
+        <w:jc w:val="center"/>
+        <w:rPr>
+          <w:b/>
+          <w:bCs/>
+          <w:sz w:val="32"/>
+          <w:szCs w:val="32"/>
+        </w:rPr>
+      </w:pPr>
+      <w:r>
+        <w:rPr>
+          <w:b/>
+          <w:bCs/>
+          <w:sz w:val="32"/>
+          <w:szCs w:val="32"/>
+        </w:rPr>
+        <w:lastRenderedPageBreak/>
+        <w:t>Nguyên tắc tạo Model, View và Controller trong ASP.NET Core MVC</w:t>
+      </w:r>
+    </w:p>
+    <w:p>
+      <w:r>
+        <w:t xml:space="preserve">Promt: </w:t>
+      </w:r>
+      <w:r>
+        <w:t>đây là cấu trúc thư mục của tôi tôi đã hiểu về mô hình MVC nhưng không biết khi nào nên tạo 1 controller mới và khi nào nên tạo 1 View đầu tiên là thư mục rồi mới đến file .cshtml trong thư mục đó và tôi không biết khi nào nên tạo models</w:t>
+      </w:r>
+    </w:p>
+    <w:p>
+      <w:pPr>
+        <w:rPr>
+          <w:b/>
+          <w:bCs/>
+          <w:color w:val="EE0000"/>
+        </w:rPr>
+      </w:pPr>
+      <w:r>
+        <w:rPr>
+          <w:b/>
+          <w:bCs/>
+          <w:color w:val="EE0000"/>
+        </w:rPr>
+        <w:t xml:space="preserve">Tóm tắt: </w:t>
+      </w:r>
+    </w:p>
+    <w:p>
+      <w:pPr>
+        <w:rPr>
+          <w:b/>
+          <w:bCs/>
+        </w:rPr>
+      </w:pPr>
+      <w:r>
+        <w:rPr>
+          <w:b/>
+          <w:bCs/>
+        </w:rPr>
+        <w:t>Nguyên tắc tạo Model - View - Controller trong ASP.NET MVC</w:t>
+      </w:r>
+    </w:p>
+    <w:p>
+      <w:pPr>
+        <w:rPr>
+          <w:b/>
+          <w:bCs/>
+        </w:rPr>
+      </w:pPr>
+      <w:r>
+        <w:rPr>
+          <w:b/>
+          <w:bCs/>
+        </w:rPr>
+        <w:t>1. Khi nào tạo Model?</w:t>
+      </w:r>
+    </w:p>
+    <w:p>
+      <w:r>
+        <w:rPr>
+          <w:rFonts w:ascii="Segoe UI Emoji" w:hAnsi="Segoe UI Emoji" w:cs="Segoe UI Emoji"/>
+        </w:rPr>
+        <w:t>👉</w:t>
+      </w:r>
+      <w:r>
+        <w:t xml:space="preserve"> Khi có </w:t>
+      </w:r>
+      <w:r>
+        <w:rPr>
+          <w:b/>
+          <w:bCs/>
+        </w:rPr>
+        <w:t>dữ liệu cần quản lý</w:t>
+      </w:r>
+      <w:r>
+        <w:t xml:space="preserve"> hoặc </w:t>
+      </w:r>
+      <w:r>
+        <w:rPr>
+          <w:b/>
+          <w:bCs/>
+        </w:rPr>
+        <w:t>bảng trong Database</w:t>
+      </w:r>
+      <w:r>
+        <w:t>.</w:t>
+      </w:r>
+    </w:p>
+    <w:p>
+      <w:r>
+        <w:t>Ví dụ:</w:t>
+      </w:r>
+    </w:p>
+    <w:p>
+      <w:r>
+        <w:t>Products → ProductModel</w:t>
+      </w:r>
+      <w:r>
+        <w:br/>
+        <w:t>Categories → CategoryModel</w:t>
+      </w:r>
+      <w:r>
+        <w:br/>
+        <w:t>Brands → BrandModel</w:t>
+      </w:r>
+    </w:p>
+    <w:p>
+      <w:r>
+        <w:pict w14:anchorId="665BC045">
+          <v:rect id="_x0000_i1430" style="width:0;height:1.5pt" o:hralign="center" o:hrstd="t" o:hr="t" fillcolor="#a0a0a0" stroked="f"/>
+        </w:pict>
+      </w:r>
+    </w:p>
+    <w:p>
+      <w:pPr>
+        <w:rPr>
+          <w:b/>
+          <w:bCs/>
+        </w:rPr>
+      </w:pPr>
+      <w:r>
+        <w:rPr>
+          <w:b/>
+          <w:bCs/>
+        </w:rPr>
+        <w:t>2. Khi nào tạo Controller?</w:t>
+      </w:r>
+    </w:p>
+    <w:p>
+      <w:r>
+        <w:rPr>
+          <w:rFonts w:ascii="Segoe UI Emoji" w:hAnsi="Segoe UI Emoji" w:cs="Segoe UI Emoji"/>
+        </w:rPr>
+        <w:t>👉</w:t>
+      </w:r>
+      <w:r>
+        <w:t xml:space="preserve"> Khi có </w:t>
+      </w:r>
+      <w:r>
+        <w:rPr>
+          <w:b/>
+          <w:bCs/>
+        </w:rPr>
+        <w:t>nhóm chức năng/nghiệp vụ mới</w:t>
+      </w:r>
+      <w:r>
+        <w:t>.</w:t>
+      </w:r>
+    </w:p>
+    <w:p>
+      <w:r>
+        <w:t>Ví dụ:</w:t>
+      </w:r>
+    </w:p>
+    <w:p>
+      <w:r>
+        <w:t>Quản lý sản phẩm → ProductController</w:t>
+      </w:r>
+      <w:r>
+        <w:br/>
+        <w:t>Quản lý danh mục → CategoryController</w:t>
+      </w:r>
+      <w:r>
+        <w:br/>
+        <w:t>Quản lý giỏ hàng → CartController</w:t>
+      </w:r>
+    </w:p>
+    <w:p>
+      <w:r>
+        <w:pict w14:anchorId="68EC02E3">
+          <v:rect id="_x0000_i1431" style="width:0;height:1.5pt" o:hralign="center" o:hrstd="t" o:hr="t" fillcolor="#a0a0a0" stroked="f"/>
+        </w:pict>
+      </w:r>
+    </w:p>
+    <w:p>
+      <w:pPr>
+        <w:rPr>
+          <w:b/>
+          <w:bCs/>
+        </w:rPr>
+      </w:pPr>
+      <w:r>
+        <w:rPr>
+          <w:b/>
+          <w:bCs/>
+        </w:rPr>
+        <w:t>3. Khi nào tạo View?</w:t>
+      </w:r>
+    </w:p>
+    <w:p>
+      <w:r>
+        <w:rPr>
+          <w:rFonts w:ascii="Segoe UI Emoji" w:hAnsi="Segoe UI Emoji" w:cs="Segoe UI Emoji"/>
+        </w:rPr>
+        <w:t>👉</w:t>
+      </w:r>
+      <w:r>
+        <w:t xml:space="preserve"> Khi cần </w:t>
+      </w:r>
+      <w:r>
+        <w:rPr>
+          <w:b/>
+          <w:bCs/>
+        </w:rPr>
+        <w:t>giao diện hiển thị cho người dùng</w:t>
+      </w:r>
+      <w:r>
+        <w:t>.</w:t>
+      </w:r>
+    </w:p>
+    <w:p>
+      <w:r>
+        <w:t>Ví dụ:</w:t>
+      </w:r>
+    </w:p>
+    <w:p>
+      <w:r>
+        <w:t>ProductController.Index()</w:t>
+      </w:r>
+      <w:r>
+        <w:br/>
+        <w:t>↓</w:t>
+      </w:r>
+      <w:r>
+        <w:br/>
+        <w:t>Views/Product/Index.cshtml</w:t>
+      </w:r>
+      <w:r>
+        <w:br/>
+      </w:r>
+      <w:r>
+        <w:br/>
+        <w:t>ProductController.Details()</w:t>
+      </w:r>
+      <w:r>
+        <w:br/>
+      </w:r>
+      <w:r>
+        <w:lastRenderedPageBreak/>
+        <w:t>↓</w:t>
+      </w:r>
+      <w:r>
+        <w:br/>
+        <w:t>Views/Product/Details.cshtml</w:t>
+      </w:r>
+    </w:p>
+    <w:p>
+      <w:r>
+        <w:pict w14:anchorId="4137A6EA">
+          <v:rect id="_x0000_i1432" style="width:0;height:1.5pt" o:hralign="center" o:hrstd="t" o:hr="t" fillcolor="#a0a0a0" stroked="f"/>
+        </w:pict>
+      </w:r>
+    </w:p>
+    <w:p>
+      <w:pPr>
+        <w:rPr>
+          <w:b/>
+          <w:bCs/>
+        </w:rPr>
+      </w:pPr>
+      <w:r>
+        <w:rPr>
+          <w:b/>
+          <w:bCs/>
+        </w:rPr>
+        <w:t>Quy tắc nhớ nhanh</w:t>
+      </w:r>
+    </w:p>
+    <w:p>
+      <w:r>
+        <w:t>Có dữ liệu mới?</w:t>
+      </w:r>
+      <w:r>
+        <w:br/>
+        <w:t xml:space="preserve">    ↓</w:t>
+      </w:r>
+      <w:r>
+        <w:br/>
+        <w:t>Tạo Model</w:t>
+      </w:r>
+      <w:r>
+        <w:br/>
+      </w:r>
+      <w:r>
+        <w:br/>
+        <w:t>Có chức năng mới?</w:t>
+      </w:r>
+      <w:r>
+        <w:br/>
+        <w:t xml:space="preserve">    ↓</w:t>
+      </w:r>
+      <w:r>
+        <w:br/>
+        <w:t>Tạo Controller</w:t>
+      </w:r>
+      <w:r>
+        <w:br/>
+      </w:r>
+      <w:r>
+        <w:br/>
+        <w:t>Có giao diện mới?</w:t>
+      </w:r>
+      <w:r>
+        <w:br/>
+        <w:t xml:space="preserve">    ↓</w:t>
+      </w:r>
+      <w:r>
+        <w:br/>
+        <w:t>Tạo View</w:t>
+      </w:r>
+    </w:p>
+    <w:p>
+      <w:pPr>
+        <w:rPr>
+          <w:b/>
+          <w:bCs/>
+        </w:rPr>
+      </w:pPr>
+      <w:r>
+        <w:rPr>
+          <w:b/>
+          <w:bCs/>
+        </w:rPr>
+        <w:t>Quan hệ thư mục MVC</w:t>
+      </w:r>
+    </w:p>
+    <w:p>
+      <w:r>
+        <w:t>Models</w:t>
+      </w:r>
+      <w:r>
+        <w:br/>
+        <w:t xml:space="preserve"> └── ProductModel</w:t>
+      </w:r>
+      <w:r>
+        <w:br/>
+      </w:r>
+      <w:r>
+        <w:br/>
+        <w:t>Controllers</w:t>
+      </w:r>
+      <w:r>
+        <w:br/>
+        <w:t xml:space="preserve"> └── ProductController</w:t>
+      </w:r>
+      <w:r>
+        <w:br/>
+      </w:r>
+      <w:r>
+        <w:br/>
+        <w:t>Views</w:t>
+      </w:r>
+      <w:r>
+        <w:br/>
+        <w:t xml:space="preserve"> └── Product</w:t>
+      </w:r>
+      <w:r>
+        <w:br/>
+        <w:t xml:space="preserve">      </w:t>
+      </w:r>
+      <w:r>
+        <w:rPr>
+          <w:rFonts w:ascii="MS Gothic" w:eastAsia="MS Gothic" w:hAnsi="MS Gothic" w:cs="MS Gothic" w:hint="eastAsia"/>
+        </w:rPr>
+        <w:t>├</w:t>
+      </w:r>
+      <w:r>
+        <w:rPr>
+          <w:rFonts w:ascii="Calibri" w:hAnsi="Calibri" w:cs="Calibri"/>
+        </w:rPr>
+        <w:t>──</w:t>
+      </w:r>
+      <w:r>
+        <w:t xml:space="preserve"> Index.cshtml</w:t>
+      </w:r>
+      <w:r>
+        <w:br/>
+        <w:t xml:space="preserve">      </w:t>
+      </w:r>
+      <w:r>
+        <w:rPr>
+          <w:rFonts w:ascii="Calibri" w:hAnsi="Calibri" w:cs="Calibri"/>
+        </w:rPr>
+        <w:t>└──</w:t>
+      </w:r>
+      <w:r>
+        <w:t xml:space="preserve"> Details.cshtml</w:t>
+      </w:r>
+    </w:p>
+    <w:p>
+      <w:r>
+        <w:rPr>
+          <w:rFonts w:ascii="Segoe UI Emoji" w:hAnsi="Segoe UI Emoji" w:cs="Segoe UI Emoji"/>
+        </w:rPr>
+        <w:t>👉</w:t>
+      </w:r>
+      <w:r>
+        <w:t xml:space="preserve"> Thông thường: </w:t>
+      </w:r>
+      <w:r>
+        <w:rPr>
+          <w:b/>
+          <w:bCs/>
+        </w:rPr>
+        <w:t>1 chức năng = 1 Controller + 1 thư mục View + các Model liên quan</w:t>
+      </w:r>
+      <w:r>
+        <w:t>.</w:t>
+      </w:r>
+    </w:p>
+    <w:p>
+      <w:pPr>
+        <w:rPr>
+          <w:b/>
+          <w:bCs/>
+          <w:color w:val="EE0000"/>
+        </w:rPr>
+      </w:pPr>
+    </w:p>
+    <w:p>
+      <w:pPr>
+        <w:rPr>
+          <w:b/>
+          <w:bCs/>
+          <w:color w:val="EE0000"/>
+        </w:rPr>
+      </w:pPr>
+      <w:r>
+        <w:rPr>
+          <w:b/>
+          <w:bCs/>
+          <w:color w:val="EE0000"/>
+        </w:rPr>
+        <w:t>Chi tiết:</w:t>
+      </w:r>
+    </w:p>
+    <w:p>
+      <w:pPr>
+        <w:rPr>
+          <w:b/>
+          <w:bCs/>
+        </w:rPr>
+      </w:pPr>
+      <w:r>
+        <w:rPr>
+          <w:b/>
+          <w:bCs/>
+        </w:rPr>
+        <w:t>1. Khi nào tạo Controller mới?</w:t>
+      </w:r>
+    </w:p>
+    <w:p>
+      <w:r>
+        <w:t xml:space="preserve">Một Controller thường đại diện cho </w:t>
+      </w:r>
+      <w:r>
+        <w:rPr>
+          <w:b/>
+          <w:bCs/>
+        </w:rPr>
+        <w:t>một nhóm chức năng nghiệp vụ</w:t>
+      </w:r>
+      <w:r>
+        <w:t>.</w:t>
+      </w:r>
+    </w:p>
+    <w:p>
+      <w:r>
+        <w:t>Ví dụ website bán điện thoại:</w:t>
+      </w:r>
+    </w:p>
+    <w:tbl>
+      <w:tblPr>
+        <w:tblW w:w="0" w:type="auto"/>
+        <w:tblCellSpacing w:w="15" w:type="dxa"/>
+        <w:tblCellMar>
+          <w:top w:w="15" w:type="dxa"/>
+          <w:left w:w="15" w:type="dxa"/>
+          <w:bottom w:w="15" w:type="dxa"/>
+          <w:right w:w="15" w:type="dxa"/>
+        </w:tblCellMar>
+        <w:tblLook w:val="04A0" w:firstRow="1" w:lastRow="0" w:firstColumn="1" w:lastColumn="0" w:noHBand="0" w:noVBand="1"/>
+      </w:tblPr>
+      <w:tblGrid>
+        <w:gridCol w:w="1322"/>
+        <w:gridCol w:w="1963"/>
+      </w:tblGrid>
+      <w:tr>
+        <w:trPr>
+          <w:tblHeader/>
+          <w:tblCellSpacing w:w="15" w:type="dxa"/>
+        </w:trPr>
+        <w:tc>
+          <w:tcPr>
+            <w:tcW w:w="0" w:type="auto"/>
+            <w:vAlign w:val="center"/>
+            <w:hideMark/>
+          </w:tcPr>
+          <w:p>
+            <w:pPr>
+              <w:rPr>
+                <w:b/>
+                <w:bCs/>
+              </w:rPr>
+            </w:pPr>
+            <w:r>
+              <w:rPr>
+                <w:b/>
+                <w:bCs/>
+              </w:rPr>
+              <w:lastRenderedPageBreak/>
+              <w:t>Chức năng</w:t>
+            </w:r>
+          </w:p>
+        </w:tc>
+        <w:tc>
+          <w:tcPr>
+            <w:tcW w:w="0" w:type="auto"/>
+            <w:vAlign w:val="center"/>
+            <w:hideMark/>
+          </w:tcPr>
+          <w:p>
+            <w:pPr>
+              <w:rPr>
+                <w:b/>
+                <w:bCs/>
+              </w:rPr>
+            </w:pPr>
+            <w:r>
+              <w:rPr>
+                <w:b/>
+                <w:bCs/>
+              </w:rPr>
+              <w:t>Controller</w:t>
+            </w:r>
+          </w:p>
+        </w:tc>
+      </w:tr>
+      <w:tr>
+        <w:trPr>
+          <w:tblCellSpacing w:w="15" w:type="dxa"/>
+        </w:trPr>
+        <w:tc>
+          <w:tcPr>
+            <w:tcW w:w="0" w:type="auto"/>
+            <w:vAlign w:val="center"/>
+            <w:hideMark/>
+          </w:tcPr>
+          <w:p>
+            <w:r>
+              <w:t>Trang chủ</w:t>
+            </w:r>
+          </w:p>
+        </w:tc>
+        <w:tc>
+          <w:tcPr>
+            <w:tcW w:w="0" w:type="auto"/>
+            <w:vAlign w:val="center"/>
+            <w:hideMark/>
+          </w:tcPr>
+          <w:p>
+            <w:r>
+              <w:t>HomeController</w:t>
+            </w:r>
+          </w:p>
+        </w:tc>
+      </w:tr>
+      <w:tr>
+        <w:trPr>
+          <w:tblCellSpacing w:w="15" w:type="dxa"/>
+        </w:trPr>
+        <w:tc>
+          <w:tcPr>
+            <w:tcW w:w="0" w:type="auto"/>
+            <w:vAlign w:val="center"/>
+            <w:hideMark/>
+          </w:tcPr>
+          <w:p>
+            <w:r>
+              <w:t>Sản phẩm</w:t>
+            </w:r>
+          </w:p>
+        </w:tc>
+        <w:tc>
+          <w:tcPr>
+            <w:tcW w:w="0" w:type="auto"/>
+            <w:vAlign w:val="center"/>
+            <w:hideMark/>
+          </w:tcPr>
+          <w:p>
+            <w:r>
+              <w:t>ProductController</w:t>
+            </w:r>
+          </w:p>
+        </w:tc>
+      </w:tr>
+      <w:tr>
+        <w:trPr>
+          <w:tblCellSpacing w:w="15" w:type="dxa"/>
+        </w:trPr>
+        <w:tc>
+          <w:tcPr>
+            <w:tcW w:w="0" w:type="auto"/>
+            <w:vAlign w:val="center"/>
+            <w:hideMark/>
+          </w:tcPr>
+          <w:p>
+            <w:r>
+              <w:t>Danh mục</w:t>
+            </w:r>
+          </w:p>
+        </w:tc>
+        <w:tc>
+          <w:tcPr>
+            <w:tcW w:w="0" w:type="auto"/>
+            <w:vAlign w:val="center"/>
+            <w:hideMark/>
+          </w:tcPr>
+          <w:p>
+            <w:r>
+              <w:t>CategoryController</w:t>
+            </w:r>
+          </w:p>
+        </w:tc>
+      </w:tr>
+      <w:tr>
+        <w:trPr>
+          <w:tblCellSpacing w:w="15" w:type="dxa"/>
+        </w:trPr>
+        <w:tc>
+          <w:tcPr>
+            <w:tcW w:w="0" w:type="auto"/>
+            <w:vAlign w:val="center"/>
+            <w:hideMark/>
+          </w:tcPr>
+          <w:p>
+            <w:r>
+              <w:t>Thương hiệu</w:t>
+            </w:r>
+          </w:p>
+        </w:tc>
+        <w:tc>
+          <w:tcPr>
+            <w:tcW w:w="0" w:type="auto"/>
+            <w:vAlign w:val="center"/>
+            <w:hideMark/>
+          </w:tcPr>
+          <w:p>
+            <w:r>
+              <w:t>BrandController</w:t>
+            </w:r>
+          </w:p>
+        </w:tc>
+      </w:tr>
+      <w:tr>
+        <w:trPr>
+          <w:tblCellSpacing w:w="15" w:type="dxa"/>
+        </w:trPr>
+        <w:tc>
+          <w:tcPr>
+            <w:tcW w:w="0" w:type="auto"/>
+            <w:vAlign w:val="center"/>
+            <w:hideMark/>
+          </w:tcPr>
+          <w:p>
+            <w:r>
+              <w:t>Giỏ hàng</w:t>
+            </w:r>
+          </w:p>
+        </w:tc>
+        <w:tc>
+          <w:tcPr>
+            <w:tcW w:w="0" w:type="auto"/>
+            <w:vAlign w:val="center"/>
+            <w:hideMark/>
+          </w:tcPr>
+          <w:p>
+            <w:r>
+              <w:t>CartController</w:t>
+            </w:r>
+          </w:p>
+        </w:tc>
+      </w:tr>
+      <w:tr>
+        <w:trPr>
+          <w:tblCellSpacing w:w="15" w:type="dxa"/>
+        </w:trPr>
+        <w:tc>
+          <w:tcPr>
+            <w:tcW w:w="0" w:type="auto"/>
+            <w:vAlign w:val="center"/>
+            <w:hideMark/>
+          </w:tcPr>
+          <w:p>
+            <w:r>
+              <w:t>Tài khoản</w:t>
+            </w:r>
+          </w:p>
+        </w:tc>
+        <w:tc>
+          <w:tcPr>
+            <w:tcW w:w="0" w:type="auto"/>
+            <w:vAlign w:val="center"/>
+            <w:hideMark/>
+          </w:tcPr>
+          <w:p>
+            <w:r>
+              <w:t>AccountController</w:t>
+            </w:r>
+          </w:p>
+        </w:tc>
+      </w:tr>
+      <w:tr>
+        <w:trPr>
+          <w:tblCellSpacing w:w="15" w:type="dxa"/>
+        </w:trPr>
+        <w:tc>
+          <w:tcPr>
+            <w:tcW w:w="0" w:type="auto"/>
+            <w:vAlign w:val="center"/>
+            <w:hideMark/>
+          </w:tcPr>
+          <w:p>
+            <w:r>
+              <w:t>Thanh toán</w:t>
+            </w:r>
+          </w:p>
+        </w:tc>
+        <w:tc>
+          <w:tcPr>
+            <w:tcW w:w="0" w:type="auto"/>
+            <w:vAlign w:val="center"/>
+            <w:hideMark/>
+          </w:tcPr>
+          <w:p>
+            <w:r>
+              <w:t>CheckoutController</w:t>
+            </w:r>
+          </w:p>
+        </w:tc>
+      </w:tr>
+    </w:tbl>
+    <w:p>
+      <w:r>
+        <w:t>Ví dụ:</w:t>
+      </w:r>
+    </w:p>
+    <w:p>
+      <w:r>
+        <w:t>Người dùng muốn xem sản phẩm</w:t>
+      </w:r>
+    </w:p>
+    <w:p>
+      <w:r>
+        <w:t>→ ProductController</w:t>
+      </w:r>
+    </w:p>
+    <w:p>
+      <w:r>
+        <w:t>Người dùng muốn xem giỏ hàng</w:t>
+      </w:r>
+    </w:p>
+    <w:p>
+      <w:r>
+        <w:t>→ CartController</w:t>
+      </w:r>
+    </w:p>
+    <w:p>
+      <w:r>
+        <w:t>Người dùng muốn đăng nhập</w:t>
+      </w:r>
+    </w:p>
+    <w:p>
+      <w:r>
+        <w:t>→ AccountController hoặc LoginController</w:t>
+      </w:r>
+    </w:p>
+    <w:p>
+      <w:r>
+        <w:pict w14:anchorId="24D3529E">
+          <v:rect id="_x0000_i1146" style="width:0;height:1.5pt" o:hralign="center" o:hrstd="t" o:hr="t" fillcolor="#a0a0a0" stroked="f"/>
+        </w:pict>
+      </w:r>
+    </w:p>
+    <w:p>
+      <w:pPr>
+        <w:rPr>
+          <w:b/>
+          <w:bCs/>
+        </w:rPr>
+      </w:pPr>
+      <w:r>
+        <w:rPr>
+          <w:b/>
+          <w:bCs/>
+        </w:rPr>
+        <w:t>Dấu hiệu cần tạo Controller mới</w:t>
+      </w:r>
+    </w:p>
+    <w:p>
+      <w:r>
+        <w:t>Nếu bạn thấy:</w:t>
+      </w:r>
+    </w:p>
+    <w:p>
+      <w:r>
+        <w:t>ProductController</w:t>
+      </w:r>
+    </w:p>
+    <w:p>
+      <w:r>
+        <w:t>đang chứa:</w:t>
+      </w:r>
+    </w:p>
+    <w:p>
+      <w:r>
+        <w:t>Product</w:t>
+      </w:r>
+      <w:r>
+        <w:br/>
+        <w:t>Category</w:t>
+      </w:r>
+      <w:r>
+        <w:br/>
+        <w:t>Brand</w:t>
+      </w:r>
+      <w:r>
+        <w:br/>
+        <w:t>Cart</w:t>
+      </w:r>
+    </w:p>
+    <w:p>
+      <w:r>
+        <w:t>thì nó quá nhiều trách nhiệm.</w:t>
+      </w:r>
+    </w:p>
+    <w:p>
+      <w:r>
+        <w:t>Lúc đó nên tách.</w:t>
+      </w:r>
+    </w:p>
+    <w:p>
+      <w:r>
+        <w:lastRenderedPageBreak/>
+        <w:t>Ví dụ:</w:t>
+      </w:r>
+    </w:p>
+    <w:p>
+      <w:r>
+        <w:rPr>
+          <w:rFonts w:ascii="Segoe UI Emoji" w:hAnsi="Segoe UI Emoji" w:cs="Segoe UI Emoji"/>
+        </w:rPr>
+        <w:t>❌</w:t>
+      </w:r>
+      <w:r>
+        <w:t xml:space="preserve"> Không tốt</w:t>
+      </w:r>
+    </w:p>
+    <w:p>
+      <w:r>
+        <w:t>public class ProductController : Controller</w:t>
+      </w:r>
+      <w:r>
+        <w:br/>
+        <w:t>{</w:t>
+      </w:r>
+      <w:r>
+        <w:br/>
+        <w:t xml:space="preserve">    public IActionResult Product() {}</w:t>
+      </w:r>
+      <w:r>
+        <w:br/>
+      </w:r>
+      <w:r>
+        <w:br/>
+        <w:t xml:space="preserve">    public IActionResult Category() {}</w:t>
+      </w:r>
+      <w:r>
+        <w:br/>
+      </w:r>
+      <w:r>
+        <w:br/>
+        <w:t xml:space="preserve">    public IActionResult Brand() {}</w:t>
+      </w:r>
+      <w:r>
+        <w:br/>
+      </w:r>
+      <w:r>
+        <w:br/>
+        <w:t xml:space="preserve">    public IActionResult Cart() {}</w:t>
+      </w:r>
+      <w:r>
+        <w:br/>
+        <w:t>}</w:t>
+      </w:r>
+    </w:p>
+    <w:p>
+      <w:r>
+        <w:pict w14:anchorId="5A154254">
+          <v:rect id="_x0000_i1147" style="width:0;height:1.5pt" o:hralign="center" o:hrstd="t" o:hr="t" fillcolor="#a0a0a0" stroked="f"/>
+        </w:pict>
+      </w:r>
+    </w:p>
+    <w:p>
+      <w:r>
+        <w:rPr>
+          <w:rFonts w:ascii="Segoe UI Emoji" w:hAnsi="Segoe UI Emoji" w:cs="Segoe UI Emoji"/>
+        </w:rPr>
+        <w:t>✅</w:t>
+      </w:r>
+      <w:r>
+        <w:t xml:space="preserve"> Tốt hơn</w:t>
+      </w:r>
+    </w:p>
+    <w:p>
+      <w:r>
+        <w:t>ProductController</w:t>
+      </w:r>
+      <w:r>
+        <w:br/>
+        <w:t>CategoryController</w:t>
+      </w:r>
+      <w:r>
+        <w:br/>
+        <w:t>BrandController</w:t>
+      </w:r>
+      <w:r>
+        <w:br/>
+        <w:t>CartController</w:t>
+      </w:r>
+    </w:p>
+    <w:p>
+      <w:r>
+        <w:pict w14:anchorId="7C9E6AF3">
+          <v:rect id="_x0000_i1148" style="width:0;height:1.5pt" o:hralign="center" o:hrstd="t" o:hr="t" fillcolor="#a0a0a0" stroked="f"/>
+        </w:pict>
+      </w:r>
+    </w:p>
+    <w:p>
+      <w:pPr>
+        <w:rPr>
+          <w:b/>
+          <w:bCs/>
+        </w:rPr>
+      </w:pPr>
+      <w:r>
+        <w:rPr>
+          <w:b/>
+          <w:bCs/>
+        </w:rPr>
+        <w:t>2. Khi nào tạo thư mục View?</w:t>
+      </w:r>
+    </w:p>
+    <w:p>
+      <w:r>
+        <w:t>Thông thường:</w:t>
+      </w:r>
+    </w:p>
+    <w:p>
+      <w:r>
+        <w:t>1 Controller</w:t>
+      </w:r>
+      <w:r>
+        <w:br/>
+      </w:r>
+      <w:r>
+        <w:rPr>
+          <w:rFonts w:ascii="Cambria Math" w:hAnsi="Cambria Math" w:cs="Cambria Math"/>
+        </w:rPr>
+        <w:t>⇔</w:t>
+      </w:r>
+      <w:r>
+        <w:br/>
+        <w:t>1 th</w:t>
+      </w:r>
+      <w:r>
+        <w:rPr>
+          <w:rFonts w:ascii="Calibri" w:hAnsi="Calibri" w:cs="Calibri"/>
+        </w:rPr>
+        <w:t>ư</w:t>
+      </w:r>
+      <w:r>
+        <w:t xml:space="preserve"> mục View</w:t>
+      </w:r>
+    </w:p>
+    <w:p>
+      <w:r>
+        <w:t>Ví dụ:</w:t>
+      </w:r>
+    </w:p>
+    <w:p>
+      <w:r>
+        <w:t>public class ProductController : Controller</w:t>
+      </w:r>
+      <w:r>
+        <w:br/>
+        <w:t>{</w:t>
+      </w:r>
+      <w:r>
+        <w:br/>
+        <w:t>}</w:t>
+      </w:r>
+    </w:p>
+    <w:p>
+      <w:r>
+        <w:t>thì tạo:</w:t>
+      </w:r>
+    </w:p>
+    <w:p>
+      <w:r>
+        <w:t>Views</w:t>
+      </w:r>
+      <w:r>
+        <w:br/>
+        <w:t>└── Product</w:t>
+      </w:r>
+    </w:p>
+    <w:p>
+      <w:r>
+        <w:lastRenderedPageBreak/>
+        <w:pict w14:anchorId="6479F5B2">
+          <v:rect id="_x0000_i1149" style="width:0;height:1.5pt" o:hralign="center" o:hrstd="t" o:hr="t" fillcolor="#a0a0a0" stroked="f"/>
+        </w:pict>
+      </w:r>
+    </w:p>
+    <w:p>
+      <w:r>
+        <w:t>public class BrandController : Controller</w:t>
+      </w:r>
+      <w:r>
+        <w:br/>
+        <w:t>{</w:t>
+      </w:r>
+      <w:r>
+        <w:br/>
+        <w:t>}</w:t>
+      </w:r>
+    </w:p>
+    <w:p>
+      <w:r>
+        <w:t>thì tạo:</w:t>
+      </w:r>
+    </w:p>
+    <w:p>
+      <w:r>
+        <w:t>Views</w:t>
+      </w:r>
+      <w:r>
+        <w:br/>
+        <w:t>└── Brand</w:t>
+      </w:r>
+    </w:p>
+    <w:p>
+      <w:r>
+        <w:pict w14:anchorId="35D38C99">
+          <v:rect id="_x0000_i1150" style="width:0;height:1.5pt" o:hralign="center" o:hrstd="t" o:hr="t" fillcolor="#a0a0a0" stroked="f"/>
+        </w:pict>
+      </w:r>
+    </w:p>
+    <w:p>
+      <w:pPr>
+        <w:rPr>
+          <w:b/>
+          <w:bCs/>
+        </w:rPr>
+      </w:pPr>
+      <w:r>
+        <w:rPr>
+          <w:b/>
+          <w:bCs/>
+        </w:rPr>
+        <w:t>3. Khi nào tạo file .cshtml?</w:t>
+      </w:r>
+    </w:p>
+    <w:p>
+      <w:r>
+        <w:t>Mỗi Action trả về View thì cần một file .cshtml.</w:t>
+      </w:r>
+    </w:p>
+    <w:p>
+      <w:r>
+        <w:t>Ví dụ:</w:t>
+      </w:r>
+    </w:p>
+    <w:p>
+      <w:r>
+        <w:t>Controller:</w:t>
+      </w:r>
+    </w:p>
+    <w:p>
+      <w:r>
+        <w:t>public IActionResult Index()</w:t>
+      </w:r>
+      <w:r>
+        <w:br/>
+        <w:t>{</w:t>
+      </w:r>
+      <w:r>
+        <w:br/>
+        <w:t xml:space="preserve">    return View();</w:t>
+      </w:r>
+      <w:r>
+        <w:br/>
+        <w:t>}</w:t>
+      </w:r>
+    </w:p>
+    <w:p>
+      <w:r>
+        <w:t>ASP.NET sẽ tìm:</w:t>
+      </w:r>
+    </w:p>
+    <w:p>
+      <w:r>
+        <w:t>Views/Product/Index.cshtml</w:t>
+      </w:r>
+    </w:p>
+    <w:p>
+      <w:r>
+        <w:pict w14:anchorId="0FC5A8BF">
+          <v:rect id="_x0000_i1151" style="width:0;height:1.5pt" o:hralign="center" o:hrstd="t" o:hr="t" fillcolor="#a0a0a0" stroked="f"/>
+        </w:pict>
+      </w:r>
+    </w:p>
+    <w:p>
+      <w:r>
+        <w:t>Ví dụ:</w:t>
+      </w:r>
+    </w:p>
+    <w:p>
+      <w:r>
+        <w:t>public IActionResult Details(int id)</w:t>
+      </w:r>
+      <w:r>
+        <w:br/>
+        <w:t>{</w:t>
+      </w:r>
+      <w:r>
+        <w:br/>
+        <w:t xml:space="preserve">    return View();</w:t>
+      </w:r>
+      <w:r>
+        <w:br/>
+        <w:t>}</w:t>
+      </w:r>
+    </w:p>
+    <w:p>
+      <w:r>
+        <w:t>ASP.NET sẽ tìm:</w:t>
+      </w:r>
+    </w:p>
+    <w:p>
+      <w:r>
+        <w:t>Views/Product/Details.cshtml</w:t>
+      </w:r>
+    </w:p>
+    <w:p>
+      <w:r>
+        <w:pict w14:anchorId="2CE74EBA">
+          <v:rect id="_x0000_i1152" style="width:0;height:1.5pt" o:hralign="center" o:hrstd="t" o:hr="t" fillcolor="#a0a0a0" stroked="f"/>
+        </w:pict>
+      </w:r>
+    </w:p>
+    <w:p>
+      <w:r>
+        <w:t>Nghĩa là:</w:t>
+      </w:r>
+    </w:p>
+    <w:p>
+      <w:r>
+        <w:lastRenderedPageBreak/>
+        <w:t>Action</w:t>
+      </w:r>
+      <w:r>
+        <w:br/>
+        <w:t xml:space="preserve">    ↓</w:t>
+      </w:r>
+      <w:r>
+        <w:br/>
+        <w:t>View cùng tên</w:t>
+      </w:r>
+    </w:p>
+    <w:p>
+      <w:r>
+        <w:pict w14:anchorId="40C3F6E8">
+          <v:rect id="_x0000_i1153" style="width:0;height:1.5pt" o:hralign="center" o:hrstd="t" o:hr="t" fillcolor="#a0a0a0" stroked="f"/>
+        </w:pict>
+      </w:r>
+    </w:p>
+    <w:p>
+      <w:r>
+        <w:t>Ví dụ:</w:t>
+      </w:r>
+    </w:p>
+    <w:p>
+      <w:r>
+        <w:t>public class ProductController : Controller</w:t>
+      </w:r>
+      <w:r>
+        <w:br/>
+        <w:t>{</w:t>
+      </w:r>
+      <w:r>
+        <w:br/>
+        <w:t xml:space="preserve">    public IActionResult Index()</w:t>
+      </w:r>
+      <w:r>
+        <w:br/>
+        <w:t xml:space="preserve">    {</w:t>
+      </w:r>
+      <w:r>
+        <w:br/>
+        <w:t xml:space="preserve">        return View();</w:t>
+      </w:r>
+      <w:r>
+        <w:br/>
+        <w:t xml:space="preserve">    }</w:t>
+      </w:r>
+      <w:r>
+        <w:br/>
+      </w:r>
+      <w:r>
+        <w:br/>
+        <w:t xml:space="preserve">    public IActionResult Details(int id)</w:t>
+      </w:r>
+      <w:r>
+        <w:br/>
+        <w:t xml:space="preserve">    {</w:t>
+      </w:r>
+      <w:r>
+        <w:br/>
+        <w:t xml:space="preserve">        return View();</w:t>
+      </w:r>
+      <w:r>
+        <w:br/>
+        <w:t xml:space="preserve">    }</w:t>
+      </w:r>
+      <w:r>
+        <w:br/>
+      </w:r>
+      <w:r>
+        <w:br/>
+        <w:t xml:space="preserve">    public IActionResult Search()</w:t>
+      </w:r>
+      <w:r>
+        <w:br/>
+        <w:t xml:space="preserve">    {</w:t>
+      </w:r>
+      <w:r>
+        <w:br/>
+        <w:t xml:space="preserve">        return View();</w:t>
+      </w:r>
+      <w:r>
+        <w:br/>
+        <w:t xml:space="preserve">    }</w:t>
+      </w:r>
+      <w:r>
+        <w:br/>
+        <w:t>}</w:t>
+      </w:r>
+    </w:p>
+    <w:p>
+      <w:r>
+        <w:t>Thường sẽ có:</w:t>
+      </w:r>
+    </w:p>
+    <w:p>
+      <w:r>
+        <w:t>Views</w:t>
+      </w:r>
+      <w:r>
+        <w:br/>
+        <w:t>└── Product</w:t>
+      </w:r>
+      <w:r>
+        <w:br/>
+        <w:t xml:space="preserve">    </w:t>
+      </w:r>
+      <w:r>
+        <w:rPr>
+          <w:rFonts w:ascii="MS Gothic" w:eastAsia="MS Gothic" w:hAnsi="MS Gothic" w:cs="MS Gothic" w:hint="eastAsia"/>
+        </w:rPr>
+        <w:t>├</w:t>
+      </w:r>
+      <w:r>
+        <w:rPr>
+          <w:rFonts w:ascii="Calibri" w:hAnsi="Calibri" w:cs="Calibri"/>
+        </w:rPr>
+        <w:t>──</w:t>
+      </w:r>
+      <w:r>
+        <w:t xml:space="preserve"> Index.cshtml</w:t>
+      </w:r>
+      <w:r>
+        <w:br/>
+        <w:t xml:space="preserve">    </w:t>
+      </w:r>
+      <w:r>
+        <w:rPr>
+          <w:rFonts w:ascii="MS Gothic" w:eastAsia="MS Gothic" w:hAnsi="MS Gothic" w:cs="MS Gothic" w:hint="eastAsia"/>
+        </w:rPr>
+        <w:t>├</w:t>
+      </w:r>
+      <w:r>
+        <w:rPr>
+          <w:rFonts w:ascii="Calibri" w:hAnsi="Calibri" w:cs="Calibri"/>
+        </w:rPr>
+        <w:t>──</w:t>
+      </w:r>
+      <w:r>
+        <w:t xml:space="preserve"> Details.cshtml</w:t>
+      </w:r>
+      <w:r>
+        <w:br/>
+        <w:t xml:space="preserve">    </w:t>
+      </w:r>
+      <w:r>
+        <w:rPr>
+          <w:rFonts w:ascii="Calibri" w:hAnsi="Calibri" w:cs="Calibri"/>
+        </w:rPr>
+        <w:t>└──</w:t>
+      </w:r>
+      <w:r>
+        <w:t xml:space="preserve"> Search.cshtml</w:t>
+      </w:r>
+    </w:p>
+    <w:p>
+      <w:r>
+        <w:pict w14:anchorId="38E40B1B">
+          <v:rect id="_x0000_i1154" style="width:0;height:1.5pt" o:hralign="center" o:hrstd="t" o:hr="t" fillcolor="#a0a0a0" stroked="f"/>
+        </w:pict>
+      </w:r>
+    </w:p>
+    <w:p>
+      <w:pPr>
+        <w:rPr>
+          <w:b/>
+          <w:bCs/>
+        </w:rPr>
+      </w:pPr>
+      <w:r>
+        <w:rPr>
+          <w:b/>
+          <w:bCs/>
+        </w:rPr>
+        <w:t>4. Khi nào tạo Model?</w:t>
+      </w:r>
+    </w:p>
+    <w:p>
+      <w:r>
+        <w:t>Đây là phần nhiều người nhầm nhất.</w:t>
+      </w:r>
+    </w:p>
+    <w:p>
+      <w:r>
+        <w:t>Model được tạo khi bạn có dữ liệu cần quản lý.</w:t>
+      </w:r>
+    </w:p>
+    <w:p>
+      <w:r>
+        <w:pict w14:anchorId="1F8AE912">
+          <v:rect id="_x0000_i1155" style="width:0;height:1.5pt" o:hralign="center" o:hrstd="t" o:hr="t" fillcolor="#a0a0a0" stroked="f"/>
+        </w:pict>
+      </w:r>
+    </w:p>
+    <w:p>
+      <w:r>
+        <w:lastRenderedPageBreak/>
+        <w:t>Ví dụ bảng Products</w:t>
+      </w:r>
+    </w:p>
+    <w:p>
+      <w:r>
+        <w:t>Products</w:t>
+      </w:r>
+      <w:r>
+        <w:br/>
+        <w:t>---------</w:t>
+      </w:r>
+      <w:r>
+        <w:br/>
+        <w:t>Id</w:t>
+      </w:r>
+      <w:r>
+        <w:br/>
+        <w:t>Name</w:t>
+      </w:r>
+      <w:r>
+        <w:br/>
+        <w:t>Price</w:t>
+      </w:r>
+      <w:r>
+        <w:br/>
+        <w:t>Description</w:t>
+      </w:r>
+    </w:p>
+    <w:p>
+      <w:r>
+        <w:t>=&gt; tạo</w:t>
+      </w:r>
+    </w:p>
+    <w:p>
+      <w:r>
+        <w:t>public class ProductModel</w:t>
+      </w:r>
+      <w:r>
+        <w:br/>
+        <w:t>{</w:t>
+      </w:r>
+      <w:r>
+        <w:br/>
+        <w:t xml:space="preserve">    public int Id { get; set; }</w:t>
+      </w:r>
+      <w:r>
+        <w:br/>
+      </w:r>
+      <w:r>
+        <w:br/>
+        <w:t xml:space="preserve">    public string Name { get; set; }</w:t>
+      </w:r>
+      <w:r>
+        <w:br/>
+      </w:r>
+      <w:r>
+        <w:br/>
+        <w:t xml:space="preserve">    public decimal Price { get; set; }</w:t>
+      </w:r>
+      <w:r>
+        <w:br/>
+      </w:r>
+      <w:r>
+        <w:br/>
+        <w:t xml:space="preserve">    public string Description { get; set; }</w:t>
+      </w:r>
+      <w:r>
+        <w:br/>
+        <w:t>}</w:t>
+      </w:r>
+    </w:p>
+    <w:p>
+      <w:r>
+        <w:pict w14:anchorId="2F1C1E59">
+          <v:rect id="_x0000_i1156" style="width:0;height:1.5pt" o:hralign="center" o:hrstd="t" o:hr="t" fillcolor="#a0a0a0" stroked="f"/>
+        </w:pict>
+      </w:r>
+    </w:p>
+    <w:p>
+      <w:r>
+        <w:t>Ví dụ bảng Categories</w:t>
+      </w:r>
+    </w:p>
+    <w:p>
+      <w:r>
+        <w:t>Categories</w:t>
+      </w:r>
+      <w:r>
+        <w:br/>
+        <w:t>----------</w:t>
+      </w:r>
+      <w:r>
+        <w:br/>
+        <w:t>Id</w:t>
+      </w:r>
+      <w:r>
+        <w:br/>
+        <w:t>Name</w:t>
+      </w:r>
+      <w:r>
+        <w:br/>
+        <w:t>Slug</w:t>
+      </w:r>
+    </w:p>
+    <w:p>
+      <w:r>
+        <w:t>=&gt; tạo</w:t>
+      </w:r>
+    </w:p>
+    <w:p>
+      <w:r>
+        <w:t>public class CategoryModel</w:t>
+      </w:r>
+      <w:r>
+        <w:br/>
+        <w:t>{</w:t>
+      </w:r>
+      <w:r>
+        <w:br/>
+        <w:t xml:space="preserve">    public int Id { get; set; }</w:t>
+      </w:r>
+      <w:r>
+        <w:br/>
+      </w:r>
+      <w:r>
+        <w:br/>
+        <w:t xml:space="preserve">    public string Name { get; set; }</w:t>
+      </w:r>
+      <w:r>
+        <w:br/>
+      </w:r>
+      <w:r>
+        <w:br/>
+        <w:t xml:space="preserve">    public string Slug { get; set; }</w:t>
+      </w:r>
+      <w:r>
+        <w:br/>
+        <w:t>}</w:t>
+      </w:r>
+    </w:p>
+    <w:p>
+      <w:r>
+        <w:lastRenderedPageBreak/>
+        <w:pict w14:anchorId="64C508C2">
+          <v:rect id="_x0000_i1157" style="width:0;height:1.5pt" o:hralign="center" o:hrstd="t" o:hr="t" fillcolor="#a0a0a0" stroked="f"/>
+        </w:pict>
+      </w:r>
+    </w:p>
+    <w:p>
+      <w:pPr>
+        <w:rPr>
+          <w:b/>
+          <w:bCs/>
+        </w:rPr>
+      </w:pPr>
+      <w:r>
+        <w:rPr>
+          <w:b/>
+          <w:bCs/>
+        </w:rPr>
+        <w:t>Quy tắc dễ nhớ</w:t>
+      </w:r>
+    </w:p>
+    <w:p>
+      <w:pPr>
+        <w:rPr>
+          <w:b/>
+          <w:bCs/>
+        </w:rPr>
+      </w:pPr>
+      <w:r>
+        <w:rPr>
+          <w:b/>
+          <w:bCs/>
+        </w:rPr>
+        <w:t>Có bảng trong Database</w:t>
+      </w:r>
+    </w:p>
+    <w:p>
+      <w:r>
+        <w:t>→ Tạo Model</w:t>
+      </w:r>
+    </w:p>
+    <w:p>
+      <w:r>
+        <w:t>Products</w:t>
+      </w:r>
+      <w:r>
+        <w:br/>
+        <w:t>Categories</w:t>
+      </w:r>
+      <w:r>
+        <w:br/>
+        <w:t>Brands</w:t>
+      </w:r>
+      <w:r>
+        <w:br/>
+        <w:t>Orders</w:t>
+      </w:r>
+      <w:r>
+        <w:br/>
+        <w:t>Users</w:t>
+      </w:r>
+    </w:p>
+    <w:p>
+      <w:r>
+        <w:t>↓</w:t>
+      </w:r>
+    </w:p>
+    <w:p>
+      <w:r>
+        <w:t>ProductModel</w:t>
+      </w:r>
+      <w:r>
+        <w:br/>
+        <w:t>CategoryModel</w:t>
+      </w:r>
+      <w:r>
+        <w:br/>
+        <w:t>BrandModel</w:t>
+      </w:r>
+      <w:r>
+        <w:br/>
+        <w:t>OrderModel</w:t>
+      </w:r>
+      <w:r>
+        <w:br/>
+        <w:t>UserModel</w:t>
+      </w:r>
+    </w:p>
+    <w:p>
+      <w:r>
+        <w:pict w14:anchorId="75EDDECD">
+          <v:rect id="_x0000_i1158" style="width:0;height:1.5pt" o:hralign="center" o:hrstd="t" o:hr="t" fillcolor="#a0a0a0" stroked="f"/>
+        </w:pict>
+      </w:r>
+    </w:p>
+    <w:p>
+      <w:pPr>
+        <w:rPr>
+          <w:b/>
+          <w:bCs/>
+        </w:rPr>
+      </w:pPr>
+      <w:r>
+        <w:rPr>
+          <w:b/>
+          <w:bCs/>
+        </w:rPr>
+        <w:t>5. Khi nào tạo ViewModel?</w:t>
+      </w:r>
+    </w:p>
+    <w:p>
+      <w:r>
+        <w:t>Bạn đang có:</w:t>
+      </w:r>
+    </w:p>
+    <w:p>
+      <w:r>
+        <w:t>Models</w:t>
+      </w:r>
+      <w:r>
+        <w:br/>
+        <w:t>└── ViewModels</w:t>
+      </w:r>
+    </w:p>
+    <w:p>
+      <w:r>
+        <w:t>ViewModel dùng khi View cần dữ liệu từ nhiều Model.</w:t>
+      </w:r>
+    </w:p>
+    <w:p>
+      <w:r>
+        <w:pict w14:anchorId="418966FE">
+          <v:rect id="_x0000_i1159" style="width:0;height:1.5pt" o:hralign="center" o:hrstd="t" o:hr="t" fillcolor="#a0a0a0" stroked="f"/>
+        </w:pict>
+      </w:r>
+    </w:p>
+    <w:p>
+      <w:r>
+        <w:t>Ví dụ trang chi tiết sản phẩm</w:t>
+      </w:r>
+    </w:p>
+    <w:p>
+      <w:r>
+        <w:t>Cần:</w:t>
+      </w:r>
+    </w:p>
+    <w:p>
+      <w:r>
+        <w:t>Thông tin sản phẩm</w:t>
+      </w:r>
+      <w:r>
+        <w:br/>
+        <w:t>+</w:t>
+      </w:r>
+      <w:r>
+        <w:br/>
+        <w:t>Danh mục</w:t>
+      </w:r>
+      <w:r>
+        <w:br/>
+        <w:t>+</w:t>
+      </w:r>
+      <w:r>
+        <w:br/>
+        <w:t>Thương hiệu</w:t>
+      </w:r>
+    </w:p>
+    <w:p>
+      <w:r>
+        <w:pict w14:anchorId="4F40F650">
+          <v:rect id="_x0000_i1160" style="width:0;height:1.5pt" o:hralign="center" o:hrstd="t" o:hr="t" fillcolor="#a0a0a0" stroked="f"/>
+        </w:pict>
+      </w:r>
+    </w:p>
+    <w:p>
+      <w:r>
+        <w:lastRenderedPageBreak/>
+        <w:t>Không nên truyền:</w:t>
+      </w:r>
+    </w:p>
+    <w:p>
+      <w:r>
+        <w:t>View(Product)</w:t>
+      </w:r>
+      <w:r>
+        <w:br/>
+        <w:t>View(Category)</w:t>
+      </w:r>
+      <w:r>
+        <w:br/>
+        <w:t>View(Brand)</w:t>
+      </w:r>
+    </w:p>
+    <w:p>
+      <w:r>
+        <w:pict w14:anchorId="0A364550">
+          <v:rect id="_x0000_i1161" style="width:0;height:1.5pt" o:hralign="center" o:hrstd="t" o:hr="t" fillcolor="#a0a0a0" stroked="f"/>
+        </w:pict>
+      </w:r>
+    </w:p>
+    <w:p>
+      <w:r>
+        <w:t>Mà tạo:</w:t>
+      </w:r>
+    </w:p>
+    <w:p>
+      <w:r>
+        <w:t>public class ProductDetailViewModel</w:t>
+      </w:r>
+      <w:r>
+        <w:br/>
+        <w:t>{</w:t>
+      </w:r>
+      <w:r>
+        <w:br/>
+        <w:t xml:space="preserve">    public ProductModel Product { get; set; }</w:t>
+      </w:r>
+      <w:r>
+        <w:br/>
+      </w:r>
+      <w:r>
+        <w:br/>
+        <w:t xml:space="preserve">    public CategoryModel Category { get; set; }</w:t>
+      </w:r>
+      <w:r>
+        <w:br/>
+      </w:r>
+      <w:r>
+        <w:br/>
+        <w:t xml:space="preserve">    public BrandModel Brand { get; set; }</w:t>
+      </w:r>
+      <w:r>
+        <w:br/>
+        <w:t>}</w:t>
+      </w:r>
+    </w:p>
+    <w:p>
+      <w:r>
+        <w:pict w14:anchorId="5F0DD744">
+          <v:rect id="_x0000_i1162" style="width:0;height:1.5pt" o:hralign="center" o:hrstd="t" o:hr="t" fillcolor="#a0a0a0" stroked="f"/>
+        </w:pict>
+      </w:r>
+    </w:p>
+    <w:p>
+      <w:pPr>
+        <w:rPr>
+          <w:b/>
+          <w:bCs/>
+        </w:rPr>
+      </w:pPr>
+      <w:r>
+        <w:rPr>
+          <w:b/>
+          <w:bCs/>
+        </w:rPr>
+        <w:t>Ví dụ thực tế</w:t>
+      </w:r>
+    </w:p>
+    <w:p>
+      <w:r>
+        <w:t>Giả sử mai bạn muốn làm chức năng đánh giá sản phẩm.</w:t>
+      </w:r>
+    </w:p>
+    <w:p>
+      <w:r>
+        <w:t>Bạn sẽ suy nghĩ như sau:</w:t>
+      </w:r>
+    </w:p>
+    <w:p>
+      <w:pPr>
+        <w:rPr>
+          <w:b/>
+          <w:bCs/>
+        </w:rPr>
+      </w:pPr>
+      <w:r>
+        <w:rPr>
+          <w:b/>
+          <w:bCs/>
+        </w:rPr>
+        <w:t>Bước 1</w:t>
+      </w:r>
+    </w:p>
+    <w:p>
+      <w:r>
+        <w:t>Có dữ liệu mới không?</w:t>
+      </w:r>
+    </w:p>
+    <w:p>
+      <w:r>
+        <w:t>Có.</w:t>
+      </w:r>
+    </w:p>
+    <w:p>
+      <w:r>
+        <w:t>Reviews</w:t>
+      </w:r>
+    </w:p>
+    <w:p>
+      <w:r>
+        <w:t>→ Tạo</w:t>
+      </w:r>
+    </w:p>
+    <w:p>
+      <w:r>
+        <w:t>ReviewModel</w:t>
+      </w:r>
+    </w:p>
+    <w:p>
+      <w:r>
+        <w:pict w14:anchorId="3108374D">
+          <v:rect id="_x0000_i1163" style="width:0;height:1.5pt" o:hralign="center" o:hrstd="t" o:hr="t" fillcolor="#a0a0a0" stroked="f"/>
+        </w:pict>
+      </w:r>
+    </w:p>
+    <w:p>
+      <w:pPr>
+        <w:rPr>
+          <w:b/>
+          <w:bCs/>
+        </w:rPr>
+      </w:pPr>
+      <w:r>
+        <w:rPr>
+          <w:b/>
+          <w:bCs/>
+        </w:rPr>
+        <w:t>Bước 2</w:t>
+      </w:r>
+    </w:p>
+    <w:p>
+      <w:r>
+        <w:t>Có nghiệp vụ mới không?</w:t>
+      </w:r>
+    </w:p>
+    <w:p>
+      <w:r>
+        <w:t>Có.</w:t>
+      </w:r>
+    </w:p>
+    <w:p>
+      <w:r>
+        <w:lastRenderedPageBreak/>
+        <w:t>Xem đánh giá</w:t>
+      </w:r>
+      <w:r>
+        <w:br/>
+        <w:t>Thêm đánh giá</w:t>
+      </w:r>
+      <w:r>
+        <w:br/>
+        <w:t>Xóa đánh giá</w:t>
+      </w:r>
+    </w:p>
+    <w:p>
+      <w:r>
+        <w:t>→ Tạo</w:t>
+      </w:r>
+    </w:p>
+    <w:p>
+      <w:r>
+        <w:t>ReviewController</w:t>
+      </w:r>
+    </w:p>
+    <w:p>
+      <w:r>
+        <w:pict w14:anchorId="233E5885">
+          <v:rect id="_x0000_i1164" style="width:0;height:1.5pt" o:hralign="center" o:hrstd="t" o:hr="t" fillcolor="#a0a0a0" stroked="f"/>
+        </w:pict>
+      </w:r>
+    </w:p>
+    <w:p>
+      <w:pPr>
+        <w:rPr>
+          <w:b/>
+          <w:bCs/>
+        </w:rPr>
+      </w:pPr>
+      <w:r>
+        <w:rPr>
+          <w:b/>
+          <w:bCs/>
+        </w:rPr>
+        <w:t>Bước 3</w:t>
+      </w:r>
+    </w:p>
+    <w:p>
+      <w:r>
+        <w:t>Có giao diện mới không?</w:t>
+      </w:r>
+    </w:p>
+    <w:p>
+      <w:r>
+        <w:t>Có.</w:t>
+      </w:r>
+    </w:p>
+    <w:p>
+      <w:r>
+        <w:t>Danh sách đánh giá</w:t>
+      </w:r>
+      <w:r>
+        <w:br/>
+        <w:t>Chi tiết đánh giá</w:t>
+      </w:r>
+    </w:p>
+    <w:p>
+      <w:r>
+        <w:t>→ Tạo</w:t>
+      </w:r>
+    </w:p>
+    <w:p>
+      <w:r>
+        <w:t>Views</w:t>
+      </w:r>
+      <w:r>
+        <w:br/>
+        <w:t>└── Review</w:t>
+      </w:r>
+      <w:r>
+        <w:br/>
+        <w:t xml:space="preserve">    </w:t>
+      </w:r>
+      <w:r>
+        <w:rPr>
+          <w:rFonts w:ascii="MS Gothic" w:eastAsia="MS Gothic" w:hAnsi="MS Gothic" w:cs="MS Gothic" w:hint="eastAsia"/>
+        </w:rPr>
+        <w:t>├</w:t>
+      </w:r>
+      <w:r>
+        <w:rPr>
+          <w:rFonts w:ascii="Calibri" w:hAnsi="Calibri" w:cs="Calibri"/>
+        </w:rPr>
+        <w:t>──</w:t>
+      </w:r>
+      <w:r>
+        <w:t xml:space="preserve"> Index.cshtml</w:t>
+      </w:r>
+      <w:r>
+        <w:br/>
+        <w:t xml:space="preserve">    </w:t>
+      </w:r>
+      <w:r>
+        <w:rPr>
+          <w:rFonts w:ascii="Calibri" w:hAnsi="Calibri" w:cs="Calibri"/>
+        </w:rPr>
+        <w:t>└──</w:t>
+      </w:r>
+      <w:r>
+        <w:t xml:space="preserve"> Details.cshtml</w:t>
+      </w:r>
+    </w:p>
+    <w:p/>
     <w:sectPr>
       <w:pgSz w:w="12240" w:h="15840"/>
       <w:pgMar w:top="1440" w:right="1440" w:bottom="1440" w:left="1440" w:header="720" w:footer="720" w:gutter="0"/>

</xml_diff>

<commit_message>
feat: add login user
</commit_message>
<xml_diff>
--- a/ghi-chu-asp.net.docx
+++ b/ghi-chu-asp.net.docx
@@ -2557,7 +2557,7 @@
     <w:p>
       <w:r>
         <w:pict w14:anchorId="665BC045">
-          <v:rect id="_x0000_i1430" style="width:0;height:1.5pt" o:hralign="center" o:hrstd="t" o:hr="t" fillcolor="#a0a0a0" stroked="f"/>
+          <v:rect id="_x0000_i1032" style="width:0;height:1.5pt" o:hralign="center" o:hrstd="t" o:hr="t" fillcolor="#a0a0a0" stroked="f"/>
         </w:pict>
       </w:r>
     </w:p>
@@ -2618,7 +2618,7 @@
     <w:p>
       <w:r>
         <w:pict w14:anchorId="68EC02E3">
-          <v:rect id="_x0000_i1431" style="width:0;height:1.5pt" o:hralign="center" o:hrstd="t" o:hr="t" fillcolor="#a0a0a0" stroked="f"/>
+          <v:rect id="_x0000_i1033" style="width:0;height:1.5pt" o:hralign="center" o:hrstd="t" o:hr="t" fillcolor="#a0a0a0" stroked="f"/>
         </w:pict>
       </w:r>
     </w:p>
@@ -2697,7 +2697,7 @@
     <w:p>
       <w:r>
         <w:pict w14:anchorId="4137A6EA">
-          <v:rect id="_x0000_i1432" style="width:0;height:1.5pt" o:hralign="center" o:hrstd="t" o:hr="t" fillcolor="#a0a0a0" stroked="f"/>
+          <v:rect id="_x0000_i1034" style="width:0;height:1.5pt" o:hralign="center" o:hrstd="t" o:hr="t" fillcolor="#a0a0a0" stroked="f"/>
         </w:pict>
       </w:r>
     </w:p>
@@ -3228,7 +3228,7 @@
     <w:p>
       <w:r>
         <w:pict w14:anchorId="24D3529E">
-          <v:rect id="_x0000_i1146" style="width:0;height:1.5pt" o:hralign="center" o:hrstd="t" o:hr="t" fillcolor="#a0a0a0" stroked="f"/>
+          <v:rect id="_x0000_i1035" style="width:0;height:1.5pt" o:hralign="center" o:hrstd="t" o:hr="t" fillcolor="#a0a0a0" stroked="f"/>
         </w:pict>
       </w:r>
     </w:p>
@@ -3347,7 +3347,7 @@
     <w:p>
       <w:r>
         <w:pict w14:anchorId="5A154254">
-          <v:rect id="_x0000_i1147" style="width:0;height:1.5pt" o:hralign="center" o:hrstd="t" o:hr="t" fillcolor="#a0a0a0" stroked="f"/>
+          <v:rect id="_x0000_i1036" style="width:0;height:1.5pt" o:hralign="center" o:hrstd="t" o:hr="t" fillcolor="#a0a0a0" stroked="f"/>
         </w:pict>
       </w:r>
     </w:p>
@@ -3382,7 +3382,7 @@
     <w:p>
       <w:r>
         <w:pict w14:anchorId="7C9E6AF3">
-          <v:rect id="_x0000_i1148" style="width:0;height:1.5pt" o:hralign="center" o:hrstd="t" o:hr="t" fillcolor="#a0a0a0" stroked="f"/>
+          <v:rect id="_x0000_i1037" style="width:0;height:1.5pt" o:hralign="center" o:hrstd="t" o:hr="t" fillcolor="#a0a0a0" stroked="f"/>
         </w:pict>
       </w:r>
     </w:p>
@@ -3469,7 +3469,7 @@
       <w:r>
         <w:lastRenderedPageBreak/>
         <w:pict w14:anchorId="6479F5B2">
-          <v:rect id="_x0000_i1149" style="width:0;height:1.5pt" o:hralign="center" o:hrstd="t" o:hr="t" fillcolor="#a0a0a0" stroked="f"/>
+          <v:rect id="_x0000_i1038" style="width:0;height:1.5pt" o:hralign="center" o:hrstd="t" o:hr="t" fillcolor="#a0a0a0" stroked="f"/>
         </w:pict>
       </w:r>
     </w:p>
@@ -3503,7 +3503,7 @@
     <w:p>
       <w:r>
         <w:pict w14:anchorId="35D38C99">
-          <v:rect id="_x0000_i1150" style="width:0;height:1.5pt" o:hralign="center" o:hrstd="t" o:hr="t" fillcolor="#a0a0a0" stroked="f"/>
+          <v:rect id="_x0000_i1039" style="width:0;height:1.5pt" o:hralign="center" o:hrstd="t" o:hr="t" fillcolor="#a0a0a0" stroked="f"/>
         </w:pict>
       </w:r>
     </w:p>
@@ -3567,7 +3567,7 @@
     <w:p>
       <w:r>
         <w:pict w14:anchorId="0FC5A8BF">
-          <v:rect id="_x0000_i1151" style="width:0;height:1.5pt" o:hralign="center" o:hrstd="t" o:hr="t" fillcolor="#a0a0a0" stroked="f"/>
+          <v:rect id="_x0000_i1040" style="width:0;height:1.5pt" o:hralign="center" o:hrstd="t" o:hr="t" fillcolor="#a0a0a0" stroked="f"/>
         </w:pict>
       </w:r>
     </w:p>
@@ -3606,7 +3606,7 @@
     <w:p>
       <w:r>
         <w:pict w14:anchorId="2CE74EBA">
-          <v:rect id="_x0000_i1152" style="width:0;height:1.5pt" o:hralign="center" o:hrstd="t" o:hr="t" fillcolor="#a0a0a0" stroked="f"/>
+          <v:rect id="_x0000_i1041" style="width:0;height:1.5pt" o:hralign="center" o:hrstd="t" o:hr="t" fillcolor="#a0a0a0" stroked="f"/>
         </w:pict>
       </w:r>
     </w:p>
@@ -3632,7 +3632,7 @@
     <w:p>
       <w:r>
         <w:pict w14:anchorId="40C3F6E8">
-          <v:rect id="_x0000_i1153" style="width:0;height:1.5pt" o:hralign="center" o:hrstd="t" o:hr="t" fillcolor="#a0a0a0" stroked="f"/>
+          <v:rect id="_x0000_i1042" style="width:0;height:1.5pt" o:hralign="center" o:hrstd="t" o:hr="t" fillcolor="#a0a0a0" stroked="f"/>
         </w:pict>
       </w:r>
     </w:p>
@@ -3776,7 +3776,7 @@
     <w:p>
       <w:r>
         <w:pict w14:anchorId="38E40B1B">
-          <v:rect id="_x0000_i1154" style="width:0;height:1.5pt" o:hralign="center" o:hrstd="t" o:hr="t" fillcolor="#a0a0a0" stroked="f"/>
+          <v:rect id="_x0000_i1043" style="width:0;height:1.5pt" o:hralign="center" o:hrstd="t" o:hr="t" fillcolor="#a0a0a0" stroked="f"/>
         </w:pict>
       </w:r>
     </w:p>
@@ -3808,7 +3808,7 @@
     <w:p>
       <w:r>
         <w:pict w14:anchorId="1F8AE912">
-          <v:rect id="_x0000_i1155" style="width:0;height:1.5pt" o:hralign="center" o:hrstd="t" o:hr="t" fillcolor="#a0a0a0" stroked="f"/>
+          <v:rect id="_x0000_i1044" style="width:0;height:1.5pt" o:hralign="center" o:hrstd="t" o:hr="t" fillcolor="#a0a0a0" stroked="f"/>
         </w:pict>
       </w:r>
     </w:p>
@@ -3889,7 +3889,7 @@
     <w:p>
       <w:r>
         <w:pict w14:anchorId="2F1C1E59">
-          <v:rect id="_x0000_i1156" style="width:0;height:1.5pt" o:hralign="center" o:hrstd="t" o:hr="t" fillcolor="#a0a0a0" stroked="f"/>
+          <v:rect id="_x0000_i1045" style="width:0;height:1.5pt" o:hralign="center" o:hrstd="t" o:hr="t" fillcolor="#a0a0a0" stroked="f"/>
         </w:pict>
       </w:r>
     </w:p>
@@ -3959,7 +3959,7 @@
       <w:r>
         <w:lastRenderedPageBreak/>
         <w:pict w14:anchorId="64C508C2">
-          <v:rect id="_x0000_i1157" style="width:0;height:1.5pt" o:hralign="center" o:hrstd="t" o:hr="t" fillcolor="#a0a0a0" stroked="f"/>
+          <v:rect id="_x0000_i1046" style="width:0;height:1.5pt" o:hralign="center" o:hrstd="t" o:hr="t" fillcolor="#a0a0a0" stroked="f"/>
         </w:pict>
       </w:r>
     </w:p>
@@ -4048,7 +4048,7 @@
     <w:p>
       <w:r>
         <w:pict w14:anchorId="75EDDECD">
-          <v:rect id="_x0000_i1158" style="width:0;height:1.5pt" o:hralign="center" o:hrstd="t" o:hr="t" fillcolor="#a0a0a0" stroked="f"/>
+          <v:rect id="_x0000_i1047" style="width:0;height:1.5pt" o:hralign="center" o:hrstd="t" o:hr="t" fillcolor="#a0a0a0" stroked="f"/>
         </w:pict>
       </w:r>
     </w:p>
@@ -4089,7 +4089,7 @@
     <w:p>
       <w:r>
         <w:pict w14:anchorId="418966FE">
-          <v:rect id="_x0000_i1159" style="width:0;height:1.5pt" o:hralign="center" o:hrstd="t" o:hr="t" fillcolor="#a0a0a0" stroked="f"/>
+          <v:rect id="_x0000_i1048" style="width:0;height:1.5pt" o:hralign="center" o:hrstd="t" o:hr="t" fillcolor="#a0a0a0" stroked="f"/>
         </w:pict>
       </w:r>
     </w:p>
@@ -4127,7 +4127,7 @@
     <w:p>
       <w:r>
         <w:pict w14:anchorId="4F40F650">
-          <v:rect id="_x0000_i1160" style="width:0;height:1.5pt" o:hralign="center" o:hrstd="t" o:hr="t" fillcolor="#a0a0a0" stroked="f"/>
+          <v:rect id="_x0000_i1049" style="width:0;height:1.5pt" o:hralign="center" o:hrstd="t" o:hr="t" fillcolor="#a0a0a0" stroked="f"/>
         </w:pict>
       </w:r>
     </w:p>
@@ -4153,7 +4153,7 @@
     <w:p>
       <w:r>
         <w:pict w14:anchorId="0A364550">
-          <v:rect id="_x0000_i1161" style="width:0;height:1.5pt" o:hralign="center" o:hrstd="t" o:hr="t" fillcolor="#a0a0a0" stroked="f"/>
+          <v:rect id="_x0000_i1050" style="width:0;height:1.5pt" o:hralign="center" o:hrstd="t" o:hr="t" fillcolor="#a0a0a0" stroked="f"/>
         </w:pict>
       </w:r>
     </w:p>
@@ -4196,7 +4196,7 @@
     <w:p>
       <w:r>
         <w:pict w14:anchorId="5F0DD744">
-          <v:rect id="_x0000_i1162" style="width:0;height:1.5pt" o:hralign="center" o:hrstd="t" o:hr="t" fillcolor="#a0a0a0" stroked="f"/>
+          <v:rect id="_x0000_i1051" style="width:0;height:1.5pt" o:hralign="center" o:hrstd="t" o:hr="t" fillcolor="#a0a0a0" stroked="f"/>
         </w:pict>
       </w:r>
     </w:p>
@@ -4268,7 +4268,7 @@
     <w:p>
       <w:r>
         <w:pict w14:anchorId="3108374D">
-          <v:rect id="_x0000_i1163" style="width:0;height:1.5pt" o:hralign="center" o:hrstd="t" o:hr="t" fillcolor="#a0a0a0" stroked="f"/>
+          <v:rect id="_x0000_i1052" style="width:0;height:1.5pt" o:hralign="center" o:hrstd="t" o:hr="t" fillcolor="#a0a0a0" stroked="f"/>
         </w:pict>
       </w:r>
     </w:p>
@@ -4324,7 +4324,7 @@
     <w:p>
       <w:r>
         <w:pict w14:anchorId="233E5885">
-          <v:rect id="_x0000_i1164" style="width:0;height:1.5pt" o:hralign="center" o:hrstd="t" o:hr="t" fillcolor="#a0a0a0" stroked="f"/>
+          <v:rect id="_x0000_i1053" style="width:0;height:1.5pt" o:hralign="center" o:hrstd="t" o:hr="t" fillcolor="#a0a0a0" stroked="f"/>
         </w:pict>
       </w:r>
     </w:p>
@@ -4406,6 +4406,196 @@
       </w:r>
       <w:r>
         <w:t xml:space="preserve"> Details.cshtml</w:t>
+      </w:r>
+    </w:p>
+    <w:p>
+      <w:r>
+        <w:br w:type="page"/>
+      </w:r>
+    </w:p>
+    <w:p>
+      <w:pPr>
+        <w:jc w:val="center"/>
+        <w:rPr>
+          <w:b/>
+          <w:bCs/>
+          <w:sz w:val="32"/>
+          <w:szCs w:val="32"/>
+        </w:rPr>
+      </w:pPr>
+      <w:r>
+        <w:rPr>
+          <w:b/>
+          <w:bCs/>
+          <w:sz w:val="32"/>
+          <w:szCs w:val="32"/>
+        </w:rPr>
+        <w:lastRenderedPageBreak/>
+        <w:t>ViewModel</w:t>
+      </w:r>
+    </w:p>
+    <w:p>
+      <w:r>
+        <w:rPr>
+          <w:noProof/>
+        </w:rPr>
+        <w:drawing>
+          <wp:inline distT="0" distB="0" distL="0" distR="0" wp14:anchorId="06D2A6B3" wp14:editId="3405E09F">
+            <wp:extent cx="5943600" cy="3912235"/>
+            <wp:effectExtent l="0" t="0" r="0" b="0"/>
+            <wp:docPr id="1437832452" name="Picture 1"/>
+            <wp:cNvGraphicFramePr>
+              <a:graphicFrameLocks xmlns:a="http://schemas.openxmlformats.org/drawingml/2006/main" noChangeAspect="1"/>
+            </wp:cNvGraphicFramePr>
+            <a:graphic xmlns:a="http://schemas.openxmlformats.org/drawingml/2006/main">
+              <a:graphicData uri="http://schemas.openxmlformats.org/drawingml/2006/picture">
+                <pic:pic xmlns:pic="http://schemas.openxmlformats.org/drawingml/2006/picture">
+                  <pic:nvPicPr>
+                    <pic:cNvPr id="1437832452" name=""/>
+                    <pic:cNvPicPr/>
+                  </pic:nvPicPr>
+                  <pic:blipFill>
+                    <a:blip r:embed="rId24"/>
+                    <a:stretch>
+                      <a:fillRect/>
+                    </a:stretch>
+                  </pic:blipFill>
+                  <pic:spPr>
+                    <a:xfrm>
+                      <a:off x="0" y="0"/>
+                      <a:ext cx="5943600" cy="3912235"/>
+                    </a:xfrm>
+                    <a:prstGeom prst="rect">
+                      <a:avLst/>
+                    </a:prstGeom>
+                  </pic:spPr>
+                </pic:pic>
+              </a:graphicData>
+            </a:graphic>
+          </wp:inline>
+        </w:drawing>
+      </w:r>
+    </w:p>
+    <w:p>
+      <w:r>
+        <w:br w:type="page"/>
+      </w:r>
+    </w:p>
+    <w:p>
+      <w:pPr>
+        <w:jc w:val="center"/>
+        <w:rPr>
+          <w:b/>
+          <w:bCs/>
+          <w:sz w:val="32"/>
+          <w:szCs w:val="32"/>
+        </w:rPr>
+      </w:pPr>
+      <w:r>
+        <w:rPr>
+          <w:b/>
+          <w:bCs/>
+          <w:sz w:val="32"/>
+          <w:szCs w:val="32"/>
+        </w:rPr>
+        <w:lastRenderedPageBreak/>
+        <w:t>tại sao lại có LoginViewModel</w:t>
+      </w:r>
+      <w:r>
+        <w:rPr>
+          <w:b/>
+          <w:bCs/>
+          <w:sz w:val="32"/>
+          <w:szCs w:val="32"/>
+        </w:rPr>
+        <w:t xml:space="preserve"> và ViewModel?</w:t>
+      </w:r>
+    </w:p>
+    <w:p>
+      <w:r>
+        <w:rPr>
+          <w:b/>
+          <w:bCs/>
+        </w:rPr>
+        <w:t>Model</w:t>
+      </w:r>
+      <w:r>
+        <w:t xml:space="preserve"> (UserModel) = dữ liệu thực của bảng User trong database.</w:t>
+      </w:r>
+    </w:p>
+    <w:p>
+      <w:r>
+        <w:rPr>
+          <w:b/>
+          <w:bCs/>
+        </w:rPr>
+        <w:t>ViewModel</w:t>
+      </w:r>
+      <w:r>
+        <w:t xml:space="preserve"> (LoginViewModel, RegisterViewModel) = dữ liệu mà một màn hình cụ thể cần hiển thị hoặc nhận từ người dùng.</w:t>
+      </w:r>
+    </w:p>
+    <w:p>
+      <w:r>
+        <w:t xml:space="preserve">Vì màn hình </w:t>
+      </w:r>
+      <w:r>
+        <w:rPr>
+          <w:b/>
+          <w:bCs/>
+        </w:rPr>
+        <w:t>Login chỉ cần Username + Password</w:t>
+      </w:r>
+      <w:r>
+        <w:t>, nên tạo LoginViewModel riêng thay vì dùng cả UserModel để tránh:</w:t>
+      </w:r>
+    </w:p>
+    <w:p>
+      <w:pPr>
+        <w:pStyle w:val="ListParagraph"/>
+        <w:numPr>
+          <w:ilvl w:val="0"/>
+          <w:numId w:val="11"/>
+        </w:numPr>
+      </w:pPr>
+      <w:r>
+        <w:t xml:space="preserve">Validation bị sai (Email bắt buộc). </w:t>
+      </w:r>
+    </w:p>
+    <w:p>
+      <w:pPr>
+        <w:pStyle w:val="ListParagraph"/>
+        <w:numPr>
+          <w:ilvl w:val="0"/>
+          <w:numId w:val="11"/>
+        </w:numPr>
+      </w:pPr>
+      <w:r>
+        <w:t xml:space="preserve">Truyền dữ liệu dư thừa. </w:t>
+      </w:r>
+    </w:p>
+    <w:p>
+      <w:pPr>
+        <w:pStyle w:val="ListParagraph"/>
+        <w:numPr>
+          <w:ilvl w:val="0"/>
+          <w:numId w:val="11"/>
+        </w:numPr>
+      </w:pPr>
+      <w:r>
+        <w:t xml:space="preserve">Code khó bảo trì. </w:t>
+      </w:r>
+    </w:p>
+    <w:p>
+      <w:pPr>
+        <w:pStyle w:val="ListParagraph"/>
+        <w:numPr>
+          <w:ilvl w:val="0"/>
+          <w:numId w:val="11"/>
+        </w:numPr>
+      </w:pPr>
+      <w:r>
+        <w:t>Không đúng nguyên tắc MVC.</w:t>
       </w:r>
     </w:p>
     <w:p/>
@@ -4422,6 +4612,268 @@
 <file path=word/numbering.xml><?xml version="1.0" encoding="utf-8"?>
 <w:numbering xmlns:wpc="http://schemas.microsoft.com/office/word/2010/wordprocessingCanvas" xmlns:cx="http://schemas.microsoft.com/office/drawing/2014/chartex" xmlns:cx1="http://schemas.microsoft.com/office/drawing/2015/9/8/chartex" xmlns:cx2="http://schemas.microsoft.com/office/drawing/2015/10/21/chartex" xmlns:cx3="http://schemas.microsoft.com/office/drawing/2016/5/9/chartex" xmlns:cx4="http://schemas.microsoft.com/office/drawing/2016/5/10/chartex" xmlns:cx5="http://schemas.microsoft.com/office/drawing/2016/5/11/chartex" xmlns:cx6="http://schemas.microsoft.com/office/drawing/2016/5/12/chartex" xmlns:cx7="http://schemas.microsoft.com/office/drawing/2016/5/13/chartex" xmlns:cx8="http://schemas.microsoft.com/office/drawing/2016/5/14/chartex" xmlns:mc="http://schemas.openxmlformats.org/markup-compatibility/2006" xmlns:aink="http://schemas.microsoft.com/office/drawing/2016/ink" xmlns:am3d="http://schemas.microsoft.com/office/drawing/2017/model3d" xmlns:o="urn:schemas-microsoft-com:office:office" xmlns:oel="http://schemas.microsoft.com/office/2019/extlst" xmlns:r="http://schemas.openxmlformats.org/officeDocument/2006/relationships" xmlns:m="http://schemas.openxmlformats.org/officeDocument/2006/math" xmlns:v="urn:schemas-microsoft-com:vml" xmlns:wp14="http://schemas.microsoft.com/office/word/2010/wordprocessingDrawing" xmlns:wp="http://schemas.openxmlformats.org/drawingml/2006/wordprocessingDrawing" xmlns:w10="urn:schemas-microsoft-com:office:word" xmlns:w="http://schemas.openxmlformats.org/wordprocessingml/2006/main" xmlns:w14="http://schemas.microsoft.com/office/word/2010/wordml" xmlns:w15="http://schemas.microsoft.com/office/word/2012/wordml" xmlns:w16cex="http://schemas.microsoft.com/office/word/2018/wordml/cex" xmlns:w16cid="http://schemas.microsoft.com/office/word/2016/wordml/cid" xmlns:w16="http://schemas.microsoft.com/office/word/2018/wordml" xmlns:w16du="http://schemas.microsoft.com/office/word/2023/wordml/word16du" xmlns:w16sdtdh="http://schemas.microsoft.com/office/word/2020/wordml/sdtdatahash" xmlns:w16sdtfl="http://schemas.microsoft.com/office/word/2024/wordml/sdtformatlock" xmlns:w16se="http://schemas.microsoft.com/office/word/2015/wordml/symex" xmlns:wpg="http://schemas.microsoft.com/office/word/2010/wordprocessingGroup" xmlns:wpi="http://schemas.microsoft.com/office/word/2010/wordprocessingInk" xmlns:wne="http://schemas.microsoft.com/office/word/2006/wordml" xmlns:wps="http://schemas.microsoft.com/office/word/2010/wordprocessingShape" mc:Ignorable="w14 w15 w16se w16cid w16 w16cex w16sdtdh w16sdtfl w16du wp14">
   <w:abstractNum w:abstractNumId="0" w15:restartNumberingAfterBreak="0">
+    <w:nsid w:val="01166347"/>
+    <w:multiLevelType w:val="hybridMultilevel"/>
+    <w:tmpl w:val="F216EB1E"/>
+    <w:lvl w:ilvl="0" w:tplc="04090001">
+      <w:start w:val="1"/>
+      <w:numFmt w:val="bullet"/>
+      <w:lvlText w:val=""/>
+      <w:lvlJc w:val="left"/>
+      <w:pPr>
+        <w:ind w:left="720" w:hanging="360"/>
+      </w:pPr>
+      <w:rPr>
+        <w:rFonts w:ascii="Symbol" w:hAnsi="Symbol" w:hint="default"/>
+      </w:rPr>
+    </w:lvl>
+    <w:lvl w:ilvl="1" w:tplc="04090003" w:tentative="1">
+      <w:start w:val="1"/>
+      <w:numFmt w:val="bullet"/>
+      <w:lvlText w:val="o"/>
+      <w:lvlJc w:val="left"/>
+      <w:pPr>
+        <w:ind w:left="1440" w:hanging="360"/>
+      </w:pPr>
+      <w:rPr>
+        <w:rFonts w:ascii="Courier New" w:hAnsi="Courier New" w:cs="Courier New" w:hint="default"/>
+      </w:rPr>
+    </w:lvl>
+    <w:lvl w:ilvl="2" w:tplc="04090005" w:tentative="1">
+      <w:start w:val="1"/>
+      <w:numFmt w:val="bullet"/>
+      <w:lvlText w:val=""/>
+      <w:lvlJc w:val="left"/>
+      <w:pPr>
+        <w:ind w:left="2160" w:hanging="360"/>
+      </w:pPr>
+      <w:rPr>
+        <w:rFonts w:ascii="Wingdings" w:hAnsi="Wingdings" w:hint="default"/>
+      </w:rPr>
+    </w:lvl>
+    <w:lvl w:ilvl="3" w:tplc="04090001" w:tentative="1">
+      <w:start w:val="1"/>
+      <w:numFmt w:val="bullet"/>
+      <w:lvlText w:val=""/>
+      <w:lvlJc w:val="left"/>
+      <w:pPr>
+        <w:ind w:left="2880" w:hanging="360"/>
+      </w:pPr>
+      <w:rPr>
+        <w:rFonts w:ascii="Symbol" w:hAnsi="Symbol" w:hint="default"/>
+      </w:rPr>
+    </w:lvl>
+    <w:lvl w:ilvl="4" w:tplc="04090003" w:tentative="1">
+      <w:start w:val="1"/>
+      <w:numFmt w:val="bullet"/>
+      <w:lvlText w:val="o"/>
+      <w:lvlJc w:val="left"/>
+      <w:pPr>
+        <w:ind w:left="3600" w:hanging="360"/>
+      </w:pPr>
+      <w:rPr>
+        <w:rFonts w:ascii="Courier New" w:hAnsi="Courier New" w:cs="Courier New" w:hint="default"/>
+      </w:rPr>
+    </w:lvl>
+    <w:lvl w:ilvl="5" w:tplc="04090005" w:tentative="1">
+      <w:start w:val="1"/>
+      <w:numFmt w:val="bullet"/>
+      <w:lvlText w:val=""/>
+      <w:lvlJc w:val="left"/>
+      <w:pPr>
+        <w:ind w:left="4320" w:hanging="360"/>
+      </w:pPr>
+      <w:rPr>
+        <w:rFonts w:ascii="Wingdings" w:hAnsi="Wingdings" w:hint="default"/>
+      </w:rPr>
+    </w:lvl>
+    <w:lvl w:ilvl="6" w:tplc="04090001" w:tentative="1">
+      <w:start w:val="1"/>
+      <w:numFmt w:val="bullet"/>
+      <w:lvlText w:val=""/>
+      <w:lvlJc w:val="left"/>
+      <w:pPr>
+        <w:ind w:left="5040" w:hanging="360"/>
+      </w:pPr>
+      <w:rPr>
+        <w:rFonts w:ascii="Symbol" w:hAnsi="Symbol" w:hint="default"/>
+      </w:rPr>
+    </w:lvl>
+    <w:lvl w:ilvl="7" w:tplc="04090003" w:tentative="1">
+      <w:start w:val="1"/>
+      <w:numFmt w:val="bullet"/>
+      <w:lvlText w:val="o"/>
+      <w:lvlJc w:val="left"/>
+      <w:pPr>
+        <w:ind w:left="5760" w:hanging="360"/>
+      </w:pPr>
+      <w:rPr>
+        <w:rFonts w:ascii="Courier New" w:hAnsi="Courier New" w:cs="Courier New" w:hint="default"/>
+      </w:rPr>
+    </w:lvl>
+    <w:lvl w:ilvl="8" w:tplc="04090005" w:tentative="1">
+      <w:start w:val="1"/>
+      <w:numFmt w:val="bullet"/>
+      <w:lvlText w:val=""/>
+      <w:lvlJc w:val="left"/>
+      <w:pPr>
+        <w:ind w:left="6480" w:hanging="360"/>
+      </w:pPr>
+      <w:rPr>
+        <w:rFonts w:ascii="Wingdings" w:hAnsi="Wingdings" w:hint="default"/>
+      </w:rPr>
+    </w:lvl>
+  </w:abstractNum>
+  <w:abstractNum w:abstractNumId="1" w15:restartNumberingAfterBreak="0">
+    <w:nsid w:val="021478B5"/>
+    <w:multiLevelType w:val="multilevel"/>
+    <w:tmpl w:val="F5683BC4"/>
+    <w:lvl w:ilvl="0">
+      <w:start w:val="1"/>
+      <w:numFmt w:val="bullet"/>
+      <w:lvlText w:val=""/>
+      <w:lvlJc w:val="left"/>
+      <w:pPr>
+        <w:tabs>
+          <w:tab w:val="num" w:pos="720"/>
+        </w:tabs>
+        <w:ind w:left="720" w:hanging="360"/>
+      </w:pPr>
+      <w:rPr>
+        <w:rFonts w:ascii="Symbol" w:hAnsi="Symbol" w:hint="default"/>
+        <w:sz w:val="20"/>
+      </w:rPr>
+    </w:lvl>
+    <w:lvl w:ilvl="1" w:tentative="1">
+      <w:start w:val="1"/>
+      <w:numFmt w:val="bullet"/>
+      <w:lvlText w:val="o"/>
+      <w:lvlJc w:val="left"/>
+      <w:pPr>
+        <w:tabs>
+          <w:tab w:val="num" w:pos="1440"/>
+        </w:tabs>
+        <w:ind w:left="1440" w:hanging="360"/>
+      </w:pPr>
+      <w:rPr>
+        <w:rFonts w:ascii="Courier New" w:hAnsi="Courier New" w:hint="default"/>
+        <w:sz w:val="20"/>
+      </w:rPr>
+    </w:lvl>
+    <w:lvl w:ilvl="2" w:tentative="1">
+      <w:start w:val="1"/>
+      <w:numFmt w:val="bullet"/>
+      <w:lvlText w:val=""/>
+      <w:lvlJc w:val="left"/>
+      <w:pPr>
+        <w:tabs>
+          <w:tab w:val="num" w:pos="2160"/>
+        </w:tabs>
+        <w:ind w:left="2160" w:hanging="360"/>
+      </w:pPr>
+      <w:rPr>
+        <w:rFonts w:ascii="Wingdings" w:hAnsi="Wingdings" w:hint="default"/>
+        <w:sz w:val="20"/>
+      </w:rPr>
+    </w:lvl>
+    <w:lvl w:ilvl="3" w:tentative="1">
+      <w:start w:val="1"/>
+      <w:numFmt w:val="bullet"/>
+      <w:lvlText w:val=""/>
+      <w:lvlJc w:val="left"/>
+      <w:pPr>
+        <w:tabs>
+          <w:tab w:val="num" w:pos="2880"/>
+        </w:tabs>
+        <w:ind w:left="2880" w:hanging="360"/>
+      </w:pPr>
+      <w:rPr>
+        <w:rFonts w:ascii="Wingdings" w:hAnsi="Wingdings" w:hint="default"/>
+        <w:sz w:val="20"/>
+      </w:rPr>
+    </w:lvl>
+    <w:lvl w:ilvl="4" w:tentative="1">
+      <w:start w:val="1"/>
+      <w:numFmt w:val="bullet"/>
+      <w:lvlText w:val=""/>
+      <w:lvlJc w:val="left"/>
+      <w:pPr>
+        <w:tabs>
+          <w:tab w:val="num" w:pos="3600"/>
+        </w:tabs>
+        <w:ind w:left="3600" w:hanging="360"/>
+      </w:pPr>
+      <w:rPr>
+        <w:rFonts w:ascii="Wingdings" w:hAnsi="Wingdings" w:hint="default"/>
+        <w:sz w:val="20"/>
+      </w:rPr>
+    </w:lvl>
+    <w:lvl w:ilvl="5" w:tentative="1">
+      <w:start w:val="1"/>
+      <w:numFmt w:val="bullet"/>
+      <w:lvlText w:val=""/>
+      <w:lvlJc w:val="left"/>
+      <w:pPr>
+        <w:tabs>
+          <w:tab w:val="num" w:pos="4320"/>
+        </w:tabs>
+        <w:ind w:left="4320" w:hanging="360"/>
+      </w:pPr>
+      <w:rPr>
+        <w:rFonts w:ascii="Wingdings" w:hAnsi="Wingdings" w:hint="default"/>
+        <w:sz w:val="20"/>
+      </w:rPr>
+    </w:lvl>
+    <w:lvl w:ilvl="6" w:tentative="1">
+      <w:start w:val="1"/>
+      <w:numFmt w:val="bullet"/>
+      <w:lvlText w:val=""/>
+      <w:lvlJc w:val="left"/>
+      <w:pPr>
+        <w:tabs>
+          <w:tab w:val="num" w:pos="5040"/>
+        </w:tabs>
+        <w:ind w:left="5040" w:hanging="360"/>
+      </w:pPr>
+      <w:rPr>
+        <w:rFonts w:ascii="Wingdings" w:hAnsi="Wingdings" w:hint="default"/>
+        <w:sz w:val="20"/>
+      </w:rPr>
+    </w:lvl>
+    <w:lvl w:ilvl="7" w:tentative="1">
+      <w:start w:val="1"/>
+      <w:numFmt w:val="bullet"/>
+      <w:lvlText w:val=""/>
+      <w:lvlJc w:val="left"/>
+      <w:pPr>
+        <w:tabs>
+          <w:tab w:val="num" w:pos="5760"/>
+        </w:tabs>
+        <w:ind w:left="5760" w:hanging="360"/>
+      </w:pPr>
+      <w:rPr>
+        <w:rFonts w:ascii="Wingdings" w:hAnsi="Wingdings" w:hint="default"/>
+        <w:sz w:val="20"/>
+      </w:rPr>
+    </w:lvl>
+    <w:lvl w:ilvl="8" w:tentative="1">
+      <w:start w:val="1"/>
+      <w:numFmt w:val="bullet"/>
+      <w:lvlText w:val=""/>
+      <w:lvlJc w:val="left"/>
+      <w:pPr>
+        <w:tabs>
+          <w:tab w:val="num" w:pos="6480"/>
+        </w:tabs>
+        <w:ind w:left="6480" w:hanging="360"/>
+      </w:pPr>
+      <w:rPr>
+        <w:rFonts w:ascii="Wingdings" w:hAnsi="Wingdings" w:hint="default"/>
+        <w:sz w:val="20"/>
+      </w:rPr>
+    </w:lvl>
+  </w:abstractNum>
+  <w:abstractNum w:abstractNumId="2" w15:restartNumberingAfterBreak="0">
     <w:nsid w:val="22CE70DD"/>
     <w:multiLevelType w:val="multilevel"/>
     <w:tmpl w:val="57140FBC"/>
@@ -4535,7 +4987,7 @@
       </w:pPr>
     </w:lvl>
   </w:abstractNum>
-  <w:abstractNum w:abstractNumId="1" w15:restartNumberingAfterBreak="0">
+  <w:abstractNum w:abstractNumId="3" w15:restartNumberingAfterBreak="0">
     <w:nsid w:val="24116465"/>
     <w:multiLevelType w:val="multilevel"/>
     <w:tmpl w:val="9BFEF634"/>
@@ -4684,7 +5136,93 @@
       </w:rPr>
     </w:lvl>
   </w:abstractNum>
-  <w:abstractNum w:abstractNumId="2" w15:restartNumberingAfterBreak="0">
+  <w:abstractNum w:abstractNumId="4" w15:restartNumberingAfterBreak="0">
+    <w:nsid w:val="2B5231B7"/>
+    <w:multiLevelType w:val="hybridMultilevel"/>
+    <w:tmpl w:val="0B5C0CEA"/>
+    <w:lvl w:ilvl="0" w:tplc="0409000F">
+      <w:start w:val="1"/>
+      <w:numFmt w:val="decimal"/>
+      <w:lvlText w:val="%1."/>
+      <w:lvlJc w:val="left"/>
+      <w:pPr>
+        <w:ind w:left="720" w:hanging="360"/>
+      </w:pPr>
+    </w:lvl>
+    <w:lvl w:ilvl="1" w:tplc="04090019" w:tentative="1">
+      <w:start w:val="1"/>
+      <w:numFmt w:val="lowerLetter"/>
+      <w:lvlText w:val="%2."/>
+      <w:lvlJc w:val="left"/>
+      <w:pPr>
+        <w:ind w:left="1440" w:hanging="360"/>
+      </w:pPr>
+    </w:lvl>
+    <w:lvl w:ilvl="2" w:tplc="0409001B" w:tentative="1">
+      <w:start w:val="1"/>
+      <w:numFmt w:val="lowerRoman"/>
+      <w:lvlText w:val="%3."/>
+      <w:lvlJc w:val="right"/>
+      <w:pPr>
+        <w:ind w:left="2160" w:hanging="180"/>
+      </w:pPr>
+    </w:lvl>
+    <w:lvl w:ilvl="3" w:tplc="0409000F" w:tentative="1">
+      <w:start w:val="1"/>
+      <w:numFmt w:val="decimal"/>
+      <w:lvlText w:val="%4."/>
+      <w:lvlJc w:val="left"/>
+      <w:pPr>
+        <w:ind w:left="2880" w:hanging="360"/>
+      </w:pPr>
+    </w:lvl>
+    <w:lvl w:ilvl="4" w:tplc="04090019" w:tentative="1">
+      <w:start w:val="1"/>
+      <w:numFmt w:val="lowerLetter"/>
+      <w:lvlText w:val="%5."/>
+      <w:lvlJc w:val="left"/>
+      <w:pPr>
+        <w:ind w:left="3600" w:hanging="360"/>
+      </w:pPr>
+    </w:lvl>
+    <w:lvl w:ilvl="5" w:tplc="0409001B" w:tentative="1">
+      <w:start w:val="1"/>
+      <w:numFmt w:val="lowerRoman"/>
+      <w:lvlText w:val="%6."/>
+      <w:lvlJc w:val="right"/>
+      <w:pPr>
+        <w:ind w:left="4320" w:hanging="180"/>
+      </w:pPr>
+    </w:lvl>
+    <w:lvl w:ilvl="6" w:tplc="0409000F" w:tentative="1">
+      <w:start w:val="1"/>
+      <w:numFmt w:val="decimal"/>
+      <w:lvlText w:val="%7."/>
+      <w:lvlJc w:val="left"/>
+      <w:pPr>
+        <w:ind w:left="5040" w:hanging="360"/>
+      </w:pPr>
+    </w:lvl>
+    <w:lvl w:ilvl="7" w:tplc="04090019" w:tentative="1">
+      <w:start w:val="1"/>
+      <w:numFmt w:val="lowerLetter"/>
+      <w:lvlText w:val="%8."/>
+      <w:lvlJc w:val="left"/>
+      <w:pPr>
+        <w:ind w:left="5760" w:hanging="360"/>
+      </w:pPr>
+    </w:lvl>
+    <w:lvl w:ilvl="8" w:tplc="0409001B" w:tentative="1">
+      <w:start w:val="1"/>
+      <w:numFmt w:val="lowerRoman"/>
+      <w:lvlText w:val="%9."/>
+      <w:lvlJc w:val="right"/>
+      <w:pPr>
+        <w:ind w:left="6480" w:hanging="180"/>
+      </w:pPr>
+    </w:lvl>
+  </w:abstractNum>
+  <w:abstractNum w:abstractNumId="5" w15:restartNumberingAfterBreak="0">
     <w:nsid w:val="444C63B5"/>
     <w:multiLevelType w:val="multilevel"/>
     <w:tmpl w:val="ABA8ED22"/>
@@ -4833,7 +5371,7 @@
       </w:rPr>
     </w:lvl>
   </w:abstractNum>
-  <w:abstractNum w:abstractNumId="3" w15:restartNumberingAfterBreak="0">
+  <w:abstractNum w:abstractNumId="6" w15:restartNumberingAfterBreak="0">
     <w:nsid w:val="4CD438BD"/>
     <w:multiLevelType w:val="multilevel"/>
     <w:tmpl w:val="DC3C93C8"/>
@@ -4982,7 +5520,7 @@
       </w:rPr>
     </w:lvl>
   </w:abstractNum>
-  <w:abstractNum w:abstractNumId="4" w15:restartNumberingAfterBreak="0">
+  <w:abstractNum w:abstractNumId="7" w15:restartNumberingAfterBreak="0">
     <w:nsid w:val="5EBC1FBA"/>
     <w:multiLevelType w:val="multilevel"/>
     <w:tmpl w:val="D8C46B14"/>
@@ -5131,7 +5669,7 @@
       </w:rPr>
     </w:lvl>
   </w:abstractNum>
-  <w:abstractNum w:abstractNumId="5" w15:restartNumberingAfterBreak="0">
+  <w:abstractNum w:abstractNumId="8" w15:restartNumberingAfterBreak="0">
     <w:nsid w:val="68194282"/>
     <w:multiLevelType w:val="multilevel"/>
     <w:tmpl w:val="8042E988"/>
@@ -5280,7 +5818,7 @@
       </w:rPr>
     </w:lvl>
   </w:abstractNum>
-  <w:abstractNum w:abstractNumId="6" w15:restartNumberingAfterBreak="0">
+  <w:abstractNum w:abstractNumId="9" w15:restartNumberingAfterBreak="0">
     <w:nsid w:val="73B52B43"/>
     <w:multiLevelType w:val="multilevel"/>
     <w:tmpl w:val="59884D7E"/>
@@ -5397,7 +5935,7 @@
       </w:rPr>
     </w:lvl>
   </w:abstractNum>
-  <w:abstractNum w:abstractNumId="7" w15:restartNumberingAfterBreak="0">
+  <w:abstractNum w:abstractNumId="10" w15:restartNumberingAfterBreak="0">
     <w:nsid w:val="763E0766"/>
     <w:multiLevelType w:val="multilevel"/>
     <w:tmpl w:val="2BD6197E"/>
@@ -5547,28 +6085,37 @@
     </w:lvl>
   </w:abstractNum>
   <w:num w:numId="1" w16cid:durableId="430272983">
+    <w:abstractNumId w:val="9"/>
+  </w:num>
+  <w:num w:numId="2" w16cid:durableId="137504538">
+    <w:abstractNumId w:val="2"/>
+  </w:num>
+  <w:num w:numId="3" w16cid:durableId="1963071122">
+    <w:abstractNumId w:val="5"/>
+  </w:num>
+  <w:num w:numId="4" w16cid:durableId="848760794">
+    <w:abstractNumId w:val="10"/>
+  </w:num>
+  <w:num w:numId="5" w16cid:durableId="565577409">
+    <w:abstractNumId w:val="7"/>
+  </w:num>
+  <w:num w:numId="6" w16cid:durableId="2099518094">
     <w:abstractNumId w:val="6"/>
   </w:num>
-  <w:num w:numId="2" w16cid:durableId="137504538">
-    <w:abstractNumId w:val="0"/>
+  <w:num w:numId="7" w16cid:durableId="1236621603">
+    <w:abstractNumId w:val="8"/>
   </w:num>
-  <w:num w:numId="3" w16cid:durableId="1963071122">
-    <w:abstractNumId w:val="2"/>
+  <w:num w:numId="8" w16cid:durableId="1895266124">
+    <w:abstractNumId w:val="3"/>
   </w:num>
-  <w:num w:numId="4" w16cid:durableId="848760794">
-    <w:abstractNumId w:val="7"/>
+  <w:num w:numId="9" w16cid:durableId="369114185">
+    <w:abstractNumId w:val="1"/>
   </w:num>
-  <w:num w:numId="5" w16cid:durableId="565577409">
+  <w:num w:numId="10" w16cid:durableId="806699983">
     <w:abstractNumId w:val="4"/>
   </w:num>
-  <w:num w:numId="6" w16cid:durableId="2099518094">
-    <w:abstractNumId w:val="3"/>
-  </w:num>
-  <w:num w:numId="7" w16cid:durableId="1236621603">
-    <w:abstractNumId w:val="5"/>
-  </w:num>
-  <w:num w:numId="8" w16cid:durableId="1895266124">
-    <w:abstractNumId w:val="1"/>
+  <w:num w:numId="11" w16cid:durableId="1873417436">
+    <w:abstractNumId w:val="0"/>
   </w:num>
 </w:numbering>
 </file>

</xml_diff>

<commit_message>
feat: update role admin
</commit_message>
<xml_diff>
--- a/ghi-chu-asp.net.docx
+++ b/ghi-chu-asp.net.docx
@@ -4799,7 +4799,737 @@
         <w:t>Id chỉ là "mã để tìm", còn user mới là "người đã tìm thấy". Muốn xóa thì phải tìm thấy người trước đã.</w:t>
       </w:r>
     </w:p>
-    <w:p/>
+    <w:p>
+      <w:r>
+        <w:br w:type="page"/>
+      </w:r>
+    </w:p>
+    <w:p>
+      <w:pPr>
+        <w:jc w:val="center"/>
+        <w:rPr>
+          <w:b/>
+          <w:bCs/>
+          <w:sz w:val="32"/>
+          <w:szCs w:val="32"/>
+        </w:rPr>
+      </w:pPr>
+      <w:r>
+        <w:rPr>
+          <w:b/>
+          <w:bCs/>
+          <w:sz w:val="32"/>
+          <w:szCs w:val="32"/>
+        </w:rPr>
+        <w:lastRenderedPageBreak/>
+        <w:t>Thêm RoleId vào AspNetUsers</w:t>
+      </w:r>
+    </w:p>
+    <w:p>
+      <w:r>
+        <w:t>Mặc định không cần có RoleId trong AspNetUsers.</w:t>
+      </w:r>
+    </w:p>
+    <w:p>
+      <w:r>
+        <w:t xml:space="preserve">Thêm vào </w:t>
+      </w:r>
+      <w:r>
+        <w:t>Để hiển thị Dropdown khi tạo User</w:t>
+      </w:r>
+    </w:p>
+    <w:p>
+      <w:r>
+        <w:drawing>
+          <wp:inline distT="0" distB="0" distL="0" distR="0" wp14:anchorId="557C1AF1" wp14:editId="6505CFA7">
+            <wp:extent cx="5943600" cy="3629025"/>
+            <wp:effectExtent l="0" t="0" r="0" b="9525"/>
+            <wp:docPr id="461438446" name="Picture 1"/>
+            <wp:cNvGraphicFramePr>
+              <a:graphicFrameLocks xmlns:a="http://schemas.openxmlformats.org/drawingml/2006/main" noChangeAspect="1"/>
+            </wp:cNvGraphicFramePr>
+            <a:graphic xmlns:a="http://schemas.openxmlformats.org/drawingml/2006/main">
+              <a:graphicData uri="http://schemas.openxmlformats.org/drawingml/2006/picture">
+                <pic:pic xmlns:pic="http://schemas.openxmlformats.org/drawingml/2006/picture">
+                  <pic:nvPicPr>
+                    <pic:cNvPr id="461438446" name=""/>
+                    <pic:cNvPicPr/>
+                  </pic:nvPicPr>
+                  <pic:blipFill>
+                    <a:blip r:embed="rId25"/>
+                    <a:stretch>
+                      <a:fillRect/>
+                    </a:stretch>
+                  </pic:blipFill>
+                  <pic:spPr>
+                    <a:xfrm>
+                      <a:off x="0" y="0"/>
+                      <a:ext cx="5943600" cy="3629025"/>
+                    </a:xfrm>
+                    <a:prstGeom prst="rect">
+                      <a:avLst/>
+                    </a:prstGeom>
+                  </pic:spPr>
+                </pic:pic>
+              </a:graphicData>
+            </a:graphic>
+          </wp:inline>
+        </w:drawing>
+      </w:r>
+    </w:p>
+    <w:p>
+      <w:r>
+        <w:lastRenderedPageBreak/>
+        <w:drawing>
+          <wp:inline distT="0" distB="0" distL="0" distR="0" wp14:anchorId="54853365" wp14:editId="42DDDBA2">
+            <wp:extent cx="5943600" cy="6163945"/>
+            <wp:effectExtent l="0" t="0" r="0" b="8255"/>
+            <wp:docPr id="369968189" name="Picture 1"/>
+            <wp:cNvGraphicFramePr>
+              <a:graphicFrameLocks xmlns:a="http://schemas.openxmlformats.org/drawingml/2006/main" noChangeAspect="1"/>
+            </wp:cNvGraphicFramePr>
+            <a:graphic xmlns:a="http://schemas.openxmlformats.org/drawingml/2006/main">
+              <a:graphicData uri="http://schemas.openxmlformats.org/drawingml/2006/picture">
+                <pic:pic xmlns:pic="http://schemas.openxmlformats.org/drawingml/2006/picture">
+                  <pic:nvPicPr>
+                    <pic:cNvPr id="369968189" name=""/>
+                    <pic:cNvPicPr/>
+                  </pic:nvPicPr>
+                  <pic:blipFill>
+                    <a:blip r:embed="rId26"/>
+                    <a:stretch>
+                      <a:fillRect/>
+                    </a:stretch>
+                  </pic:blipFill>
+                  <pic:spPr>
+                    <a:xfrm>
+                      <a:off x="0" y="0"/>
+                      <a:ext cx="5943600" cy="6163945"/>
+                    </a:xfrm>
+                    <a:prstGeom prst="rect">
+                      <a:avLst/>
+                    </a:prstGeom>
+                  </pic:spPr>
+                </pic:pic>
+              </a:graphicData>
+            </a:graphic>
+          </wp:inline>
+        </w:drawing>
+      </w:r>
+    </w:p>
+    <w:p>
+      <w:r>
+        <w:t>Lúc này:</w:t>
+      </w:r>
+    </w:p>
+    <w:p>
+      <w:pPr>
+        <w:numPr>
+          <w:ilvl w:val="0"/>
+          <w:numId w:val="13"/>
+        </w:numPr>
+      </w:pPr>
+      <w:r>
+        <w:t xml:space="preserve">AppUserModel </w:t>
+      </w:r>
+      <w:r>
+        <w:rPr>
+          <w:b/>
+          <w:bCs/>
+        </w:rPr>
+        <w:t>không cần có RoleId</w:t>
+      </w:r>
+      <w:r>
+        <w:t xml:space="preserve">. </w:t>
+      </w:r>
+    </w:p>
+    <w:p>
+      <w:pPr>
+        <w:numPr>
+          <w:ilvl w:val="0"/>
+          <w:numId w:val="13"/>
+        </w:numPr>
+      </w:pPr>
+      <w:r>
+        <w:t xml:space="preserve">AspNetUsers </w:t>
+      </w:r>
+      <w:r>
+        <w:rPr>
+          <w:b/>
+          <w:bCs/>
+        </w:rPr>
+        <w:t>không có cột RoleId</w:t>
+      </w:r>
+      <w:r>
+        <w:t xml:space="preserve">. </w:t>
+      </w:r>
+    </w:p>
+    <w:p>
+      <w:pPr>
+        <w:numPr>
+          <w:ilvl w:val="0"/>
+          <w:numId w:val="13"/>
+        </w:numPr>
+      </w:pPr>
+      <w:r>
+        <w:t xml:space="preserve">Quan hệ User–Role vẫn được Identity lưu đúng trong AspNetUserRoles. </w:t>
+      </w:r>
+    </w:p>
+    <w:p>
+      <w:r>
+        <w:t xml:space="preserve">Đây là cách triển khai phổ biến trong các dự án ASP.NET Core vì tách biệt </w:t>
+      </w:r>
+      <w:r>
+        <w:rPr>
+          <w:b/>
+          <w:bCs/>
+        </w:rPr>
+        <w:t>dữ liệu dùng để hiển thị/nhập liệu (ViewModel)</w:t>
+      </w:r>
+      <w:r>
+        <w:t xml:space="preserve"> với </w:t>
+      </w:r>
+      <w:r>
+        <w:rPr>
+          <w:b/>
+          <w:bCs/>
+        </w:rPr>
+        <w:t>dữ liệu lưu trong cơ sở dữ liệu (Entity/IdentityUser)</w:t>
+      </w:r>
+      <w:r>
+        <w:t>.</w:t>
+      </w:r>
+    </w:p>
+    <w:p>
+      <w:pPr>
+        <w:pStyle w:val="ListParagraph"/>
+        <w:numPr>
+          <w:ilvl w:val="1"/>
+          <w:numId w:val="13"/>
+        </w:numPr>
+        <w:ind w:left="426"/>
+        <w:rPr>
+          <w:color w:val="EE0000"/>
+        </w:rPr>
+      </w:pPr>
+      <w:r>
+        <w:rPr>
+          <w:color w:val="EE0000"/>
+        </w:rPr>
+        <w:lastRenderedPageBreak/>
+        <w:t>AppUserModel</w:t>
+      </w:r>
+      <w:r>
+        <w:rPr>
+          <w:color w:val="EE0000"/>
+        </w:rPr>
+        <w:t xml:space="preserve"> giống với </w:t>
+      </w:r>
+      <w:r>
+        <w:rPr>
+          <w:color w:val="EE0000"/>
+        </w:rPr>
+        <w:t>CreateUserViewModel</w:t>
+      </w:r>
+      <w:r>
+        <w:rPr>
+          <w:color w:val="EE0000"/>
+        </w:rPr>
+        <w:t xml:space="preserve"> nhưng </w:t>
+      </w:r>
+      <w:r>
+        <w:rPr>
+          <w:color w:val="EE0000"/>
+        </w:rPr>
+        <w:t>CreateUserViewModel</w:t>
+      </w:r>
+      <w:r>
+        <w:rPr>
+          <w:color w:val="EE0000"/>
+        </w:rPr>
+        <w:t xml:space="preserve"> có thêm </w:t>
+      </w:r>
+      <w:r>
+        <w:rPr>
+          <w:color w:val="EE0000"/>
+        </w:rPr>
+        <w:t>RoleId</w:t>
+      </w:r>
+      <w:r>
+        <w:rPr>
+          <w:color w:val="EE0000"/>
+        </w:rPr>
+        <w:t xml:space="preserve"> để hiển thị trên </w:t>
+      </w:r>
+      <w:r>
+        <w:rPr>
+          <w:color w:val="EE0000"/>
+        </w:rPr>
+        <w:t>Dropdown</w:t>
+      </w:r>
+      <w:r>
+        <w:rPr>
+          <w:color w:val="EE0000"/>
+        </w:rPr>
+        <w:t xml:space="preserve"> khi tạo User</w:t>
+      </w:r>
+    </w:p>
+    <w:p>
+      <w:pPr>
+        <w:spacing w:after="0" w:line="240" w:lineRule="auto"/>
+        <w:ind w:left="142" w:firstLine="218"/>
+        <w:rPr>
+          <w:rFonts w:ascii="Times New Roman" w:eastAsia="Times New Roman" w:hAnsi="Times New Roman" w:cs="Times New Roman"/>
+          <w:color w:val="EE0000"/>
+          <w:kern w:val="0"/>
+          <w14:ligatures w14:val="none"/>
+        </w:rPr>
+      </w:pPr>
+      <w:r>
+        <w:rPr>
+          <w:rFonts w:ascii="Courier New" w:eastAsia="Times New Roman" w:hAnsi="Courier New" w:cs="Courier New"/>
+          <w:color w:val="EE0000"/>
+          <w:kern w:val="0"/>
+          <w:sz w:val="20"/>
+          <w:szCs w:val="20"/>
+          <w14:ligatures w14:val="none"/>
+        </w:rPr>
+        <w:t>AddToRoleAsync()</w:t>
+      </w:r>
+      <w:r>
+        <w:rPr>
+          <w:rFonts w:ascii="Times New Roman" w:eastAsia="Times New Roman" w:hAnsi="Times New Roman" w:cs="Times New Roman"/>
+          <w:color w:val="EE0000"/>
+          <w:kern w:val="0"/>
+          <w14:ligatures w14:val="none"/>
+        </w:rPr>
+        <w:t xml:space="preserve"> → </w:t>
+      </w:r>
+      <w:r>
+        <w:rPr>
+          <w:rFonts w:ascii="Times New Roman" w:eastAsia="Times New Roman" w:hAnsi="Times New Roman" w:cs="Times New Roman"/>
+          <w:b/>
+          <w:bCs/>
+          <w:color w:val="EE0000"/>
+          <w:kern w:val="0"/>
+          <w14:ligatures w14:val="none"/>
+        </w:rPr>
+        <w:t>Gán 1 Role cho User</w:t>
+      </w:r>
+      <w:r>
+        <w:rPr>
+          <w:rFonts w:ascii="Times New Roman" w:eastAsia="Times New Roman" w:hAnsi="Times New Roman" w:cs="Times New Roman"/>
+          <w:color w:val="EE0000"/>
+          <w:kern w:val="0"/>
+          <w14:ligatures w14:val="none"/>
+        </w:rPr>
+        <w:t xml:space="preserve">. </w:t>
+      </w:r>
+    </w:p>
+    <w:p>
+      <w:pPr>
+        <w:ind w:left="142" w:firstLine="218"/>
+        <w:rPr>
+          <w:rFonts w:ascii="Times New Roman" w:eastAsia="Times New Roman" w:hAnsi="Times New Roman" w:cs="Times New Roman"/>
+          <w:b/>
+          <w:bCs/>
+          <w:color w:val="EE0000"/>
+          <w:kern w:val="0"/>
+          <w14:ligatures w14:val="none"/>
+        </w:rPr>
+      </w:pPr>
+      <w:r>
+        <w:rPr>
+          <w:rFonts w:ascii="Courier New" w:eastAsia="Times New Roman" w:hAnsi="Courier New" w:cs="Courier New"/>
+          <w:color w:val="EE0000"/>
+          <w:kern w:val="0"/>
+          <w:sz w:val="20"/>
+          <w:szCs w:val="20"/>
+          <w14:ligatures w14:val="none"/>
+        </w:rPr>
+        <w:t>AddToRolesAsync()</w:t>
+      </w:r>
+      <w:r>
+        <w:rPr>
+          <w:rFonts w:ascii="Times New Roman" w:eastAsia="Times New Roman" w:hAnsi="Times New Roman" w:cs="Times New Roman"/>
+          <w:color w:val="EE0000"/>
+          <w:kern w:val="0"/>
+          <w14:ligatures w14:val="none"/>
+        </w:rPr>
+        <w:t xml:space="preserve"> → </w:t>
+      </w:r>
+      <w:r>
+        <w:rPr>
+          <w:rFonts w:ascii="Times New Roman" w:eastAsia="Times New Roman" w:hAnsi="Times New Roman" w:cs="Times New Roman"/>
+          <w:b/>
+          <w:bCs/>
+          <w:color w:val="EE0000"/>
+          <w:kern w:val="0"/>
+          <w14:ligatures w14:val="none"/>
+        </w:rPr>
+        <w:t>Gán nhiều Role cho User cùng lúc</w:t>
+      </w:r>
+    </w:p>
+    <w:p>
+      <w:pPr>
+        <w:rPr>
+          <w:rFonts w:ascii="Times New Roman" w:eastAsia="Times New Roman" w:hAnsi="Times New Roman" w:cs="Times New Roman"/>
+          <w:b/>
+          <w:bCs/>
+          <w:color w:val="EE0000"/>
+          <w:kern w:val="0"/>
+          <w14:ligatures w14:val="none"/>
+        </w:rPr>
+      </w:pPr>
+      <w:r>
+        <w:rPr>
+          <w:rFonts w:ascii="Times New Roman" w:eastAsia="Times New Roman" w:hAnsi="Times New Roman" w:cs="Times New Roman"/>
+          <w:b/>
+          <w:bCs/>
+          <w:color w:val="EE0000"/>
+          <w:kern w:val="0"/>
+          <w14:ligatures w14:val="none"/>
+        </w:rPr>
+        <w:br w:type="page"/>
+      </w:r>
+    </w:p>
+    <w:p>
+      <w:pPr>
+        <w:ind w:left="142" w:firstLine="218"/>
+        <w:rPr>
+          <w:color w:val="EE0000"/>
+        </w:rPr>
+      </w:pPr>
+      <w:r>
+        <w:rPr>
+          <w:color w:val="EE0000"/>
+        </w:rPr>
+        <w:lastRenderedPageBreak/>
+        <w:drawing>
+          <wp:inline distT="0" distB="0" distL="0" distR="0" wp14:anchorId="6DCD26D4" wp14:editId="5D55B5AF">
+            <wp:extent cx="5351228" cy="2151354"/>
+            <wp:effectExtent l="0" t="0" r="1905" b="1905"/>
+            <wp:docPr id="166812246" name="Picture 1"/>
+            <wp:cNvGraphicFramePr>
+              <a:graphicFrameLocks xmlns:a="http://schemas.openxmlformats.org/drawingml/2006/main" noChangeAspect="1"/>
+            </wp:cNvGraphicFramePr>
+            <a:graphic xmlns:a="http://schemas.openxmlformats.org/drawingml/2006/main">
+              <a:graphicData uri="http://schemas.openxmlformats.org/drawingml/2006/picture">
+                <pic:pic xmlns:pic="http://schemas.openxmlformats.org/drawingml/2006/picture">
+                  <pic:nvPicPr>
+                    <pic:cNvPr id="166812246" name=""/>
+                    <pic:cNvPicPr/>
+                  </pic:nvPicPr>
+                  <pic:blipFill>
+                    <a:blip r:embed="rId27"/>
+                    <a:stretch>
+                      <a:fillRect/>
+                    </a:stretch>
+                  </pic:blipFill>
+                  <pic:spPr>
+                    <a:xfrm>
+                      <a:off x="0" y="0"/>
+                      <a:ext cx="5359705" cy="2154762"/>
+                    </a:xfrm>
+                    <a:prstGeom prst="rect">
+                      <a:avLst/>
+                    </a:prstGeom>
+                  </pic:spPr>
+                </pic:pic>
+              </a:graphicData>
+            </a:graphic>
+          </wp:inline>
+        </w:drawing>
+      </w:r>
+    </w:p>
+    <w:p>
+      <w:pPr>
+        <w:ind w:left="142" w:firstLine="218"/>
+        <w:rPr>
+          <w:color w:val="EE0000"/>
+        </w:rPr>
+      </w:pPr>
+      <w:r>
+        <w:rPr>
+          <w:color w:val="EE0000"/>
+        </w:rPr>
+        <w:drawing>
+          <wp:inline distT="0" distB="0" distL="0" distR="0" wp14:anchorId="4ECB348B" wp14:editId="02B23E14">
+            <wp:extent cx="5239909" cy="2529264"/>
+            <wp:effectExtent l="0" t="0" r="0" b="4445"/>
+            <wp:docPr id="1744277257" name="Picture 1"/>
+            <wp:cNvGraphicFramePr>
+              <a:graphicFrameLocks xmlns:a="http://schemas.openxmlformats.org/drawingml/2006/main" noChangeAspect="1"/>
+            </wp:cNvGraphicFramePr>
+            <a:graphic xmlns:a="http://schemas.openxmlformats.org/drawingml/2006/main">
+              <a:graphicData uri="http://schemas.openxmlformats.org/drawingml/2006/picture">
+                <pic:pic xmlns:pic="http://schemas.openxmlformats.org/drawingml/2006/picture">
+                  <pic:nvPicPr>
+                    <pic:cNvPr id="1744277257" name=""/>
+                    <pic:cNvPicPr/>
+                  </pic:nvPicPr>
+                  <pic:blipFill>
+                    <a:blip r:embed="rId28"/>
+                    <a:stretch>
+                      <a:fillRect/>
+                    </a:stretch>
+                  </pic:blipFill>
+                  <pic:spPr>
+                    <a:xfrm>
+                      <a:off x="0" y="0"/>
+                      <a:ext cx="5242337" cy="2530436"/>
+                    </a:xfrm>
+                    <a:prstGeom prst="rect">
+                      <a:avLst/>
+                    </a:prstGeom>
+                  </pic:spPr>
+                </pic:pic>
+              </a:graphicData>
+            </a:graphic>
+          </wp:inline>
+        </w:drawing>
+      </w:r>
+    </w:p>
+    <w:p>
+      <w:pPr>
+        <w:ind w:left="142" w:firstLine="218"/>
+        <w:rPr>
+          <w:color w:val="EE0000"/>
+        </w:rPr>
+      </w:pPr>
+    </w:p>
+    <w:p>
+      <w:pPr>
+        <w:ind w:left="142" w:firstLine="218"/>
+        <w:rPr>
+          <w:color w:val="EE0000"/>
+        </w:rPr>
+      </w:pPr>
+      <w:r>
+        <w:rPr>
+          <w:color w:val="EE0000"/>
+        </w:rPr>
+        <w:t>//return View(await _userManager.Users.OrderByDescending(p =&gt; p.Id).ToListAsync());</w:t>
+      </w:r>
+    </w:p>
+    <w:p>
+      <w:pPr>
+        <w:ind w:left="142" w:firstLine="218"/>
+        <w:rPr>
+          <w:color w:val="EE0000"/>
+        </w:rPr>
+      </w:pPr>
+      <w:r>
+        <w:rPr>
+          <w:color w:val="EE0000"/>
+        </w:rPr>
+        <w:t xml:space="preserve">chỉ lấy được danh sách </w:t>
+      </w:r>
+      <w:r>
+        <w:rPr>
+          <w:b/>
+          <w:bCs/>
+          <w:color w:val="EE0000"/>
+        </w:rPr>
+        <w:t>User</w:t>
+      </w:r>
+      <w:r>
+        <w:rPr>
+          <w:color w:val="EE0000"/>
+        </w:rPr>
+        <w:t xml:space="preserve">, </w:t>
+      </w:r>
+      <w:r>
+        <w:rPr>
+          <w:b/>
+          <w:bCs/>
+          <w:color w:val="EE0000"/>
+        </w:rPr>
+        <w:t>không có thông tin Role</w:t>
+      </w:r>
+      <w:r>
+        <w:rPr>
+          <w:color w:val="EE0000"/>
+        </w:rPr>
+        <w:t>.</w:t>
+      </w:r>
+    </w:p>
+    <w:p>
+      <w:pPr>
+        <w:ind w:left="142" w:firstLine="218"/>
+        <w:rPr>
+          <w:color w:val="EE0000"/>
+        </w:rPr>
+      </w:pPr>
+    </w:p>
+    <w:p>
+      <w:pPr>
+        <w:ind w:left="142" w:firstLine="218"/>
+        <w:rPr>
+          <w:color w:val="EE0000"/>
+        </w:rPr>
+      </w:pPr>
+      <w:r>
+        <w:rPr>
+          <w:color w:val="EE0000"/>
+        </w:rPr>
+        <w:drawing>
+          <wp:inline distT="0" distB="0" distL="0" distR="0" wp14:anchorId="504C21B3" wp14:editId="0302F9DB">
+            <wp:extent cx="5143036" cy="1637969"/>
+            <wp:effectExtent l="0" t="0" r="635" b="635"/>
+            <wp:docPr id="1940263112" name="Picture 1"/>
+            <wp:cNvGraphicFramePr>
+              <a:graphicFrameLocks xmlns:a="http://schemas.openxmlformats.org/drawingml/2006/main" noChangeAspect="1"/>
+            </wp:cNvGraphicFramePr>
+            <a:graphic xmlns:a="http://schemas.openxmlformats.org/drawingml/2006/main">
+              <a:graphicData uri="http://schemas.openxmlformats.org/drawingml/2006/picture">
+                <pic:pic xmlns:pic="http://schemas.openxmlformats.org/drawingml/2006/picture">
+                  <pic:nvPicPr>
+                    <pic:cNvPr id="1940263112" name=""/>
+                    <pic:cNvPicPr/>
+                  </pic:nvPicPr>
+                  <pic:blipFill>
+                    <a:blip r:embed="rId29"/>
+                    <a:stretch>
+                      <a:fillRect/>
+                    </a:stretch>
+                  </pic:blipFill>
+                  <pic:spPr>
+                    <a:xfrm>
+                      <a:off x="0" y="0"/>
+                      <a:ext cx="5157127" cy="1642457"/>
+                    </a:xfrm>
+                    <a:prstGeom prst="rect">
+                      <a:avLst/>
+                    </a:prstGeom>
+                  </pic:spPr>
+                </pic:pic>
+              </a:graphicData>
+            </a:graphic>
+          </wp:inline>
+        </w:drawing>
+      </w:r>
+    </w:p>
+    <w:p>
+      <w:pPr>
+        <w:ind w:left="142" w:firstLine="218"/>
+        <w:rPr>
+          <w:color w:val="EE0000"/>
+        </w:rPr>
+      </w:pPr>
+    </w:p>
+    <w:p>
+      <w:pPr>
+        <w:ind w:left="142" w:firstLine="218"/>
+        <w:rPr>
+          <w:color w:val="EE0000"/>
+        </w:rPr>
+      </w:pPr>
+      <w:r>
+        <w:rPr>
+          <w:color w:val="EE0000"/>
+        </w:rPr>
+        <w:lastRenderedPageBreak/>
+        <w:t>select new { User = u, RoleName = r.Name }).ToListAsync();</w:t>
+      </w:r>
+    </w:p>
+    <w:p>
+      <w:pPr>
+        <w:ind w:left="142" w:firstLine="218"/>
+        <w:rPr>
+          <w:color w:val="EE0000"/>
+        </w:rPr>
+      </w:pPr>
+      <w:r>
+        <w:rPr>
+          <w:color w:val="EE0000"/>
+        </w:rPr>
+        <w:drawing>
+          <wp:inline distT="0" distB="0" distL="0" distR="0" wp14:anchorId="2F9BC8D1" wp14:editId="7310126D">
+            <wp:extent cx="4738977" cy="4044332"/>
+            <wp:effectExtent l="0" t="0" r="5080" b="0"/>
+            <wp:docPr id="255101435" name="Picture 1"/>
+            <wp:cNvGraphicFramePr>
+              <a:graphicFrameLocks xmlns:a="http://schemas.openxmlformats.org/drawingml/2006/main" noChangeAspect="1"/>
+            </wp:cNvGraphicFramePr>
+            <a:graphic xmlns:a="http://schemas.openxmlformats.org/drawingml/2006/main">
+              <a:graphicData uri="http://schemas.openxmlformats.org/drawingml/2006/picture">
+                <pic:pic xmlns:pic="http://schemas.openxmlformats.org/drawingml/2006/picture">
+                  <pic:nvPicPr>
+                    <pic:cNvPr id="255101435" name=""/>
+                    <pic:cNvPicPr/>
+                  </pic:nvPicPr>
+                  <pic:blipFill>
+                    <a:blip r:embed="rId30"/>
+                    <a:stretch>
+                      <a:fillRect/>
+                    </a:stretch>
+                  </pic:blipFill>
+                  <pic:spPr>
+                    <a:xfrm>
+                      <a:off x="0" y="0"/>
+                      <a:ext cx="4749006" cy="4052891"/>
+                    </a:xfrm>
+                    <a:prstGeom prst="rect">
+                      <a:avLst/>
+                    </a:prstGeom>
+                  </pic:spPr>
+                </pic:pic>
+              </a:graphicData>
+            </a:graphic>
+          </wp:inline>
+        </w:drawing>
+      </w:r>
+    </w:p>
+    <w:p>
+      <w:pPr>
+        <w:ind w:left="142" w:firstLine="218"/>
+        <w:rPr>
+          <w:color w:val="EE0000"/>
+        </w:rPr>
+      </w:pPr>
+      <w:r>
+        <w:rPr>
+          <w:color w:val="EE0000"/>
+        </w:rPr>
+        <w:lastRenderedPageBreak/>
+        <w:drawing>
+          <wp:inline distT="0" distB="0" distL="0" distR="0" wp14:anchorId="380E43DE" wp14:editId="22F37143">
+            <wp:extent cx="4611756" cy="4259961"/>
+            <wp:effectExtent l="0" t="0" r="0" b="7620"/>
+            <wp:docPr id="2027128031" name="Picture 1"/>
+            <wp:cNvGraphicFramePr>
+              <a:graphicFrameLocks xmlns:a="http://schemas.openxmlformats.org/drawingml/2006/main" noChangeAspect="1"/>
+            </wp:cNvGraphicFramePr>
+            <a:graphic xmlns:a="http://schemas.openxmlformats.org/drawingml/2006/main">
+              <a:graphicData uri="http://schemas.openxmlformats.org/drawingml/2006/picture">
+                <pic:pic xmlns:pic="http://schemas.openxmlformats.org/drawingml/2006/picture">
+                  <pic:nvPicPr>
+                    <pic:cNvPr id="2027128031" name=""/>
+                    <pic:cNvPicPr/>
+                  </pic:nvPicPr>
+                  <pic:blipFill>
+                    <a:blip r:embed="rId31"/>
+                    <a:stretch>
+                      <a:fillRect/>
+                    </a:stretch>
+                  </pic:blipFill>
+                  <pic:spPr>
+                    <a:xfrm>
+                      <a:off x="0" y="0"/>
+                      <a:ext cx="4614396" cy="4262399"/>
+                    </a:xfrm>
+                    <a:prstGeom prst="rect">
+                      <a:avLst/>
+                    </a:prstGeom>
+                  </pic:spPr>
+                </pic:pic>
+              </a:graphicData>
+            </a:graphic>
+          </wp:inline>
+        </w:drawing>
+      </w:r>
+    </w:p>
     <w:sectPr>
       <w:pgSz w:w="12240" w:h="15840"/>
       <w:pgMar w:top="1440" w:right="1440" w:bottom="1440" w:left="1440" w:header="720" w:footer="720" w:gutter="0"/>
@@ -5871,6 +6601,150 @@
     </w:lvl>
   </w:abstractNum>
   <w:abstractNum w:abstractNumId="8" w15:restartNumberingAfterBreak="0">
+    <w:nsid w:val="577B4576"/>
+    <w:multiLevelType w:val="multilevel"/>
+    <w:tmpl w:val="9D5C5C44"/>
+    <w:lvl w:ilvl="0">
+      <w:start w:val="1"/>
+      <w:numFmt w:val="bullet"/>
+      <w:lvlText w:val=""/>
+      <w:lvlJc w:val="left"/>
+      <w:pPr>
+        <w:tabs>
+          <w:tab w:val="num" w:pos="720"/>
+        </w:tabs>
+        <w:ind w:left="720" w:hanging="360"/>
+      </w:pPr>
+      <w:rPr>
+        <w:rFonts w:ascii="Symbol" w:hAnsi="Symbol" w:hint="default"/>
+        <w:sz w:val="20"/>
+      </w:rPr>
+    </w:lvl>
+    <w:lvl w:ilvl="1">
+      <w:numFmt w:val="bullet"/>
+      <w:lvlText w:val=""/>
+      <w:lvlJc w:val="left"/>
+      <w:pPr>
+        <w:ind w:left="1440" w:hanging="360"/>
+      </w:pPr>
+      <w:rPr>
+        <w:rFonts w:ascii="Wingdings" w:eastAsiaTheme="minorHAnsi" w:hAnsi="Wingdings" w:cstheme="minorBidi" w:hint="default"/>
+      </w:rPr>
+    </w:lvl>
+    <w:lvl w:ilvl="2" w:tentative="1">
+      <w:start w:val="1"/>
+      <w:numFmt w:val="bullet"/>
+      <w:lvlText w:val=""/>
+      <w:lvlJc w:val="left"/>
+      <w:pPr>
+        <w:tabs>
+          <w:tab w:val="num" w:pos="2160"/>
+        </w:tabs>
+        <w:ind w:left="2160" w:hanging="360"/>
+      </w:pPr>
+      <w:rPr>
+        <w:rFonts w:ascii="Wingdings" w:hAnsi="Wingdings" w:hint="default"/>
+        <w:sz w:val="20"/>
+      </w:rPr>
+    </w:lvl>
+    <w:lvl w:ilvl="3" w:tentative="1">
+      <w:start w:val="1"/>
+      <w:numFmt w:val="bullet"/>
+      <w:lvlText w:val=""/>
+      <w:lvlJc w:val="left"/>
+      <w:pPr>
+        <w:tabs>
+          <w:tab w:val="num" w:pos="2880"/>
+        </w:tabs>
+        <w:ind w:left="2880" w:hanging="360"/>
+      </w:pPr>
+      <w:rPr>
+        <w:rFonts w:ascii="Wingdings" w:hAnsi="Wingdings" w:hint="default"/>
+        <w:sz w:val="20"/>
+      </w:rPr>
+    </w:lvl>
+    <w:lvl w:ilvl="4" w:tentative="1">
+      <w:start w:val="1"/>
+      <w:numFmt w:val="bullet"/>
+      <w:lvlText w:val=""/>
+      <w:lvlJc w:val="left"/>
+      <w:pPr>
+        <w:tabs>
+          <w:tab w:val="num" w:pos="3600"/>
+        </w:tabs>
+        <w:ind w:left="3600" w:hanging="360"/>
+      </w:pPr>
+      <w:rPr>
+        <w:rFonts w:ascii="Wingdings" w:hAnsi="Wingdings" w:hint="default"/>
+        <w:sz w:val="20"/>
+      </w:rPr>
+    </w:lvl>
+    <w:lvl w:ilvl="5" w:tentative="1">
+      <w:start w:val="1"/>
+      <w:numFmt w:val="bullet"/>
+      <w:lvlText w:val=""/>
+      <w:lvlJc w:val="left"/>
+      <w:pPr>
+        <w:tabs>
+          <w:tab w:val="num" w:pos="4320"/>
+        </w:tabs>
+        <w:ind w:left="4320" w:hanging="360"/>
+      </w:pPr>
+      <w:rPr>
+        <w:rFonts w:ascii="Wingdings" w:hAnsi="Wingdings" w:hint="default"/>
+        <w:sz w:val="20"/>
+      </w:rPr>
+    </w:lvl>
+    <w:lvl w:ilvl="6" w:tentative="1">
+      <w:start w:val="1"/>
+      <w:numFmt w:val="bullet"/>
+      <w:lvlText w:val=""/>
+      <w:lvlJc w:val="left"/>
+      <w:pPr>
+        <w:tabs>
+          <w:tab w:val="num" w:pos="5040"/>
+        </w:tabs>
+        <w:ind w:left="5040" w:hanging="360"/>
+      </w:pPr>
+      <w:rPr>
+        <w:rFonts w:ascii="Wingdings" w:hAnsi="Wingdings" w:hint="default"/>
+        <w:sz w:val="20"/>
+      </w:rPr>
+    </w:lvl>
+    <w:lvl w:ilvl="7" w:tentative="1">
+      <w:start w:val="1"/>
+      <w:numFmt w:val="bullet"/>
+      <w:lvlText w:val=""/>
+      <w:lvlJc w:val="left"/>
+      <w:pPr>
+        <w:tabs>
+          <w:tab w:val="num" w:pos="5760"/>
+        </w:tabs>
+        <w:ind w:left="5760" w:hanging="360"/>
+      </w:pPr>
+      <w:rPr>
+        <w:rFonts w:ascii="Wingdings" w:hAnsi="Wingdings" w:hint="default"/>
+        <w:sz w:val="20"/>
+      </w:rPr>
+    </w:lvl>
+    <w:lvl w:ilvl="8" w:tentative="1">
+      <w:start w:val="1"/>
+      <w:numFmt w:val="bullet"/>
+      <w:lvlText w:val=""/>
+      <w:lvlJc w:val="left"/>
+      <w:pPr>
+        <w:tabs>
+          <w:tab w:val="num" w:pos="6480"/>
+        </w:tabs>
+        <w:ind w:left="6480" w:hanging="360"/>
+      </w:pPr>
+      <w:rPr>
+        <w:rFonts w:ascii="Wingdings" w:hAnsi="Wingdings" w:hint="default"/>
+        <w:sz w:val="20"/>
+      </w:rPr>
+    </w:lvl>
+  </w:abstractNum>
+  <w:abstractNum w:abstractNumId="9" w15:restartNumberingAfterBreak="0">
     <w:nsid w:val="5EBC1FBA"/>
     <w:multiLevelType w:val="multilevel"/>
     <w:tmpl w:val="D8C46B14"/>
@@ -6019,7 +6893,7 @@
       </w:rPr>
     </w:lvl>
   </w:abstractNum>
-  <w:abstractNum w:abstractNumId="9" w15:restartNumberingAfterBreak="0">
+  <w:abstractNum w:abstractNumId="10" w15:restartNumberingAfterBreak="0">
     <w:nsid w:val="68194282"/>
     <w:multiLevelType w:val="multilevel"/>
     <w:tmpl w:val="8042E988"/>
@@ -6168,7 +7042,7 @@
       </w:rPr>
     </w:lvl>
   </w:abstractNum>
-  <w:abstractNum w:abstractNumId="10" w15:restartNumberingAfterBreak="0">
+  <w:abstractNum w:abstractNumId="11" w15:restartNumberingAfterBreak="0">
     <w:nsid w:val="73B52B43"/>
     <w:multiLevelType w:val="multilevel"/>
     <w:tmpl w:val="59884D7E"/>
@@ -6285,7 +7159,7 @@
       </w:rPr>
     </w:lvl>
   </w:abstractNum>
-  <w:abstractNum w:abstractNumId="11" w15:restartNumberingAfterBreak="0">
+  <w:abstractNum w:abstractNumId="12" w15:restartNumberingAfterBreak="0">
     <w:nsid w:val="763E0766"/>
     <w:multiLevelType w:val="multilevel"/>
     <w:tmpl w:val="2BD6197E"/>
@@ -6435,7 +7309,7 @@
     </w:lvl>
   </w:abstractNum>
   <w:num w:numId="1" w16cid:durableId="430272983">
-    <w:abstractNumId w:val="10"/>
+    <w:abstractNumId w:val="11"/>
   </w:num>
   <w:num w:numId="2" w16cid:durableId="137504538">
     <w:abstractNumId w:val="3"/>
@@ -6444,16 +7318,16 @@
     <w:abstractNumId w:val="6"/>
   </w:num>
   <w:num w:numId="4" w16cid:durableId="848760794">
-    <w:abstractNumId w:val="11"/>
+    <w:abstractNumId w:val="12"/>
   </w:num>
   <w:num w:numId="5" w16cid:durableId="565577409">
-    <w:abstractNumId w:val="8"/>
+    <w:abstractNumId w:val="9"/>
   </w:num>
   <w:num w:numId="6" w16cid:durableId="2099518094">
     <w:abstractNumId w:val="7"/>
   </w:num>
   <w:num w:numId="7" w16cid:durableId="1236621603">
-    <w:abstractNumId w:val="9"/>
+    <w:abstractNumId w:val="10"/>
   </w:num>
   <w:num w:numId="8" w16cid:durableId="1895266124">
     <w:abstractNumId w:val="4"/>
@@ -6469,6 +7343,9 @@
   </w:num>
   <w:num w:numId="12" w16cid:durableId="1445270732">
     <w:abstractNumId w:val="2"/>
+  </w:num>
+  <w:num w:numId="13" w16cid:durableId="1868715304">
+    <w:abstractNumId w:val="8"/>
   </w:num>
 </w:numbering>
 </file>
@@ -7459,6 +8336,30 @@
       </w:tblBorders>
     </w:tblPr>
   </w:style>
+  <w:style w:type="character" w:styleId="HTMLCode">
+    <w:name w:val="HTML Code"/>
+    <w:basedOn w:val="DefaultParagraphFont"/>
+    <w:uiPriority w:val="99"/>
+    <w:semiHidden/>
+    <w:unhideWhenUsed/>
+    <w:rsid w:val="0027141E"/>
+    <w:rPr>
+      <w:rFonts w:ascii="Courier New" w:eastAsia="Times New Roman" w:hAnsi="Courier New" w:cs="Courier New"/>
+      <w:sz w:val="20"/>
+      <w:szCs w:val="20"/>
+    </w:rPr>
+  </w:style>
+  <w:style w:type="character" w:styleId="Strong">
+    <w:name w:val="Strong"/>
+    <w:basedOn w:val="DefaultParagraphFont"/>
+    <w:uiPriority w:val="22"/>
+    <w:qFormat/>
+    <w:rsid w:val="0027141E"/>
+    <w:rPr>
+      <w:b/>
+      <w:bCs/>
+    </w:rPr>
+  </w:style>
 </w:styles>
 </file>
 

</xml_diff>

<commit_message>
feat: add cart ajax
</commit_message>
<xml_diff>
--- a/ghi-chu-asp.net.docx
+++ b/ghi-chu-asp.net.docx
@@ -23,7 +23,7 @@
                     <pic:cNvPicPr/>
                   </pic:nvPicPr>
                   <pic:blipFill>
-                    <a:blip r:embed="rId5"/>
+                    <a:blip r:embed="rId7"/>
                     <a:stretch>
                       <a:fillRect/>
                     </a:stretch>
@@ -65,7 +65,7 @@
                     <pic:cNvPicPr/>
                   </pic:nvPicPr>
                   <pic:blipFill>
-                    <a:blip r:embed="rId6"/>
+                    <a:blip r:embed="rId8"/>
                     <a:stretch>
                       <a:fillRect/>
                     </a:stretch>
@@ -107,7 +107,7 @@
                     <pic:cNvPicPr/>
                   </pic:nvPicPr>
                   <pic:blipFill>
-                    <a:blip r:embed="rId7"/>
+                    <a:blip r:embed="rId9"/>
                     <a:stretch>
                       <a:fillRect/>
                     </a:stretch>
@@ -189,7 +189,7 @@
                     <pic:cNvPicPr/>
                   </pic:nvPicPr>
                   <pic:blipFill>
-                    <a:blip r:embed="rId8"/>
+                    <a:blip r:embed="rId10"/>
                     <a:stretch>
                       <a:fillRect/>
                     </a:stretch>
@@ -610,7 +610,7 @@
                     <pic:cNvPicPr/>
                   </pic:nvPicPr>
                   <pic:blipFill>
-                    <a:blip r:embed="rId9"/>
+                    <a:blip r:embed="rId11"/>
                     <a:stretch>
                       <a:fillRect/>
                     </a:stretch>
@@ -652,7 +652,7 @@
                     <pic:cNvPicPr/>
                   </pic:nvPicPr>
                   <pic:blipFill>
-                    <a:blip r:embed="rId10"/>
+                    <a:blip r:embed="rId12"/>
                     <a:stretch>
                       <a:fillRect/>
                     </a:stretch>
@@ -695,7 +695,7 @@
                     <pic:cNvPicPr/>
                   </pic:nvPicPr>
                   <pic:blipFill>
-                    <a:blip r:embed="rId11"/>
+                    <a:blip r:embed="rId13"/>
                     <a:stretch>
                       <a:fillRect/>
                     </a:stretch>
@@ -743,7 +743,7 @@
                     <pic:cNvPicPr/>
                   </pic:nvPicPr>
                   <pic:blipFill>
-                    <a:blip r:embed="rId12"/>
+                    <a:blip r:embed="rId14"/>
                     <a:stretch>
                       <a:fillRect/>
                     </a:stretch>
@@ -1410,7 +1410,7 @@
                     <pic:cNvPicPr/>
                   </pic:nvPicPr>
                   <pic:blipFill>
-                    <a:blip r:embed="rId13"/>
+                    <a:blip r:embed="rId15"/>
                     <a:stretch>
                       <a:fillRect/>
                     </a:stretch>
@@ -1478,7 +1478,7 @@
                     <pic:cNvPicPr/>
                   </pic:nvPicPr>
                   <pic:blipFill>
-                    <a:blip r:embed="rId14"/>
+                    <a:blip r:embed="rId16"/>
                     <a:stretch>
                       <a:fillRect/>
                     </a:stretch>
@@ -1562,7 +1562,7 @@
                     <pic:cNvPicPr/>
                   </pic:nvPicPr>
                   <pic:blipFill>
-                    <a:blip r:embed="rId15"/>
+                    <a:blip r:embed="rId17"/>
                     <a:stretch>
                       <a:fillRect/>
                     </a:stretch>
@@ -1611,7 +1611,7 @@
                     <pic:cNvPicPr/>
                   </pic:nvPicPr>
                   <pic:blipFill>
-                    <a:blip r:embed="rId16"/>
+                    <a:blip r:embed="rId18"/>
                     <a:stretch>
                       <a:fillRect/>
                     </a:stretch>
@@ -1682,7 +1682,7 @@
                     <pic:cNvPicPr/>
                   </pic:nvPicPr>
                   <pic:blipFill>
-                    <a:blip r:embed="rId17"/>
+                    <a:blip r:embed="rId19"/>
                     <a:stretch>
                       <a:fillRect/>
                     </a:stretch>
@@ -1730,7 +1730,7 @@
                     <pic:cNvPicPr/>
                   </pic:nvPicPr>
                   <pic:blipFill>
-                    <a:blip r:embed="rId18"/>
+                    <a:blip r:embed="rId20"/>
                     <a:stretch>
                       <a:fillRect/>
                     </a:stretch>
@@ -1773,7 +1773,7 @@
                     <pic:cNvPicPr/>
                   </pic:nvPicPr>
                   <pic:blipFill>
-                    <a:blip r:embed="rId19"/>
+                    <a:blip r:embed="rId21"/>
                     <a:stretch>
                       <a:fillRect/>
                     </a:stretch>
@@ -1846,7 +1846,7 @@
                     <pic:cNvPicPr/>
                   </pic:nvPicPr>
                   <pic:blipFill>
-                    <a:blip r:embed="rId20"/>
+                    <a:blip r:embed="rId22"/>
                     <a:stretch>
                       <a:fillRect/>
                     </a:stretch>
@@ -1963,7 +1963,7 @@
                     <pic:cNvPicPr/>
                   </pic:nvPicPr>
                   <pic:blipFill>
-                    <a:blip r:embed="rId21"/>
+                    <a:blip r:embed="rId23"/>
                     <a:stretch>
                       <a:fillRect/>
                     </a:stretch>
@@ -2335,7 +2335,7 @@
                     <pic:cNvPicPr/>
                   </pic:nvPicPr>
                   <pic:blipFill>
-                    <a:blip r:embed="rId22"/>
+                    <a:blip r:embed="rId24"/>
                     <a:stretch>
                       <a:fillRect/>
                     </a:stretch>
@@ -2403,7 +2403,7 @@
                     <pic:cNvPicPr/>
                   </pic:nvPicPr>
                   <pic:blipFill>
-                    <a:blip r:embed="rId23"/>
+                    <a:blip r:embed="rId25"/>
                     <a:stretch>
                       <a:fillRect/>
                     </a:stretch>
@@ -4455,7 +4455,7 @@
                     <pic:cNvPicPr/>
                   </pic:nvPicPr>
                   <pic:blipFill>
-                    <a:blip r:embed="rId24"/>
+                    <a:blip r:embed="rId26"/>
                     <a:stretch>
                       <a:fillRect/>
                     </a:stretch>
@@ -4840,6 +4840,9 @@
     </w:p>
     <w:p>
       <w:r>
+        <w:rPr>
+          <w:noProof/>
+        </w:rPr>
         <w:drawing>
           <wp:inline distT="0" distB="0" distL="0" distR="0" wp14:anchorId="557C1AF1" wp14:editId="6505CFA7">
             <wp:extent cx="5943600" cy="3629025"/>
@@ -4856,7 +4859,7 @@
                     <pic:cNvPicPr/>
                   </pic:nvPicPr>
                   <pic:blipFill>
-                    <a:blip r:embed="rId25"/>
+                    <a:blip r:embed="rId27"/>
                     <a:stretch>
                       <a:fillRect/>
                     </a:stretch>
@@ -4879,6 +4882,9 @@
     </w:p>
     <w:p>
       <w:r>
+        <w:rPr>
+          <w:noProof/>
+        </w:rPr>
         <w:lastRenderedPageBreak/>
         <w:drawing>
           <wp:inline distT="0" distB="0" distL="0" distR="0" wp14:anchorId="54853365" wp14:editId="42DDDBA2">
@@ -4896,7 +4902,7 @@
                     <pic:cNvPicPr/>
                   </pic:nvPicPr>
                   <pic:blipFill>
-                    <a:blip r:embed="rId26"/>
+                    <a:blip r:embed="rId28"/>
                     <a:stretch>
                       <a:fillRect/>
                     </a:stretch>
@@ -5017,61 +5023,7 @@
           <w:color w:val="EE0000"/>
         </w:rPr>
         <w:lastRenderedPageBreak/>
-        <w:t>AppUserModel</w:t>
-      </w:r>
-      <w:r>
-        <w:rPr>
-          <w:color w:val="EE0000"/>
-        </w:rPr>
-        <w:t xml:space="preserve"> giống với </w:t>
-      </w:r>
-      <w:r>
-        <w:rPr>
-          <w:color w:val="EE0000"/>
-        </w:rPr>
-        <w:t>CreateUserViewModel</w:t>
-      </w:r>
-      <w:r>
-        <w:rPr>
-          <w:color w:val="EE0000"/>
-        </w:rPr>
-        <w:t xml:space="preserve"> nhưng </w:t>
-      </w:r>
-      <w:r>
-        <w:rPr>
-          <w:color w:val="EE0000"/>
-        </w:rPr>
-        <w:t>CreateUserViewModel</w:t>
-      </w:r>
-      <w:r>
-        <w:rPr>
-          <w:color w:val="EE0000"/>
-        </w:rPr>
-        <w:t xml:space="preserve"> có thêm </w:t>
-      </w:r>
-      <w:r>
-        <w:rPr>
-          <w:color w:val="EE0000"/>
-        </w:rPr>
-        <w:t>RoleId</w:t>
-      </w:r>
-      <w:r>
-        <w:rPr>
-          <w:color w:val="EE0000"/>
-        </w:rPr>
-        <w:t xml:space="preserve"> để hiển thị trên </w:t>
-      </w:r>
-      <w:r>
-        <w:rPr>
-          <w:color w:val="EE0000"/>
-        </w:rPr>
-        <w:t>Dropdown</w:t>
-      </w:r>
-      <w:r>
-        <w:rPr>
-          <w:color w:val="EE0000"/>
-        </w:rPr>
-        <w:t xml:space="preserve"> khi tạo User</w:t>
+        <w:t>AppUserModel giống với CreateUserViewModel nhưng CreateUserViewModel có thêm RoleId để hiển thị trên Dropdown khi tạo User</w:t>
       </w:r>
     </w:p>
     <w:p>
@@ -5202,6 +5154,7 @@
       </w:pPr>
       <w:r>
         <w:rPr>
+          <w:noProof/>
           <w:color w:val="EE0000"/>
         </w:rPr>
         <w:lastRenderedPageBreak/>
@@ -5221,7 +5174,7 @@
                     <pic:cNvPicPr/>
                   </pic:nvPicPr>
                   <pic:blipFill>
-                    <a:blip r:embed="rId27"/>
+                    <a:blip r:embed="rId29"/>
                     <a:stretch>
                       <a:fillRect/>
                     </a:stretch>
@@ -5251,6 +5204,7 @@
       </w:pPr>
       <w:r>
         <w:rPr>
+          <w:noProof/>
           <w:color w:val="EE0000"/>
         </w:rPr>
         <w:drawing>
@@ -5269,7 +5223,7 @@
                     <pic:cNvPicPr/>
                   </pic:nvPicPr>
                   <pic:blipFill>
-                    <a:blip r:embed="rId28"/>
+                    <a:blip r:embed="rId30"/>
                     <a:stretch>
                       <a:fillRect/>
                     </a:stretch>
@@ -5371,6 +5325,7 @@
       </w:pPr>
       <w:r>
         <w:rPr>
+          <w:noProof/>
           <w:color w:val="EE0000"/>
         </w:rPr>
         <w:drawing>
@@ -5389,7 +5344,7 @@
                     <pic:cNvPicPr/>
                   </pic:nvPicPr>
                   <pic:blipFill>
-                    <a:blip r:embed="rId29"/>
+                    <a:blip r:embed="rId31"/>
                     <a:stretch>
                       <a:fillRect/>
                     </a:stretch>
@@ -5442,6 +5397,7 @@
       </w:pPr>
       <w:r>
         <w:rPr>
+          <w:noProof/>
           <w:color w:val="EE0000"/>
         </w:rPr>
         <w:drawing>
@@ -5460,7 +5416,7 @@
                     <pic:cNvPicPr/>
                   </pic:nvPicPr>
                   <pic:blipFill>
-                    <a:blip r:embed="rId30"/>
+                    <a:blip r:embed="rId32"/>
                     <a:stretch>
                       <a:fillRect/>
                     </a:stretch>
@@ -5490,6 +5446,7 @@
       </w:pPr>
       <w:r>
         <w:rPr>
+          <w:noProof/>
           <w:color w:val="EE0000"/>
         </w:rPr>
         <w:lastRenderedPageBreak/>
@@ -5509,7 +5466,7 @@
                     <pic:cNvPicPr/>
                   </pic:nvPicPr>
                   <pic:blipFill>
-                    <a:blip r:embed="rId31"/>
+                    <a:blip r:embed="rId33"/>
                     <a:stretch>
                       <a:fillRect/>
                     </a:stretch>
@@ -5530,6 +5487,353 @@
         </w:drawing>
       </w:r>
     </w:p>
+    <w:p>
+      <w:pPr>
+        <w:rPr>
+          <w:color w:val="EE0000"/>
+        </w:rPr>
+      </w:pPr>
+      <w:r>
+        <w:rPr>
+          <w:color w:val="EE0000"/>
+        </w:rPr>
+        <w:br w:type="page"/>
+      </w:r>
+    </w:p>
+    <w:p>
+      <w:pPr>
+        <w:ind w:left="142" w:firstLine="218"/>
+        <w:jc w:val="center"/>
+        <w:rPr>
+          <w:b/>
+          <w:bCs/>
+          <w:color w:val="000000" w:themeColor="text1"/>
+          <w:sz w:val="32"/>
+          <w:szCs w:val="32"/>
+        </w:rPr>
+      </w:pPr>
+      <w:r>
+        <w:rPr>
+          <w:b/>
+          <w:bCs/>
+          <w:color w:val="000000" w:themeColor="text1"/>
+          <w:sz w:val="32"/>
+          <w:szCs w:val="32"/>
+        </w:rPr>
+        <w:lastRenderedPageBreak/>
+        <w:t>Ajax update đơn hàng</w:t>
+      </w:r>
+    </w:p>
+    <w:p>
+      <w:pPr>
+        <w:ind w:left="142" w:firstLine="218"/>
+        <w:rPr>
+          <w:b/>
+          <w:bCs/>
+          <w:color w:val="000000" w:themeColor="text1"/>
+          <w:sz w:val="32"/>
+          <w:szCs w:val="32"/>
+        </w:rPr>
+      </w:pPr>
+      <w:r>
+        <w:rPr>
+          <w:b/>
+          <w:bCs/>
+          <w:color w:val="000000" w:themeColor="text1"/>
+          <w:sz w:val="32"/>
+          <w:szCs w:val="32"/>
+        </w:rPr>
+        <w:drawing>
+          <wp:inline distT="0" distB="0" distL="0" distR="0" wp14:anchorId="7F33D1CD" wp14:editId="44324FAC">
+            <wp:extent cx="5943600" cy="2995930"/>
+            <wp:effectExtent l="0" t="0" r="0" b="0"/>
+            <wp:docPr id="723666941" name="Picture 1"/>
+            <wp:cNvGraphicFramePr>
+              <a:graphicFrameLocks xmlns:a="http://schemas.openxmlformats.org/drawingml/2006/main" noChangeAspect="1"/>
+            </wp:cNvGraphicFramePr>
+            <a:graphic xmlns:a="http://schemas.openxmlformats.org/drawingml/2006/main">
+              <a:graphicData uri="http://schemas.openxmlformats.org/drawingml/2006/picture">
+                <pic:pic xmlns:pic="http://schemas.openxmlformats.org/drawingml/2006/picture">
+                  <pic:nvPicPr>
+                    <pic:cNvPr id="723666941" name=""/>
+                    <pic:cNvPicPr/>
+                  </pic:nvPicPr>
+                  <pic:blipFill>
+                    <a:blip r:embed="rId34"/>
+                    <a:stretch>
+                      <a:fillRect/>
+                    </a:stretch>
+                  </pic:blipFill>
+                  <pic:spPr>
+                    <a:xfrm>
+                      <a:off x="0" y="0"/>
+                      <a:ext cx="5943600" cy="2995930"/>
+                    </a:xfrm>
+                    <a:prstGeom prst="rect">
+                      <a:avLst/>
+                    </a:prstGeom>
+                  </pic:spPr>
+                </pic:pic>
+              </a:graphicData>
+            </a:graphic>
+          </wp:inline>
+        </w:drawing>
+      </w:r>
+    </w:p>
+    <w:p>
+      <w:pPr>
+        <w:ind w:left="142" w:firstLine="218"/>
+        <w:rPr>
+          <w:b/>
+          <w:bCs/>
+          <w:color w:val="000000" w:themeColor="text1"/>
+          <w:sz w:val="32"/>
+          <w:szCs w:val="32"/>
+        </w:rPr>
+      </w:pPr>
+      <w:r>
+        <w:rPr>
+          <w:b/>
+          <w:bCs/>
+          <w:color w:val="000000" w:themeColor="text1"/>
+          <w:sz w:val="32"/>
+          <w:szCs w:val="32"/>
+        </w:rPr>
+        <w:lastRenderedPageBreak/>
+        <w:drawing>
+          <wp:inline distT="0" distB="0" distL="0" distR="0" wp14:anchorId="3D866ADD" wp14:editId="28AE3CD6">
+            <wp:extent cx="5943600" cy="5462905"/>
+            <wp:effectExtent l="0" t="0" r="0" b="4445"/>
+            <wp:docPr id="1186127274" name="Picture 1"/>
+            <wp:cNvGraphicFramePr>
+              <a:graphicFrameLocks xmlns:a="http://schemas.openxmlformats.org/drawingml/2006/main" noChangeAspect="1"/>
+            </wp:cNvGraphicFramePr>
+            <a:graphic xmlns:a="http://schemas.openxmlformats.org/drawingml/2006/main">
+              <a:graphicData uri="http://schemas.openxmlformats.org/drawingml/2006/picture">
+                <pic:pic xmlns:pic="http://schemas.openxmlformats.org/drawingml/2006/picture">
+                  <pic:nvPicPr>
+                    <pic:cNvPr id="1186127274" name=""/>
+                    <pic:cNvPicPr/>
+                  </pic:nvPicPr>
+                  <pic:blipFill>
+                    <a:blip r:embed="rId35"/>
+                    <a:stretch>
+                      <a:fillRect/>
+                    </a:stretch>
+                  </pic:blipFill>
+                  <pic:spPr>
+                    <a:xfrm>
+                      <a:off x="0" y="0"/>
+                      <a:ext cx="5943600" cy="5462905"/>
+                    </a:xfrm>
+                    <a:prstGeom prst="rect">
+                      <a:avLst/>
+                    </a:prstGeom>
+                  </pic:spPr>
+                </pic:pic>
+              </a:graphicData>
+            </a:graphic>
+          </wp:inline>
+        </w:drawing>
+      </w:r>
+    </w:p>
+    <w:p>
+      <w:pPr>
+        <w:rPr>
+          <w:color w:val="000000" w:themeColor="text1"/>
+        </w:rPr>
+      </w:pPr>
+      <w:r>
+        <w:rPr>
+          <w:b/>
+          <w:bCs/>
+          <w:color w:val="000000" w:themeColor="text1"/>
+        </w:rPr>
+        <w:t>click()</w:t>
+      </w:r>
+      <w:r>
+        <w:rPr>
+          <w:color w:val="000000" w:themeColor="text1"/>
+        </w:rPr>
+        <w:t xml:space="preserve"> là sự kiện của jQuery dùng để </w:t>
+      </w:r>
+      <w:r>
+        <w:rPr>
+          <w:b/>
+          <w:bCs/>
+          <w:color w:val="000000" w:themeColor="text1"/>
+        </w:rPr>
+        <w:t>bắt hành động người dùng nhấn chuột vào một phần tử</w:t>
+      </w:r>
+      <w:r>
+        <w:rPr>
+          <w:color w:val="000000" w:themeColor="text1"/>
+        </w:rPr>
+        <w:t xml:space="preserve"> (button, link, hình ảnh, div,...).</w:t>
+      </w:r>
+      <w:r>
+        <w:rPr>
+          <w:color w:val="000000" w:themeColor="text1"/>
+        </w:rPr>
+        <w:t xml:space="preserve"> </w:t>
+      </w:r>
+    </w:p>
+    <w:p>
+      <w:pPr>
+        <w:rPr>
+          <w:color w:val="000000" w:themeColor="text1"/>
+        </w:rPr>
+      </w:pPr>
+      <w:r>
+        <w:rPr>
+          <w:b/>
+          <w:bCs/>
+          <w:color w:val="000000" w:themeColor="text1"/>
+        </w:rPr>
+        <w:t>change()</w:t>
+      </w:r>
+      <w:r>
+        <w:rPr>
+          <w:color w:val="000000" w:themeColor="text1"/>
+        </w:rPr>
+        <w:t xml:space="preserve"> là sự kiện của jQuery dùng để </w:t>
+      </w:r>
+      <w:r>
+        <w:rPr>
+          <w:b/>
+          <w:bCs/>
+          <w:color w:val="000000" w:themeColor="text1"/>
+        </w:rPr>
+        <w:t>phát hiện khi giá trị của một phần tử nhập liệu thay đổi</w:t>
+      </w:r>
+      <w:r>
+        <w:rPr>
+          <w:color w:val="000000" w:themeColor="text1"/>
+        </w:rPr>
+        <w:t>.</w:t>
+      </w:r>
+    </w:p>
+    <w:p>
+      <w:pPr>
+        <w:rPr>
+          <w:color w:val="000000" w:themeColor="text1"/>
+        </w:rPr>
+      </w:pPr>
+      <w:r>
+        <w:rPr>
+          <w:color w:val="000000" w:themeColor="text1"/>
+        </w:rPr>
+        <w:t>Nó thường được dùng với:</w:t>
+      </w:r>
+    </w:p>
+    <w:p>
+      <w:pPr>
+        <w:numPr>
+          <w:ilvl w:val="0"/>
+          <w:numId w:val="14"/>
+        </w:numPr>
+        <w:rPr>
+          <w:color w:val="000000" w:themeColor="text1"/>
+        </w:rPr>
+      </w:pPr>
+      <w:r>
+        <w:rPr>
+          <w:color w:val="000000" w:themeColor="text1"/>
+        </w:rPr>
+        <w:t xml:space="preserve">&lt;select&gt; </w:t>
+      </w:r>
+    </w:p>
+    <w:p>
+      <w:pPr>
+        <w:numPr>
+          <w:ilvl w:val="0"/>
+          <w:numId w:val="14"/>
+        </w:numPr>
+        <w:rPr>
+          <w:color w:val="000000" w:themeColor="text1"/>
+        </w:rPr>
+      </w:pPr>
+      <w:r>
+        <w:rPr>
+          <w:color w:val="000000" w:themeColor="text1"/>
+        </w:rPr>
+        <w:t xml:space="preserve">&lt;input&gt; </w:t>
+      </w:r>
+    </w:p>
+    <w:p>
+      <w:pPr>
+        <w:numPr>
+          <w:ilvl w:val="0"/>
+          <w:numId w:val="14"/>
+        </w:numPr>
+        <w:rPr>
+          <w:color w:val="000000" w:themeColor="text1"/>
+        </w:rPr>
+      </w:pPr>
+      <w:r>
+        <w:rPr>
+          <w:color w:val="000000" w:themeColor="text1"/>
+        </w:rPr>
+        <w:t>&lt;textarea&gt;</w:t>
+      </w:r>
+    </w:p>
+    <w:p>
+      <w:pPr>
+        <w:ind w:left="142"/>
+        <w:rPr>
+          <w:color w:val="000000" w:themeColor="text1"/>
+        </w:rPr>
+      </w:pPr>
+    </w:p>
+    <w:p>
+      <w:pPr>
+        <w:ind w:left="142" w:firstLine="218"/>
+        <w:rPr>
+          <w:color w:val="000000" w:themeColor="text1"/>
+        </w:rPr>
+      </w:pPr>
+      <w:r>
+        <w:rPr>
+          <w:color w:val="000000" w:themeColor="text1"/>
+        </w:rPr>
+        <w:lastRenderedPageBreak/>
+        <w:drawing>
+          <wp:inline distT="0" distB="0" distL="0" distR="0" wp14:anchorId="4604EC18" wp14:editId="79BEBD49">
+            <wp:extent cx="5943600" cy="3549015"/>
+            <wp:effectExtent l="0" t="0" r="0" b="0"/>
+            <wp:docPr id="793638838" name="Picture 1"/>
+            <wp:cNvGraphicFramePr>
+              <a:graphicFrameLocks xmlns:a="http://schemas.openxmlformats.org/drawingml/2006/main" noChangeAspect="1"/>
+            </wp:cNvGraphicFramePr>
+            <a:graphic xmlns:a="http://schemas.openxmlformats.org/drawingml/2006/main">
+              <a:graphicData uri="http://schemas.openxmlformats.org/drawingml/2006/picture">
+                <pic:pic xmlns:pic="http://schemas.openxmlformats.org/drawingml/2006/picture">
+                  <pic:nvPicPr>
+                    <pic:cNvPr id="793638838" name=""/>
+                    <pic:cNvPicPr/>
+                  </pic:nvPicPr>
+                  <pic:blipFill>
+                    <a:blip r:embed="rId36"/>
+                    <a:stretch>
+                      <a:fillRect/>
+                    </a:stretch>
+                  </pic:blipFill>
+                  <pic:spPr>
+                    <a:xfrm>
+                      <a:off x="0" y="0"/>
+                      <a:ext cx="5943600" cy="3549015"/>
+                    </a:xfrm>
+                    <a:prstGeom prst="rect">
+                      <a:avLst/>
+                    </a:prstGeom>
+                  </pic:spPr>
+                </pic:pic>
+              </a:graphicData>
+            </a:graphic>
+          </wp:inline>
+        </w:drawing>
+      </w:r>
+    </w:p>
     <w:sectPr>
       <w:pgSz w:w="12240" w:h="15840"/>
       <w:pgMar w:top="1440" w:right="1440" w:bottom="1440" w:left="1440" w:header="720" w:footer="720" w:gutter="0"/>
@@ -5540,6 +5844,56 @@
 </w:document>
 </file>
 
+<file path=word/endnotes.xml><?xml version="1.0" encoding="utf-8"?>
+<w:endnotes xmlns:wpc="http://schemas.microsoft.com/office/word/2010/wordprocessingCanvas" xmlns:cx="http://schemas.microsoft.com/office/drawing/2014/chartex" xmlns:cx1="http://schemas.microsoft.com/office/drawing/2015/9/8/chartex" xmlns:cx2="http://schemas.microsoft.com/office/drawing/2015/10/21/chartex" xmlns:cx3="http://schemas.microsoft.com/office/drawing/2016/5/9/chartex" xmlns:cx4="http://schemas.microsoft.com/office/drawing/2016/5/10/chartex" xmlns:cx5="http://schemas.microsoft.com/office/drawing/2016/5/11/chartex" xmlns:cx6="http://schemas.microsoft.com/office/drawing/2016/5/12/chartex" xmlns:cx7="http://schemas.microsoft.com/office/drawing/2016/5/13/chartex" xmlns:cx8="http://schemas.microsoft.com/office/drawing/2016/5/14/chartex" xmlns:mc="http://schemas.openxmlformats.org/markup-compatibility/2006" xmlns:aink="http://schemas.microsoft.com/office/drawing/2016/ink" xmlns:am3d="http://schemas.microsoft.com/office/drawing/2017/model3d" xmlns:o="urn:schemas-microsoft-com:office:office" xmlns:oel="http://schemas.microsoft.com/office/2019/extlst" xmlns:r="http://schemas.openxmlformats.org/officeDocument/2006/relationships" xmlns:m="http://schemas.openxmlformats.org/officeDocument/2006/math" xmlns:v="urn:schemas-microsoft-com:vml" xmlns:wp14="http://schemas.microsoft.com/office/word/2010/wordprocessingDrawing" xmlns:wp="http://schemas.openxmlformats.org/drawingml/2006/wordprocessingDrawing" xmlns:w10="urn:schemas-microsoft-com:office:word" xmlns:w="http://schemas.openxmlformats.org/wordprocessingml/2006/main" xmlns:w14="http://schemas.microsoft.com/office/word/2010/wordml" xmlns:w15="http://schemas.microsoft.com/office/word/2012/wordml" xmlns:w16cex="http://schemas.microsoft.com/office/word/2018/wordml/cex" xmlns:w16cid="http://schemas.microsoft.com/office/word/2016/wordml/cid" xmlns:w16="http://schemas.microsoft.com/office/word/2018/wordml" xmlns:w16du="http://schemas.microsoft.com/office/word/2023/wordml/word16du" xmlns:w16sdtdh="http://schemas.microsoft.com/office/word/2020/wordml/sdtdatahash" xmlns:w16sdtfl="http://schemas.microsoft.com/office/word/2024/wordml/sdtformatlock" xmlns:w16se="http://schemas.microsoft.com/office/word/2015/wordml/symex" xmlns:wpg="http://schemas.microsoft.com/office/word/2010/wordprocessingGroup" xmlns:wpi="http://schemas.microsoft.com/office/word/2010/wordprocessingInk" xmlns:wne="http://schemas.microsoft.com/office/word/2006/wordml" xmlns:wps="http://schemas.microsoft.com/office/word/2010/wordprocessingShape" mc:Ignorable="w14 w15 w16se w16cid w16 w16cex w16sdtdh w16sdtfl w16du wp14">
+  <w:endnote w:type="separator" w:id="-1">
+    <w:p>
+      <w:pPr>
+        <w:spacing w:after="0" w:line="240" w:lineRule="auto"/>
+      </w:pPr>
+      <w:r>
+        <w:separator/>
+      </w:r>
+    </w:p>
+  </w:endnote>
+  <w:endnote w:type="continuationSeparator" w:id="0">
+    <w:p>
+      <w:pPr>
+        <w:spacing w:after="0" w:line="240" w:lineRule="auto"/>
+      </w:pPr>
+      <w:r>
+        <w:continuationSeparator/>
+      </w:r>
+    </w:p>
+  </w:endnote>
+</w:endnotes>
+</file>
+
+<file path=word/footnotes.xml><?xml version="1.0" encoding="utf-8"?>
+<w:footnotes xmlns:wpc="http://schemas.microsoft.com/office/word/2010/wordprocessingCanvas" xmlns:cx="http://schemas.microsoft.com/office/drawing/2014/chartex" xmlns:cx1="http://schemas.microsoft.com/office/drawing/2015/9/8/chartex" xmlns:cx2="http://schemas.microsoft.com/office/drawing/2015/10/21/chartex" xmlns:cx3="http://schemas.microsoft.com/office/drawing/2016/5/9/chartex" xmlns:cx4="http://schemas.microsoft.com/office/drawing/2016/5/10/chartex" xmlns:cx5="http://schemas.microsoft.com/office/drawing/2016/5/11/chartex" xmlns:cx6="http://schemas.microsoft.com/office/drawing/2016/5/12/chartex" xmlns:cx7="http://schemas.microsoft.com/office/drawing/2016/5/13/chartex" xmlns:cx8="http://schemas.microsoft.com/office/drawing/2016/5/14/chartex" xmlns:mc="http://schemas.openxmlformats.org/markup-compatibility/2006" xmlns:aink="http://schemas.microsoft.com/office/drawing/2016/ink" xmlns:am3d="http://schemas.microsoft.com/office/drawing/2017/model3d" xmlns:o="urn:schemas-microsoft-com:office:office" xmlns:oel="http://schemas.microsoft.com/office/2019/extlst" xmlns:r="http://schemas.openxmlformats.org/officeDocument/2006/relationships" xmlns:m="http://schemas.openxmlformats.org/officeDocument/2006/math" xmlns:v="urn:schemas-microsoft-com:vml" xmlns:wp14="http://schemas.microsoft.com/office/word/2010/wordprocessingDrawing" xmlns:wp="http://schemas.openxmlformats.org/drawingml/2006/wordprocessingDrawing" xmlns:w10="urn:schemas-microsoft-com:office:word" xmlns:w="http://schemas.openxmlformats.org/wordprocessingml/2006/main" xmlns:w14="http://schemas.microsoft.com/office/word/2010/wordml" xmlns:w15="http://schemas.microsoft.com/office/word/2012/wordml" xmlns:w16cex="http://schemas.microsoft.com/office/word/2018/wordml/cex" xmlns:w16cid="http://schemas.microsoft.com/office/word/2016/wordml/cid" xmlns:w16="http://schemas.microsoft.com/office/word/2018/wordml" xmlns:w16du="http://schemas.microsoft.com/office/word/2023/wordml/word16du" xmlns:w16sdtdh="http://schemas.microsoft.com/office/word/2020/wordml/sdtdatahash" xmlns:w16sdtfl="http://schemas.microsoft.com/office/word/2024/wordml/sdtformatlock" xmlns:w16se="http://schemas.microsoft.com/office/word/2015/wordml/symex" xmlns:wpg="http://schemas.microsoft.com/office/word/2010/wordprocessingGroup" xmlns:wpi="http://schemas.microsoft.com/office/word/2010/wordprocessingInk" xmlns:wne="http://schemas.microsoft.com/office/word/2006/wordml" xmlns:wps="http://schemas.microsoft.com/office/word/2010/wordprocessingShape" mc:Ignorable="w14 w15 w16se w16cid w16 w16cex w16sdtdh w16sdtfl w16du wp14">
+  <w:footnote w:type="separator" w:id="-1">
+    <w:p>
+      <w:pPr>
+        <w:spacing w:after="0" w:line="240" w:lineRule="auto"/>
+      </w:pPr>
+      <w:r>
+        <w:separator/>
+      </w:r>
+    </w:p>
+  </w:footnote>
+  <w:footnote w:type="continuationSeparator" w:id="0">
+    <w:p>
+      <w:pPr>
+        <w:spacing w:after="0" w:line="240" w:lineRule="auto"/>
+      </w:pPr>
+      <w:r>
+        <w:continuationSeparator/>
+      </w:r>
+    </w:p>
+  </w:footnote>
+</w:footnotes>
+</file>
+
 <file path=word/numbering.xml><?xml version="1.0" encoding="utf-8"?>
 <w:numbering xmlns:wpc="http://schemas.microsoft.com/office/word/2010/wordprocessingCanvas" xmlns:cx="http://schemas.microsoft.com/office/drawing/2014/chartex" xmlns:cx1="http://schemas.microsoft.com/office/drawing/2015/9/8/chartex" xmlns:cx2="http://schemas.microsoft.com/office/drawing/2015/10/21/chartex" xmlns:cx3="http://schemas.microsoft.com/office/drawing/2016/5/9/chartex" xmlns:cx4="http://schemas.microsoft.com/office/drawing/2016/5/10/chartex" xmlns:cx5="http://schemas.microsoft.com/office/drawing/2016/5/11/chartex" xmlns:cx6="http://schemas.microsoft.com/office/drawing/2016/5/12/chartex" xmlns:cx7="http://schemas.microsoft.com/office/drawing/2016/5/13/chartex" xmlns:cx8="http://schemas.microsoft.com/office/drawing/2016/5/14/chartex" xmlns:mc="http://schemas.openxmlformats.org/markup-compatibility/2006" xmlns:aink="http://schemas.microsoft.com/office/drawing/2016/ink" xmlns:am3d="http://schemas.microsoft.com/office/drawing/2017/model3d" xmlns:o="urn:schemas-microsoft-com:office:office" xmlns:oel="http://schemas.microsoft.com/office/2019/extlst" xmlns:r="http://schemas.openxmlformats.org/officeDocument/2006/relationships" xmlns:m="http://schemas.openxmlformats.org/officeDocument/2006/math" xmlns:v="urn:schemas-microsoft-com:vml" xmlns:wp14="http://schemas.microsoft.com/office/word/2010/wordprocessingDrawing" xmlns:wp="http://schemas.openxmlformats.org/drawingml/2006/wordprocessingDrawing" xmlns:w10="urn:schemas-microsoft-com:office:word" xmlns:w="http://schemas.openxmlformats.org/wordprocessingml/2006/main" xmlns:w14="http://schemas.microsoft.com/office/word/2010/wordml" xmlns:w15="http://schemas.microsoft.com/office/word/2012/wordml" xmlns:w16cex="http://schemas.microsoft.com/office/word/2018/wordml/cex" xmlns:w16cid="http://schemas.microsoft.com/office/word/2016/wordml/cid" xmlns:w16="http://schemas.microsoft.com/office/word/2018/wordml" xmlns:w16du="http://schemas.microsoft.com/office/word/2023/wordml/word16du" xmlns:w16sdtdh="http://schemas.microsoft.com/office/word/2020/wordml/sdtdatahash" xmlns:w16sdtfl="http://schemas.microsoft.com/office/word/2024/wordml/sdtformatlock" xmlns:w16se="http://schemas.microsoft.com/office/word/2015/wordml/symex" xmlns:wpg="http://schemas.microsoft.com/office/word/2010/wordprocessingGroup" xmlns:wpi="http://schemas.microsoft.com/office/word/2010/wordprocessingInk" xmlns:wne="http://schemas.microsoft.com/office/word/2006/wordml" xmlns:wps="http://schemas.microsoft.com/office/word/2010/wordprocessingShape" mc:Ignorable="w14 w15 w16se w16cid w16 w16cex w16sdtdh w16sdtfl w16du wp14">
   <w:abstractNum w:abstractNumId="0" w15:restartNumberingAfterBreak="0">
@@ -6745,6 +7099,155 @@
     </w:lvl>
   </w:abstractNum>
   <w:abstractNum w:abstractNumId="9" w15:restartNumberingAfterBreak="0">
+    <w:nsid w:val="5DB52225"/>
+    <w:multiLevelType w:val="multilevel"/>
+    <w:tmpl w:val="54607798"/>
+    <w:lvl w:ilvl="0">
+      <w:start w:val="1"/>
+      <w:numFmt w:val="bullet"/>
+      <w:lvlText w:val=""/>
+      <w:lvlJc w:val="left"/>
+      <w:pPr>
+        <w:tabs>
+          <w:tab w:val="num" w:pos="720"/>
+        </w:tabs>
+        <w:ind w:left="720" w:hanging="360"/>
+      </w:pPr>
+      <w:rPr>
+        <w:rFonts w:ascii="Symbol" w:hAnsi="Symbol" w:hint="default"/>
+        <w:sz w:val="20"/>
+      </w:rPr>
+    </w:lvl>
+    <w:lvl w:ilvl="1" w:tentative="1">
+      <w:start w:val="1"/>
+      <w:numFmt w:val="bullet"/>
+      <w:lvlText w:val="o"/>
+      <w:lvlJc w:val="left"/>
+      <w:pPr>
+        <w:tabs>
+          <w:tab w:val="num" w:pos="1440"/>
+        </w:tabs>
+        <w:ind w:left="1440" w:hanging="360"/>
+      </w:pPr>
+      <w:rPr>
+        <w:rFonts w:ascii="Courier New" w:hAnsi="Courier New" w:hint="default"/>
+        <w:sz w:val="20"/>
+      </w:rPr>
+    </w:lvl>
+    <w:lvl w:ilvl="2" w:tentative="1">
+      <w:start w:val="1"/>
+      <w:numFmt w:val="bullet"/>
+      <w:lvlText w:val=""/>
+      <w:lvlJc w:val="left"/>
+      <w:pPr>
+        <w:tabs>
+          <w:tab w:val="num" w:pos="2160"/>
+        </w:tabs>
+        <w:ind w:left="2160" w:hanging="360"/>
+      </w:pPr>
+      <w:rPr>
+        <w:rFonts w:ascii="Wingdings" w:hAnsi="Wingdings" w:hint="default"/>
+        <w:sz w:val="20"/>
+      </w:rPr>
+    </w:lvl>
+    <w:lvl w:ilvl="3" w:tentative="1">
+      <w:start w:val="1"/>
+      <w:numFmt w:val="bullet"/>
+      <w:lvlText w:val=""/>
+      <w:lvlJc w:val="left"/>
+      <w:pPr>
+        <w:tabs>
+          <w:tab w:val="num" w:pos="2880"/>
+        </w:tabs>
+        <w:ind w:left="2880" w:hanging="360"/>
+      </w:pPr>
+      <w:rPr>
+        <w:rFonts w:ascii="Wingdings" w:hAnsi="Wingdings" w:hint="default"/>
+        <w:sz w:val="20"/>
+      </w:rPr>
+    </w:lvl>
+    <w:lvl w:ilvl="4" w:tentative="1">
+      <w:start w:val="1"/>
+      <w:numFmt w:val="bullet"/>
+      <w:lvlText w:val=""/>
+      <w:lvlJc w:val="left"/>
+      <w:pPr>
+        <w:tabs>
+          <w:tab w:val="num" w:pos="3600"/>
+        </w:tabs>
+        <w:ind w:left="3600" w:hanging="360"/>
+      </w:pPr>
+      <w:rPr>
+        <w:rFonts w:ascii="Wingdings" w:hAnsi="Wingdings" w:hint="default"/>
+        <w:sz w:val="20"/>
+      </w:rPr>
+    </w:lvl>
+    <w:lvl w:ilvl="5" w:tentative="1">
+      <w:start w:val="1"/>
+      <w:numFmt w:val="bullet"/>
+      <w:lvlText w:val=""/>
+      <w:lvlJc w:val="left"/>
+      <w:pPr>
+        <w:tabs>
+          <w:tab w:val="num" w:pos="4320"/>
+        </w:tabs>
+        <w:ind w:left="4320" w:hanging="360"/>
+      </w:pPr>
+      <w:rPr>
+        <w:rFonts w:ascii="Wingdings" w:hAnsi="Wingdings" w:hint="default"/>
+        <w:sz w:val="20"/>
+      </w:rPr>
+    </w:lvl>
+    <w:lvl w:ilvl="6" w:tentative="1">
+      <w:start w:val="1"/>
+      <w:numFmt w:val="bullet"/>
+      <w:lvlText w:val=""/>
+      <w:lvlJc w:val="left"/>
+      <w:pPr>
+        <w:tabs>
+          <w:tab w:val="num" w:pos="5040"/>
+        </w:tabs>
+        <w:ind w:left="5040" w:hanging="360"/>
+      </w:pPr>
+      <w:rPr>
+        <w:rFonts w:ascii="Wingdings" w:hAnsi="Wingdings" w:hint="default"/>
+        <w:sz w:val="20"/>
+      </w:rPr>
+    </w:lvl>
+    <w:lvl w:ilvl="7" w:tentative="1">
+      <w:start w:val="1"/>
+      <w:numFmt w:val="bullet"/>
+      <w:lvlText w:val=""/>
+      <w:lvlJc w:val="left"/>
+      <w:pPr>
+        <w:tabs>
+          <w:tab w:val="num" w:pos="5760"/>
+        </w:tabs>
+        <w:ind w:left="5760" w:hanging="360"/>
+      </w:pPr>
+      <w:rPr>
+        <w:rFonts w:ascii="Wingdings" w:hAnsi="Wingdings" w:hint="default"/>
+        <w:sz w:val="20"/>
+      </w:rPr>
+    </w:lvl>
+    <w:lvl w:ilvl="8" w:tentative="1">
+      <w:start w:val="1"/>
+      <w:numFmt w:val="bullet"/>
+      <w:lvlText w:val=""/>
+      <w:lvlJc w:val="left"/>
+      <w:pPr>
+        <w:tabs>
+          <w:tab w:val="num" w:pos="6480"/>
+        </w:tabs>
+        <w:ind w:left="6480" w:hanging="360"/>
+      </w:pPr>
+      <w:rPr>
+        <w:rFonts w:ascii="Wingdings" w:hAnsi="Wingdings" w:hint="default"/>
+        <w:sz w:val="20"/>
+      </w:rPr>
+    </w:lvl>
+  </w:abstractNum>
+  <w:abstractNum w:abstractNumId="10" w15:restartNumberingAfterBreak="0">
     <w:nsid w:val="5EBC1FBA"/>
     <w:multiLevelType w:val="multilevel"/>
     <w:tmpl w:val="D8C46B14"/>
@@ -6893,7 +7396,7 @@
       </w:rPr>
     </w:lvl>
   </w:abstractNum>
-  <w:abstractNum w:abstractNumId="10" w15:restartNumberingAfterBreak="0">
+  <w:abstractNum w:abstractNumId="11" w15:restartNumberingAfterBreak="0">
     <w:nsid w:val="68194282"/>
     <w:multiLevelType w:val="multilevel"/>
     <w:tmpl w:val="8042E988"/>
@@ -7042,7 +7545,7 @@
       </w:rPr>
     </w:lvl>
   </w:abstractNum>
-  <w:abstractNum w:abstractNumId="11" w15:restartNumberingAfterBreak="0">
+  <w:abstractNum w:abstractNumId="12" w15:restartNumberingAfterBreak="0">
     <w:nsid w:val="73B52B43"/>
     <w:multiLevelType w:val="multilevel"/>
     <w:tmpl w:val="59884D7E"/>
@@ -7159,7 +7662,7 @@
       </w:rPr>
     </w:lvl>
   </w:abstractNum>
-  <w:abstractNum w:abstractNumId="12" w15:restartNumberingAfterBreak="0">
+  <w:abstractNum w:abstractNumId="13" w15:restartNumberingAfterBreak="0">
     <w:nsid w:val="763E0766"/>
     <w:multiLevelType w:val="multilevel"/>
     <w:tmpl w:val="2BD6197E"/>
@@ -7309,7 +7812,7 @@
     </w:lvl>
   </w:abstractNum>
   <w:num w:numId="1" w16cid:durableId="430272983">
-    <w:abstractNumId w:val="11"/>
+    <w:abstractNumId w:val="12"/>
   </w:num>
   <w:num w:numId="2" w16cid:durableId="137504538">
     <w:abstractNumId w:val="3"/>
@@ -7318,16 +7821,16 @@
     <w:abstractNumId w:val="6"/>
   </w:num>
   <w:num w:numId="4" w16cid:durableId="848760794">
-    <w:abstractNumId w:val="12"/>
+    <w:abstractNumId w:val="13"/>
   </w:num>
   <w:num w:numId="5" w16cid:durableId="565577409">
-    <w:abstractNumId w:val="9"/>
+    <w:abstractNumId w:val="10"/>
   </w:num>
   <w:num w:numId="6" w16cid:durableId="2099518094">
     <w:abstractNumId w:val="7"/>
   </w:num>
   <w:num w:numId="7" w16cid:durableId="1236621603">
-    <w:abstractNumId w:val="10"/>
+    <w:abstractNumId w:val="11"/>
   </w:num>
   <w:num w:numId="8" w16cid:durableId="1895266124">
     <w:abstractNumId w:val="4"/>
@@ -7346,6 +7849,9 @@
   </w:num>
   <w:num w:numId="13" w16cid:durableId="1868715304">
     <w:abstractNumId w:val="8"/>
+  </w:num>
+  <w:num w:numId="14" w16cid:durableId="1228802026">
+    <w:abstractNumId w:val="9"/>
   </w:num>
 </w:numbering>
 </file>
@@ -8360,6 +8866,50 @@
       <w:bCs/>
     </w:rPr>
   </w:style>
+  <w:style w:type="paragraph" w:styleId="Header">
+    <w:name w:val="header"/>
+    <w:basedOn w:val="Normal"/>
+    <w:link w:val="HeaderChar"/>
+    <w:uiPriority w:val="99"/>
+    <w:unhideWhenUsed/>
+    <w:rsid w:val="0027423A"/>
+    <w:pPr>
+      <w:tabs>
+        <w:tab w:val="center" w:pos="4680"/>
+        <w:tab w:val="right" w:pos="9360"/>
+      </w:tabs>
+      <w:spacing w:after="0" w:line="240" w:lineRule="auto"/>
+    </w:pPr>
+  </w:style>
+  <w:style w:type="character" w:customStyle="1" w:styleId="HeaderChar">
+    <w:name w:val="Header Char"/>
+    <w:basedOn w:val="DefaultParagraphFont"/>
+    <w:link w:val="Header"/>
+    <w:uiPriority w:val="99"/>
+    <w:rsid w:val="0027423A"/>
+  </w:style>
+  <w:style w:type="paragraph" w:styleId="Footer">
+    <w:name w:val="footer"/>
+    <w:basedOn w:val="Normal"/>
+    <w:link w:val="FooterChar"/>
+    <w:uiPriority w:val="99"/>
+    <w:unhideWhenUsed/>
+    <w:rsid w:val="0027423A"/>
+    <w:pPr>
+      <w:tabs>
+        <w:tab w:val="center" w:pos="4680"/>
+        <w:tab w:val="right" w:pos="9360"/>
+      </w:tabs>
+      <w:spacing w:after="0" w:line="240" w:lineRule="auto"/>
+    </w:pPr>
+  </w:style>
+  <w:style w:type="character" w:customStyle="1" w:styleId="FooterChar">
+    <w:name w:val="Footer Char"/>
+    <w:basedOn w:val="DefaultParagraphFont"/>
+    <w:link w:val="Footer"/>
+    <w:uiPriority w:val="99"/>
+    <w:rsid w:val="0027423A"/>
+  </w:style>
 </w:styles>
 </file>
 

</xml_diff>

<commit_message>
feat: add data tablejs
</commit_message>
<xml_diff>
--- a/ghi-chu-asp.net.docx
+++ b/ghi-chu-asp.net.docx
@@ -5539,6 +5539,7 @@
         <w:rPr>
           <w:b/>
           <w:bCs/>
+          <w:noProof/>
           <w:color w:val="000000" w:themeColor="text1"/>
           <w:sz w:val="32"/>
           <w:szCs w:val="32"/>
@@ -5595,6 +5596,7 @@
         <w:rPr>
           <w:b/>
           <w:bCs/>
+          <w:noProof/>
           <w:color w:val="000000" w:themeColor="text1"/>
           <w:sz w:val="32"/>
           <w:szCs w:val="32"/>
@@ -5794,6 +5796,7 @@
       </w:pPr>
       <w:r>
         <w:rPr>
+          <w:noProof/>
           <w:color w:val="000000" w:themeColor="text1"/>
         </w:rPr>
         <w:lastRenderedPageBreak/>
@@ -5822,6 +5825,188 @@
                     <a:xfrm>
                       <a:off x="0" y="0"/>
                       <a:ext cx="5943600" cy="3549015"/>
+                    </a:xfrm>
+                    <a:prstGeom prst="rect">
+                      <a:avLst/>
+                    </a:prstGeom>
+                  </pic:spPr>
+                </pic:pic>
+              </a:graphicData>
+            </a:graphic>
+          </wp:inline>
+        </w:drawing>
+      </w:r>
+    </w:p>
+    <w:p>
+      <w:pPr>
+        <w:rPr>
+          <w:color w:val="000000" w:themeColor="text1"/>
+        </w:rPr>
+      </w:pPr>
+      <w:r>
+        <w:rPr>
+          <w:color w:val="000000" w:themeColor="text1"/>
+        </w:rPr>
+        <w:br w:type="page"/>
+      </w:r>
+    </w:p>
+    <w:p>
+      <w:pPr>
+        <w:ind w:left="142" w:firstLine="218"/>
+        <w:jc w:val="center"/>
+        <w:rPr>
+          <w:b/>
+          <w:bCs/>
+          <w:color w:val="000000" w:themeColor="text1"/>
+          <w:sz w:val="32"/>
+          <w:szCs w:val="32"/>
+        </w:rPr>
+      </w:pPr>
+      <w:r>
+        <w:rPr>
+          <w:b/>
+          <w:bCs/>
+          <w:color w:val="000000" w:themeColor="text1"/>
+          <w:sz w:val="32"/>
+          <w:szCs w:val="32"/>
+        </w:rPr>
+        <w:lastRenderedPageBreak/>
+        <w:t>@section Scripts dùng ở đâu?</w:t>
+      </w:r>
+    </w:p>
+    <w:p>
+      <w:pPr>
+        <w:ind w:left="142" w:firstLine="218"/>
+        <w:rPr>
+          <w:color w:val="000000" w:themeColor="text1"/>
+        </w:rPr>
+      </w:pPr>
+      <w:r>
+        <w:rPr>
+          <w:color w:val="000000" w:themeColor="text1"/>
+        </w:rPr>
+        <w:drawing>
+          <wp:inline distT="0" distB="0" distL="0" distR="0" wp14:anchorId="2E3D0D7C" wp14:editId="773B10A8">
+            <wp:extent cx="4344006" cy="1352739"/>
+            <wp:effectExtent l="0" t="0" r="0" b="0"/>
+            <wp:docPr id="646741667" name="Picture 1"/>
+            <wp:cNvGraphicFramePr>
+              <a:graphicFrameLocks xmlns:a="http://schemas.openxmlformats.org/drawingml/2006/main" noChangeAspect="1"/>
+            </wp:cNvGraphicFramePr>
+            <a:graphic xmlns:a="http://schemas.openxmlformats.org/drawingml/2006/main">
+              <a:graphicData uri="http://schemas.openxmlformats.org/drawingml/2006/picture">
+                <pic:pic xmlns:pic="http://schemas.openxmlformats.org/drawingml/2006/picture">
+                  <pic:nvPicPr>
+                    <pic:cNvPr id="646741667" name=""/>
+                    <pic:cNvPicPr/>
+                  </pic:nvPicPr>
+                  <pic:blipFill>
+                    <a:blip r:embed="rId37"/>
+                    <a:stretch>
+                      <a:fillRect/>
+                    </a:stretch>
+                  </pic:blipFill>
+                  <pic:spPr>
+                    <a:xfrm>
+                      <a:off x="0" y="0"/>
+                      <a:ext cx="4344006" cy="1352739"/>
+                    </a:xfrm>
+                    <a:prstGeom prst="rect">
+                      <a:avLst/>
+                    </a:prstGeom>
+                  </pic:spPr>
+                </pic:pic>
+              </a:graphicData>
+            </a:graphic>
+          </wp:inline>
+        </w:drawing>
+      </w:r>
+    </w:p>
+    <w:p>
+      <w:pPr>
+        <w:ind w:left="142" w:firstLine="218"/>
+        <w:rPr>
+          <w:color w:val="000000" w:themeColor="text1"/>
+        </w:rPr>
+      </w:pPr>
+      <w:r>
+        <w:rPr>
+          <w:color w:val="000000" w:themeColor="text1"/>
+        </w:rPr>
+        <w:drawing>
+          <wp:inline distT="0" distB="0" distL="0" distR="0" wp14:anchorId="2C9FE837" wp14:editId="406752B0">
+            <wp:extent cx="5943600" cy="4157980"/>
+            <wp:effectExtent l="0" t="0" r="0" b="0"/>
+            <wp:docPr id="1971048904" name="Picture 1"/>
+            <wp:cNvGraphicFramePr>
+              <a:graphicFrameLocks xmlns:a="http://schemas.openxmlformats.org/drawingml/2006/main" noChangeAspect="1"/>
+            </wp:cNvGraphicFramePr>
+            <a:graphic xmlns:a="http://schemas.openxmlformats.org/drawingml/2006/main">
+              <a:graphicData uri="http://schemas.openxmlformats.org/drawingml/2006/picture">
+                <pic:pic xmlns:pic="http://schemas.openxmlformats.org/drawingml/2006/picture">
+                  <pic:nvPicPr>
+                    <pic:cNvPr id="1971048904" name=""/>
+                    <pic:cNvPicPr/>
+                  </pic:nvPicPr>
+                  <pic:blipFill>
+                    <a:blip r:embed="rId38"/>
+                    <a:stretch>
+                      <a:fillRect/>
+                    </a:stretch>
+                  </pic:blipFill>
+                  <pic:spPr>
+                    <a:xfrm>
+                      <a:off x="0" y="0"/>
+                      <a:ext cx="5943600" cy="4157980"/>
+                    </a:xfrm>
+                    <a:prstGeom prst="rect">
+                      <a:avLst/>
+                    </a:prstGeom>
+                  </pic:spPr>
+                </pic:pic>
+              </a:graphicData>
+            </a:graphic>
+          </wp:inline>
+        </w:drawing>
+      </w:r>
+    </w:p>
+    <w:p>
+      <w:pPr>
+        <w:ind w:left="142" w:firstLine="218"/>
+        <w:rPr>
+          <w:color w:val="000000" w:themeColor="text1"/>
+        </w:rPr>
+      </w:pPr>
+      <w:r>
+        <w:rPr>
+          <w:color w:val="000000" w:themeColor="text1"/>
+        </w:rPr>
+        <w:lastRenderedPageBreak/>
+        <w:drawing>
+          <wp:inline distT="0" distB="0" distL="0" distR="0" wp14:anchorId="114F34FE" wp14:editId="63E320BC">
+            <wp:extent cx="5943600" cy="2686685"/>
+            <wp:effectExtent l="0" t="0" r="0" b="0"/>
+            <wp:docPr id="1519892170" name="Picture 1"/>
+            <wp:cNvGraphicFramePr>
+              <a:graphicFrameLocks xmlns:a="http://schemas.openxmlformats.org/drawingml/2006/main" noChangeAspect="1"/>
+            </wp:cNvGraphicFramePr>
+            <a:graphic xmlns:a="http://schemas.openxmlformats.org/drawingml/2006/main">
+              <a:graphicData uri="http://schemas.openxmlformats.org/drawingml/2006/picture">
+                <pic:pic xmlns:pic="http://schemas.openxmlformats.org/drawingml/2006/picture">
+                  <pic:nvPicPr>
+                    <pic:cNvPr id="1519892170" name=""/>
+                    <pic:cNvPicPr/>
+                  </pic:nvPicPr>
+                  <pic:blipFill>
+                    <a:blip r:embed="rId39"/>
+                    <a:stretch>
+                      <a:fillRect/>
+                    </a:stretch>
+                  </pic:blipFill>
+                  <pic:spPr>
+                    <a:xfrm>
+                      <a:off x="0" y="0"/>
+                      <a:ext cx="5943600" cy="2686685"/>
                     </a:xfrm>
                     <a:prstGeom prst="rect">
                       <a:avLst/>

</xml_diff>

<commit_message>
feat: add Product Review
</commit_message>
<xml_diff>
--- a/ghi-chu-asp.net.docx
+++ b/ghi-chu-asp.net.docx
@@ -5883,6 +5883,7 @@
       </w:pPr>
       <w:r>
         <w:rPr>
+          <w:noProof/>
           <w:color w:val="000000" w:themeColor="text1"/>
         </w:rPr>
         <w:drawing>
@@ -5931,6 +5932,7 @@
       </w:pPr>
       <w:r>
         <w:rPr>
+          <w:noProof/>
           <w:color w:val="000000" w:themeColor="text1"/>
         </w:rPr>
         <w:drawing>
@@ -5979,6 +5981,7 @@
       </w:pPr>
       <w:r>
         <w:rPr>
+          <w:noProof/>
           <w:color w:val="000000" w:themeColor="text1"/>
         </w:rPr>
         <w:lastRenderedPageBreak/>
@@ -6019,6 +6022,422 @@
         </w:drawing>
       </w:r>
     </w:p>
+    <w:p>
+      <w:pPr>
+        <w:rPr>
+          <w:color w:val="000000" w:themeColor="text1"/>
+        </w:rPr>
+      </w:pPr>
+      <w:r>
+        <w:rPr>
+          <w:color w:val="000000" w:themeColor="text1"/>
+        </w:rPr>
+        <w:br w:type="page"/>
+      </w:r>
+    </w:p>
+    <w:p>
+      <w:pPr>
+        <w:ind w:left="142" w:firstLine="218"/>
+        <w:jc w:val="center"/>
+        <w:rPr>
+          <w:b/>
+          <w:bCs/>
+          <w:color w:val="000000" w:themeColor="text1"/>
+          <w:sz w:val="32"/>
+          <w:szCs w:val="32"/>
+        </w:rPr>
+      </w:pPr>
+      <w:r>
+        <w:rPr>
+          <w:b/>
+          <w:bCs/>
+          <w:color w:val="000000" w:themeColor="text1"/>
+          <w:sz w:val="32"/>
+          <w:szCs w:val="32"/>
+        </w:rPr>
+        <w:lastRenderedPageBreak/>
+        <w:t>LÀM SAO EF BIẾT KHÓA NGOẠI</w:t>
+      </w:r>
+    </w:p>
+    <w:p>
+      <w:pPr>
+        <w:ind w:left="142" w:firstLine="218"/>
+        <w:rPr>
+          <w:color w:val="000000" w:themeColor="text1"/>
+        </w:rPr>
+      </w:pPr>
+      <w:r>
+        <w:rPr>
+          <w:color w:val="000000" w:themeColor="text1"/>
+        </w:rPr>
+        <w:drawing>
+          <wp:inline distT="0" distB="0" distL="0" distR="0" wp14:anchorId="7671EFED" wp14:editId="340A288E">
+            <wp:extent cx="5943600" cy="4309745"/>
+            <wp:effectExtent l="0" t="0" r="0" b="0"/>
+            <wp:docPr id="1938999655" name="Picture 1"/>
+            <wp:cNvGraphicFramePr>
+              <a:graphicFrameLocks xmlns:a="http://schemas.openxmlformats.org/drawingml/2006/main" noChangeAspect="1"/>
+            </wp:cNvGraphicFramePr>
+            <a:graphic xmlns:a="http://schemas.openxmlformats.org/drawingml/2006/main">
+              <a:graphicData uri="http://schemas.openxmlformats.org/drawingml/2006/picture">
+                <pic:pic xmlns:pic="http://schemas.openxmlformats.org/drawingml/2006/picture">
+                  <pic:nvPicPr>
+                    <pic:cNvPr id="1938999655" name=""/>
+                    <pic:cNvPicPr/>
+                  </pic:nvPicPr>
+                  <pic:blipFill>
+                    <a:blip r:embed="rId40"/>
+                    <a:stretch>
+                      <a:fillRect/>
+                    </a:stretch>
+                  </pic:blipFill>
+                  <pic:spPr>
+                    <a:xfrm>
+                      <a:off x="0" y="0"/>
+                      <a:ext cx="5943600" cy="4309745"/>
+                    </a:xfrm>
+                    <a:prstGeom prst="rect">
+                      <a:avLst/>
+                    </a:prstGeom>
+                  </pic:spPr>
+                </pic:pic>
+              </a:graphicData>
+            </a:graphic>
+          </wp:inline>
+        </w:drawing>
+      </w:r>
+    </w:p>
+    <w:p>
+      <w:pPr>
+        <w:ind w:left="142" w:firstLine="218"/>
+        <w:rPr>
+          <w:color w:val="000000" w:themeColor="text1"/>
+        </w:rPr>
+      </w:pPr>
+      <w:r>
+        <w:rPr>
+          <w:color w:val="000000" w:themeColor="text1"/>
+        </w:rPr>
+        <w:lastRenderedPageBreak/>
+        <w:drawing>
+          <wp:inline distT="0" distB="0" distL="0" distR="0" wp14:anchorId="61540CF2" wp14:editId="164F7CAC">
+            <wp:extent cx="5943600" cy="5785485"/>
+            <wp:effectExtent l="0" t="0" r="0" b="5715"/>
+            <wp:docPr id="1397350569" name="Picture 1"/>
+            <wp:cNvGraphicFramePr>
+              <a:graphicFrameLocks xmlns:a="http://schemas.openxmlformats.org/drawingml/2006/main" noChangeAspect="1"/>
+            </wp:cNvGraphicFramePr>
+            <a:graphic xmlns:a="http://schemas.openxmlformats.org/drawingml/2006/main">
+              <a:graphicData uri="http://schemas.openxmlformats.org/drawingml/2006/picture">
+                <pic:pic xmlns:pic="http://schemas.openxmlformats.org/drawingml/2006/picture">
+                  <pic:nvPicPr>
+                    <pic:cNvPr id="1397350569" name=""/>
+                    <pic:cNvPicPr/>
+                  </pic:nvPicPr>
+                  <pic:blipFill>
+                    <a:blip r:embed="rId41"/>
+                    <a:stretch>
+                      <a:fillRect/>
+                    </a:stretch>
+                  </pic:blipFill>
+                  <pic:spPr>
+                    <a:xfrm>
+                      <a:off x="0" y="0"/>
+                      <a:ext cx="5943600" cy="5785485"/>
+                    </a:xfrm>
+                    <a:prstGeom prst="rect">
+                      <a:avLst/>
+                    </a:prstGeom>
+                  </pic:spPr>
+                </pic:pic>
+              </a:graphicData>
+            </a:graphic>
+          </wp:inline>
+        </w:drawing>
+      </w:r>
+    </w:p>
+    <w:p>
+      <w:pPr>
+        <w:rPr>
+          <w:color w:val="000000" w:themeColor="text1"/>
+        </w:rPr>
+      </w:pPr>
+      <w:r>
+        <w:rPr>
+          <w:color w:val="000000" w:themeColor="text1"/>
+        </w:rPr>
+        <w:br w:type="page"/>
+      </w:r>
+    </w:p>
+    <w:p>
+      <w:pPr>
+        <w:ind w:left="142" w:firstLine="218"/>
+        <w:jc w:val="center"/>
+        <w:rPr>
+          <w:b/>
+          <w:bCs/>
+          <w:color w:val="000000" w:themeColor="text1"/>
+          <w:sz w:val="32"/>
+          <w:szCs w:val="32"/>
+        </w:rPr>
+      </w:pPr>
+      <w:r>
+        <w:rPr>
+          <w:b/>
+          <w:bCs/>
+          <w:color w:val="000000" w:themeColor="text1"/>
+          <w:sz w:val="32"/>
+          <w:szCs w:val="32"/>
+        </w:rPr>
+        <w:lastRenderedPageBreak/>
+        <w:t>ViewModels dùng để làm gì</w:t>
+      </w:r>
+    </w:p>
+    <w:p>
+      <w:pPr>
+        <w:ind w:left="142" w:firstLine="218"/>
+        <w:rPr>
+          <w:color w:val="000000" w:themeColor="text1"/>
+        </w:rPr>
+      </w:pPr>
+      <w:r>
+        <w:rPr>
+          <w:color w:val="000000" w:themeColor="text1"/>
+        </w:rPr>
+        <w:drawing>
+          <wp:inline distT="0" distB="0" distL="0" distR="0" wp14:anchorId="5EB4EA94" wp14:editId="2CF3C18C">
+            <wp:extent cx="5943600" cy="6018530"/>
+            <wp:effectExtent l="0" t="0" r="0" b="1270"/>
+            <wp:docPr id="809098436" name="Picture 1"/>
+            <wp:cNvGraphicFramePr>
+              <a:graphicFrameLocks xmlns:a="http://schemas.openxmlformats.org/drawingml/2006/main" noChangeAspect="1"/>
+            </wp:cNvGraphicFramePr>
+            <a:graphic xmlns:a="http://schemas.openxmlformats.org/drawingml/2006/main">
+              <a:graphicData uri="http://schemas.openxmlformats.org/drawingml/2006/picture">
+                <pic:pic xmlns:pic="http://schemas.openxmlformats.org/drawingml/2006/picture">
+                  <pic:nvPicPr>
+                    <pic:cNvPr id="809098436" name=""/>
+                    <pic:cNvPicPr/>
+                  </pic:nvPicPr>
+                  <pic:blipFill>
+                    <a:blip r:embed="rId42"/>
+                    <a:stretch>
+                      <a:fillRect/>
+                    </a:stretch>
+                  </pic:blipFill>
+                  <pic:spPr>
+                    <a:xfrm>
+                      <a:off x="0" y="0"/>
+                      <a:ext cx="5943600" cy="6018530"/>
+                    </a:xfrm>
+                    <a:prstGeom prst="rect">
+                      <a:avLst/>
+                    </a:prstGeom>
+                  </pic:spPr>
+                </pic:pic>
+              </a:graphicData>
+            </a:graphic>
+          </wp:inline>
+        </w:drawing>
+      </w:r>
+    </w:p>
+    <w:p>
+      <w:pPr>
+        <w:ind w:left="142" w:firstLine="218"/>
+        <w:rPr>
+          <w:color w:val="000000" w:themeColor="text1"/>
+        </w:rPr>
+      </w:pPr>
+      <w:r>
+        <w:rPr>
+          <w:color w:val="000000" w:themeColor="text1"/>
+        </w:rPr>
+        <w:lastRenderedPageBreak/>
+        <w:drawing>
+          <wp:inline distT="0" distB="0" distL="0" distR="0" wp14:anchorId="55FD202A" wp14:editId="54398D97">
+            <wp:extent cx="5943600" cy="3967480"/>
+            <wp:effectExtent l="0" t="0" r="0" b="0"/>
+            <wp:docPr id="461583946" name="Picture 1"/>
+            <wp:cNvGraphicFramePr>
+              <a:graphicFrameLocks xmlns:a="http://schemas.openxmlformats.org/drawingml/2006/main" noChangeAspect="1"/>
+            </wp:cNvGraphicFramePr>
+            <a:graphic xmlns:a="http://schemas.openxmlformats.org/drawingml/2006/main">
+              <a:graphicData uri="http://schemas.openxmlformats.org/drawingml/2006/picture">
+                <pic:pic xmlns:pic="http://schemas.openxmlformats.org/drawingml/2006/picture">
+                  <pic:nvPicPr>
+                    <pic:cNvPr id="461583946" name=""/>
+                    <pic:cNvPicPr/>
+                  </pic:nvPicPr>
+                  <pic:blipFill>
+                    <a:blip r:embed="rId43"/>
+                    <a:stretch>
+                      <a:fillRect/>
+                    </a:stretch>
+                  </pic:blipFill>
+                  <pic:spPr>
+                    <a:xfrm>
+                      <a:off x="0" y="0"/>
+                      <a:ext cx="5943600" cy="3967480"/>
+                    </a:xfrm>
+                    <a:prstGeom prst="rect">
+                      <a:avLst/>
+                    </a:prstGeom>
+                  </pic:spPr>
+                </pic:pic>
+              </a:graphicData>
+            </a:graphic>
+          </wp:inline>
+        </w:drawing>
+      </w:r>
+    </w:p>
+    <w:p>
+      <w:pPr>
+        <w:ind w:left="142" w:firstLine="218"/>
+        <w:rPr>
+          <w:color w:val="000000" w:themeColor="text1"/>
+        </w:rPr>
+      </w:pPr>
+      <w:r>
+        <w:rPr>
+          <w:color w:val="000000" w:themeColor="text1"/>
+        </w:rPr>
+        <w:drawing>
+          <wp:inline distT="0" distB="0" distL="0" distR="0" wp14:anchorId="50A5192C" wp14:editId="4AC0F473">
+            <wp:extent cx="5943600" cy="3895725"/>
+            <wp:effectExtent l="0" t="0" r="0" b="9525"/>
+            <wp:docPr id="1332243951" name="Picture 1"/>
+            <wp:cNvGraphicFramePr>
+              <a:graphicFrameLocks xmlns:a="http://schemas.openxmlformats.org/drawingml/2006/main" noChangeAspect="1"/>
+            </wp:cNvGraphicFramePr>
+            <a:graphic xmlns:a="http://schemas.openxmlformats.org/drawingml/2006/main">
+              <a:graphicData uri="http://schemas.openxmlformats.org/drawingml/2006/picture">
+                <pic:pic xmlns:pic="http://schemas.openxmlformats.org/drawingml/2006/picture">
+                  <pic:nvPicPr>
+                    <pic:cNvPr id="1332243951" name=""/>
+                    <pic:cNvPicPr/>
+                  </pic:nvPicPr>
+                  <pic:blipFill>
+                    <a:blip r:embed="rId44"/>
+                    <a:stretch>
+                      <a:fillRect/>
+                    </a:stretch>
+                  </pic:blipFill>
+                  <pic:spPr>
+                    <a:xfrm>
+                      <a:off x="0" y="0"/>
+                      <a:ext cx="5943600" cy="3895725"/>
+                    </a:xfrm>
+                    <a:prstGeom prst="rect">
+                      <a:avLst/>
+                    </a:prstGeom>
+                  </pic:spPr>
+                </pic:pic>
+              </a:graphicData>
+            </a:graphic>
+          </wp:inline>
+        </w:drawing>
+      </w:r>
+    </w:p>
+    <w:p>
+      <w:pPr>
+        <w:pStyle w:val="ListParagraph"/>
+        <w:numPr>
+          <w:ilvl w:val="1"/>
+          <w:numId w:val="5"/>
+        </w:numPr>
+        <w:rPr>
+          <w:b/>
+          <w:bCs/>
+          <w:color w:val="EE0000"/>
+        </w:rPr>
+      </w:pPr>
+      <w:r>
+        <w:rPr>
+          <w:b/>
+          <w:bCs/>
+          <w:color w:val="EE0000"/>
+        </w:rPr>
+        <w:lastRenderedPageBreak/>
+        <w:t>Gộp nhiều model thành 1 ViewModel</w:t>
+      </w:r>
+    </w:p>
+    <w:p>
+      <w:pPr>
+        <w:rPr>
+          <w:b/>
+          <w:bCs/>
+          <w:color w:val="EE0000"/>
+        </w:rPr>
+      </w:pPr>
+    </w:p>
+    <w:p>
+      <w:pPr>
+        <w:rPr>
+          <w:b/>
+          <w:bCs/>
+          <w:color w:val="EE0000"/>
+        </w:rPr>
+      </w:pPr>
+      <w:r>
+        <w:rPr>
+          <w:b/>
+          <w:bCs/>
+          <w:color w:val="EE0000"/>
+        </w:rPr>
+        <w:t xml:space="preserve">Quan trọng: </w:t>
+      </w:r>
+    </w:p>
+    <w:p>
+      <w:pPr>
+        <w:rPr>
+          <w:b/>
+          <w:bCs/>
+          <w:color w:val="EE0000"/>
+        </w:rPr>
+      </w:pPr>
+      <w:r>
+        <w:rPr>
+          <w:b/>
+          <w:bCs/>
+          <w:color w:val="EE0000"/>
+        </w:rPr>
+        <w:drawing>
+          <wp:inline distT="0" distB="0" distL="0" distR="0" wp14:anchorId="48E1D4A0" wp14:editId="0ADAD77A">
+            <wp:extent cx="5943600" cy="1054100"/>
+            <wp:effectExtent l="0" t="0" r="0" b="0"/>
+            <wp:docPr id="81627633" name="Picture 1"/>
+            <wp:cNvGraphicFramePr>
+              <a:graphicFrameLocks xmlns:a="http://schemas.openxmlformats.org/drawingml/2006/main" noChangeAspect="1"/>
+            </wp:cNvGraphicFramePr>
+            <a:graphic xmlns:a="http://schemas.openxmlformats.org/drawingml/2006/main">
+              <a:graphicData uri="http://schemas.openxmlformats.org/drawingml/2006/picture">
+                <pic:pic xmlns:pic="http://schemas.openxmlformats.org/drawingml/2006/picture">
+                  <pic:nvPicPr>
+                    <pic:cNvPr id="81627633" name=""/>
+                    <pic:cNvPicPr/>
+                  </pic:nvPicPr>
+                  <pic:blipFill>
+                    <a:blip r:embed="rId45"/>
+                    <a:stretch>
+                      <a:fillRect/>
+                    </a:stretch>
+                  </pic:blipFill>
+                  <pic:spPr>
+                    <a:xfrm>
+                      <a:off x="0" y="0"/>
+                      <a:ext cx="5943600" cy="1054100"/>
+                    </a:xfrm>
+                    <a:prstGeom prst="rect">
+                      <a:avLst/>
+                    </a:prstGeom>
+                  </pic:spPr>
+                </pic:pic>
+              </a:graphicData>
+            </a:graphic>
+          </wp:inline>
+        </w:drawing>
+      </w:r>
+    </w:p>
     <w:sectPr>
       <w:pgSz w:w="12240" w:h="15840"/>
       <w:pgMar w:top="1440" w:right="1440" w:bottom="1440" w:left="1440" w:header="720" w:footer="720" w:gutter="0"/>
@@ -7435,7 +7854,7 @@
   <w:abstractNum w:abstractNumId="10" w15:restartNumberingAfterBreak="0">
     <w:nsid w:val="5EBC1FBA"/>
     <w:multiLevelType w:val="multilevel"/>
-    <w:tmpl w:val="D8C46B14"/>
+    <w:tmpl w:val="2A0A0D52"/>
     <w:lvl w:ilvl="0">
       <w:start w:val="1"/>
       <w:numFmt w:val="bullet"/>
@@ -7452,20 +7871,15 @@
         <w:sz w:val="20"/>
       </w:rPr>
     </w:lvl>
-    <w:lvl w:ilvl="1" w:tentative="1">
-      <w:start w:val="1"/>
+    <w:lvl w:ilvl="1">
       <w:numFmt w:val="bullet"/>
-      <w:lvlText w:val="o"/>
-      <w:lvlJc w:val="left"/>
-      <w:pPr>
-        <w:tabs>
-          <w:tab w:val="num" w:pos="1440"/>
-        </w:tabs>
+      <w:lvlText w:val=""/>
+      <w:lvlJc w:val="left"/>
+      <w:pPr>
         <w:ind w:left="1440" w:hanging="360"/>
       </w:pPr>
       <w:rPr>
-        <w:rFonts w:ascii="Courier New" w:hAnsi="Courier New" w:hint="default"/>
-        <w:sz w:val="20"/>
+        <w:rFonts w:ascii="Wingdings" w:eastAsiaTheme="minorHAnsi" w:hAnsi="Wingdings" w:cstheme="minorBidi" w:hint="default"/>
       </w:rPr>
     </w:lvl>
     <w:lvl w:ilvl="2" w:tentative="1">

</xml_diff>

<commit_message>
feat: add contact website
</commit_message>
<xml_diff>
--- a/ghi-chu-asp.net.docx
+++ b/ghi-chu-asp.net.docx
@@ -6908,6 +6908,7 @@
         <w:rPr>
           <w:b/>
           <w:bCs/>
+          <w:noProof/>
           <w:color w:val="EE0000"/>
         </w:rPr>
         <w:drawing>
@@ -6968,14 +6969,7 @@
           <w:b/>
           <w:bCs/>
         </w:rPr>
-        <w:t xml:space="preserve">Cần phải có </w:t>
-      </w:r>
-      <w:r>
-        <w:rPr>
-          <w:b/>
-          <w:bCs/>
-        </w:rPr>
-        <w:t>id="myTable"</w:t>
+        <w:t>Cần phải có id="myTable"</w:t>
       </w:r>
     </w:p>
     <w:p>
@@ -6990,6 +6984,7 @@
         <w:rPr>
           <w:b/>
           <w:bCs/>
+          <w:noProof/>
           <w:color w:val="EE0000"/>
         </w:rPr>
         <w:drawing>
@@ -7017,6 +7012,350 @@
                     <a:xfrm>
                       <a:off x="0" y="0"/>
                       <a:ext cx="5496692" cy="2638793"/>
+                    </a:xfrm>
+                    <a:prstGeom prst="rect">
+                      <a:avLst/>
+                    </a:prstGeom>
+                  </pic:spPr>
+                </pic:pic>
+              </a:graphicData>
+            </a:graphic>
+          </wp:inline>
+        </w:drawing>
+      </w:r>
+    </w:p>
+    <w:p>
+      <w:pPr>
+        <w:rPr>
+          <w:b/>
+          <w:bCs/>
+          <w:color w:val="EE0000"/>
+        </w:rPr>
+      </w:pPr>
+      <w:r>
+        <w:rPr>
+          <w:b/>
+          <w:bCs/>
+          <w:color w:val="EE0000"/>
+        </w:rPr>
+        <w:br w:type="page"/>
+      </w:r>
+    </w:p>
+    <w:p>
+      <w:pPr>
+        <w:jc w:val="center"/>
+        <w:rPr>
+          <w:b/>
+          <w:bCs/>
+          <w:sz w:val="32"/>
+          <w:szCs w:val="32"/>
+        </w:rPr>
+      </w:pPr>
+      <w:r>
+        <w:rPr>
+          <w:b/>
+          <w:bCs/>
+          <w:sz w:val="32"/>
+          <w:szCs w:val="32"/>
+        </w:rPr>
+        <w:lastRenderedPageBreak/>
+        <w:t>Mục đích của ContactModel không có Id</w:t>
+      </w:r>
+    </w:p>
+    <w:p>
+      <w:pPr>
+        <w:rPr>
+          <w:b/>
+          <w:bCs/>
+        </w:rPr>
+      </w:pPr>
+      <w:r>
+        <w:rPr>
+          <w:b/>
+          <w:bCs/>
+          <w:noProof/>
+        </w:rPr>
+        <w:drawing>
+          <wp:inline distT="0" distB="0" distL="0" distR="0" wp14:anchorId="6167507F" wp14:editId="10A9D3C3">
+            <wp:extent cx="5943600" cy="4589780"/>
+            <wp:effectExtent l="0" t="0" r="0" b="1270"/>
+            <wp:docPr id="1769660095" name="Picture 1"/>
+            <wp:cNvGraphicFramePr>
+              <a:graphicFrameLocks xmlns:a="http://schemas.openxmlformats.org/drawingml/2006/main" noChangeAspect="1"/>
+            </wp:cNvGraphicFramePr>
+            <a:graphic xmlns:a="http://schemas.openxmlformats.org/drawingml/2006/main">
+              <a:graphicData uri="http://schemas.openxmlformats.org/drawingml/2006/picture">
+                <pic:pic xmlns:pic="http://schemas.openxmlformats.org/drawingml/2006/picture">
+                  <pic:nvPicPr>
+                    <pic:cNvPr id="1769660095" name=""/>
+                    <pic:cNvPicPr/>
+                  </pic:nvPicPr>
+                  <pic:blipFill>
+                    <a:blip r:embed="rId54"/>
+                    <a:stretch>
+                      <a:fillRect/>
+                    </a:stretch>
+                  </pic:blipFill>
+                  <pic:spPr>
+                    <a:xfrm>
+                      <a:off x="0" y="0"/>
+                      <a:ext cx="5943600" cy="4589780"/>
+                    </a:xfrm>
+                    <a:prstGeom prst="rect">
+                      <a:avLst/>
+                    </a:prstGeom>
+                  </pic:spPr>
+                </pic:pic>
+              </a:graphicData>
+            </a:graphic>
+          </wp:inline>
+        </w:drawing>
+      </w:r>
+    </w:p>
+    <w:p>
+      <w:pPr>
+        <w:rPr>
+          <w:b/>
+          <w:bCs/>
+        </w:rPr>
+      </w:pPr>
+    </w:p>
+    <w:p>
+      <w:pPr>
+        <w:rPr>
+          <w:b/>
+          <w:bCs/>
+        </w:rPr>
+      </w:pPr>
+      <w:r>
+        <w:rPr>
+          <w:b/>
+          <w:bCs/>
+        </w:rPr>
+        <w:br w:type="page"/>
+      </w:r>
+    </w:p>
+    <w:p>
+      <w:pPr>
+        <w:jc w:val="center"/>
+        <w:rPr>
+          <w:b/>
+          <w:bCs/>
+          <w:sz w:val="32"/>
+          <w:szCs w:val="32"/>
+        </w:rPr>
+      </w:pPr>
+      <w:r>
+        <w:rPr>
+          <w:b/>
+          <w:bCs/>
+          <w:sz w:val="32"/>
+          <w:szCs w:val="32"/>
+        </w:rPr>
+        <w:lastRenderedPageBreak/>
+        <w:t>View Component</w:t>
+      </w:r>
+    </w:p>
+    <w:p>
+      <w:pPr>
+        <w:rPr>
+          <w:b/>
+          <w:bCs/>
+        </w:rPr>
+      </w:pPr>
+      <w:r>
+        <w:rPr>
+          <w:b/>
+          <w:bCs/>
+        </w:rPr>
+        <w:drawing>
+          <wp:inline distT="0" distB="0" distL="0" distR="0" wp14:anchorId="34ED24A4" wp14:editId="61C3040D">
+            <wp:extent cx="5943600" cy="2934970"/>
+            <wp:effectExtent l="0" t="0" r="0" b="0"/>
+            <wp:docPr id="1397612716" name="Picture 1"/>
+            <wp:cNvGraphicFramePr>
+              <a:graphicFrameLocks xmlns:a="http://schemas.openxmlformats.org/drawingml/2006/main" noChangeAspect="1"/>
+            </wp:cNvGraphicFramePr>
+            <a:graphic xmlns:a="http://schemas.openxmlformats.org/drawingml/2006/main">
+              <a:graphicData uri="http://schemas.openxmlformats.org/drawingml/2006/picture">
+                <pic:pic xmlns:pic="http://schemas.openxmlformats.org/drawingml/2006/picture">
+                  <pic:nvPicPr>
+                    <pic:cNvPr id="1397612716" name=""/>
+                    <pic:cNvPicPr/>
+                  </pic:nvPicPr>
+                  <pic:blipFill>
+                    <a:blip r:embed="rId55"/>
+                    <a:stretch>
+                      <a:fillRect/>
+                    </a:stretch>
+                  </pic:blipFill>
+                  <pic:spPr>
+                    <a:xfrm>
+                      <a:off x="0" y="0"/>
+                      <a:ext cx="5943600" cy="2934970"/>
+                    </a:xfrm>
+                    <a:prstGeom prst="rect">
+                      <a:avLst/>
+                    </a:prstGeom>
+                  </pic:spPr>
+                </pic:pic>
+              </a:graphicData>
+            </a:graphic>
+          </wp:inline>
+        </w:drawing>
+      </w:r>
+    </w:p>
+    <w:p>
+      <w:pPr>
+        <w:rPr>
+          <w:b/>
+          <w:bCs/>
+        </w:rPr>
+      </w:pPr>
+      <w:r>
+        <w:rPr>
+          <w:b/>
+          <w:bCs/>
+        </w:rPr>
+        <w:t>*</w:t>
+      </w:r>
+    </w:p>
+    <w:p>
+      <w:pPr>
+        <w:rPr>
+          <w:b/>
+          <w:bCs/>
+        </w:rPr>
+      </w:pPr>
+      <w:r>
+        <w:rPr>
+          <w:b/>
+          <w:bCs/>
+        </w:rPr>
+        <w:drawing>
+          <wp:inline distT="0" distB="0" distL="0" distR="0" wp14:anchorId="224F4345" wp14:editId="55D48595">
+            <wp:extent cx="3982006" cy="809738"/>
+            <wp:effectExtent l="0" t="0" r="0" b="9525"/>
+            <wp:docPr id="500662748" name="Picture 1"/>
+            <wp:cNvGraphicFramePr>
+              <a:graphicFrameLocks xmlns:a="http://schemas.openxmlformats.org/drawingml/2006/main" noChangeAspect="1"/>
+            </wp:cNvGraphicFramePr>
+            <a:graphic xmlns:a="http://schemas.openxmlformats.org/drawingml/2006/main">
+              <a:graphicData uri="http://schemas.openxmlformats.org/drawingml/2006/picture">
+                <pic:pic xmlns:pic="http://schemas.openxmlformats.org/drawingml/2006/picture">
+                  <pic:nvPicPr>
+                    <pic:cNvPr id="500662748" name=""/>
+                    <pic:cNvPicPr/>
+                  </pic:nvPicPr>
+                  <pic:blipFill>
+                    <a:blip r:embed="rId56"/>
+                    <a:stretch>
+                      <a:fillRect/>
+                    </a:stretch>
+                  </pic:blipFill>
+                  <pic:spPr>
+                    <a:xfrm>
+                      <a:off x="0" y="0"/>
+                      <a:ext cx="3982006" cy="809738"/>
+                    </a:xfrm>
+                    <a:prstGeom prst="rect">
+                      <a:avLst/>
+                    </a:prstGeom>
+                  </pic:spPr>
+                </pic:pic>
+              </a:graphicData>
+            </a:graphic>
+          </wp:inline>
+        </w:drawing>
+      </w:r>
+    </w:p>
+    <w:p>
+      <w:pPr>
+        <w:rPr>
+          <w:b/>
+          <w:bCs/>
+        </w:rPr>
+      </w:pPr>
+      <w:r>
+        <w:rPr>
+          <w:b/>
+          <w:bCs/>
+        </w:rPr>
+        <w:drawing>
+          <wp:inline distT="0" distB="0" distL="0" distR="0" wp14:anchorId="507284EB" wp14:editId="744C56FB">
+            <wp:extent cx="5943600" cy="1838960"/>
+            <wp:effectExtent l="0" t="0" r="0" b="8890"/>
+            <wp:docPr id="1891387393" name="Picture 1"/>
+            <wp:cNvGraphicFramePr>
+              <a:graphicFrameLocks xmlns:a="http://schemas.openxmlformats.org/drawingml/2006/main" noChangeAspect="1"/>
+            </wp:cNvGraphicFramePr>
+            <a:graphic xmlns:a="http://schemas.openxmlformats.org/drawingml/2006/main">
+              <a:graphicData uri="http://schemas.openxmlformats.org/drawingml/2006/picture">
+                <pic:pic xmlns:pic="http://schemas.openxmlformats.org/drawingml/2006/picture">
+                  <pic:nvPicPr>
+                    <pic:cNvPr id="1891387393" name=""/>
+                    <pic:cNvPicPr/>
+                  </pic:nvPicPr>
+                  <pic:blipFill>
+                    <a:blip r:embed="rId57"/>
+                    <a:stretch>
+                      <a:fillRect/>
+                    </a:stretch>
+                  </pic:blipFill>
+                  <pic:spPr>
+                    <a:xfrm>
+                      <a:off x="0" y="0"/>
+                      <a:ext cx="5943600" cy="1838960"/>
+                    </a:xfrm>
+                    <a:prstGeom prst="rect">
+                      <a:avLst/>
+                    </a:prstGeom>
+                  </pic:spPr>
+                </pic:pic>
+              </a:graphicData>
+            </a:graphic>
+          </wp:inline>
+        </w:drawing>
+      </w:r>
+    </w:p>
+    <w:p>
+      <w:pPr>
+        <w:rPr>
+          <w:b/>
+          <w:bCs/>
+        </w:rPr>
+      </w:pPr>
+      <w:r>
+        <w:rPr>
+          <w:b/>
+          <w:bCs/>
+        </w:rPr>
+        <w:lastRenderedPageBreak/>
+        <w:drawing>
+          <wp:inline distT="0" distB="0" distL="0" distR="0" wp14:anchorId="1545970D" wp14:editId="29C07E94">
+            <wp:extent cx="5087060" cy="2562583"/>
+            <wp:effectExtent l="0" t="0" r="0" b="9525"/>
+            <wp:docPr id="233339369" name="Picture 1"/>
+            <wp:cNvGraphicFramePr>
+              <a:graphicFrameLocks xmlns:a="http://schemas.openxmlformats.org/drawingml/2006/main" noChangeAspect="1"/>
+            </wp:cNvGraphicFramePr>
+            <a:graphic xmlns:a="http://schemas.openxmlformats.org/drawingml/2006/main">
+              <a:graphicData uri="http://schemas.openxmlformats.org/drawingml/2006/picture">
+                <pic:pic xmlns:pic="http://schemas.openxmlformats.org/drawingml/2006/picture">
+                  <pic:nvPicPr>
+                    <pic:cNvPr id="233339369" name=""/>
+                    <pic:cNvPicPr/>
+                  </pic:nvPicPr>
+                  <pic:blipFill>
+                    <a:blip r:embed="rId58"/>
+                    <a:stretch>
+                      <a:fillRect/>
+                    </a:stretch>
+                  </pic:blipFill>
+                  <pic:spPr>
+                    <a:xfrm>
+                      <a:off x="0" y="0"/>
+                      <a:ext cx="5087060" cy="2562583"/>
                     </a:xfrm>
                     <a:prstGeom prst="rect">
                       <a:avLst/>
@@ -9649,6 +9988,7 @@
   <w:style w:type="character" w:default="1" w:styleId="DefaultParagraphFont">
     <w:name w:val="Default Paragraph Font"/>
     <w:uiPriority w:val="1"/>
+    <w:semiHidden/>
     <w:unhideWhenUsed/>
   </w:style>
   <w:style w:type="table" w:default="1" w:styleId="TableNormal">

</xml_diff>

<commit_message>
feat: add wishlist and compare
</commit_message>
<xml_diff>
--- a/ghi-chu-asp.net.docx
+++ b/ghi-chu-asp.net.docx
@@ -7167,6 +7167,7 @@
         <w:rPr>
           <w:b/>
           <w:bCs/>
+          <w:noProof/>
         </w:rPr>
         <w:drawing>
           <wp:inline distT="0" distB="0" distL="0" distR="0" wp14:anchorId="34ED24A4" wp14:editId="61C3040D">
@@ -7231,6 +7232,7 @@
         <w:rPr>
           <w:b/>
           <w:bCs/>
+          <w:noProof/>
         </w:rPr>
         <w:drawing>
           <wp:inline distT="0" distB="0" distL="0" distR="0" wp14:anchorId="224F4345" wp14:editId="55D48595">
@@ -7280,6 +7282,7 @@
         <w:rPr>
           <w:b/>
           <w:bCs/>
+          <w:noProof/>
         </w:rPr>
         <w:drawing>
           <wp:inline distT="0" distB="0" distL="0" distR="0" wp14:anchorId="507284EB" wp14:editId="744C56FB">
@@ -7329,6 +7332,7 @@
         <w:rPr>
           <w:b/>
           <w:bCs/>
+          <w:noProof/>
         </w:rPr>
         <w:lastRenderedPageBreak/>
         <w:drawing>
@@ -7368,6 +7372,342 @@
         </w:drawing>
       </w:r>
     </w:p>
+    <w:p>
+      <w:pPr>
+        <w:rPr>
+          <w:b/>
+          <w:bCs/>
+        </w:rPr>
+      </w:pPr>
+    </w:p>
+    <w:p>
+      <w:pPr>
+        <w:rPr>
+          <w:b/>
+          <w:bCs/>
+          <w:color w:val="EE0000"/>
+        </w:rPr>
+      </w:pPr>
+      <w:r>
+        <w:rPr>
+          <w:b/>
+          <w:bCs/>
+          <w:color w:val="EE0000"/>
+        </w:rPr>
+        <w:br w:type="page"/>
+      </w:r>
+    </w:p>
+    <w:p>
+      <w:pPr>
+        <w:rPr>
+          <w:b/>
+          <w:bCs/>
+          <w:color w:val="EE0000"/>
+        </w:rPr>
+      </w:pPr>
+      <w:r>
+        <w:rPr>
+          <w:b/>
+          <w:bCs/>
+          <w:color w:val="EE0000"/>
+        </w:rPr>
+        <w:lastRenderedPageBreak/>
+        <w:t>@Lưu ý:</w:t>
+      </w:r>
+    </w:p>
+    <w:p>
+      <w:pPr>
+        <w:rPr>
+          <w:b/>
+          <w:bCs/>
+        </w:rPr>
+      </w:pPr>
+      <w:r>
+        <w:rPr>
+          <w:b/>
+          <w:bCs/>
+          <w:noProof/>
+        </w:rPr>
+        <w:drawing>
+          <wp:inline distT="0" distB="0" distL="0" distR="0" wp14:anchorId="5329B1A6" wp14:editId="2E05F4C2">
+            <wp:extent cx="5943600" cy="1398905"/>
+            <wp:effectExtent l="0" t="0" r="0" b="0"/>
+            <wp:docPr id="191945343" name="Picture 1"/>
+            <wp:cNvGraphicFramePr>
+              <a:graphicFrameLocks xmlns:a="http://schemas.openxmlformats.org/drawingml/2006/main" noChangeAspect="1"/>
+            </wp:cNvGraphicFramePr>
+            <a:graphic xmlns:a="http://schemas.openxmlformats.org/drawingml/2006/main">
+              <a:graphicData uri="http://schemas.openxmlformats.org/drawingml/2006/picture">
+                <pic:pic xmlns:pic="http://schemas.openxmlformats.org/drawingml/2006/picture">
+                  <pic:nvPicPr>
+                    <pic:cNvPr id="191945343" name=""/>
+                    <pic:cNvPicPr/>
+                  </pic:nvPicPr>
+                  <pic:blipFill>
+                    <a:blip r:embed="rId59"/>
+                    <a:stretch>
+                      <a:fillRect/>
+                    </a:stretch>
+                  </pic:blipFill>
+                  <pic:spPr>
+                    <a:xfrm>
+                      <a:off x="0" y="0"/>
+                      <a:ext cx="5943600" cy="1398905"/>
+                    </a:xfrm>
+                    <a:prstGeom prst="rect">
+                      <a:avLst/>
+                    </a:prstGeom>
+                  </pic:spPr>
+                </pic:pic>
+              </a:graphicData>
+            </a:graphic>
+          </wp:inline>
+        </w:drawing>
+      </w:r>
+    </w:p>
+    <w:p>
+      <w:pPr>
+        <w:rPr>
+          <w:b/>
+          <w:bCs/>
+        </w:rPr>
+      </w:pPr>
+      <w:r>
+        <w:rPr>
+          <w:b/>
+          <w:bCs/>
+        </w:rPr>
+        <w:br w:type="page"/>
+      </w:r>
+    </w:p>
+    <w:p>
+      <w:pPr>
+        <w:jc w:val="center"/>
+        <w:rPr>
+          <w:b/>
+          <w:bCs/>
+          <w:sz w:val="32"/>
+          <w:szCs w:val="32"/>
+        </w:rPr>
+      </w:pPr>
+      <w:r>
+        <w:rPr>
+          <w:b/>
+          <w:bCs/>
+          <w:sz w:val="32"/>
+          <w:szCs w:val="32"/>
+        </w:rPr>
+        <w:lastRenderedPageBreak/>
+        <w:t>Wishlist và Compare</w:t>
+      </w:r>
+    </w:p>
+    <w:p>
+      <w:pPr>
+        <w:rPr>
+          <w:b/>
+          <w:bCs/>
+        </w:rPr>
+      </w:pPr>
+      <w:r>
+        <w:rPr>
+          <w:b/>
+          <w:bCs/>
+          <w:noProof/>
+        </w:rPr>
+        <w:drawing>
+          <wp:inline distT="0" distB="0" distL="0" distR="0" wp14:anchorId="0E0E9F14" wp14:editId="61F2A09C">
+            <wp:extent cx="5669280" cy="3850992"/>
+            <wp:effectExtent l="0" t="0" r="7620" b="0"/>
+            <wp:docPr id="1462651995" name="Picture 1"/>
+            <wp:cNvGraphicFramePr>
+              <a:graphicFrameLocks xmlns:a="http://schemas.openxmlformats.org/drawingml/2006/main" noChangeAspect="1"/>
+            </wp:cNvGraphicFramePr>
+            <a:graphic xmlns:a="http://schemas.openxmlformats.org/drawingml/2006/main">
+              <a:graphicData uri="http://schemas.openxmlformats.org/drawingml/2006/picture">
+                <pic:pic xmlns:pic="http://schemas.openxmlformats.org/drawingml/2006/picture">
+                  <pic:nvPicPr>
+                    <pic:cNvPr id="1462651995" name=""/>
+                    <pic:cNvPicPr/>
+                  </pic:nvPicPr>
+                  <pic:blipFill>
+                    <a:blip r:embed="rId60"/>
+                    <a:stretch>
+                      <a:fillRect/>
+                    </a:stretch>
+                  </pic:blipFill>
+                  <pic:spPr>
+                    <a:xfrm>
+                      <a:off x="0" y="0"/>
+                      <a:ext cx="5678608" cy="3857329"/>
+                    </a:xfrm>
+                    <a:prstGeom prst="rect">
+                      <a:avLst/>
+                    </a:prstGeom>
+                  </pic:spPr>
+                </pic:pic>
+              </a:graphicData>
+            </a:graphic>
+          </wp:inline>
+        </w:drawing>
+      </w:r>
+    </w:p>
+    <w:p>
+      <w:pPr>
+        <w:rPr>
+          <w:b/>
+          <w:bCs/>
+        </w:rPr>
+      </w:pPr>
+      <w:r>
+        <w:rPr>
+          <w:b/>
+          <w:bCs/>
+          <w:noProof/>
+        </w:rPr>
+        <w:lastRenderedPageBreak/>
+        <w:drawing>
+          <wp:inline distT="0" distB="0" distL="0" distR="0" wp14:anchorId="5ACD594C" wp14:editId="1ADC1407">
+            <wp:extent cx="5645426" cy="5156276"/>
+            <wp:effectExtent l="0" t="0" r="0" b="6350"/>
+            <wp:docPr id="1639011685" name="Picture 1"/>
+            <wp:cNvGraphicFramePr>
+              <a:graphicFrameLocks xmlns:a="http://schemas.openxmlformats.org/drawingml/2006/main" noChangeAspect="1"/>
+            </wp:cNvGraphicFramePr>
+            <a:graphic xmlns:a="http://schemas.openxmlformats.org/drawingml/2006/main">
+              <a:graphicData uri="http://schemas.openxmlformats.org/drawingml/2006/picture">
+                <pic:pic xmlns:pic="http://schemas.openxmlformats.org/drawingml/2006/picture">
+                  <pic:nvPicPr>
+                    <pic:cNvPr id="1639011685" name=""/>
+                    <pic:cNvPicPr/>
+                  </pic:nvPicPr>
+                  <pic:blipFill>
+                    <a:blip r:embed="rId61"/>
+                    <a:stretch>
+                      <a:fillRect/>
+                    </a:stretch>
+                  </pic:blipFill>
+                  <pic:spPr>
+                    <a:xfrm>
+                      <a:off x="0" y="0"/>
+                      <a:ext cx="5651001" cy="5161368"/>
+                    </a:xfrm>
+                    <a:prstGeom prst="rect">
+                      <a:avLst/>
+                    </a:prstGeom>
+                  </pic:spPr>
+                </pic:pic>
+              </a:graphicData>
+            </a:graphic>
+          </wp:inline>
+        </w:drawing>
+      </w:r>
+    </w:p>
+    <w:p>
+      <w:pPr>
+        <w:rPr>
+          <w:b/>
+          <w:bCs/>
+        </w:rPr>
+      </w:pPr>
+    </w:p>
+    <w:p>
+      <w:pPr>
+        <w:rPr>
+          <w:b/>
+          <w:bCs/>
+          <w:color w:val="EE0000"/>
+        </w:rPr>
+      </w:pPr>
+      <w:r>
+        <w:rPr>
+          <w:b/>
+          <w:bCs/>
+          <w:color w:val="EE0000"/>
+        </w:rPr>
+        <w:t>Lưu ý:</w:t>
+      </w:r>
+    </w:p>
+    <w:p>
+      <w:pPr>
+        <w:rPr>
+          <w:color w:val="EE0000"/>
+        </w:rPr>
+      </w:pPr>
+      <w:r>
+        <w:rPr>
+          <w:color w:val="EE0000"/>
+        </w:rPr>
+        <w:t>ASP.NET Core sẽ mặc định lấy View có cùng tên với Action.</w:t>
+      </w:r>
+    </w:p>
+    <w:p>
+      <w:pPr>
+        <w:rPr>
+          <w:color w:val="EE0000"/>
+        </w:rPr>
+      </w:pPr>
+      <w:r>
+        <w:rPr>
+          <w:color w:val="EE0000"/>
+        </w:rPr>
+        <w:t>Nghĩa là:</w:t>
+      </w:r>
+    </w:p>
+    <w:p>
+      <w:pPr>
+        <w:numPr>
+          <w:ilvl w:val="0"/>
+          <w:numId w:val="15"/>
+        </w:numPr>
+        <w:rPr>
+          <w:color w:val="EE0000"/>
+        </w:rPr>
+      </w:pPr>
+      <w:r>
+        <w:rPr>
+          <w:color w:val="EE0000"/>
+        </w:rPr>
+        <w:t xml:space="preserve">Action Wishlist() → Views/Home/Wishlist.cshtml </w:t>
+      </w:r>
+    </w:p>
+    <w:p>
+      <w:pPr>
+        <w:numPr>
+          <w:ilvl w:val="0"/>
+          <w:numId w:val="15"/>
+        </w:numPr>
+        <w:rPr>
+          <w:color w:val="EE0000"/>
+        </w:rPr>
+      </w:pPr>
+      <w:r>
+        <w:rPr>
+          <w:color w:val="EE0000"/>
+        </w:rPr>
+        <w:t xml:space="preserve">Action Compare() → Views/Home/Compare.cshtml </w:t>
+      </w:r>
+    </w:p>
+    <w:p>
+      <w:pPr>
+        <w:rPr>
+          <w:color w:val="EE0000"/>
+        </w:rPr>
+      </w:pPr>
+      <w:r>
+        <w:rPr>
+          <w:color w:val="EE0000"/>
+        </w:rPr>
+        <w:t>Nó không nhìn tên biến data, mà nhìn tên Action.</w:t>
+      </w:r>
+    </w:p>
+    <w:p>
+      <w:pPr>
+        <w:rPr>
+          <w:b/>
+          <w:bCs/>
+        </w:rPr>
+      </w:pPr>
+    </w:p>
     <w:sectPr>
       <w:pgSz w:w="12240" w:h="15840"/>
       <w:pgMar w:top="1440" w:right="1440" w:bottom="1440" w:left="1440" w:header="720" w:footer="720" w:gutter="0"/>
@@ -8633,6 +8973,155 @@
     </w:lvl>
   </w:abstractNum>
   <w:abstractNum w:abstractNumId="9" w15:restartNumberingAfterBreak="0">
+    <w:nsid w:val="5BCF5A03"/>
+    <w:multiLevelType w:val="multilevel"/>
+    <w:tmpl w:val="CEA2D126"/>
+    <w:lvl w:ilvl="0">
+      <w:start w:val="1"/>
+      <w:numFmt w:val="bullet"/>
+      <w:lvlText w:val=""/>
+      <w:lvlJc w:val="left"/>
+      <w:pPr>
+        <w:tabs>
+          <w:tab w:val="num" w:pos="720"/>
+        </w:tabs>
+        <w:ind w:left="720" w:hanging="360"/>
+      </w:pPr>
+      <w:rPr>
+        <w:rFonts w:ascii="Symbol" w:hAnsi="Symbol" w:hint="default"/>
+        <w:sz w:val="20"/>
+      </w:rPr>
+    </w:lvl>
+    <w:lvl w:ilvl="1" w:tentative="1">
+      <w:start w:val="1"/>
+      <w:numFmt w:val="bullet"/>
+      <w:lvlText w:val="o"/>
+      <w:lvlJc w:val="left"/>
+      <w:pPr>
+        <w:tabs>
+          <w:tab w:val="num" w:pos="1440"/>
+        </w:tabs>
+        <w:ind w:left="1440" w:hanging="360"/>
+      </w:pPr>
+      <w:rPr>
+        <w:rFonts w:ascii="Courier New" w:hAnsi="Courier New" w:hint="default"/>
+        <w:sz w:val="20"/>
+      </w:rPr>
+    </w:lvl>
+    <w:lvl w:ilvl="2" w:tentative="1">
+      <w:start w:val="1"/>
+      <w:numFmt w:val="bullet"/>
+      <w:lvlText w:val=""/>
+      <w:lvlJc w:val="left"/>
+      <w:pPr>
+        <w:tabs>
+          <w:tab w:val="num" w:pos="2160"/>
+        </w:tabs>
+        <w:ind w:left="2160" w:hanging="360"/>
+      </w:pPr>
+      <w:rPr>
+        <w:rFonts w:ascii="Wingdings" w:hAnsi="Wingdings" w:hint="default"/>
+        <w:sz w:val="20"/>
+      </w:rPr>
+    </w:lvl>
+    <w:lvl w:ilvl="3" w:tentative="1">
+      <w:start w:val="1"/>
+      <w:numFmt w:val="bullet"/>
+      <w:lvlText w:val=""/>
+      <w:lvlJc w:val="left"/>
+      <w:pPr>
+        <w:tabs>
+          <w:tab w:val="num" w:pos="2880"/>
+        </w:tabs>
+        <w:ind w:left="2880" w:hanging="360"/>
+      </w:pPr>
+      <w:rPr>
+        <w:rFonts w:ascii="Wingdings" w:hAnsi="Wingdings" w:hint="default"/>
+        <w:sz w:val="20"/>
+      </w:rPr>
+    </w:lvl>
+    <w:lvl w:ilvl="4" w:tentative="1">
+      <w:start w:val="1"/>
+      <w:numFmt w:val="bullet"/>
+      <w:lvlText w:val=""/>
+      <w:lvlJc w:val="left"/>
+      <w:pPr>
+        <w:tabs>
+          <w:tab w:val="num" w:pos="3600"/>
+        </w:tabs>
+        <w:ind w:left="3600" w:hanging="360"/>
+      </w:pPr>
+      <w:rPr>
+        <w:rFonts w:ascii="Wingdings" w:hAnsi="Wingdings" w:hint="default"/>
+        <w:sz w:val="20"/>
+      </w:rPr>
+    </w:lvl>
+    <w:lvl w:ilvl="5" w:tentative="1">
+      <w:start w:val="1"/>
+      <w:numFmt w:val="bullet"/>
+      <w:lvlText w:val=""/>
+      <w:lvlJc w:val="left"/>
+      <w:pPr>
+        <w:tabs>
+          <w:tab w:val="num" w:pos="4320"/>
+        </w:tabs>
+        <w:ind w:left="4320" w:hanging="360"/>
+      </w:pPr>
+      <w:rPr>
+        <w:rFonts w:ascii="Wingdings" w:hAnsi="Wingdings" w:hint="default"/>
+        <w:sz w:val="20"/>
+      </w:rPr>
+    </w:lvl>
+    <w:lvl w:ilvl="6" w:tentative="1">
+      <w:start w:val="1"/>
+      <w:numFmt w:val="bullet"/>
+      <w:lvlText w:val=""/>
+      <w:lvlJc w:val="left"/>
+      <w:pPr>
+        <w:tabs>
+          <w:tab w:val="num" w:pos="5040"/>
+        </w:tabs>
+        <w:ind w:left="5040" w:hanging="360"/>
+      </w:pPr>
+      <w:rPr>
+        <w:rFonts w:ascii="Wingdings" w:hAnsi="Wingdings" w:hint="default"/>
+        <w:sz w:val="20"/>
+      </w:rPr>
+    </w:lvl>
+    <w:lvl w:ilvl="7" w:tentative="1">
+      <w:start w:val="1"/>
+      <w:numFmt w:val="bullet"/>
+      <w:lvlText w:val=""/>
+      <w:lvlJc w:val="left"/>
+      <w:pPr>
+        <w:tabs>
+          <w:tab w:val="num" w:pos="5760"/>
+        </w:tabs>
+        <w:ind w:left="5760" w:hanging="360"/>
+      </w:pPr>
+      <w:rPr>
+        <w:rFonts w:ascii="Wingdings" w:hAnsi="Wingdings" w:hint="default"/>
+        <w:sz w:val="20"/>
+      </w:rPr>
+    </w:lvl>
+    <w:lvl w:ilvl="8" w:tentative="1">
+      <w:start w:val="1"/>
+      <w:numFmt w:val="bullet"/>
+      <w:lvlText w:val=""/>
+      <w:lvlJc w:val="left"/>
+      <w:pPr>
+        <w:tabs>
+          <w:tab w:val="num" w:pos="6480"/>
+        </w:tabs>
+        <w:ind w:left="6480" w:hanging="360"/>
+      </w:pPr>
+      <w:rPr>
+        <w:rFonts w:ascii="Wingdings" w:hAnsi="Wingdings" w:hint="default"/>
+        <w:sz w:val="20"/>
+      </w:rPr>
+    </w:lvl>
+  </w:abstractNum>
+  <w:abstractNum w:abstractNumId="10" w15:restartNumberingAfterBreak="0">
     <w:nsid w:val="5DB52225"/>
     <w:multiLevelType w:val="multilevel"/>
     <w:tmpl w:val="54607798"/>
@@ -8781,7 +9270,7 @@
       </w:rPr>
     </w:lvl>
   </w:abstractNum>
-  <w:abstractNum w:abstractNumId="10" w15:restartNumberingAfterBreak="0">
+  <w:abstractNum w:abstractNumId="11" w15:restartNumberingAfterBreak="0">
     <w:nsid w:val="5EBC1FBA"/>
     <w:multiLevelType w:val="multilevel"/>
     <w:tmpl w:val="2A0A0D52"/>
@@ -8925,7 +9414,7 @@
       </w:rPr>
     </w:lvl>
   </w:abstractNum>
-  <w:abstractNum w:abstractNumId="11" w15:restartNumberingAfterBreak="0">
+  <w:abstractNum w:abstractNumId="12" w15:restartNumberingAfterBreak="0">
     <w:nsid w:val="68194282"/>
     <w:multiLevelType w:val="multilevel"/>
     <w:tmpl w:val="8042E988"/>
@@ -9074,7 +9563,7 @@
       </w:rPr>
     </w:lvl>
   </w:abstractNum>
-  <w:abstractNum w:abstractNumId="12" w15:restartNumberingAfterBreak="0">
+  <w:abstractNum w:abstractNumId="13" w15:restartNumberingAfterBreak="0">
     <w:nsid w:val="73B52B43"/>
     <w:multiLevelType w:val="multilevel"/>
     <w:tmpl w:val="59884D7E"/>
@@ -9191,7 +9680,7 @@
       </w:rPr>
     </w:lvl>
   </w:abstractNum>
-  <w:abstractNum w:abstractNumId="13" w15:restartNumberingAfterBreak="0">
+  <w:abstractNum w:abstractNumId="14" w15:restartNumberingAfterBreak="0">
     <w:nsid w:val="763E0766"/>
     <w:multiLevelType w:val="multilevel"/>
     <w:tmpl w:val="2BD6197E"/>
@@ -9341,7 +9830,7 @@
     </w:lvl>
   </w:abstractNum>
   <w:num w:numId="1" w16cid:durableId="430272983">
-    <w:abstractNumId w:val="12"/>
+    <w:abstractNumId w:val="13"/>
   </w:num>
   <w:num w:numId="2" w16cid:durableId="137504538">
     <w:abstractNumId w:val="3"/>
@@ -9350,16 +9839,16 @@
     <w:abstractNumId w:val="6"/>
   </w:num>
   <w:num w:numId="4" w16cid:durableId="848760794">
-    <w:abstractNumId w:val="13"/>
+    <w:abstractNumId w:val="14"/>
   </w:num>
   <w:num w:numId="5" w16cid:durableId="565577409">
-    <w:abstractNumId w:val="10"/>
+    <w:abstractNumId w:val="11"/>
   </w:num>
   <w:num w:numId="6" w16cid:durableId="2099518094">
     <w:abstractNumId w:val="7"/>
   </w:num>
   <w:num w:numId="7" w16cid:durableId="1236621603">
-    <w:abstractNumId w:val="11"/>
+    <w:abstractNumId w:val="12"/>
   </w:num>
   <w:num w:numId="8" w16cid:durableId="1895266124">
     <w:abstractNumId w:val="4"/>
@@ -9380,6 +9869,9 @@
     <w:abstractNumId w:val="8"/>
   </w:num>
   <w:num w:numId="14" w16cid:durableId="1228802026">
+    <w:abstractNumId w:val="10"/>
+  </w:num>
+  <w:num w:numId="15" w16cid:durableId="292950768">
     <w:abstractNumId w:val="9"/>
   </w:num>
 </w:numbering>
@@ -9988,7 +10480,6 @@
   <w:style w:type="character" w:default="1" w:styleId="DefaultParagraphFont">
     <w:name w:val="Default Paragraph Font"/>
     <w:uiPriority w:val="1"/>
-    <w:semiHidden/>
     <w:unhideWhenUsed/>
   </w:style>
   <w:style w:type="table" w:default="1" w:styleId="TableNormal">

</xml_diff>

<commit_message>
feat: add admin shipping
</commit_message>
<xml_diff>
--- a/ghi-chu-asp.net.docx
+++ b/ghi-chu-asp.net.docx
@@ -1,6 +1,6 @@
 
 <file path=word/document.xml><?xml version="1.0" encoding="utf-8"?>
-<w:document xmlns:wpc="http://schemas.microsoft.com/office/word/2010/wordprocessingCanvas" xmlns:cx="http://schemas.microsoft.com/office/drawing/2014/chartex" xmlns:cx1="http://schemas.microsoft.com/office/drawing/2015/9/8/chartex" xmlns:cx2="http://schemas.microsoft.com/office/drawing/2015/10/21/chartex" xmlns:cx3="http://schemas.microsoft.com/office/drawing/2016/5/9/chartex" xmlns:cx4="http://schemas.microsoft.com/office/drawing/2016/5/10/chartex" xmlns:cx5="http://schemas.microsoft.com/office/drawing/2016/5/11/chartex" xmlns:cx6="http://schemas.microsoft.com/office/drawing/2016/5/12/chartex" xmlns:cx7="http://schemas.microsoft.com/office/drawing/2016/5/13/chartex" xmlns:cx8="http://schemas.microsoft.com/office/drawing/2016/5/14/chartex" xmlns:mc="http://schemas.openxmlformats.org/markup-compatibility/2006" xmlns:aink="http://schemas.microsoft.com/office/drawing/2016/ink" xmlns:am3d="http://schemas.microsoft.com/office/drawing/2017/model3d" xmlns:o="urn:schemas-microsoft-com:office:office" xmlns:oel="http://schemas.microsoft.com/office/2019/extlst" xmlns:r="http://schemas.openxmlformats.org/officeDocument/2006/relationships" xmlns:m="http://schemas.openxmlformats.org/officeDocument/2006/math" xmlns:v="urn:schemas-microsoft-com:vml" xmlns:wp14="http://schemas.microsoft.com/office/word/2010/wordprocessingDrawing" xmlns:wp="http://schemas.openxmlformats.org/drawingml/2006/wordprocessingDrawing" xmlns:w10="urn:schemas-microsoft-com:office:word" xmlns:w="http://schemas.openxmlformats.org/wordprocessingml/2006/main" xmlns:w14="http://schemas.microsoft.com/office/word/2010/wordml" xmlns:w15="http://schemas.microsoft.com/office/word/2012/wordml" xmlns:w16cex="http://schemas.microsoft.com/office/word/2018/wordml/cex" xmlns:w16cid="http://schemas.microsoft.com/office/word/2016/wordml/cid" xmlns:w16="http://schemas.microsoft.com/office/word/2018/wordml" xmlns:w16du="http://schemas.microsoft.com/office/word/2023/wordml/word16du" xmlns:w16sdtdh="http://schemas.microsoft.com/office/word/2020/wordml/sdtdatahash" xmlns:w16sdtfl="http://schemas.microsoft.com/office/word/2024/wordml/sdtformatlock" xmlns:w16se="http://schemas.microsoft.com/office/word/2015/wordml/symex" xmlns:wpg="http://schemas.microsoft.com/office/word/2010/wordprocessingGroup" xmlns:wpi="http://schemas.microsoft.com/office/word/2010/wordprocessingInk" xmlns:wne="http://schemas.microsoft.com/office/word/2006/wordml" xmlns:wps="http://schemas.microsoft.com/office/word/2010/wordprocessingShape" mc:Ignorable="w14 w15 w16se w16cid w16 w16cex w16sdtdh w16sdtfl w16du wp14">
+<w:document xmlns:wpc="http://schemas.microsoft.com/office/word/2010/wordprocessingCanvas" xmlns:cx="http://schemas.microsoft.com/office/drawing/2014/chartex" xmlns:cx1="http://schemas.microsoft.com/office/drawing/2015/9/8/chartex" xmlns:cx2="http://schemas.microsoft.com/office/drawing/2015/10/21/chartex" xmlns:cx3="http://schemas.microsoft.com/office/drawing/2016/5/9/chartex" xmlns:cx4="http://schemas.microsoft.com/office/drawing/2016/5/10/chartex" xmlns:cx5="http://schemas.microsoft.com/office/drawing/2016/5/11/chartex" xmlns:cx6="http://schemas.microsoft.com/office/drawing/2016/5/12/chartex" xmlns:cx7="http://schemas.microsoft.com/office/drawing/2016/5/13/chartex" xmlns:cx8="http://schemas.microsoft.com/office/drawing/2016/5/14/chartex" xmlns:mc="http://schemas.openxmlformats.org/markup-compatibility/2006" xmlns:aink="http://schemas.microsoft.com/office/drawing/2016/ink" xmlns:am3d="http://schemas.microsoft.com/office/drawing/2017/model3d" xmlns:o="urn:schemas-microsoft-com:office:office" xmlns:oel="http://schemas.microsoft.com/office/2019/extlst" xmlns:r="http://schemas.openxmlformats.org/officeDocument/2006/relationships" xmlns:m="http://schemas.openxmlformats.org/officeDocument/2006/math" xmlns:v="urn:schemas-microsoft-com:vml" xmlns:wp14="http://schemas.microsoft.com/office/word/2010/wordprocessingDrawing" xmlns:wp="http://schemas.openxmlformats.org/drawingml/2006/wordprocessingDrawing" xmlns:w10="urn:schemas-microsoft-com:office:word" xmlns:w="http://schemas.openxmlformats.org/wordprocessingml/2006/main" xmlns:w14="http://schemas.microsoft.com/office/word/2010/wordml" xmlns:w15="http://schemas.microsoft.com/office/word/2012/wordml" xmlns:w16cei="http://schemas.microsoft.com/office/word/2026/wordml/cei" xmlns:w16cex="http://schemas.microsoft.com/office/word/2018/wordml/cex" xmlns:w16cid="http://schemas.microsoft.com/office/word/2016/wordml/cid" xmlns:w16="http://schemas.microsoft.com/office/word/2018/wordml" xmlns:w16du="http://schemas.microsoft.com/office/word/2023/wordml/word16du" xmlns:w16sdtdh="http://schemas.microsoft.com/office/word/2020/wordml/sdtdatahash" xmlns:w16sdtfl="http://schemas.microsoft.com/office/word/2024/wordml/sdtformatlock" xmlns:w16se="http://schemas.microsoft.com/office/word/2015/wordml/symex" xmlns:wpg="http://schemas.microsoft.com/office/word/2010/wordprocessingGroup" xmlns:wpi="http://schemas.microsoft.com/office/word/2010/wordprocessingInk" xmlns:wne="http://schemas.microsoft.com/office/word/2006/wordml" xmlns:wps="http://schemas.microsoft.com/office/word/2010/wordprocessingShape" mc:Ignorable="w14 w15 w16se w16cid w16 w16cex w16sdtdh w16sdtfl w16du wp14">
   <w:body>
     <w:p>
       <w:r>
@@ -7703,6 +7703,233 @@
     <w:p>
       <w:pPr>
         <w:rPr>
+          <w:color w:val="EE0000"/>
+        </w:rPr>
+      </w:pPr>
+      <w:r>
+        <w:rPr>
+          <w:color w:val="EE0000"/>
+        </w:rPr>
+        <w:br w:type="page"/>
+      </w:r>
+    </w:p>
+    <w:p>
+      <w:pPr>
+        <w:jc w:val="center"/>
+        <w:rPr>
+          <w:b/>
+          <w:bCs/>
+          <w:sz w:val="36"/>
+          <w:szCs w:val="36"/>
+        </w:rPr>
+      </w:pPr>
+      <w:r>
+        <w:rPr>
+          <w:b/>
+          <w:bCs/>
+          <w:sz w:val="36"/>
+          <w:szCs w:val="36"/>
+        </w:rPr>
+        <w:lastRenderedPageBreak/>
+        <w:t>AJAX</w:t>
+      </w:r>
+    </w:p>
+    <w:p>
+      <w:r>
+        <w:t xml:space="preserve">Ý của </w:t>
+      </w:r>
+      <w:r>
+        <w:rPr>
+          <w:b/>
+          <w:bCs/>
+        </w:rPr>
+        <w:t>"gửi AJAX"</w:t>
+      </w:r>
+      <w:r>
+        <w:t xml:space="preserve"> rất đơn giản.</w:t>
+      </w:r>
+    </w:p>
+    <w:p>
+      <w:r>
+        <w:t xml:space="preserve">Bình thường khi bạn bấm nút </w:t>
+      </w:r>
+      <w:r>
+        <w:rPr>
+          <w:b/>
+          <w:bCs/>
+        </w:rPr>
+        <w:t>Thêm</w:t>
+      </w:r>
+      <w:r>
+        <w:t xml:space="preserve">, trình duyệt sẽ gửi cả form lên server và </w:t>
+      </w:r>
+      <w:r>
+        <w:rPr>
+          <w:b/>
+          <w:bCs/>
+        </w:rPr>
+        <w:t>tải lại toàn bộ trang</w:t>
+      </w:r>
+      <w:r>
+        <w:t>.</w:t>
+      </w:r>
+    </w:p>
+    <w:p>
+      <w:r>
+        <w:t xml:space="preserve">Còn </w:t>
+      </w:r>
+      <w:r>
+        <w:rPr>
+          <w:b/>
+          <w:bCs/>
+        </w:rPr>
+        <w:t>AJAX</w:t>
+      </w:r>
+      <w:r>
+        <w:t xml:space="preserve"> thì chỉ gửi </w:t>
+      </w:r>
+      <w:r>
+        <w:rPr>
+          <w:b/>
+          <w:bCs/>
+        </w:rPr>
+        <w:t>dữ liệu</w:t>
+      </w:r>
+      <w:r>
+        <w:t xml:space="preserve"> lên server mà </w:t>
+      </w:r>
+      <w:r>
+        <w:rPr>
+          <w:b/>
+          <w:bCs/>
+        </w:rPr>
+        <w:t>không cần tải lại trang</w:t>
+      </w:r>
+      <w:r>
+        <w:t>.</w:t>
+      </w:r>
+    </w:p>
+    <w:p/>
+    <w:p>
+      <w:r>
+        <w:t>Nhấn nút "Thêm"</w:t>
+      </w:r>
+    </w:p>
+    <w:p>
+      <w:r>
+        <w:t xml:space="preserve">        │</w:t>
+      </w:r>
+    </w:p>
+    <w:p>
+      <w:r>
+        <w:t xml:space="preserve">        </w:t>
+      </w:r>
+      <w:r>
+        <w:rPr>
+          <w:rFonts w:ascii="Arial" w:hAnsi="Arial" w:cs="Arial"/>
+        </w:rPr>
+        <w:t>▼</w:t>
+      </w:r>
+    </w:p>
+    <w:p>
+      <w:r>
+        <w:t>JavaScript lấy dữ liệu</w:t>
+      </w:r>
+    </w:p>
+    <w:p>
+      <w:r>
+        <w:t xml:space="preserve">        │</w:t>
+      </w:r>
+    </w:p>
+    <w:p>
+      <w:r>
+        <w:t xml:space="preserve">        </w:t>
+      </w:r>
+      <w:r>
+        <w:rPr>
+          <w:rFonts w:ascii="Arial" w:hAnsi="Arial" w:cs="Arial"/>
+        </w:rPr>
+        <w:t>▼</w:t>
+      </w:r>
+    </w:p>
+    <w:p>
+      <w:r>
+        <w:t>AJAX gửi dữ liệu lên Controller</w:t>
+      </w:r>
+    </w:p>
+    <w:p>
+      <w:r>
+        <w:t xml:space="preserve">        │</w:t>
+      </w:r>
+    </w:p>
+    <w:p>
+      <w:r>
+        <w:t xml:space="preserve">        </w:t>
+      </w:r>
+      <w:r>
+        <w:rPr>
+          <w:rFonts w:ascii="Arial" w:hAnsi="Arial" w:cs="Arial"/>
+        </w:rPr>
+        <w:t>▼</w:t>
+      </w:r>
+    </w:p>
+    <w:p>
+      <w:r>
+        <w:t>Controller xử lý</w:t>
+      </w:r>
+    </w:p>
+    <w:p>
+      <w:r>
+        <w:t xml:space="preserve">        │</w:t>
+      </w:r>
+    </w:p>
+    <w:p>
+      <w:r>
+        <w:t xml:space="preserve">        </w:t>
+      </w:r>
+      <w:r>
+        <w:rPr>
+          <w:rFonts w:ascii="Arial" w:hAnsi="Arial" w:cs="Arial"/>
+        </w:rPr>
+        <w:t>▼</w:t>
+      </w:r>
+    </w:p>
+    <w:p>
+      <w:r>
+        <w:t>Controller trả kết quả (success hoặc duplicate)</w:t>
+      </w:r>
+    </w:p>
+    <w:p>
+      <w:r>
+        <w:t xml:space="preserve">        │</w:t>
+      </w:r>
+    </w:p>
+    <w:p>
+      <w:r>
+        <w:t xml:space="preserve">        </w:t>
+      </w:r>
+      <w:r>
+        <w:rPr>
+          <w:rFonts w:ascii="Arial" w:hAnsi="Arial" w:cs="Arial"/>
+        </w:rPr>
+        <w:t>▼</w:t>
+      </w:r>
+    </w:p>
+    <w:p>
+      <w:r>
+        <w:t>JavaScript nhận kết quả và hiển thị SweetAlert</w:t>
+      </w:r>
+    </w:p>
+    <w:p>
+      <w:pPr>
+        <w:rPr>
+          <w:color w:val="EE0000"/>
+        </w:rPr>
+      </w:pPr>
+    </w:p>
+    <w:p>
+      <w:pPr>
+        <w:rPr>
           <w:b/>
           <w:bCs/>
         </w:rPr>
@@ -7719,7 +7946,7 @@
 </file>
 
 <file path=word/endnotes.xml><?xml version="1.0" encoding="utf-8"?>
-<w:endnotes xmlns:wpc="http://schemas.microsoft.com/office/word/2010/wordprocessingCanvas" xmlns:cx="http://schemas.microsoft.com/office/drawing/2014/chartex" xmlns:cx1="http://schemas.microsoft.com/office/drawing/2015/9/8/chartex" xmlns:cx2="http://schemas.microsoft.com/office/drawing/2015/10/21/chartex" xmlns:cx3="http://schemas.microsoft.com/office/drawing/2016/5/9/chartex" xmlns:cx4="http://schemas.microsoft.com/office/drawing/2016/5/10/chartex" xmlns:cx5="http://schemas.microsoft.com/office/drawing/2016/5/11/chartex" xmlns:cx6="http://schemas.microsoft.com/office/drawing/2016/5/12/chartex" xmlns:cx7="http://schemas.microsoft.com/office/drawing/2016/5/13/chartex" xmlns:cx8="http://schemas.microsoft.com/office/drawing/2016/5/14/chartex" xmlns:mc="http://schemas.openxmlformats.org/markup-compatibility/2006" xmlns:aink="http://schemas.microsoft.com/office/drawing/2016/ink" xmlns:am3d="http://schemas.microsoft.com/office/drawing/2017/model3d" xmlns:o="urn:schemas-microsoft-com:office:office" xmlns:oel="http://schemas.microsoft.com/office/2019/extlst" xmlns:r="http://schemas.openxmlformats.org/officeDocument/2006/relationships" xmlns:m="http://schemas.openxmlformats.org/officeDocument/2006/math" xmlns:v="urn:schemas-microsoft-com:vml" xmlns:wp14="http://schemas.microsoft.com/office/word/2010/wordprocessingDrawing" xmlns:wp="http://schemas.openxmlformats.org/drawingml/2006/wordprocessingDrawing" xmlns:w10="urn:schemas-microsoft-com:office:word" xmlns:w="http://schemas.openxmlformats.org/wordprocessingml/2006/main" xmlns:w14="http://schemas.microsoft.com/office/word/2010/wordml" xmlns:w15="http://schemas.microsoft.com/office/word/2012/wordml" xmlns:w16cex="http://schemas.microsoft.com/office/word/2018/wordml/cex" xmlns:w16cid="http://schemas.microsoft.com/office/word/2016/wordml/cid" xmlns:w16="http://schemas.microsoft.com/office/word/2018/wordml" xmlns:w16du="http://schemas.microsoft.com/office/word/2023/wordml/word16du" xmlns:w16sdtdh="http://schemas.microsoft.com/office/word/2020/wordml/sdtdatahash" xmlns:w16sdtfl="http://schemas.microsoft.com/office/word/2024/wordml/sdtformatlock" xmlns:w16se="http://schemas.microsoft.com/office/word/2015/wordml/symex" xmlns:wpg="http://schemas.microsoft.com/office/word/2010/wordprocessingGroup" xmlns:wpi="http://schemas.microsoft.com/office/word/2010/wordprocessingInk" xmlns:wne="http://schemas.microsoft.com/office/word/2006/wordml" xmlns:wps="http://schemas.microsoft.com/office/word/2010/wordprocessingShape" mc:Ignorable="w14 w15 w16se w16cid w16 w16cex w16sdtdh w16sdtfl w16du wp14">
+<w:endnotes xmlns:wpc="http://schemas.microsoft.com/office/word/2010/wordprocessingCanvas" xmlns:cx="http://schemas.microsoft.com/office/drawing/2014/chartex" xmlns:cx1="http://schemas.microsoft.com/office/drawing/2015/9/8/chartex" xmlns:cx2="http://schemas.microsoft.com/office/drawing/2015/10/21/chartex" xmlns:cx3="http://schemas.microsoft.com/office/drawing/2016/5/9/chartex" xmlns:cx4="http://schemas.microsoft.com/office/drawing/2016/5/10/chartex" xmlns:cx5="http://schemas.microsoft.com/office/drawing/2016/5/11/chartex" xmlns:cx6="http://schemas.microsoft.com/office/drawing/2016/5/12/chartex" xmlns:cx7="http://schemas.microsoft.com/office/drawing/2016/5/13/chartex" xmlns:cx8="http://schemas.microsoft.com/office/drawing/2016/5/14/chartex" xmlns:mc="http://schemas.openxmlformats.org/markup-compatibility/2006" xmlns:aink="http://schemas.microsoft.com/office/drawing/2016/ink" xmlns:am3d="http://schemas.microsoft.com/office/drawing/2017/model3d" xmlns:o="urn:schemas-microsoft-com:office:office" xmlns:oel="http://schemas.microsoft.com/office/2019/extlst" xmlns:r="http://schemas.openxmlformats.org/officeDocument/2006/relationships" xmlns:m="http://schemas.openxmlformats.org/officeDocument/2006/math" xmlns:v="urn:schemas-microsoft-com:vml" xmlns:wp14="http://schemas.microsoft.com/office/word/2010/wordprocessingDrawing" xmlns:wp="http://schemas.openxmlformats.org/drawingml/2006/wordprocessingDrawing" xmlns:w10="urn:schemas-microsoft-com:office:word" xmlns:w="http://schemas.openxmlformats.org/wordprocessingml/2006/main" xmlns:w14="http://schemas.microsoft.com/office/word/2010/wordml" xmlns:w15="http://schemas.microsoft.com/office/word/2012/wordml" xmlns:w16cei="http://schemas.microsoft.com/office/word/2026/wordml/cei" xmlns:w16cex="http://schemas.microsoft.com/office/word/2018/wordml/cex" xmlns:w16cid="http://schemas.microsoft.com/office/word/2016/wordml/cid" xmlns:w16="http://schemas.microsoft.com/office/word/2018/wordml" xmlns:w16du="http://schemas.microsoft.com/office/word/2023/wordml/word16du" xmlns:w16sdtdh="http://schemas.microsoft.com/office/word/2020/wordml/sdtdatahash" xmlns:w16sdtfl="http://schemas.microsoft.com/office/word/2024/wordml/sdtformatlock" xmlns:w16se="http://schemas.microsoft.com/office/word/2015/wordml/symex" xmlns:wpg="http://schemas.microsoft.com/office/word/2010/wordprocessingGroup" xmlns:wpi="http://schemas.microsoft.com/office/word/2010/wordprocessingInk" xmlns:wne="http://schemas.microsoft.com/office/word/2006/wordml" xmlns:wps="http://schemas.microsoft.com/office/word/2010/wordprocessingShape" mc:Ignorable="w14 w15 w16se w16cid w16 w16cex w16sdtdh w16sdtfl w16du wp14">
   <w:endnote w:type="separator" w:id="-1">
     <w:p>
       <w:pPr>
@@ -7744,7 +7971,7 @@
 </file>
 
 <file path=word/footnotes.xml><?xml version="1.0" encoding="utf-8"?>
-<w:footnotes xmlns:wpc="http://schemas.microsoft.com/office/word/2010/wordprocessingCanvas" xmlns:cx="http://schemas.microsoft.com/office/drawing/2014/chartex" xmlns:cx1="http://schemas.microsoft.com/office/drawing/2015/9/8/chartex" xmlns:cx2="http://schemas.microsoft.com/office/drawing/2015/10/21/chartex" xmlns:cx3="http://schemas.microsoft.com/office/drawing/2016/5/9/chartex" xmlns:cx4="http://schemas.microsoft.com/office/drawing/2016/5/10/chartex" xmlns:cx5="http://schemas.microsoft.com/office/drawing/2016/5/11/chartex" xmlns:cx6="http://schemas.microsoft.com/office/drawing/2016/5/12/chartex" xmlns:cx7="http://schemas.microsoft.com/office/drawing/2016/5/13/chartex" xmlns:cx8="http://schemas.microsoft.com/office/drawing/2016/5/14/chartex" xmlns:mc="http://schemas.openxmlformats.org/markup-compatibility/2006" xmlns:aink="http://schemas.microsoft.com/office/drawing/2016/ink" xmlns:am3d="http://schemas.microsoft.com/office/drawing/2017/model3d" xmlns:o="urn:schemas-microsoft-com:office:office" xmlns:oel="http://schemas.microsoft.com/office/2019/extlst" xmlns:r="http://schemas.openxmlformats.org/officeDocument/2006/relationships" xmlns:m="http://schemas.openxmlformats.org/officeDocument/2006/math" xmlns:v="urn:schemas-microsoft-com:vml" xmlns:wp14="http://schemas.microsoft.com/office/word/2010/wordprocessingDrawing" xmlns:wp="http://schemas.openxmlformats.org/drawingml/2006/wordprocessingDrawing" xmlns:w10="urn:schemas-microsoft-com:office:word" xmlns:w="http://schemas.openxmlformats.org/wordprocessingml/2006/main" xmlns:w14="http://schemas.microsoft.com/office/word/2010/wordml" xmlns:w15="http://schemas.microsoft.com/office/word/2012/wordml" xmlns:w16cex="http://schemas.microsoft.com/office/word/2018/wordml/cex" xmlns:w16cid="http://schemas.microsoft.com/office/word/2016/wordml/cid" xmlns:w16="http://schemas.microsoft.com/office/word/2018/wordml" xmlns:w16du="http://schemas.microsoft.com/office/word/2023/wordml/word16du" xmlns:w16sdtdh="http://schemas.microsoft.com/office/word/2020/wordml/sdtdatahash" xmlns:w16sdtfl="http://schemas.microsoft.com/office/word/2024/wordml/sdtformatlock" xmlns:w16se="http://schemas.microsoft.com/office/word/2015/wordml/symex" xmlns:wpg="http://schemas.microsoft.com/office/word/2010/wordprocessingGroup" xmlns:wpi="http://schemas.microsoft.com/office/word/2010/wordprocessingInk" xmlns:wne="http://schemas.microsoft.com/office/word/2006/wordml" xmlns:wps="http://schemas.microsoft.com/office/word/2010/wordprocessingShape" mc:Ignorable="w14 w15 w16se w16cid w16 w16cex w16sdtdh w16sdtfl w16du wp14">
+<w:footnotes xmlns:wpc="http://schemas.microsoft.com/office/word/2010/wordprocessingCanvas" xmlns:cx="http://schemas.microsoft.com/office/drawing/2014/chartex" xmlns:cx1="http://schemas.microsoft.com/office/drawing/2015/9/8/chartex" xmlns:cx2="http://schemas.microsoft.com/office/drawing/2015/10/21/chartex" xmlns:cx3="http://schemas.microsoft.com/office/drawing/2016/5/9/chartex" xmlns:cx4="http://schemas.microsoft.com/office/drawing/2016/5/10/chartex" xmlns:cx5="http://schemas.microsoft.com/office/drawing/2016/5/11/chartex" xmlns:cx6="http://schemas.microsoft.com/office/drawing/2016/5/12/chartex" xmlns:cx7="http://schemas.microsoft.com/office/drawing/2016/5/13/chartex" xmlns:cx8="http://schemas.microsoft.com/office/drawing/2016/5/14/chartex" xmlns:mc="http://schemas.openxmlformats.org/markup-compatibility/2006" xmlns:aink="http://schemas.microsoft.com/office/drawing/2016/ink" xmlns:am3d="http://schemas.microsoft.com/office/drawing/2017/model3d" xmlns:o="urn:schemas-microsoft-com:office:office" xmlns:oel="http://schemas.microsoft.com/office/2019/extlst" xmlns:r="http://schemas.openxmlformats.org/officeDocument/2006/relationships" xmlns:m="http://schemas.openxmlformats.org/officeDocument/2006/math" xmlns:v="urn:schemas-microsoft-com:vml" xmlns:wp14="http://schemas.microsoft.com/office/word/2010/wordprocessingDrawing" xmlns:wp="http://schemas.openxmlformats.org/drawingml/2006/wordprocessingDrawing" xmlns:w10="urn:schemas-microsoft-com:office:word" xmlns:w="http://schemas.openxmlformats.org/wordprocessingml/2006/main" xmlns:w14="http://schemas.microsoft.com/office/word/2010/wordml" xmlns:w15="http://schemas.microsoft.com/office/word/2012/wordml" xmlns:w16cei="http://schemas.microsoft.com/office/word/2026/wordml/cei" xmlns:w16cex="http://schemas.microsoft.com/office/word/2018/wordml/cex" xmlns:w16cid="http://schemas.microsoft.com/office/word/2016/wordml/cid" xmlns:w16="http://schemas.microsoft.com/office/word/2018/wordml" xmlns:w16du="http://schemas.microsoft.com/office/word/2023/wordml/word16du" xmlns:w16sdtdh="http://schemas.microsoft.com/office/word/2020/wordml/sdtdatahash" xmlns:w16sdtfl="http://schemas.microsoft.com/office/word/2024/wordml/sdtformatlock" xmlns:w16se="http://schemas.microsoft.com/office/word/2015/wordml/symex" xmlns:wpg="http://schemas.microsoft.com/office/word/2010/wordprocessingGroup" xmlns:wpi="http://schemas.microsoft.com/office/word/2010/wordprocessingInk" xmlns:wne="http://schemas.microsoft.com/office/word/2006/wordml" xmlns:wps="http://schemas.microsoft.com/office/word/2010/wordprocessingShape" mc:Ignorable="w14 w15 w16se w16cid w16 w16cex w16sdtdh w16sdtfl w16du wp14">
   <w:footnote w:type="separator" w:id="-1">
     <w:p>
       <w:pPr>
@@ -7769,7 +7996,7 @@
 </file>
 
 <file path=word/numbering.xml><?xml version="1.0" encoding="utf-8"?>
-<w:numbering xmlns:wpc="http://schemas.microsoft.com/office/word/2010/wordprocessingCanvas" xmlns:cx="http://schemas.microsoft.com/office/drawing/2014/chartex" xmlns:cx1="http://schemas.microsoft.com/office/drawing/2015/9/8/chartex" xmlns:cx2="http://schemas.microsoft.com/office/drawing/2015/10/21/chartex" xmlns:cx3="http://schemas.microsoft.com/office/drawing/2016/5/9/chartex" xmlns:cx4="http://schemas.microsoft.com/office/drawing/2016/5/10/chartex" xmlns:cx5="http://schemas.microsoft.com/office/drawing/2016/5/11/chartex" xmlns:cx6="http://schemas.microsoft.com/office/drawing/2016/5/12/chartex" xmlns:cx7="http://schemas.microsoft.com/office/drawing/2016/5/13/chartex" xmlns:cx8="http://schemas.microsoft.com/office/drawing/2016/5/14/chartex" xmlns:mc="http://schemas.openxmlformats.org/markup-compatibility/2006" xmlns:aink="http://schemas.microsoft.com/office/drawing/2016/ink" xmlns:am3d="http://schemas.microsoft.com/office/drawing/2017/model3d" xmlns:o="urn:schemas-microsoft-com:office:office" xmlns:oel="http://schemas.microsoft.com/office/2019/extlst" xmlns:r="http://schemas.openxmlformats.org/officeDocument/2006/relationships" xmlns:m="http://schemas.openxmlformats.org/officeDocument/2006/math" xmlns:v="urn:schemas-microsoft-com:vml" xmlns:wp14="http://schemas.microsoft.com/office/word/2010/wordprocessingDrawing" xmlns:wp="http://schemas.openxmlformats.org/drawingml/2006/wordprocessingDrawing" xmlns:w10="urn:schemas-microsoft-com:office:word" xmlns:w="http://schemas.openxmlformats.org/wordprocessingml/2006/main" xmlns:w14="http://schemas.microsoft.com/office/word/2010/wordml" xmlns:w15="http://schemas.microsoft.com/office/word/2012/wordml" xmlns:w16cex="http://schemas.microsoft.com/office/word/2018/wordml/cex" xmlns:w16cid="http://schemas.microsoft.com/office/word/2016/wordml/cid" xmlns:w16="http://schemas.microsoft.com/office/word/2018/wordml" xmlns:w16du="http://schemas.microsoft.com/office/word/2023/wordml/word16du" xmlns:w16sdtdh="http://schemas.microsoft.com/office/word/2020/wordml/sdtdatahash" xmlns:w16sdtfl="http://schemas.microsoft.com/office/word/2024/wordml/sdtformatlock" xmlns:w16se="http://schemas.microsoft.com/office/word/2015/wordml/symex" xmlns:wpg="http://schemas.microsoft.com/office/word/2010/wordprocessingGroup" xmlns:wpi="http://schemas.microsoft.com/office/word/2010/wordprocessingInk" xmlns:wne="http://schemas.microsoft.com/office/word/2006/wordml" xmlns:wps="http://schemas.microsoft.com/office/word/2010/wordprocessingShape" mc:Ignorable="w14 w15 w16se w16cid w16 w16cex w16sdtdh w16sdtfl w16du wp14">
+<w:numbering xmlns:wpc="http://schemas.microsoft.com/office/word/2010/wordprocessingCanvas" xmlns:cx="http://schemas.microsoft.com/office/drawing/2014/chartex" xmlns:cx1="http://schemas.microsoft.com/office/drawing/2015/9/8/chartex" xmlns:cx2="http://schemas.microsoft.com/office/drawing/2015/10/21/chartex" xmlns:cx3="http://schemas.microsoft.com/office/drawing/2016/5/9/chartex" xmlns:cx4="http://schemas.microsoft.com/office/drawing/2016/5/10/chartex" xmlns:cx5="http://schemas.microsoft.com/office/drawing/2016/5/11/chartex" xmlns:cx6="http://schemas.microsoft.com/office/drawing/2016/5/12/chartex" xmlns:cx7="http://schemas.microsoft.com/office/drawing/2016/5/13/chartex" xmlns:cx8="http://schemas.microsoft.com/office/drawing/2016/5/14/chartex" xmlns:mc="http://schemas.openxmlformats.org/markup-compatibility/2006" xmlns:aink="http://schemas.microsoft.com/office/drawing/2016/ink" xmlns:am3d="http://schemas.microsoft.com/office/drawing/2017/model3d" xmlns:o="urn:schemas-microsoft-com:office:office" xmlns:oel="http://schemas.microsoft.com/office/2019/extlst" xmlns:r="http://schemas.openxmlformats.org/officeDocument/2006/relationships" xmlns:m="http://schemas.openxmlformats.org/officeDocument/2006/math" xmlns:v="urn:schemas-microsoft-com:vml" xmlns:wp14="http://schemas.microsoft.com/office/word/2010/wordprocessingDrawing" xmlns:wp="http://schemas.openxmlformats.org/drawingml/2006/wordprocessingDrawing" xmlns:w10="urn:schemas-microsoft-com:office:word" xmlns:w="http://schemas.openxmlformats.org/wordprocessingml/2006/main" xmlns:w14="http://schemas.microsoft.com/office/word/2010/wordml" xmlns:w15="http://schemas.microsoft.com/office/word/2012/wordml" xmlns:w16cei="http://schemas.microsoft.com/office/word/2026/wordml/cei" xmlns:w16cex="http://schemas.microsoft.com/office/word/2018/wordml/cex" xmlns:w16cid="http://schemas.microsoft.com/office/word/2016/wordml/cid" xmlns:w16="http://schemas.microsoft.com/office/word/2018/wordml" xmlns:w16du="http://schemas.microsoft.com/office/word/2023/wordml/word16du" xmlns:w16sdtdh="http://schemas.microsoft.com/office/word/2020/wordml/sdtdatahash" xmlns:w16sdtfl="http://schemas.microsoft.com/office/word/2024/wordml/sdtformatlock" xmlns:w16se="http://schemas.microsoft.com/office/word/2015/wordml/symex" xmlns:wpg="http://schemas.microsoft.com/office/word/2010/wordprocessingGroup" xmlns:wpi="http://schemas.microsoft.com/office/word/2010/wordprocessingInk" xmlns:wne="http://schemas.microsoft.com/office/word/2006/wordml" xmlns:wps="http://schemas.microsoft.com/office/word/2010/wordprocessingShape" mc:Ignorable="w14 w15 w16se w16cid w16 w16cex w16sdtdh w16sdtfl w16du wp14">
   <w:abstractNum w:abstractNumId="0" w15:restartNumberingAfterBreak="0">
     <w:nsid w:val="01166347"/>
     <w:multiLevelType w:val="hybridMultilevel"/>

</xml_diff>